<commit_message>
Draft_127_body: appendix gaps via empty spacer paragraphs
Zero before/after on text; spacers before/after majors, minors, tables.
</commit_message>
<xml_diff>
--- a/thesis/003_ThesisProposal_Draft_127_body.docx
+++ b/thesis/003_ThesisProposal_Draft_127_body.docx
@@ -24898,7 +24898,7 @@
     </w:p>
     <w:p>
       <w:pPr>
-        <w:spacing w:before="720" w:after="720" w:line="480" w:lineRule="auto"/>
+        <w:spacing w:before="0" w:after="0" w:line="480" w:lineRule="auto"/>
         <w:jc w:val="center"/>
         <w:ind w:left="0" w:firstLine="0"/>
       </w:pPr>
@@ -24925,6 +24925,12 @@
     <w:p>
       <w:pPr>
         <w:spacing w:before="0" w:after="0" w:line="480" w:lineRule="auto"/>
+        <w:ind w:left="0" w:firstLine="0"/>
+      </w:pPr>
+    </w:p>
+    <w:p>
+      <w:pPr>
+        <w:spacing w:before="0" w:after="0" w:line="480" w:lineRule="auto"/>
         <w:jc w:val="both"/>
         <w:ind w:left="720" w:hanging="360"/>
       </w:pPr>
@@ -24947,7 +24953,13 @@
     </w:p>
     <w:p>
       <w:pPr>
-        <w:spacing w:before="240" w:after="0" w:line="480" w:lineRule="auto"/>
+        <w:spacing w:before="0" w:after="0" w:line="480" w:lineRule="auto"/>
+        <w:ind w:left="0" w:firstLine="0"/>
+      </w:pPr>
+    </w:p>
+    <w:p>
+      <w:pPr>
+        <w:spacing w:before="0" w:after="0" w:line="480" w:lineRule="auto"/>
         <w:jc w:val="left"/>
         <w:ind w:left="0" w:firstLine="0"/>
         <w:keepNext/>
@@ -24997,7 +25009,13 @@
     </w:p>
     <w:p>
       <w:pPr>
-        <w:spacing w:before="240" w:after="0" w:line="480" w:lineRule="auto"/>
+        <w:spacing w:before="0" w:after="0" w:line="480" w:lineRule="auto"/>
+        <w:ind w:left="0" w:firstLine="0"/>
+      </w:pPr>
+    </w:p>
+    <w:p>
+      <w:pPr>
+        <w:spacing w:before="0" w:after="0" w:line="480" w:lineRule="auto"/>
         <w:jc w:val="left"/>
         <w:ind w:left="0" w:firstLine="0"/>
         <w:keepNext/>
@@ -25176,7 +25194,13 @@
     </w:p>
     <w:p>
       <w:pPr>
-        <w:spacing w:before="240" w:after="0" w:line="480" w:lineRule="auto"/>
+        <w:spacing w:before="0" w:after="0" w:line="480" w:lineRule="auto"/>
+        <w:ind w:left="0" w:firstLine="0"/>
+      </w:pPr>
+    </w:p>
+    <w:p>
+      <w:pPr>
+        <w:spacing w:before="0" w:after="0" w:line="480" w:lineRule="auto"/>
         <w:jc w:val="left"/>
         <w:ind w:left="0" w:firstLine="0"/>
         <w:keepNext/>
@@ -25702,7 +25726,7 @@
     </w:p>
     <w:p>
       <w:pPr>
-        <w:spacing w:before="240" w:after="0" w:line="480" w:lineRule="auto"/>
+        <w:spacing w:before="0" w:after="0" w:line="480" w:lineRule="auto"/>
         <w:jc w:val="left"/>
         <w:ind w:left="0" w:firstLine="0"/>
         <w:keepNext/>
@@ -26000,7 +26024,7 @@
     </w:p>
     <w:p>
       <w:pPr>
-        <w:spacing w:before="240" w:after="0" w:line="480" w:lineRule="auto"/>
+        <w:spacing w:before="0" w:after="0" w:line="480" w:lineRule="auto"/>
         <w:jc w:val="left"/>
         <w:ind w:left="0" w:firstLine="0"/>
         <w:keepNext/>
@@ -26050,7 +26074,13 @@
     </w:p>
     <w:p>
       <w:pPr>
-        <w:spacing w:before="240" w:after="0" w:line="480" w:lineRule="auto"/>
+        <w:spacing w:before="0" w:after="0" w:line="480" w:lineRule="auto"/>
+        <w:ind w:left="0" w:firstLine="0"/>
+      </w:pPr>
+    </w:p>
+    <w:p>
+      <w:pPr>
+        <w:spacing w:before="0" w:after="0" w:line="480" w:lineRule="auto"/>
         <w:jc w:val="left"/>
         <w:ind w:left="0" w:firstLine="0"/>
         <w:keepNext/>
@@ -26168,7 +26198,13 @@
     </w:p>
     <w:p>
       <w:pPr>
-        <w:spacing w:before="240" w:after="0" w:line="480" w:lineRule="auto"/>
+        <w:spacing w:before="0" w:after="0" w:line="480" w:lineRule="auto"/>
+        <w:ind w:left="0" w:firstLine="0"/>
+      </w:pPr>
+    </w:p>
+    <w:p>
+      <w:pPr>
+        <w:spacing w:before="0" w:after="0" w:line="480" w:lineRule="auto"/>
         <w:jc w:val="left"/>
         <w:ind w:left="0" w:firstLine="0"/>
         <w:keepNext/>
@@ -26302,7 +26338,13 @@
     </w:p>
     <w:p>
       <w:pPr>
-        <w:spacing w:before="240" w:after="0" w:line="480" w:lineRule="auto"/>
+        <w:spacing w:before="0" w:after="0" w:line="480" w:lineRule="auto"/>
+        <w:ind w:left="0" w:firstLine="0"/>
+      </w:pPr>
+    </w:p>
+    <w:p>
+      <w:pPr>
+        <w:spacing w:before="0" w:after="0" w:line="480" w:lineRule="auto"/>
         <w:jc w:val="left"/>
         <w:ind w:left="0" w:firstLine="0"/>
         <w:keepNext/>
@@ -27094,7 +27136,13 @@
     </w:p>
     <w:p>
       <w:pPr>
-        <w:spacing w:before="240" w:after="0" w:line="480" w:lineRule="auto"/>
+        <w:spacing w:before="0" w:after="0" w:line="480" w:lineRule="auto"/>
+        <w:ind w:left="0" w:firstLine="0"/>
+      </w:pPr>
+    </w:p>
+    <w:p>
+      <w:pPr>
+        <w:spacing w:before="0" w:after="0" w:line="480" w:lineRule="auto"/>
         <w:jc w:val="left"/>
         <w:ind w:left="0" w:firstLine="0"/>
         <w:keepNext/>
@@ -27787,7 +27835,13 @@
     </w:p>
     <w:p>
       <w:pPr>
-        <w:spacing w:before="240" w:after="0" w:line="480" w:lineRule="auto"/>
+        <w:spacing w:before="0" w:after="0" w:line="480" w:lineRule="auto"/>
+        <w:ind w:left="0" w:firstLine="0"/>
+      </w:pPr>
+    </w:p>
+    <w:p>
+      <w:pPr>
+        <w:spacing w:before="0" w:after="0" w:line="480" w:lineRule="auto"/>
         <w:jc w:val="left"/>
         <w:ind w:left="0" w:firstLine="0"/>
         <w:keepNext/>
@@ -29205,7 +29259,13 @@
     </w:tbl>
     <w:p>
       <w:pPr>
-        <w:spacing w:before="240" w:after="0" w:line="480" w:lineRule="auto"/>
+        <w:spacing w:before="0" w:after="0" w:line="480" w:lineRule="auto"/>
+        <w:ind w:left="0" w:firstLine="0"/>
+      </w:pPr>
+    </w:p>
+    <w:p>
+      <w:pPr>
+        <w:spacing w:before="0" w:after="0" w:line="480" w:lineRule="auto"/>
         <w:jc w:val="left"/>
         <w:ind w:left="0" w:firstLine="0"/>
         <w:keepNext/>
@@ -30822,7 +30882,7 @@
     </w:p>
     <w:p>
       <w:pPr>
-        <w:spacing w:before="720" w:after="720" w:line="480" w:lineRule="auto"/>
+        <w:spacing w:before="0" w:after="0" w:line="480" w:lineRule="auto"/>
         <w:jc w:val="center"/>
         <w:ind w:left="0" w:firstLine="0"/>
       </w:pPr>
@@ -30873,7 +30933,13 @@
     </w:p>
     <w:p>
       <w:pPr>
-        <w:spacing w:before="240" w:after="0" w:line="480" w:lineRule="auto"/>
+        <w:spacing w:before="0" w:after="0" w:line="480" w:lineRule="auto"/>
+        <w:ind w:left="0" w:firstLine="0"/>
+      </w:pPr>
+    </w:p>
+    <w:p>
+      <w:pPr>
+        <w:spacing w:before="0" w:after="0" w:line="480" w:lineRule="auto"/>
         <w:jc w:val="left"/>
         <w:ind w:left="0" w:firstLine="0"/>
         <w:keepNext/>
@@ -30930,7 +30996,13 @@
     </w:p>
     <w:p>
       <w:pPr>
-        <w:spacing w:before="240" w:after="0" w:line="480" w:lineRule="auto"/>
+        <w:spacing w:before="0" w:after="0" w:line="480" w:lineRule="auto"/>
+        <w:ind w:left="0" w:firstLine="0"/>
+      </w:pPr>
+    </w:p>
+    <w:p>
+      <w:pPr>
+        <w:spacing w:before="0" w:after="0" w:line="480" w:lineRule="auto"/>
         <w:jc w:val="left"/>
         <w:ind w:left="0" w:firstLine="0"/>
         <w:keepNext/>
@@ -30995,7 +31067,13 @@
     </w:p>
     <w:p>
       <w:pPr>
-        <w:spacing w:before="240" w:after="0" w:line="480" w:lineRule="auto"/>
+        <w:spacing w:before="0" w:after="0" w:line="480" w:lineRule="auto"/>
+        <w:ind w:left="0" w:firstLine="0"/>
+      </w:pPr>
+    </w:p>
+    <w:p>
+      <w:pPr>
+        <w:spacing w:before="0" w:after="0" w:line="480" w:lineRule="auto"/>
         <w:jc w:val="left"/>
         <w:ind w:left="0" w:firstLine="0"/>
         <w:keepNext/>
@@ -31037,7 +31115,13 @@
     </w:p>
     <w:p>
       <w:pPr>
-        <w:spacing w:before="240" w:after="0" w:line="480" w:lineRule="auto"/>
+        <w:spacing w:before="0" w:after="0" w:line="480" w:lineRule="auto"/>
+        <w:ind w:left="0" w:firstLine="0"/>
+      </w:pPr>
+    </w:p>
+    <w:p>
+      <w:pPr>
+        <w:spacing w:before="0" w:after="0" w:line="480" w:lineRule="auto"/>
         <w:jc w:val="left"/>
         <w:ind w:left="0" w:firstLine="0"/>
         <w:keepNext/>
@@ -31154,7 +31238,13 @@
     </w:p>
     <w:p>
       <w:pPr>
-        <w:spacing w:before="240" w:after="0" w:line="480" w:lineRule="auto"/>
+        <w:spacing w:before="0" w:after="0" w:line="480" w:lineRule="auto"/>
+        <w:ind w:left="0" w:firstLine="0"/>
+      </w:pPr>
+    </w:p>
+    <w:p>
+      <w:pPr>
+        <w:spacing w:before="0" w:after="0" w:line="480" w:lineRule="auto"/>
         <w:jc w:val="left"/>
         <w:ind w:left="0" w:firstLine="0"/>
         <w:keepNext/>
@@ -31211,7 +31301,13 @@
     </w:p>
     <w:p>
       <w:pPr>
-        <w:spacing w:before="240" w:after="0" w:line="480" w:lineRule="auto"/>
+        <w:spacing w:before="0" w:after="0" w:line="480" w:lineRule="auto"/>
+        <w:ind w:left="0" w:firstLine="0"/>
+      </w:pPr>
+    </w:p>
+    <w:p>
+      <w:pPr>
+        <w:spacing w:before="0" w:after="0" w:line="480" w:lineRule="auto"/>
         <w:jc w:val="left"/>
         <w:ind w:left="0" w:firstLine="0"/>
         <w:keepNext/>
@@ -31276,7 +31372,13 @@
     </w:p>
     <w:p>
       <w:pPr>
-        <w:spacing w:before="240" w:after="0" w:line="480" w:lineRule="auto"/>
+        <w:spacing w:before="0" w:after="0" w:line="480" w:lineRule="auto"/>
+        <w:ind w:left="0" w:firstLine="0"/>
+      </w:pPr>
+    </w:p>
+    <w:p>
+      <w:pPr>
+        <w:spacing w:before="0" w:after="0" w:line="480" w:lineRule="auto"/>
         <w:jc w:val="left"/>
         <w:ind w:left="0" w:firstLine="0"/>
         <w:keepNext/>
@@ -31333,7 +31435,13 @@
     </w:p>
     <w:p>
       <w:pPr>
-        <w:spacing w:before="240" w:after="0" w:line="480" w:lineRule="auto"/>
+        <w:spacing w:before="0" w:after="0" w:line="480" w:lineRule="auto"/>
+        <w:ind w:left="0" w:firstLine="0"/>
+      </w:pPr>
+    </w:p>
+    <w:p>
+      <w:pPr>
+        <w:spacing w:before="0" w:after="0" w:line="480" w:lineRule="auto"/>
         <w:jc w:val="left"/>
         <w:ind w:left="0" w:firstLine="0"/>
         <w:keepNext/>
@@ -31467,7 +31575,7 @@
     </w:p>
     <w:p>
       <w:pPr>
-        <w:spacing w:before="720" w:after="720" w:line="480" w:lineRule="auto"/>
+        <w:spacing w:before="0" w:after="0" w:line="480" w:lineRule="auto"/>
         <w:jc w:val="center"/>
         <w:ind w:left="0" w:firstLine="0"/>
       </w:pPr>
@@ -31518,7 +31626,13 @@
     </w:p>
     <w:p>
       <w:pPr>
-        <w:spacing w:before="240" w:after="0" w:line="480" w:lineRule="auto"/>
+        <w:spacing w:before="0" w:after="0" w:line="480" w:lineRule="auto"/>
+        <w:ind w:left="0" w:firstLine="0"/>
+      </w:pPr>
+    </w:p>
+    <w:p>
+      <w:pPr>
+        <w:spacing w:before="0" w:after="0" w:line="480" w:lineRule="auto"/>
         <w:jc w:val="left"/>
         <w:ind w:left="0" w:firstLine="0"/>
         <w:keepNext/>
@@ -33982,7 +34096,13 @@
     </w:p>
     <w:p>
       <w:pPr>
-        <w:spacing w:before="240" w:after="0" w:line="480" w:lineRule="auto"/>
+        <w:spacing w:before="0" w:after="0" w:line="480" w:lineRule="auto"/>
+        <w:ind w:left="0" w:firstLine="0"/>
+      </w:pPr>
+    </w:p>
+    <w:p>
+      <w:pPr>
+        <w:spacing w:before="0" w:after="0" w:line="480" w:lineRule="auto"/>
         <w:jc w:val="left"/>
         <w:ind w:left="0" w:firstLine="0"/>
         <w:keepNext/>
@@ -35421,7 +35541,13 @@
     </w:p>
     <w:p>
       <w:pPr>
-        <w:spacing w:before="240" w:after="0" w:line="480" w:lineRule="auto"/>
+        <w:spacing w:before="0" w:after="0" w:line="480" w:lineRule="auto"/>
+        <w:ind w:left="0" w:firstLine="0"/>
+      </w:pPr>
+    </w:p>
+    <w:p>
+      <w:pPr>
+        <w:spacing w:before="0" w:after="0" w:line="480" w:lineRule="auto"/>
         <w:jc w:val="left"/>
         <w:ind w:left="0" w:firstLine="0"/>
         <w:keepNext/>
@@ -36466,7 +36592,13 @@
     </w:p>
     <w:p>
       <w:pPr>
-        <w:spacing w:before="240" w:after="0" w:line="480" w:lineRule="auto"/>
+        <w:spacing w:before="0" w:after="0" w:line="480" w:lineRule="auto"/>
+        <w:ind w:left="0" w:firstLine="0"/>
+      </w:pPr>
+    </w:p>
+    <w:p>
+      <w:pPr>
+        <w:spacing w:before="0" w:after="0" w:line="480" w:lineRule="auto"/>
         <w:jc w:val="left"/>
         <w:ind w:left="0" w:firstLine="0"/>
         <w:keepNext/>

</xml_diff>

<commit_message>
Draft_127_body: Table/Figure caption line spacing 1.15
Labels and titles only; cell text unchanged.
</commit_message>
<xml_diff>
--- a/thesis/003_ThesisProposal_Draft_127_body.docx
+++ b/thesis/003_ThesisProposal_Draft_127_body.docx
@@ -2265,7 +2265,7 @@
           </w:tcPr>
           <w:p>
             <w:pPr>
-              <w:spacing w:after="0" w:before="240" w:line="480" w:lineRule="auto"/>
+              <w:spacing w:after="0" w:before="240" w:line="276" w:lineRule="auto"/>
               <w:ind w:left="0" w:right="0" w:firstLine="0"/>
               <w:jc w:val="left"/>
               <w:rPr/>
@@ -2292,7 +2292,7 @@
           </w:p>
           <w:p>
             <w:pPr>
-              <w:spacing w:after="240" w:before="0" w:line="480" w:lineRule="auto"/>
+              <w:spacing w:after="240" w:before="0" w:line="276" w:lineRule="auto"/>
               <w:ind w:left="0" w:right="0" w:firstLine="0"/>
               <w:jc w:val="left"/>
               <w:rPr/>
@@ -4913,7 +4913,7 @@
     <w:p>
       <w:pPr>
         <w:keepNext w:val="1"/>
-        <w:spacing w:after="0" w:before="240" w:line="480" w:lineRule="auto"/>
+        <w:spacing w:after="0" w:before="240" w:line="276" w:lineRule="auto"/>
         <w:ind w:left="0" w:right="0" w:firstLine="0"/>
         <w:jc w:val="left"/>
         <w:rPr/>
@@ -4940,7 +4940,7 @@
     <w:p>
       <w:pPr>
         <w:keepNext w:val="1"/>
-        <w:spacing w:after="240" w:before="0" w:line="480" w:lineRule="auto"/>
+        <w:spacing w:after="240" w:before="0" w:line="276" w:lineRule="auto"/>
         <w:ind w:left="0" w:right="0" w:firstLine="0"/>
         <w:jc w:val="left"/>
         <w:rPr/>
@@ -6650,7 +6650,7 @@
     <w:p>
       <w:pPr>
         <w:keepNext w:val="1"/>
-        <w:spacing w:after="0" w:before="240" w:line="480" w:lineRule="auto"/>
+        <w:spacing w:after="0" w:before="240" w:line="276" w:lineRule="auto"/>
         <w:ind w:left="0" w:right="0" w:firstLine="0"/>
         <w:jc w:val="left"/>
         <w:rPr/>
@@ -6677,7 +6677,7 @@
     <w:p>
       <w:pPr>
         <w:keepNext w:val="1"/>
-        <w:spacing w:after="240" w:before="0" w:line="360" w:lineRule="auto"/>
+        <w:spacing w:after="240" w:before="0" w:line="276" w:lineRule="auto"/>
         <w:ind w:left="0" w:right="0" w:firstLine="0"/>
         <w:jc w:val="left"/>
         <w:rPr/>
@@ -8560,7 +8560,7 @@
     <w:p>
       <w:pPr>
         <w:keepNext w:val="1"/>
-        <w:spacing w:after="0" w:before="240" w:line="480" w:lineRule="auto"/>
+        <w:spacing w:after="0" w:before="240" w:line="276" w:lineRule="auto"/>
         <w:ind w:left="0" w:right="0" w:firstLine="0"/>
         <w:jc w:val="left"/>
         <w:rPr/>
@@ -8587,7 +8587,7 @@
     <w:p>
       <w:pPr>
         <w:keepNext w:val="1"/>
-        <w:spacing w:after="240" w:before="0" w:line="240" w:lineRule="auto"/>
+        <w:spacing w:after="240" w:before="0" w:line="276" w:lineRule="auto"/>
         <w:ind w:left="0" w:right="0" w:firstLine="0"/>
         <w:jc w:val="left"/>
         <w:rPr/>
@@ -12015,7 +12015,7 @@
       <w:pPr>
         <w:keepNext w:val="1"/>
         <w:pageBreakBefore w:val="1"/>
-        <w:spacing w:after="0" w:before="240" w:line="480" w:lineRule="auto"/>
+        <w:spacing w:after="0" w:before="240" w:line="276" w:lineRule="auto"/>
         <w:ind w:left="0" w:right="0" w:firstLine="0"/>
         <w:jc w:val="left"/>
         <w:rPr/>
@@ -12042,7 +12042,7 @@
     <w:p>
       <w:pPr>
         <w:keepNext w:val="1"/>
-        <w:spacing w:after="240" w:before="0" w:line="480" w:lineRule="auto"/>
+        <w:spacing w:after="240" w:before="0" w:line="276" w:lineRule="auto"/>
         <w:ind w:left="0" w:right="0" w:firstLine="0"/>
         <w:jc w:val="left"/>
         <w:rPr/>
@@ -13969,7 +13969,7 @@
     <w:p>
       <w:pPr>
         <w:keepNext w:val="1"/>
-        <w:spacing w:after="0" w:before="240" w:line="480" w:lineRule="auto"/>
+        <w:spacing w:after="0" w:before="240" w:line="276" w:lineRule="auto"/>
         <w:ind w:left="0" w:firstLine="0"/>
         <w:jc w:val="left"/>
         <w:rPr/>
@@ -13996,7 +13996,7 @@
     <w:p>
       <w:pPr>
         <w:keepNext w:val="1"/>
-        <w:spacing w:after="240" w:before="0" w:line="480" w:lineRule="auto"/>
+        <w:spacing w:after="240" w:before="0" w:line="276" w:lineRule="auto"/>
         <w:ind w:left="0" w:firstLine="0"/>
         <w:jc w:val="left"/>
         <w:rPr/>
@@ -15392,7 +15392,7 @@
     <w:p>
       <w:pPr>
         <w:keepNext w:val="1"/>
-        <w:spacing w:after="0" w:before="240" w:line="480" w:lineRule="auto"/>
+        <w:spacing w:after="0" w:before="240" w:line="276" w:lineRule="auto"/>
         <w:ind w:left="0" w:right="0" w:firstLine="0"/>
         <w:jc w:val="left"/>
         <w:rPr/>
@@ -15419,7 +15419,7 @@
     <w:p>
       <w:pPr>
         <w:keepNext w:val="1"/>
-        <w:spacing w:after="240" w:before="0" w:line="480" w:lineRule="auto"/>
+        <w:spacing w:after="240" w:before="0" w:line="276" w:lineRule="auto"/>
         <w:ind w:left="0" w:right="0" w:firstLine="0"/>
         <w:jc w:val="left"/>
         <w:rPr/>
@@ -16303,7 +16303,7 @@
     <w:p>
       <w:pPr>
         <w:keepNext w:val="1"/>
-        <w:spacing w:after="0" w:before="240" w:line="360" w:lineRule="auto"/>
+        <w:spacing w:after="0" w:before="240" w:line="276" w:lineRule="auto"/>
         <w:ind w:left="0" w:firstLine="0"/>
         <w:jc w:val="left"/>
         <w:rPr/>
@@ -17979,7 +17979,7 @@
     <w:p>
       <w:pPr>
         <w:keepNext w:val="1"/>
-        <w:spacing w:after="0" w:before="240" w:line="480" w:lineRule="auto"/>
+        <w:spacing w:after="0" w:before="240" w:line="276" w:lineRule="auto"/>
         <w:ind w:left="0" w:firstLine="0"/>
         <w:jc w:val="left"/>
         <w:rPr/>
@@ -18006,7 +18006,7 @@
     <w:p>
       <w:pPr>
         <w:keepNext w:val="1"/>
-        <w:spacing w:after="240" w:before="0" w:line="480" w:lineRule="auto"/>
+        <w:spacing w:after="240" w:before="0" w:line="276" w:lineRule="auto"/>
         <w:ind w:left="0" w:firstLine="0"/>
         <w:jc w:val="left"/>
         <w:rPr/>
@@ -19462,7 +19462,7 @@
     <w:p>
       <w:pPr>
         <w:keepNext w:val="1"/>
-        <w:spacing w:after="0" w:before="240" w:line="360" w:lineRule="auto"/>
+        <w:spacing w:after="0" w:before="240" w:line="276" w:lineRule="auto"/>
         <w:ind w:left="0" w:right="0" w:firstLine="0"/>
         <w:jc w:val="left"/>
         <w:rPr/>
@@ -19489,7 +19489,7 @@
     <w:p>
       <w:pPr>
         <w:keepNext w:val="1"/>
-        <w:spacing w:after="240" w:before="0" w:line="240" w:lineRule="auto"/>
+        <w:spacing w:after="240" w:before="0" w:line="276" w:lineRule="auto"/>
         <w:ind w:left="0" w:right="0" w:firstLine="0"/>
         <w:jc w:val="left"/>
         <w:rPr/>
@@ -21302,7 +21302,7 @@
     <w:p>
       <w:pPr>
         <w:keepNext w:val="1"/>
-        <w:spacing w:after="0" w:before="240" w:line="480" w:lineRule="auto"/>
+        <w:spacing w:after="0" w:before="240" w:line="276" w:lineRule="auto"/>
         <w:ind w:left="0" w:firstLine="0"/>
         <w:jc w:val="left"/>
         <w:rPr/>
@@ -21329,7 +21329,7 @@
     <w:p>
       <w:pPr>
         <w:keepNext w:val="1"/>
-        <w:spacing w:after="240" w:before="0" w:line="480" w:lineRule="auto"/>
+        <w:spacing w:after="240" w:before="0" w:line="276" w:lineRule="auto"/>
         <w:ind w:left="0" w:firstLine="0"/>
         <w:jc w:val="left"/>
         <w:rPr/>

</xml_diff>

<commit_message>
Draft_127_body: universal Table/Figure caption line spacing 1.5
</commit_message>
<xml_diff>
--- a/thesis/003_ThesisProposal_Draft_127_body.docx
+++ b/thesis/003_ThesisProposal_Draft_127_body.docx
@@ -2265,7 +2265,7 @@
           </w:tcPr>
           <w:p>
             <w:pPr>
-              <w:spacing w:after="0" w:before="240" w:line="276" w:lineRule="auto"/>
+              <w:spacing w:after="0" w:before="240" w:line="360" w:lineRule="auto"/>
               <w:ind w:left="0" w:right="0" w:firstLine="0"/>
               <w:jc w:val="left"/>
               <w:rPr/>
@@ -2292,7 +2292,7 @@
           </w:p>
           <w:p>
             <w:pPr>
-              <w:spacing w:after="240" w:before="0" w:line="276" w:lineRule="auto"/>
+              <w:spacing w:after="240" w:before="0" w:line="360" w:lineRule="auto"/>
               <w:ind w:left="0" w:right="0" w:firstLine="0"/>
               <w:jc w:val="left"/>
               <w:rPr/>
@@ -4913,7 +4913,7 @@
     <w:p>
       <w:pPr>
         <w:keepNext w:val="1"/>
-        <w:spacing w:after="0" w:before="240" w:line="276" w:lineRule="auto"/>
+        <w:spacing w:after="0" w:before="240" w:line="360" w:lineRule="auto"/>
         <w:ind w:left="0" w:right="0" w:firstLine="0"/>
         <w:jc w:val="left"/>
         <w:rPr/>
@@ -4940,7 +4940,7 @@
     <w:p>
       <w:pPr>
         <w:keepNext w:val="1"/>
-        <w:spacing w:after="240" w:before="0" w:line="276" w:lineRule="auto"/>
+        <w:spacing w:after="240" w:before="0" w:line="360" w:lineRule="auto"/>
         <w:ind w:left="0" w:right="0" w:firstLine="0"/>
         <w:jc w:val="left"/>
         <w:rPr/>
@@ -6650,7 +6650,7 @@
     <w:p>
       <w:pPr>
         <w:keepNext w:val="1"/>
-        <w:spacing w:after="0" w:before="240" w:line="276" w:lineRule="auto"/>
+        <w:spacing w:after="0" w:before="240" w:line="360" w:lineRule="auto"/>
         <w:ind w:left="0" w:right="0" w:firstLine="0"/>
         <w:jc w:val="left"/>
         <w:rPr/>
@@ -6677,7 +6677,7 @@
     <w:p>
       <w:pPr>
         <w:keepNext w:val="1"/>
-        <w:spacing w:after="240" w:before="0" w:line="276" w:lineRule="auto"/>
+        <w:spacing w:after="240" w:before="0" w:line="360" w:lineRule="auto"/>
         <w:ind w:left="0" w:right="0" w:firstLine="0"/>
         <w:jc w:val="left"/>
         <w:rPr/>
@@ -8560,7 +8560,7 @@
     <w:p>
       <w:pPr>
         <w:keepNext w:val="1"/>
-        <w:spacing w:after="0" w:before="240" w:line="276" w:lineRule="auto"/>
+        <w:spacing w:after="0" w:before="240" w:line="360" w:lineRule="auto"/>
         <w:ind w:left="0" w:right="0" w:firstLine="0"/>
         <w:jc w:val="left"/>
         <w:rPr/>
@@ -8587,7 +8587,7 @@
     <w:p>
       <w:pPr>
         <w:keepNext w:val="1"/>
-        <w:spacing w:after="240" w:before="0" w:line="276" w:lineRule="auto"/>
+        <w:spacing w:after="240" w:before="0" w:line="360" w:lineRule="auto"/>
         <w:ind w:left="0" w:right="0" w:firstLine="0"/>
         <w:jc w:val="left"/>
         <w:rPr/>
@@ -12015,7 +12015,7 @@
       <w:pPr>
         <w:keepNext w:val="1"/>
         <w:pageBreakBefore w:val="1"/>
-        <w:spacing w:after="0" w:before="240" w:line="276" w:lineRule="auto"/>
+        <w:spacing w:after="0" w:before="240" w:line="360" w:lineRule="auto"/>
         <w:ind w:left="0" w:right="0" w:firstLine="0"/>
         <w:jc w:val="left"/>
         <w:rPr/>
@@ -12042,7 +12042,7 @@
     <w:p>
       <w:pPr>
         <w:keepNext w:val="1"/>
-        <w:spacing w:after="240" w:before="0" w:line="276" w:lineRule="auto"/>
+        <w:spacing w:after="240" w:before="0" w:line="360" w:lineRule="auto"/>
         <w:ind w:left="0" w:right="0" w:firstLine="0"/>
         <w:jc w:val="left"/>
         <w:rPr/>
@@ -13969,7 +13969,7 @@
     <w:p>
       <w:pPr>
         <w:keepNext w:val="1"/>
-        <w:spacing w:after="0" w:before="240" w:line="276" w:lineRule="auto"/>
+        <w:spacing w:after="0" w:before="240" w:line="360" w:lineRule="auto"/>
         <w:ind w:left="0" w:firstLine="0"/>
         <w:jc w:val="left"/>
         <w:rPr/>
@@ -13996,7 +13996,7 @@
     <w:p>
       <w:pPr>
         <w:keepNext w:val="1"/>
-        <w:spacing w:after="240" w:before="0" w:line="276" w:lineRule="auto"/>
+        <w:spacing w:after="240" w:before="0" w:line="360" w:lineRule="auto"/>
         <w:ind w:left="0" w:firstLine="0"/>
         <w:jc w:val="left"/>
         <w:rPr/>
@@ -15392,7 +15392,7 @@
     <w:p>
       <w:pPr>
         <w:keepNext w:val="1"/>
-        <w:spacing w:after="0" w:before="240" w:line="276" w:lineRule="auto"/>
+        <w:spacing w:after="0" w:before="240" w:line="360" w:lineRule="auto"/>
         <w:ind w:left="0" w:right="0" w:firstLine="0"/>
         <w:jc w:val="left"/>
         <w:rPr/>
@@ -15419,7 +15419,7 @@
     <w:p>
       <w:pPr>
         <w:keepNext w:val="1"/>
-        <w:spacing w:after="240" w:before="0" w:line="276" w:lineRule="auto"/>
+        <w:spacing w:after="240" w:before="0" w:line="360" w:lineRule="auto"/>
         <w:ind w:left="0" w:right="0" w:firstLine="0"/>
         <w:jc w:val="left"/>
         <w:rPr/>
@@ -16303,7 +16303,7 @@
     <w:p>
       <w:pPr>
         <w:keepNext w:val="1"/>
-        <w:spacing w:after="0" w:before="240" w:line="276" w:lineRule="auto"/>
+        <w:spacing w:after="0" w:before="240" w:line="360" w:lineRule="auto"/>
         <w:ind w:left="0" w:firstLine="0"/>
         <w:jc w:val="left"/>
         <w:rPr/>
@@ -16330,7 +16330,7 @@
     <w:p>
       <w:pPr>
         <w:keepNext w:val="1"/>
-        <w:spacing w:after="240" w:before="0" w:line="276" w:lineRule="auto"/>
+        <w:spacing w:after="240" w:before="0" w:line="360" w:lineRule="auto"/>
         <w:ind w:left="0" w:firstLine="0"/>
         <w:jc w:val="left"/>
         <w:rPr/>
@@ -17979,7 +17979,7 @@
     <w:p>
       <w:pPr>
         <w:keepNext w:val="1"/>
-        <w:spacing w:after="0" w:before="240" w:line="276" w:lineRule="auto"/>
+        <w:spacing w:after="0" w:before="240" w:line="360" w:lineRule="auto"/>
         <w:ind w:left="0" w:firstLine="0"/>
         <w:jc w:val="left"/>
         <w:rPr/>
@@ -18006,7 +18006,7 @@
     <w:p>
       <w:pPr>
         <w:keepNext w:val="1"/>
-        <w:spacing w:after="240" w:before="0" w:line="276" w:lineRule="auto"/>
+        <w:spacing w:after="240" w:before="0" w:line="360" w:lineRule="auto"/>
         <w:ind w:left="0" w:firstLine="0"/>
         <w:jc w:val="left"/>
         <w:rPr/>
@@ -19462,7 +19462,7 @@
     <w:p>
       <w:pPr>
         <w:keepNext w:val="1"/>
-        <w:spacing w:after="0" w:before="240" w:line="276" w:lineRule="auto"/>
+        <w:spacing w:after="0" w:before="240" w:line="360" w:lineRule="auto"/>
         <w:ind w:left="0" w:right="0" w:firstLine="0"/>
         <w:jc w:val="left"/>
         <w:rPr/>
@@ -19489,7 +19489,7 @@
     <w:p>
       <w:pPr>
         <w:keepNext w:val="1"/>
-        <w:spacing w:after="240" w:before="0" w:line="276" w:lineRule="auto"/>
+        <w:spacing w:after="240" w:before="0" w:line="360" w:lineRule="auto"/>
         <w:ind w:left="0" w:right="0" w:firstLine="0"/>
         <w:jc w:val="left"/>
         <w:rPr/>
@@ -21302,7 +21302,7 @@
     <w:p>
       <w:pPr>
         <w:keepNext w:val="1"/>
-        <w:spacing w:after="0" w:before="240" w:line="276" w:lineRule="auto"/>
+        <w:spacing w:after="0" w:before="240" w:line="360" w:lineRule="auto"/>
         <w:ind w:left="0" w:firstLine="0"/>
         <w:jc w:val="left"/>
         <w:rPr/>
@@ -21329,7 +21329,7 @@
     <w:p>
       <w:pPr>
         <w:keepNext w:val="1"/>
-        <w:spacing w:after="240" w:before="0" w:line="276" w:lineRule="auto"/>
+        <w:spacing w:after="240" w:before="0" w:line="360" w:lineRule="auto"/>
         <w:ind w:left="0" w:firstLine="0"/>
         <w:jc w:val="left"/>
         <w:rPr/>

</xml_diff>

<commit_message>
Draft_127_body: force-rebuild Table/Figure caption pPr at 1.5
</commit_message>
<xml_diff>
--- a/thesis/003_ThesisProposal_Draft_127_body.docx
+++ b/thesis/003_ThesisProposal_Draft_127_body.docx
@@ -2265,53 +2265,51 @@
           </w:tcPr>
           <w:p>
             <w:pPr>
-              <w:spacing w:after="0" w:before="240" w:line="360" w:lineRule="auto"/>
-              <w:ind w:left="0" w:right="0" w:firstLine="0"/>
+              <w:keepNext/>
+              <w:spacing w:before="240" w:after="0" w:line="360" w:lineRule="auto"/>
+              <w:ind w:left="0" w:firstLine="0"/>
               <w:jc w:val="left"/>
-              <w:rPr/>
+            </w:pPr>
+            <w:r>
+              <w:rPr>
+                <w:rFonts w:ascii="Georgia" w:hAnsi="Georgia" w:cs="Georgia" w:eastAsia="Georgia"/>
+                <w:b/>
+                <w:bCs/>
+                <w:sz w:val="22"/>
+                <w:szCs w:val="22"/>
+              </w:rPr>
+              <w:t xml:space="preserve">Figure 1</w:t>
+            </w:r>
+            <w:r>
+              <w:rPr>
+                <w:rFonts w:ascii="Georgia" w:hAnsi="Georgia" w:cs="Georgia" w:eastAsia="Georgia"/>
+                <w:b/>
+                <w:bCs/>
+                <w:sz w:val="22"/>
+                <w:szCs w:val="22"/>
+              </w:rPr>
+            </w:r>
+          </w:p>
+          <w:p>
+            <w:pPr>
               <w:keepNext/>
-            </w:pPr>
-            <w:r>
-              <w:rPr>
-                <w:rFonts w:ascii="Georgia" w:cs="Georgia" w:eastAsia="Georgia" w:hAnsi="Georgia"/>
-                <w:b/>
-                <w:bCs w:val="1"/>
-                <w:i w:val="0"/>
-                <w:iCs w:val="0"/>
-                <w:sz w:val="22"/>
-                <w:szCs w:val="22"/>
-                <w:rtl w:val="0"/>
-              </w:rPr>
-              <w:t xml:space="preserve">Figure 1</w:t>
-            </w:r>
-            <w:r>
-              <w:rPr>
-                <w:rtl w:val="0"/>
-              </w:rPr>
-            </w:r>
-          </w:p>
-          <w:p>
-            <w:pPr>
-              <w:spacing w:after="240" w:before="0" w:line="360" w:lineRule="auto"/>
-              <w:ind w:left="0" w:right="0" w:firstLine="0"/>
+              <w:spacing w:before="0" w:after="240" w:line="360" w:lineRule="auto"/>
+              <w:ind w:left="0" w:firstLine="0"/>
               <w:jc w:val="left"/>
-              <w:rPr/>
-              <w:keepNext/>
-            </w:pPr>
-            <w:r>
-              <w:rPr>
-                <w:rFonts w:ascii="Georgia" w:cs="Georgia" w:eastAsia="Georgia" w:hAnsi="Georgia"/>
-                <w:i w:val="0"/>
-                <w:iCs w:val="0"/>
-                <w:sz w:val="22"/>
-                <w:szCs w:val="22"/>
-                <w:rtl w:val="0"/>
+            </w:pPr>
+            <w:r>
+              <w:rPr>
+                <w:rFonts w:ascii="Georgia" w:hAnsi="Georgia" w:cs="Georgia" w:eastAsia="Georgia"/>
+                <w:sz w:val="22"/>
+                <w:szCs w:val="22"/>
               </w:rPr>
               <w:t xml:space="preserve">Conceptual Framework of the Study</w:t>
             </w:r>
             <w:r>
               <w:rPr>
-                <w:rtl w:val="0"/>
+                <w:rFonts w:ascii="Georgia" w:hAnsi="Georgia" w:cs="Georgia" w:eastAsia="Georgia"/>
+                <w:sz w:val="22"/>
+                <w:szCs w:val="22"/>
               </w:rPr>
             </w:r>
           </w:p>
@@ -4912,53 +4910,51 @@
     </w:p>
     <w:p>
       <w:pPr>
-        <w:keepNext w:val="1"/>
-        <w:spacing w:after="0" w:before="240" w:line="360" w:lineRule="auto"/>
-        <w:ind w:left="0" w:right="0" w:firstLine="0"/>
+        <w:keepNext/>
+        <w:spacing w:before="240" w:after="0" w:line="360" w:lineRule="auto"/>
+        <w:ind w:left="0" w:firstLine="0"/>
         <w:jc w:val="left"/>
-        <w:rPr/>
-      </w:pPr>
-      <w:r>
-        <w:rPr>
-          <w:rFonts w:ascii="Georgia" w:cs="Georgia" w:eastAsia="Georgia" w:hAnsi="Georgia"/>
-          <w:b w:val="1"/>
-          <w:bCs w:val="1"/>
-          <w:i w:val="0"/>
-          <w:iCs w:val="0"/>
-          <w:sz w:val="22"/>
-          <w:szCs w:val="22"/>
-          <w:rtl w:val="0"/>
+      </w:pPr>
+      <w:r>
+        <w:rPr>
+          <w:rFonts w:ascii="Georgia" w:hAnsi="Georgia" w:cs="Georgia" w:eastAsia="Georgia"/>
+          <w:b/>
+          <w:bCs/>
+          <w:sz w:val="22"/>
+          <w:szCs w:val="22"/>
         </w:rPr>
         <w:t xml:space="preserve">Table 1</w:t>
       </w:r>
       <w:r>
         <w:rPr>
-          <w:rtl w:val="0"/>
-        </w:rPr>
-      </w:r>
-    </w:p>
-    <w:p>
-      <w:pPr>
-        <w:keepNext w:val="1"/>
-        <w:spacing w:after="240" w:before="0" w:line="360" w:lineRule="auto"/>
-        <w:ind w:left="0" w:right="0" w:firstLine="0"/>
+          <w:rFonts w:ascii="Georgia" w:hAnsi="Georgia" w:cs="Georgia" w:eastAsia="Georgia"/>
+          <w:b/>
+          <w:bCs/>
+          <w:sz w:val="22"/>
+          <w:szCs w:val="22"/>
+        </w:rPr>
+      </w:r>
+    </w:p>
+    <w:p>
+      <w:pPr>
+        <w:keepNext/>
+        <w:spacing w:before="0" w:after="240" w:line="360" w:lineRule="auto"/>
+        <w:ind w:left="0" w:firstLine="0"/>
         <w:jc w:val="left"/>
-        <w:rPr/>
-      </w:pPr>
-      <w:r>
-        <w:rPr>
-          <w:rFonts w:ascii="Georgia" w:cs="Georgia" w:eastAsia="Georgia" w:hAnsi="Georgia"/>
-          <w:i w:val="0"/>
-          <w:iCs w:val="0"/>
-          <w:sz w:val="22"/>
-          <w:szCs w:val="22"/>
-          <w:rtl w:val="0"/>
+      </w:pPr>
+      <w:r>
+        <w:rPr>
+          <w:rFonts w:ascii="Georgia" w:hAnsi="Georgia" w:cs="Georgia" w:eastAsia="Georgia"/>
+          <w:sz w:val="22"/>
+          <w:szCs w:val="22"/>
         </w:rPr>
         <w:t xml:space="preserve">Decision rules for ambiguous hedge forms.</w:t>
       </w:r>
       <w:r>
         <w:rPr>
-          <w:rtl w:val="0"/>
+          <w:rFonts w:ascii="Georgia" w:hAnsi="Georgia" w:cs="Georgia" w:eastAsia="Georgia"/>
+          <w:sz w:val="22"/>
+          <w:szCs w:val="22"/>
         </w:rPr>
       </w:r>
     </w:p>
@@ -6649,53 +6645,51 @@
     </w:p>
     <w:p>
       <w:pPr>
-        <w:keepNext w:val="1"/>
-        <w:spacing w:after="0" w:before="240" w:line="360" w:lineRule="auto"/>
-        <w:ind w:left="0" w:right="0" w:firstLine="0"/>
+        <w:keepNext/>
+        <w:spacing w:before="240" w:after="0" w:line="360" w:lineRule="auto"/>
+        <w:ind w:left="0" w:firstLine="0"/>
         <w:jc w:val="left"/>
-        <w:rPr/>
-      </w:pPr>
-      <w:r>
-        <w:rPr>
-          <w:rFonts w:ascii="Georgia" w:cs="Georgia" w:eastAsia="Georgia" w:hAnsi="Georgia"/>
-          <w:b w:val="1"/>
-          <w:bCs w:val="1"/>
-          <w:i w:val="0"/>
-          <w:iCs w:val="0"/>
-          <w:sz w:val="22"/>
-          <w:szCs w:val="22"/>
-          <w:rtl w:val="0"/>
+      </w:pPr>
+      <w:r>
+        <w:rPr>
+          <w:rFonts w:ascii="Georgia" w:hAnsi="Georgia" w:cs="Georgia" w:eastAsia="Georgia"/>
+          <w:b/>
+          <w:bCs/>
+          <w:sz w:val="22"/>
+          <w:szCs w:val="22"/>
         </w:rPr>
         <w:t xml:space="preserve">Table 2</w:t>
       </w:r>
       <w:r>
         <w:rPr>
-          <w:rtl w:val="0"/>
-        </w:rPr>
-      </w:r>
-    </w:p>
-    <w:p>
-      <w:pPr>
-        <w:keepNext w:val="1"/>
-        <w:spacing w:after="240" w:before="0" w:line="360" w:lineRule="auto"/>
-        <w:ind w:left="0" w:right="0" w:firstLine="0"/>
+          <w:rFonts w:ascii="Georgia" w:hAnsi="Georgia" w:cs="Georgia" w:eastAsia="Georgia"/>
+          <w:b/>
+          <w:bCs/>
+          <w:sz w:val="22"/>
+          <w:szCs w:val="22"/>
+        </w:rPr>
+      </w:r>
+    </w:p>
+    <w:p>
+      <w:pPr>
+        <w:keepNext/>
+        <w:spacing w:before="0" w:after="240" w:line="360" w:lineRule="auto"/>
+        <w:ind w:left="0" w:firstLine="0"/>
         <w:jc w:val="left"/>
-        <w:rPr/>
-      </w:pPr>
-      <w:r>
-        <w:rPr>
-          <w:rFonts w:ascii="Georgia" w:cs="Georgia" w:eastAsia="Georgia" w:hAnsi="Georgia"/>
-          <w:i w:val="0"/>
-          <w:iCs w:val="0"/>
-          <w:sz w:val="22"/>
-          <w:szCs w:val="22"/>
-          <w:rtl w:val="0"/>
+      </w:pPr>
+      <w:r>
+        <w:rPr>
+          <w:rFonts w:ascii="Georgia" w:hAnsi="Georgia" w:cs="Georgia" w:eastAsia="Georgia"/>
+          <w:sz w:val="22"/>
+          <w:szCs w:val="22"/>
         </w:rPr>
         <w:t xml:space="preserve">PSAU Thesis Repository: Population and Sampling Summary</w:t>
       </w:r>
       <w:r>
         <w:rPr>
-          <w:rtl w:val="0"/>
+          <w:rFonts w:ascii="Georgia" w:hAnsi="Georgia" w:cs="Georgia" w:eastAsia="Georgia"/>
+          <w:sz w:val="22"/>
+          <w:szCs w:val="22"/>
         </w:rPr>
       </w:r>
     </w:p>
@@ -8559,53 +8553,51 @@
     </w:p>
     <w:p>
       <w:pPr>
-        <w:keepNext w:val="1"/>
-        <w:spacing w:after="0" w:before="240" w:line="360" w:lineRule="auto"/>
-        <w:ind w:left="0" w:right="0" w:firstLine="0"/>
+        <w:keepNext/>
+        <w:spacing w:before="240" w:after="0" w:line="360" w:lineRule="auto"/>
+        <w:ind w:left="0" w:firstLine="0"/>
         <w:jc w:val="left"/>
-        <w:rPr/>
-      </w:pPr>
-      <w:r>
-        <w:rPr>
-          <w:rFonts w:ascii="Georgia" w:cs="Georgia" w:eastAsia="Georgia" w:hAnsi="Georgia"/>
-          <w:b w:val="1"/>
-          <w:bCs w:val="1"/>
-          <w:i w:val="0"/>
-          <w:iCs w:val="0"/>
-          <w:sz w:val="22"/>
-          <w:szCs w:val="22"/>
-          <w:rtl w:val="0"/>
+      </w:pPr>
+      <w:r>
+        <w:rPr>
+          <w:rFonts w:ascii="Georgia" w:hAnsi="Georgia" w:cs="Georgia" w:eastAsia="Georgia"/>
+          <w:b/>
+          <w:bCs/>
+          <w:sz w:val="22"/>
+          <w:szCs w:val="22"/>
         </w:rPr>
         <w:t xml:space="preserve">Table 3</w:t>
       </w:r>
       <w:r>
         <w:rPr>
-          <w:rtl w:val="0"/>
-        </w:rPr>
-      </w:r>
-    </w:p>
-    <w:p>
-      <w:pPr>
-        <w:keepNext w:val="1"/>
-        <w:spacing w:after="240" w:before="0" w:line="360" w:lineRule="auto"/>
-        <w:ind w:left="0" w:right="0" w:firstLine="0"/>
+          <w:rFonts w:ascii="Georgia" w:hAnsi="Georgia" w:cs="Georgia" w:eastAsia="Georgia"/>
+          <w:b/>
+          <w:bCs/>
+          <w:sz w:val="22"/>
+          <w:szCs w:val="22"/>
+        </w:rPr>
+      </w:r>
+    </w:p>
+    <w:p>
+      <w:pPr>
+        <w:keepNext/>
+        <w:spacing w:before="0" w:after="240" w:line="360" w:lineRule="auto"/>
+        <w:ind w:left="0" w:firstLine="0"/>
         <w:jc w:val="left"/>
-        <w:rPr/>
-      </w:pPr>
-      <w:r>
-        <w:rPr>
-          <w:rFonts w:ascii="Georgia" w:cs="Georgia" w:eastAsia="Georgia" w:hAnsi="Georgia"/>
-          <w:i w:val="0"/>
-          <w:iCs w:val="0"/>
-          <w:sz w:val="22"/>
-          <w:szCs w:val="22"/>
-          <w:rtl w:val="0"/>
+      </w:pPr>
+      <w:r>
+        <w:rPr>
+          <w:rFonts w:ascii="Georgia" w:hAnsi="Georgia" w:cs="Georgia" w:eastAsia="Georgia"/>
+          <w:sz w:val="22"/>
+          <w:szCs w:val="22"/>
         </w:rPr>
         <w:t xml:space="preserve">Hedge Types by Count and Discipline</w:t>
       </w:r>
       <w:r>
         <w:rPr>
-          <w:rtl w:val="0"/>
+          <w:rFonts w:ascii="Georgia" w:hAnsi="Georgia" w:cs="Georgia" w:eastAsia="Georgia"/>
+          <w:sz w:val="22"/>
+          <w:szCs w:val="22"/>
         </w:rPr>
       </w:r>
     </w:p>
@@ -12013,54 +12005,51 @@
     </w:p>
     <w:p>
       <w:pPr>
-        <w:keepNext w:val="1"/>
-        <w:pageBreakBefore w:val="1"/>
-        <w:spacing w:after="0" w:before="240" w:line="360" w:lineRule="auto"/>
-        <w:ind w:left="0" w:right="0" w:firstLine="0"/>
+        <w:keepNext/>
+        <w:spacing w:before="240" w:after="0" w:line="360" w:lineRule="auto"/>
+        <w:ind w:left="0" w:firstLine="0"/>
         <w:jc w:val="left"/>
-        <w:rPr/>
-      </w:pPr>
-      <w:r>
-        <w:rPr>
-          <w:rFonts w:ascii="Georgia" w:cs="Georgia" w:eastAsia="Georgia" w:hAnsi="Georgia"/>
-          <w:b w:val="1"/>
-          <w:bCs w:val="1"/>
-          <w:i w:val="0"/>
-          <w:iCs w:val="0"/>
-          <w:sz w:val="22"/>
-          <w:szCs w:val="22"/>
-          <w:rtl w:val="0"/>
+      </w:pPr>
+      <w:r>
+        <w:rPr>
+          <w:rFonts w:ascii="Georgia" w:hAnsi="Georgia" w:cs="Georgia" w:eastAsia="Georgia"/>
+          <w:b/>
+          <w:bCs/>
+          <w:sz w:val="22"/>
+          <w:szCs w:val="22"/>
         </w:rPr>
         <w:t xml:space="preserve">Table 4</w:t>
       </w:r>
       <w:r>
         <w:rPr>
-          <w:rtl w:val="0"/>
-        </w:rPr>
-      </w:r>
-    </w:p>
-    <w:p>
-      <w:pPr>
-        <w:keepNext w:val="1"/>
-        <w:spacing w:after="240" w:before="0" w:line="360" w:lineRule="auto"/>
-        <w:ind w:left="0" w:right="0" w:firstLine="0"/>
+          <w:rFonts w:ascii="Georgia" w:hAnsi="Georgia" w:cs="Georgia" w:eastAsia="Georgia"/>
+          <w:b/>
+          <w:bCs/>
+          <w:sz w:val="22"/>
+          <w:szCs w:val="22"/>
+        </w:rPr>
+      </w:r>
+    </w:p>
+    <w:p>
+      <w:pPr>
+        <w:keepNext/>
+        <w:spacing w:before="0" w:after="240" w:line="360" w:lineRule="auto"/>
+        <w:ind w:left="0" w:firstLine="0"/>
         <w:jc w:val="left"/>
-        <w:rPr/>
-      </w:pPr>
-      <w:r>
-        <w:rPr>
-          <w:rFonts w:ascii="Georgia" w:cs="Georgia" w:eastAsia="Georgia" w:hAnsi="Georgia"/>
-          <w:i w:val="0"/>
-          <w:iCs w:val="0"/>
-          <w:sz w:val="22"/>
-          <w:szCs w:val="22"/>
-          <w:rtl w:val="0"/>
+      </w:pPr>
+      <w:r>
+        <w:rPr>
+          <w:rFonts w:ascii="Georgia" w:hAnsi="Georgia" w:cs="Georgia" w:eastAsia="Georgia"/>
+          <w:sz w:val="22"/>
+          <w:szCs w:val="22"/>
         </w:rPr>
         <w:t xml:space="preserve">Hedge Frequency by Discipline</w:t>
       </w:r>
       <w:r>
         <w:rPr>
-          <w:rtl w:val="0"/>
+          <w:rFonts w:ascii="Georgia" w:hAnsi="Georgia" w:cs="Georgia" w:eastAsia="Georgia"/>
+          <w:sz w:val="22"/>
+          <w:szCs w:val="22"/>
         </w:rPr>
       </w:r>
     </w:p>
@@ -13968,53 +13957,51 @@
     </w:p>
     <w:p>
       <w:pPr>
-        <w:keepNext w:val="1"/>
-        <w:spacing w:after="0" w:before="240" w:line="360" w:lineRule="auto"/>
+        <w:keepNext/>
+        <w:spacing w:before="240" w:after="0" w:line="360" w:lineRule="auto"/>
         <w:ind w:left="0" w:firstLine="0"/>
         <w:jc w:val="left"/>
-        <w:rPr/>
-      </w:pPr>
-      <w:r>
-        <w:rPr>
-          <w:rFonts w:ascii="Georgia" w:cs="Georgia" w:eastAsia="Georgia" w:hAnsi="Georgia"/>
-          <w:b w:val="1"/>
-          <w:bCs w:val="1"/>
-          <w:i w:val="0"/>
-          <w:iCs w:val="0"/>
-          <w:sz w:val="22"/>
-          <w:szCs w:val="22"/>
-          <w:rtl w:val="0"/>
+      </w:pPr>
+      <w:r>
+        <w:rPr>
+          <w:rFonts w:ascii="Georgia" w:hAnsi="Georgia" w:cs="Georgia" w:eastAsia="Georgia"/>
+          <w:b/>
+          <w:bCs/>
+          <w:sz w:val="22"/>
+          <w:szCs w:val="22"/>
         </w:rPr>
         <w:t xml:space="preserve">Table 4.1</w:t>
       </w:r>
       <w:r>
         <w:rPr>
-          <w:rtl w:val="0"/>
-        </w:rPr>
-      </w:r>
-    </w:p>
-    <w:p>
-      <w:pPr>
-        <w:keepNext w:val="1"/>
-        <w:spacing w:after="240" w:before="0" w:line="360" w:lineRule="auto"/>
+          <w:rFonts w:ascii="Georgia" w:hAnsi="Georgia" w:cs="Georgia" w:eastAsia="Georgia"/>
+          <w:b/>
+          <w:bCs/>
+          <w:sz w:val="22"/>
+          <w:szCs w:val="22"/>
+        </w:rPr>
+      </w:r>
+    </w:p>
+    <w:p>
+      <w:pPr>
+        <w:keepNext/>
+        <w:spacing w:before="0" w:after="240" w:line="360" w:lineRule="auto"/>
         <w:ind w:left="0" w:firstLine="0"/>
         <w:jc w:val="left"/>
-        <w:rPr/>
-      </w:pPr>
-      <w:r>
-        <w:rPr>
-          <w:rFonts w:ascii="Georgia" w:cs="Georgia" w:eastAsia="Georgia" w:hAnsi="Georgia"/>
-          <w:i w:val="0"/>
-          <w:iCs w:val="0"/>
-          <w:sz w:val="22"/>
-          <w:szCs w:val="22"/>
-          <w:rtl w:val="0"/>
+      </w:pPr>
+      <w:r>
+        <w:rPr>
+          <w:rFonts w:ascii="Georgia" w:hAnsi="Georgia" w:cs="Georgia" w:eastAsia="Georgia"/>
+          <w:sz w:val="22"/>
+          <w:szCs w:val="22"/>
         </w:rPr>
         <w:t xml:space="preserve">Illustrative Unhedged Claims</w:t>
       </w:r>
       <w:r>
         <w:rPr>
-          <w:rtl w:val="0"/>
+          <w:rFonts w:ascii="Georgia" w:hAnsi="Georgia" w:cs="Georgia" w:eastAsia="Georgia"/>
+          <w:sz w:val="22"/>
+          <w:szCs w:val="22"/>
         </w:rPr>
       </w:r>
     </w:p>
@@ -15391,53 +15378,51 @@
     </w:p>
     <w:p>
       <w:pPr>
-        <w:keepNext w:val="1"/>
-        <w:spacing w:after="0" w:before="240" w:line="360" w:lineRule="auto"/>
-        <w:ind w:left="0" w:right="0" w:firstLine="0"/>
+        <w:keepNext/>
+        <w:spacing w:before="240" w:after="0" w:line="360" w:lineRule="auto"/>
+        <w:ind w:left="0" w:firstLine="0"/>
         <w:jc w:val="left"/>
-        <w:rPr/>
-      </w:pPr>
-      <w:r>
-        <w:rPr>
-          <w:rFonts w:ascii="Georgia" w:cs="Georgia" w:eastAsia="Georgia" w:hAnsi="Georgia"/>
-          <w:b w:val="1"/>
-          <w:bCs w:val="1"/>
-          <w:i w:val="0"/>
-          <w:iCs w:val="0"/>
-          <w:sz w:val="22"/>
-          <w:szCs w:val="22"/>
-          <w:rtl w:val="0"/>
+      </w:pPr>
+      <w:r>
+        <w:rPr>
+          <w:rFonts w:ascii="Georgia" w:hAnsi="Georgia" w:cs="Georgia" w:eastAsia="Georgia"/>
+          <w:b/>
+          <w:bCs/>
+          <w:sz w:val="22"/>
+          <w:szCs w:val="22"/>
         </w:rPr>
         <w:t xml:space="preserve">Table 5</w:t>
       </w:r>
       <w:r>
         <w:rPr>
-          <w:rtl w:val="0"/>
-        </w:rPr>
-      </w:r>
-    </w:p>
-    <w:p>
-      <w:pPr>
-        <w:keepNext w:val="1"/>
-        <w:spacing w:after="240" w:before="0" w:line="360" w:lineRule="auto"/>
-        <w:ind w:left="0" w:right="0" w:firstLine="0"/>
+          <w:rFonts w:ascii="Georgia" w:hAnsi="Georgia" w:cs="Georgia" w:eastAsia="Georgia"/>
+          <w:b/>
+          <w:bCs/>
+          <w:sz w:val="22"/>
+          <w:szCs w:val="22"/>
+        </w:rPr>
+      </w:r>
+    </w:p>
+    <w:p>
+      <w:pPr>
+        <w:keepNext/>
+        <w:spacing w:before="0" w:after="240" w:line="360" w:lineRule="auto"/>
+        <w:ind w:left="0" w:firstLine="0"/>
         <w:jc w:val="left"/>
-        <w:rPr/>
-      </w:pPr>
-      <w:r>
-        <w:rPr>
-          <w:rFonts w:ascii="Georgia" w:cs="Georgia" w:eastAsia="Georgia" w:hAnsi="Georgia"/>
-          <w:i w:val="0"/>
-          <w:iCs w:val="0"/>
-          <w:sz w:val="22"/>
-          <w:szCs w:val="22"/>
-          <w:rtl w:val="0"/>
+      </w:pPr>
+      <w:r>
+        <w:rPr>
+          <w:rFonts w:ascii="Georgia" w:hAnsi="Georgia" w:cs="Georgia" w:eastAsia="Georgia"/>
+          <w:sz w:val="22"/>
+          <w:szCs w:val="22"/>
         </w:rPr>
         <w:t xml:space="preserve">Function Distribution among Candidate Tokens</w:t>
       </w:r>
       <w:r>
         <w:rPr>
-          <w:rtl w:val="0"/>
+          <w:rFonts w:ascii="Georgia" w:hAnsi="Georgia" w:cs="Georgia" w:eastAsia="Georgia"/>
+          <w:sz w:val="22"/>
+          <w:szCs w:val="22"/>
         </w:rPr>
       </w:r>
     </w:p>
@@ -16302,53 +16287,51 @@
     </w:p>
     <w:p>
       <w:pPr>
-        <w:keepNext w:val="1"/>
-        <w:spacing w:after="0" w:before="240" w:line="360" w:lineRule="auto"/>
+        <w:keepNext/>
+        <w:spacing w:before="240" w:after="0" w:line="360" w:lineRule="auto"/>
         <w:ind w:left="0" w:firstLine="0"/>
         <w:jc w:val="left"/>
-        <w:rPr/>
-      </w:pPr>
-      <w:r>
-        <w:rPr>
-          <w:rFonts w:ascii="Georgia" w:cs="Georgia" w:eastAsia="Georgia" w:hAnsi="Georgia"/>
-          <w:b w:val="1"/>
-          <w:bCs w:val="1"/>
-          <w:i w:val="0"/>
-          <w:iCs w:val="0"/>
-          <w:sz w:val="22"/>
-          <w:szCs w:val="22"/>
-          <w:rtl w:val="0"/>
+      </w:pPr>
+      <w:r>
+        <w:rPr>
+          <w:rFonts w:ascii="Georgia" w:hAnsi="Georgia" w:cs="Georgia" w:eastAsia="Georgia"/>
+          <w:b/>
+          <w:bCs/>
+          <w:sz w:val="22"/>
+          <w:szCs w:val="22"/>
         </w:rPr>
         <w:t xml:space="preserve">Table 5.1</w:t>
       </w:r>
       <w:r>
         <w:rPr>
-          <w:rtl w:val="0"/>
-        </w:rPr>
-      </w:r>
-    </w:p>
-    <w:p>
-      <w:pPr>
-        <w:keepNext w:val="1"/>
-        <w:spacing w:after="240" w:before="0" w:line="360" w:lineRule="auto"/>
+          <w:rFonts w:ascii="Georgia" w:hAnsi="Georgia" w:cs="Georgia" w:eastAsia="Georgia"/>
+          <w:b/>
+          <w:bCs/>
+          <w:sz w:val="22"/>
+          <w:szCs w:val="22"/>
+        </w:rPr>
+      </w:r>
+    </w:p>
+    <w:p>
+      <w:pPr>
+        <w:keepNext/>
+        <w:spacing w:before="0" w:after="240" w:line="360" w:lineRule="auto"/>
         <w:ind w:left="0" w:firstLine="0"/>
         <w:jc w:val="left"/>
-        <w:rPr/>
-      </w:pPr>
-      <w:r>
-        <w:rPr>
-          <w:rFonts w:ascii="Georgia" w:cs="Georgia" w:eastAsia="Georgia" w:hAnsi="Georgia"/>
-          <w:i w:val="0"/>
-          <w:iCs w:val="0"/>
-          <w:sz w:val="22"/>
-          <w:szCs w:val="22"/>
-          <w:rtl w:val="0"/>
+      </w:pPr>
+      <w:r>
+        <w:rPr>
+          <w:rFonts w:ascii="Georgia" w:hAnsi="Georgia" w:cs="Georgia" w:eastAsia="Georgia"/>
+          <w:sz w:val="22"/>
+          <w:szCs w:val="22"/>
         </w:rPr>
         <w:t xml:space="preserve">Retained Hedge versus False Positive: Coding Contrasts</w:t>
       </w:r>
       <w:r>
         <w:rPr>
-          <w:rtl w:val="0"/>
+          <w:rFonts w:ascii="Georgia" w:hAnsi="Georgia" w:cs="Georgia" w:eastAsia="Georgia"/>
+          <w:sz w:val="22"/>
+          <w:szCs w:val="22"/>
         </w:rPr>
       </w:r>
     </w:p>
@@ -17978,53 +17961,51 @@
     </w:p>
     <w:p>
       <w:pPr>
-        <w:keepNext w:val="1"/>
-        <w:spacing w:after="0" w:before="240" w:line="360" w:lineRule="auto"/>
+        <w:keepNext/>
+        <w:spacing w:before="240" w:after="0" w:line="360" w:lineRule="auto"/>
         <w:ind w:left="0" w:firstLine="0"/>
         <w:jc w:val="left"/>
-        <w:rPr/>
-      </w:pPr>
-      <w:r>
-        <w:rPr>
-          <w:rFonts w:ascii="Georgia" w:cs="Georgia" w:eastAsia="Georgia" w:hAnsi="Georgia"/>
-          <w:b w:val="1"/>
-          <w:bCs w:val="1"/>
-          <w:i w:val="0"/>
-          <w:iCs w:val="0"/>
-          <w:sz w:val="22"/>
-          <w:szCs w:val="22"/>
-          <w:rtl w:val="0"/>
+      </w:pPr>
+      <w:r>
+        <w:rPr>
+          <w:rFonts w:ascii="Georgia" w:hAnsi="Georgia" w:cs="Georgia" w:eastAsia="Georgia"/>
+          <w:b/>
+          <w:bCs/>
+          <w:sz w:val="22"/>
+          <w:szCs w:val="22"/>
         </w:rPr>
         <w:t xml:space="preserve">Table 5.2</w:t>
       </w:r>
       <w:r>
         <w:rPr>
-          <w:rtl w:val="0"/>
-        </w:rPr>
-      </w:r>
-    </w:p>
-    <w:p>
-      <w:pPr>
-        <w:keepNext w:val="1"/>
-        <w:spacing w:after="240" w:before="0" w:line="360" w:lineRule="auto"/>
+          <w:rFonts w:ascii="Georgia" w:hAnsi="Georgia" w:cs="Georgia" w:eastAsia="Georgia"/>
+          <w:b/>
+          <w:bCs/>
+          <w:sz w:val="22"/>
+          <w:szCs w:val="22"/>
+        </w:rPr>
+      </w:r>
+    </w:p>
+    <w:p>
+      <w:pPr>
+        <w:keepNext/>
+        <w:spacing w:before="0" w:after="240" w:line="360" w:lineRule="auto"/>
         <w:ind w:left="0" w:firstLine="0"/>
         <w:jc w:val="left"/>
-        <w:rPr/>
-      </w:pPr>
-      <w:r>
-        <w:rPr>
-          <w:rFonts w:ascii="Georgia" w:cs="Georgia" w:eastAsia="Georgia" w:hAnsi="Georgia"/>
-          <w:i w:val="0"/>
-          <w:iCs w:val="0"/>
-          <w:sz w:val="22"/>
-          <w:szCs w:val="22"/>
-          <w:rtl w:val="0"/>
+      </w:pPr>
+      <w:r>
+        <w:rPr>
+          <w:rFonts w:ascii="Georgia" w:hAnsi="Georgia" w:cs="Georgia" w:eastAsia="Georgia"/>
+          <w:sz w:val="22"/>
+          <w:szCs w:val="22"/>
         </w:rPr>
         <w:t xml:space="preserve">Illustrative Retained Hedges by Program</w:t>
       </w:r>
       <w:r>
         <w:rPr>
-          <w:rtl w:val="0"/>
+          <w:rFonts w:ascii="Georgia" w:hAnsi="Georgia" w:cs="Georgia" w:eastAsia="Georgia"/>
+          <w:sz w:val="22"/>
+          <w:szCs w:val="22"/>
         </w:rPr>
       </w:r>
     </w:p>
@@ -19461,53 +19442,51 @@
     </w:p>
     <w:p>
       <w:pPr>
-        <w:keepNext w:val="1"/>
-        <w:spacing w:after="0" w:before="240" w:line="360" w:lineRule="auto"/>
-        <w:ind w:left="0" w:right="0" w:firstLine="0"/>
+        <w:keepNext/>
+        <w:spacing w:before="240" w:after="0" w:line="360" w:lineRule="auto"/>
+        <w:ind w:left="0" w:firstLine="0"/>
         <w:jc w:val="left"/>
-        <w:rPr/>
-      </w:pPr>
-      <w:r>
-        <w:rPr>
-          <w:rFonts w:ascii="Georgia" w:cs="Georgia" w:eastAsia="Georgia" w:hAnsi="Georgia"/>
-          <w:b w:val="1"/>
-          <w:bCs w:val="1"/>
-          <w:i w:val="0"/>
-          <w:iCs w:val="0"/>
-          <w:sz w:val="22"/>
-          <w:szCs w:val="22"/>
-          <w:rtl w:val="0"/>
+      </w:pPr>
+      <w:r>
+        <w:rPr>
+          <w:rFonts w:ascii="Georgia" w:hAnsi="Georgia" w:cs="Georgia" w:eastAsia="Georgia"/>
+          <w:b/>
+          <w:bCs/>
+          <w:sz w:val="22"/>
+          <w:szCs w:val="22"/>
         </w:rPr>
         <w:t xml:space="preserve">Table 6</w:t>
       </w:r>
       <w:r>
         <w:rPr>
-          <w:rtl w:val="0"/>
-        </w:rPr>
-      </w:r>
-    </w:p>
-    <w:p>
-      <w:pPr>
-        <w:keepNext w:val="1"/>
-        <w:spacing w:after="240" w:before="0" w:line="360" w:lineRule="auto"/>
-        <w:ind w:left="0" w:right="0" w:firstLine="0"/>
+          <w:rFonts w:ascii="Georgia" w:hAnsi="Georgia" w:cs="Georgia" w:eastAsia="Georgia"/>
+          <w:b/>
+          <w:bCs/>
+          <w:sz w:val="22"/>
+          <w:szCs w:val="22"/>
+        </w:rPr>
+      </w:r>
+    </w:p>
+    <w:p>
+      <w:pPr>
+        <w:keepNext/>
+        <w:spacing w:before="0" w:after="240" w:line="360" w:lineRule="auto"/>
+        <w:ind w:left="0" w:firstLine="0"/>
         <w:jc w:val="left"/>
-        <w:rPr/>
-      </w:pPr>
-      <w:r>
-        <w:rPr>
-          <w:rFonts w:ascii="Georgia" w:cs="Georgia" w:eastAsia="Georgia" w:hAnsi="Georgia"/>
-          <w:i w:val="0"/>
-          <w:iCs w:val="0"/>
-          <w:sz w:val="22"/>
-          <w:szCs w:val="22"/>
-          <w:rtl w:val="0"/>
+      </w:pPr>
+      <w:r>
+        <w:rPr>
+          <w:rFonts w:ascii="Georgia" w:hAnsi="Georgia" w:cs="Georgia" w:eastAsia="Georgia"/>
+          <w:sz w:val="22"/>
+          <w:szCs w:val="22"/>
         </w:rPr>
         <w:t xml:space="preserve">Outcome Type by Discipline</w:t>
       </w:r>
       <w:r>
         <w:rPr>
-          <w:rtl w:val="0"/>
+          <w:rFonts w:ascii="Georgia" w:hAnsi="Georgia" w:cs="Georgia" w:eastAsia="Georgia"/>
+          <w:sz w:val="22"/>
+          <w:szCs w:val="22"/>
         </w:rPr>
       </w:r>
     </w:p>
@@ -21301,53 +21280,51 @@
     </w:p>
     <w:p>
       <w:pPr>
-        <w:keepNext w:val="1"/>
-        <w:spacing w:after="0" w:before="240" w:line="360" w:lineRule="auto"/>
+        <w:keepNext/>
+        <w:spacing w:before="240" w:after="0" w:line="360" w:lineRule="auto"/>
         <w:ind w:left="0" w:firstLine="0"/>
         <w:jc w:val="left"/>
-        <w:rPr/>
-      </w:pPr>
-      <w:r>
-        <w:rPr>
-          <w:rFonts w:ascii="Georgia" w:cs="Georgia" w:eastAsia="Georgia" w:hAnsi="Georgia"/>
-          <w:b w:val="1"/>
-          <w:bCs w:val="1"/>
-          <w:i w:val="0"/>
-          <w:iCs w:val="0"/>
-          <w:sz w:val="22"/>
-          <w:szCs w:val="22"/>
-          <w:rtl w:val="0"/>
+      </w:pPr>
+      <w:r>
+        <w:rPr>
+          <w:rFonts w:ascii="Georgia" w:hAnsi="Georgia" w:cs="Georgia" w:eastAsia="Georgia"/>
+          <w:b/>
+          <w:bCs/>
+          <w:sz w:val="22"/>
+          <w:szCs w:val="22"/>
         </w:rPr>
         <w:t xml:space="preserve">Table 6.1</w:t>
       </w:r>
       <w:r>
         <w:rPr>
-          <w:rtl w:val="0"/>
-        </w:rPr>
-      </w:r>
-    </w:p>
-    <w:p>
-      <w:pPr>
-        <w:keepNext w:val="1"/>
-        <w:spacing w:after="240" w:before="0" w:line="360" w:lineRule="auto"/>
+          <w:rFonts w:ascii="Georgia" w:hAnsi="Georgia" w:cs="Georgia" w:eastAsia="Georgia"/>
+          <w:b/>
+          <w:bCs/>
+          <w:sz w:val="22"/>
+          <w:szCs w:val="22"/>
+        </w:rPr>
+      </w:r>
+    </w:p>
+    <w:p>
+      <w:pPr>
+        <w:keepNext/>
+        <w:spacing w:before="0" w:after="240" w:line="360" w:lineRule="auto"/>
         <w:ind w:left="0" w:firstLine="0"/>
         <w:jc w:val="left"/>
-        <w:rPr/>
-      </w:pPr>
-      <w:r>
-        <w:rPr>
-          <w:rFonts w:ascii="Georgia" w:cs="Georgia" w:eastAsia="Georgia" w:hAnsi="Georgia"/>
-          <w:i w:val="0"/>
-          <w:iCs w:val="0"/>
-          <w:sz w:val="22"/>
-          <w:szCs w:val="22"/>
-          <w:rtl w:val="0"/>
+      </w:pPr>
+      <w:r>
+        <w:rPr>
+          <w:rFonts w:ascii="Georgia" w:hAnsi="Georgia" w:cs="Georgia" w:eastAsia="Georgia"/>
+          <w:sz w:val="22"/>
+          <w:szCs w:val="22"/>
         </w:rPr>
         <w:t xml:space="preserve">Program Contrast: Sample Excerpts</w:t>
       </w:r>
       <w:r>
         <w:rPr>
-          <w:rtl w:val="0"/>
+          <w:rFonts w:ascii="Georgia" w:hAnsi="Georgia" w:cs="Georgia" w:eastAsia="Georgia"/>
+          <w:sz w:val="22"/>
+          <w:szCs w:val="22"/>
         </w:rPr>
       </w:r>
     </w:p>

</xml_diff>

<commit_message>
Draft_127_body: overwrite with section breaks + spacer cleanup (no version inflate)
</commit_message>
<xml_diff>
--- a/thesis/003_ThesisProposal_Draft_127_body.docx
+++ b/thesis/003_ThesisProposal_Draft_127_body.docx
@@ -522,13 +522,9 @@
         <w:jc w:val="center"/>
         <w:rPr/>
         <w:sectPr>
-          <w:headerReference r:id="rId6" w:type="default"/>
-          <w:headerReference r:id="rId7" w:type="first"/>
-          <w:footerReference r:id="rId8" w:type="default"/>
-          <w:footerReference r:id="rId9" w:type="first"/>
+          <w:type w:val="nextPage"/>
           <w:pgSz w:h="16838" w:w="11906" w:orient="portrait"/>
           <w:pgMar w:bottom="1440" w:top="1440" w:left="2160" w:right="1440" w:header="720" w:footer="720"/>
-          <w:pgNumType w:start="1"/>
           <w:titlePg w:val="1"/>
         </w:sectPr>
       </w:pPr>
@@ -553,7 +549,7 @@
     </w:p>
     <w:p>
       <w:pPr>
-        <w:spacing w:after="720" w:before="720" w:line="480" w:lineRule="auto"/>
+        <w:spacing w:after="0" w:before="0" w:line="480" w:lineRule="auto"/>
         <w:ind w:left="0" w:right="0" w:firstLine="0"/>
         <w:jc w:val="center"/>
         <w:rPr>
@@ -3518,10 +3514,6 @@
         <w:jc w:val="both"/>
         <w:rPr/>
         <w:sectPr>
-          <w:headerReference r:id="rId11" w:type="default"/>
-          <w:headerReference r:id="rId12" w:type="first"/>
-          <w:footerReference r:id="rId13" w:type="default"/>
-          <w:footerReference r:id="rId14" w:type="first"/>
           <w:type w:val="nextPage"/>
           <w:pgSz w:h="16838" w:w="11906" w:orient="portrait"/>
           <w:pgMar w:bottom="1440" w:top="1440" w:left="2160" w:right="1440" w:header="720" w:footer="720"/>
@@ -3562,7 +3554,7 @@
     </w:p>
     <w:p>
       <w:pPr>
-        <w:spacing w:after="720" w:before="720" w:line="480" w:lineRule="auto"/>
+        <w:spacing w:after="0" w:before="0" w:line="480" w:lineRule="auto"/>
         <w:ind w:left="0" w:right="0" w:firstLine="0"/>
         <w:jc w:val="center"/>
         <w:rPr>
@@ -6546,10 +6538,6 @@
         <w:jc w:val="both"/>
         <w:rPr/>
         <w:sectPr>
-          <w:headerReference r:id="rId15" w:type="default"/>
-          <w:headerReference r:id="rId16" w:type="first"/>
-          <w:footerReference r:id="rId17" w:type="default"/>
-          <w:footerReference r:id="rId18" w:type="first"/>
           <w:type w:val="nextPage"/>
           <w:pgSz w:h="16838" w:w="11906" w:orient="portrait"/>
           <w:pgMar w:bottom="1440" w:top="1440" w:left="2160" w:right="1440" w:header="720" w:footer="720"/>
@@ -6577,7 +6565,7 @@
     </w:p>
     <w:p>
       <w:pPr>
-        <w:spacing w:after="720" w:before="720" w:line="480" w:lineRule="auto"/>
+        <w:spacing w:after="0" w:before="0" w:line="480" w:lineRule="auto"/>
         <w:ind w:left="0" w:right="0" w:firstLine="0"/>
         <w:jc w:val="center"/>
         <w:rPr>
@@ -23015,10 +23003,6 @@
         <w:jc w:val="both"/>
         <w:rPr/>
         <w:sectPr>
-          <w:headerReference r:id="rId19" w:type="default"/>
-          <w:headerReference r:id="rId20" w:type="first"/>
-          <w:footerReference r:id="rId21" w:type="default"/>
-          <w:footerReference r:id="rId22" w:type="first"/>
           <w:type w:val="nextPage"/>
           <w:pgSz w:h="16838" w:w="11906" w:orient="portrait"/>
           <w:pgMar w:bottom="1440" w:top="1440" w:left="2160" w:right="1440" w:header="720" w:footer="720"/>
@@ -23046,7 +23030,7 @@
     </w:p>
     <w:p>
       <w:pPr>
-        <w:spacing w:after="720" w:before="720" w:line="480" w:lineRule="auto"/>
+        <w:spacing w:after="0" w:before="0" w:line="480" w:lineRule="auto"/>
         <w:ind w:left="0" w:right="0" w:firstLine="0"/>
         <w:jc w:val="center"/>
         <w:rPr>
@@ -23345,10 +23329,6 @@
         <w:jc w:val="both"/>
         <w:rPr/>
         <w:sectPr>
-          <w:headerReference r:id="rId23" w:type="default"/>
-          <w:headerReference r:id="rId24" w:type="first"/>
-          <w:footerReference r:id="rId25" w:type="default"/>
-          <w:footerReference r:id="rId26" w:type="first"/>
           <w:type w:val="nextPage"/>
           <w:pgSz w:h="16838" w:w="11906" w:orient="portrait"/>
           <w:pgMar w:bottom="1440" w:top="1440" w:left="2160" w:right="1440" w:header="720" w:footer="720"/>
@@ -23376,7 +23356,7 @@
     </w:p>
     <w:p>
       <w:pPr>
-        <w:spacing w:after="720" w:before="720" w:line="480" w:lineRule="auto"/>
+        <w:spacing w:after="0" w:before="0" w:line="480" w:lineRule="auto"/>
         <w:ind w:left="0" w:right="0" w:firstLine="0"/>
         <w:jc w:val="center"/>
         <w:rPr>
@@ -23401,6 +23381,14 @@
         <w:rPr>
           <w:rtl w:val="0"/>
         </w:rPr>
+      </w:r>
+    </w:p>
+    <w:p>
+      <w:pPr>
+        <w:spacing w:before="0" w:after="0" w:line="480" w:lineRule="auto"/>
+      </w:pPr>
+      <w:r>
+        <w:t xml:space="preserve"/>
       </w:r>
     </w:p>
     <w:p>
@@ -24790,10 +24778,6 @@
         <w:jc w:val="both"/>
         <w:rPr/>
         <w:sectPr>
-          <w:headerReference r:id="rId48" w:type="default"/>
-          <w:headerReference r:id="rId49" w:type="first"/>
-          <w:footerReference r:id="rId50" w:type="default"/>
-          <w:footerReference r:id="rId51" w:type="first"/>
           <w:type w:val="nextPage"/>
           <w:pgSz w:h="16838" w:w="11906" w:orient="portrait"/>
           <w:pgMar w:bottom="1440" w:top="1440" w:left="2160" w:right="1440" w:header="720" w:footer="720"/>
@@ -24821,60 +24805,6 @@
     </w:p>
     <w:p>
       <w:pPr>
-        <w:spacing w:after="0" w:before="0" w:line="480" w:lineRule="auto"/>
-        <w:ind w:left="0" w:right="0" w:firstLine="0"/>
-        <w:jc w:val="both"/>
-        <w:rPr/>
-      </w:pPr>
-      <w:r>
-        <w:rPr>
-          <w:rtl w:val="0"/>
-        </w:rPr>
-      </w:r>
-    </w:p>
-    <w:p>
-      <w:pPr>
-        <w:keepNext w:val="1"/>
-        <w:spacing w:after="240" w:before="720" w:line="480" w:lineRule="auto"/>
-        <w:ind w:firstLine="0"/>
-        <w:jc w:val="left"/>
-        <w:rPr>
-          <w:sz w:val="28"/>
-          <w:szCs w:val="28"/>
-        </w:rPr>
-      </w:pPr>
-      <w:r>
-        <w:rPr>
-          <w:b w:val="1"/>
-          <w:bCs w:val="1"/>
-          <w:sz w:val="28"/>
-          <w:szCs w:val="28"/>
-          <w:rtl w:val="0"/>
-        </w:rPr>
-      </w:r>
-      <w:r>
-        <w:rPr>
-          <w:rtl w:val="0"/>
-        </w:rPr>
-      </w:r>
-    </w:p>
-    <w:p>
-      <w:pPr>
-        <w:spacing w:after="40" w:before="0" w:line="480" w:lineRule="auto"/>
-        <w:jc w:val="left"/>
-        <w:rPr>
-          <w:b w:val="1"/>
-          <w:bCs w:val="1"/>
-        </w:rPr>
-      </w:pPr>
-      <w:r>
-        <w:rPr>
-          <w:rtl w:val="0"/>
-        </w:rPr>
-      </w:r>
-    </w:p>
-    <w:p>
-      <w:pPr>
         <w:spacing w:before="0" w:after="0" w:line="480" w:lineRule="auto"/>
         <w:jc w:val="center"/>
         <w:ind w:left="0" w:firstLine="0"/>
@@ -25159,7 +25089,6 @@
           <w:sz w:val="22"/>
           <w:szCs w:val="22"/>
         </w:rPr>
-        <w:br w:type="page"/>
       </w:r>
       <w:r>
         <w:rPr>
@@ -26303,7 +26232,6 @@
           <w:sz w:val="22"/>
           <w:szCs w:val="22"/>
         </w:rPr>
-        <w:br w:type="page"/>
       </w:r>
       <w:r>
         <w:rPr>
@@ -27101,7 +27029,6 @@
           <w:sz w:val="22"/>
           <w:szCs w:val="22"/>
         </w:rPr>
-        <w:br w:type="page"/>
       </w:r>
       <w:r>
         <w:rPr>
@@ -29255,7 +29182,6 @@
           <w:sz w:val="24"/>
           <w:szCs w:val="24"/>
         </w:rPr>
-        <w:br w:type="page"/>
       </w:r>
       <w:r>
         <w:rPr>
@@ -30806,707 +30732,85 @@
     </w:p>
     <w:p>
       <w:pPr>
-        <w:sectPr>
-          <w:type w:val="nextPage"/>
-          <w:pgSz w:h="16838" w:w="11906" w:orient="portrait"/>
-          <w:pgMar w:bottom="1440" w:top="1440" w:left="2160" w:right="1440" w:header="720" w:footer="720"/>
-        </w:sectPr>
         <w:spacing w:before="0" w:after="0" w:line="480" w:lineRule="auto"/>
         <w:jc w:val="both"/>
         <w:ind w:left="720" w:hanging="360"/>
-      </w:pPr>
-      <w:r>
-        <w:rPr>
-          <w:rFonts w:ascii="Georgia" w:hAnsi="Georgia" w:cs="Georgia" w:eastAsia="Georgia"/>
-          <w:sz w:val="22"/>
-          <w:szCs w:val="22"/>
-        </w:rPr>
-        <w:t xml:space="preserve">• FP tab. </w:t>
-      </w:r>
-      <w:r>
-        <w:rPr>
-          <w:rFonts w:ascii="Georgia" w:hAnsi="Georgia" w:cs="Georgia" w:eastAsia="Georgia"/>
-          <w:sz w:val="22"/>
-          <w:szCs w:val="22"/>
-        </w:rPr>
-        <w:t xml:space="preserve">Optional Rejected Candidates tab for FP traceability.</w:t>
-      </w:r>
-      <w:r>
-        <w:rPr>
-          <w:rFonts w:ascii="Georgia" w:hAnsi="Georgia" w:cs="Georgia" w:eastAsia="Georgia"/>
-          <w:sz w:val="22"/>
-          <w:szCs w:val="22"/>
-        </w:rPr>
-        <w:br w:type="page"/>
-      </w:r>
-      <w:r>
-        <w:rPr>
-          <w:rFonts w:ascii="Georgia" w:hAnsi="Georgia" w:cs="Georgia" w:eastAsia="Georgia"/>
-          <w:sz w:val="22"/>
-          <w:szCs w:val="22"/>
-        </w:rPr>
-      </w:r>
-    </w:p>
-    <w:p>
-      <w:pPr>
-        <w:spacing w:before="0" w:after="0" w:line="480" w:lineRule="auto"/>
-      </w:pPr>
-      <w:r>
-        <w:rPr>
-          <w:rtl w:val="0"/>
-        </w:rPr>
-      </w:r>
-    </w:p>
-    <w:p>
-      <w:pPr>
-        <w:spacing w:before="0" w:after="0" w:line="480" w:lineRule="auto"/>
-        <w:jc w:val="center"/>
-        <w:ind w:left="0" w:firstLine="0"/>
-      </w:pPr>
-      <w:r>
-        <w:rPr>
-          <w:rFonts w:ascii="Georgia" w:hAnsi="Georgia" w:cs="Georgia" w:eastAsia="Georgia"/>
-          <w:b/>
-          <w:bCs/>
-          <w:sz w:val="28"/>
-          <w:szCs w:val="28"/>
-        </w:rPr>
-        <w:t xml:space="preserve">APPENDIX B: PILOT SAMPLE ANALYSIS AND CODING VERIFICATION</w:t>
-      </w:r>
-      <w:r>
-        <w:rPr>
-          <w:rFonts w:ascii="Georgia" w:hAnsi="Georgia" w:cs="Georgia" w:eastAsia="Georgia"/>
-          <w:b/>
-          <w:bCs/>
-          <w:sz w:val="28"/>
-          <w:szCs w:val="28"/>
-        </w:rPr>
-      </w:r>
-    </w:p>
-    <w:p>
-      <w:pPr>
-        <w:spacing w:before="0" w:after="0" w:line="480" w:lineRule="auto"/>
-      </w:pPr>
-      <w:r>
-        <w:rPr>
-          <w:rtl w:val="0"/>
-        </w:rPr>
-      </w:r>
-    </w:p>
-    <w:p>
-      <w:pPr>
-        <w:spacing w:before="0" w:after="0" w:line="480" w:lineRule="auto"/>
-        <w:jc w:val="both"/>
-        <w:ind w:left="0" w:firstLine="720"/>
-      </w:pPr>
-      <w:r>
-        <w:rPr>
-          <w:rFonts w:ascii="Georgia" w:hAnsi="Georgia" w:cs="Georgia" w:eastAsia="Georgia"/>
-          <w:sz w:val="22"/>
-          <w:szCs w:val="22"/>
-        </w:rPr>
-        <w:t xml:space="preserve">Four abstracts drawn from the pre-2023 pool were coded before the main corpus. The goal was to test the scheme, settle borderline cases, and see whether zero-hedge abstracts were common enough to shape the study design. Each abstract is given below with its coding summary.</w:t>
-      </w:r>
-    </w:p>
-    <w:p>
-      <w:pPr>
-        <w:spacing w:before="0" w:after="0" w:line="480" w:lineRule="auto"/>
-        <w:ind w:left="0" w:firstLine="0"/>
-      </w:pPr>
-    </w:p>
-    <w:p>
-      <w:pPr>
-        <w:spacing w:before="0" w:after="0" w:line="480" w:lineRule="auto"/>
-        <w:jc w:val="left"/>
-        <w:ind w:left="0" w:firstLine="0"/>
-        <w:keepNext/>
-      </w:pPr>
-      <w:r>
-        <w:rPr>
-          <w:rFonts w:ascii="Georgia" w:hAnsi="Georgia" w:cs="Georgia" w:eastAsia="Georgia"/>
-          <w:b/>
-          <w:bCs/>
-          <w:sz w:val="24"/>
-          <w:szCs w:val="24"/>
-        </w:rPr>
-        <w:t xml:space="preserve">Sample 1: Biology</w:t>
-      </w:r>
-      <w:r>
-        <w:rPr>
-          <w:rFonts w:ascii="Georgia" w:hAnsi="Georgia" w:cs="Georgia" w:eastAsia="Georgia"/>
-          <w:b/>
-          <w:bCs/>
-          <w:sz w:val="24"/>
-          <w:szCs w:val="24"/>
-        </w:rPr>
-      </w:r>
-    </w:p>
-    <w:p>
-      <w:pPr>
-        <w:spacing w:before="0" w:after="0" w:line="480" w:lineRule="auto"/>
-        <w:jc w:val="both"/>
-        <w:ind w:left="0" w:firstLine="720"/>
-      </w:pPr>
-      <w:r>
-        <w:rPr>
-          <w:rFonts w:ascii="Georgia" w:hAnsi="Georgia" w:cs="Georgia" w:eastAsia="Georgia"/>
-          <w:sz w:val="22"/>
-          <w:szCs w:val="22"/>
-        </w:rPr>
-        <w:t xml:space="preserve">A field and laboratory monitoring was conducted at the Bureau of Fisheries and Aquatic Resources Regional Fish Health Laboratory 3 (BFAR RFHL3) and Zambales, Philippines to compare the effectiveness of Nested Polymerase Chain Reaction and Micro-Insulated Isothermal PCR (Pocket) in monitoring Acute Hepatopancreatic Necrosis Disease.</w:t>
-      </w:r>
-    </w:p>
-    <w:p>
-      <w:pPr>
-        <w:spacing w:before="0" w:after="0" w:line="480" w:lineRule="auto"/>
-        <w:jc w:val="both"/>
-        <w:ind w:left="0" w:firstLine="720"/>
-      </w:pPr>
-      <w:r>
-        <w:rPr>
-          <w:rFonts w:ascii="Georgia" w:hAnsi="Georgia" w:cs="Georgia" w:eastAsia="Georgia"/>
-          <w:sz w:val="22"/>
-          <w:szCs w:val="22"/>
-        </w:rPr>
-        <w:t xml:space="preserve">A total of 33 samples were used in this study to compare the results of Nested Polymerase Chain Reaction and Micro-Insulated Isothermal Polymerase Chain Reaction (POCKIT) in monitoring Acute Hepatopancreatic Necrosis Disease-causing Vibrio parahaemolyticus. The study used collected shrimp samples, pre-detected samples, and positive and negative standards for the detection of Acute Hepatopancreatic Necrosis Disease-causing Vibrio parahaemolyticus on shrimp samples, bacterial culture for vibrio sp. was also conducted as well as dna sequencing for the confirmation of the results. The result showed negative results on all the shrimp samples that led to the conclusion that all shrimp farms were free from Acute Hepatopancreatic Necrosis Disease-causing Vibrio parahaemolyticus.</w:t>
-      </w:r>
-    </w:p>
-    <w:p>
-      <w:pPr>
-        <w:spacing w:before="0" w:after="0" w:line="480" w:lineRule="auto"/>
-        <w:ind w:left="0" w:firstLine="0"/>
-      </w:pPr>
-    </w:p>
-    <w:p>
-      <w:pPr>
-        <w:spacing w:before="0" w:after="0" w:line="480" w:lineRule="auto"/>
-        <w:jc w:val="left"/>
-        <w:ind w:left="0" w:firstLine="0"/>
-        <w:keepNext/>
-      </w:pPr>
-      <w:r>
-        <w:rPr>
-          <w:rFonts w:ascii="Georgia" w:hAnsi="Georgia" w:cs="Georgia" w:eastAsia="Georgia"/>
-          <w:b/>
-          <w:bCs/>
-          <w:sz w:val="24"/>
-          <w:szCs w:val="24"/>
-        </w:rPr>
-        <w:t xml:space="preserve">Hedge Count: 0</w:t>
-      </w:r>
-      <w:r>
-        <w:rPr>
-          <w:rFonts w:ascii="Georgia" w:hAnsi="Georgia" w:cs="Georgia" w:eastAsia="Georgia"/>
-          <w:b/>
-          <w:bCs/>
-          <w:sz w:val="24"/>
-          <w:szCs w:val="24"/>
-        </w:rPr>
-      </w:r>
-    </w:p>
-    <w:p>
-      <w:pPr>
-        <w:spacing w:before="0" w:after="0" w:line="480" w:lineRule="auto"/>
-        <w:jc w:val="both"/>
-        <w:ind w:left="0" w:firstLine="720"/>
-      </w:pPr>
-      <w:r>
-        <w:rPr>
-          <w:rFonts w:ascii="Georgia" w:hAnsi="Georgia" w:cs="Georgia" w:eastAsia="Georgia"/>
-          <w:sz w:val="22"/>
-          <w:szCs w:val="22"/>
-        </w:rPr>
-        <w:t xml:space="preserve">Analysis: The abstract relies entirely on factive verbs (conducted, showed, led to the conclusion). The final claim is presented as categorical with no qualification.</w:t>
-      </w:r>
-    </w:p>
-    <w:p>
-      <w:pPr>
-        <w:spacing w:before="0" w:after="0" w:line="480" w:lineRule="auto"/>
-        <w:jc w:val="both"/>
-        <w:ind w:left="0" w:firstLine="720"/>
-      </w:pPr>
-      <w:r>
-        <w:rPr>
-          <w:rFonts w:ascii="Georgia" w:hAnsi="Georgia" w:cs="Georgia" w:eastAsia="Georgia"/>
-          <w:sz w:val="22"/>
-          <w:szCs w:val="22"/>
-        </w:rPr>
-        <w:t xml:space="preserve">Key Excerpt: </w:t>
-      </w:r>
-      <w:r>
-        <w:rPr>
-          <w:rFonts w:ascii="Georgia" w:hAnsi="Georgia" w:cs="Georgia" w:eastAsia="Georgia"/>
-          <w:sz w:val="22"/>
-          <w:szCs w:val="22"/>
-        </w:rPr>
-        <w:t xml:space="preserve">“The result showed negative results that led to the conclusion that all shrimp farms were free…”</w:t>
-      </w:r>
-    </w:p>
-    <w:p>
-      <w:pPr>
-        <w:spacing w:before="0" w:after="0" w:line="480" w:lineRule="auto"/>
-        <w:ind w:left="0" w:firstLine="0"/>
-      </w:pPr>
-    </w:p>
-    <w:p>
-      <w:pPr>
-        <w:spacing w:before="0" w:after="0" w:line="480" w:lineRule="auto"/>
-        <w:jc w:val="left"/>
-        <w:ind w:left="0" w:firstLine="0"/>
-        <w:keepNext/>
-      </w:pPr>
-      <w:r>
-        <w:rPr>
-          <w:rFonts w:ascii="Georgia" w:hAnsi="Georgia" w:cs="Georgia" w:eastAsia="Georgia"/>
-          <w:b/>
-          <w:bCs/>
-          <w:sz w:val="24"/>
-          <w:szCs w:val="24"/>
-        </w:rPr>
-        <w:t xml:space="preserve">Sample 2: Veterinary Medicine</w:t>
-      </w:r>
-      <w:r>
-        <w:rPr>
-          <w:rFonts w:ascii="Georgia" w:hAnsi="Georgia" w:cs="Georgia" w:eastAsia="Georgia"/>
-          <w:b/>
-          <w:bCs/>
-          <w:sz w:val="24"/>
-          <w:szCs w:val="24"/>
-        </w:rPr>
-      </w:r>
-    </w:p>
-    <w:p>
-      <w:pPr>
-        <w:spacing w:before="0" w:after="0" w:line="480" w:lineRule="auto"/>
-        <w:jc w:val="both"/>
-        <w:ind w:left="0" w:firstLine="720"/>
-      </w:pPr>
-      <w:r>
-        <w:rPr>
-          <w:rFonts w:ascii="Georgia" w:hAnsi="Georgia" w:cs="Georgia" w:eastAsia="Georgia"/>
-          <w:sz w:val="22"/>
-          <w:szCs w:val="22"/>
-        </w:rPr>
-        <w:t xml:space="preserve">The study was conducted to determine and compare the staining effect of C. longa, I. batatas and M. acuminata aqueous extracts for gonad examination of Nile tilapia. Twelve Nile tilapia fingerlings, with approximately two and one-half to four-inch size, were divided into four treatments with three replicates each. Treatment 1 was assigned as the positive control, which were stained with malachite green, while Treatments 2, 3 and 4 were stained with C. longa, I. batatas and M. acuminata extracts, respectively. The prepared slides of stained gonads were randomly distributed on the microscopes using completely randomized design (CRD). Blind examination and evaluation by five faculty members was done on the stained unlabeled tissues under the microscopes. The tissues were evaluated according to five parameters: hue, saturation, contrast, clarity and overall appearance. A scoring scheme was followed, i.e. 1 to 2 - very poor, 3 to 4 - poor, 5 to 6 - average, 7 to 8 - good, and 9 to 10 - excellent. Data gathered were subjected to one-way analysis of variance (ANOVA). The results suggested that C. longa, I. batatas and M. acuminata extracts are potential alternative stains for gonadal examination of Nile tilapia with M. acuminata as the most preferred.</w:t>
-      </w:r>
-    </w:p>
-    <w:p>
-      <w:pPr>
-        <w:spacing w:before="0" w:after="0" w:line="480" w:lineRule="auto"/>
-        <w:ind w:left="0" w:firstLine="0"/>
-      </w:pPr>
-    </w:p>
-    <w:p>
-      <w:pPr>
-        <w:spacing w:before="0" w:after="0" w:line="480" w:lineRule="auto"/>
-        <w:jc w:val="left"/>
-        <w:ind w:left="0" w:firstLine="0"/>
-        <w:keepNext/>
-      </w:pPr>
-      <w:r>
-        <w:rPr>
-          <w:rFonts w:ascii="Georgia" w:hAnsi="Georgia" w:cs="Georgia" w:eastAsia="Georgia"/>
-          <w:b/>
-          <w:bCs/>
-          <w:sz w:val="24"/>
-          <w:szCs w:val="24"/>
-        </w:rPr>
-        <w:t xml:space="preserve">Hedge Count: 2</w:t>
-      </w:r>
-      <w:r>
-        <w:rPr>
-          <w:rFonts w:ascii="Georgia" w:hAnsi="Georgia" w:cs="Georgia" w:eastAsia="Georgia"/>
-          <w:b/>
-          <w:bCs/>
-          <w:sz w:val="24"/>
-          <w:szCs w:val="24"/>
-        </w:rPr>
-      </w:r>
-    </w:p>
-    <w:p>
-      <w:pPr>
-        <w:spacing w:before="0" w:after="0" w:line="480" w:lineRule="auto"/>
-        <w:jc w:val="both"/>
-        <w:ind w:left="0" w:firstLine="720"/>
-      </w:pPr>
-      <w:r>
-        <w:rPr>
-          <w:rFonts w:ascii="Georgia" w:hAnsi="Georgia" w:cs="Georgia" w:eastAsia="Georgia"/>
-          <w:sz w:val="22"/>
-          <w:szCs w:val="22"/>
-        </w:rPr>
-        <w:t xml:space="preserve">Analysis: This abstract demonstrates awareness of claim management. Both hedges serve to qualify the final conclusion.</w:t>
-      </w:r>
-    </w:p>
-    <w:p>
-      <w:pPr>
-        <w:spacing w:before="0" w:after="0" w:line="480" w:lineRule="auto"/>
-        <w:jc w:val="both"/>
-        <w:ind w:left="0" w:firstLine="720"/>
-      </w:pPr>
-      <w:r>
-        <w:rPr>
-          <w:rFonts w:ascii="Georgia" w:hAnsi="Georgia" w:cs="Georgia" w:eastAsia="Georgia"/>
-          <w:sz w:val="22"/>
-          <w:szCs w:val="22"/>
-        </w:rPr>
-        <w:t xml:space="preserve">Coded Instances:</w:t>
-      </w:r>
-      <w:r>
-        <w:rPr>
-          <w:rFonts w:ascii="Georgia" w:hAnsi="Georgia" w:cs="Georgia" w:eastAsia="Georgia"/>
-          <w:sz w:val="22"/>
-          <w:szCs w:val="22"/>
-        </w:rPr>
-      </w:r>
-    </w:p>
-    <w:p>
-      <w:pPr>
-        <w:spacing w:before="0" w:after="0" w:line="480" w:lineRule="auto"/>
-        <w:jc w:val="both"/>
-        <w:ind w:left="0" w:firstLine="720"/>
-      </w:pPr>
-      <w:r>
-        <w:rPr>
-          <w:rFonts w:ascii="Georgia" w:hAnsi="Georgia" w:cs="Georgia" w:eastAsia="Georgia"/>
-          <w:sz w:val="22"/>
-          <w:szCs w:val="22"/>
-        </w:rPr>
-        <w:t xml:space="preserve">“The results suggested that..” (Lexical Verb - Epistemic Caution)</w:t>
-      </w:r>
-    </w:p>
-    <w:p>
-      <w:pPr>
-        <w:spacing w:before="0" w:after="0" w:line="480" w:lineRule="auto"/>
-        <w:jc w:val="both"/>
-        <w:ind w:left="0" w:firstLine="720"/>
-      </w:pPr>
-      <w:r>
-        <w:rPr>
-          <w:rFonts w:ascii="Georgia" w:hAnsi="Georgia" w:cs="Georgia" w:eastAsia="Georgia"/>
-          <w:sz w:val="22"/>
-          <w:szCs w:val="22"/>
-        </w:rPr>
-        <w:t xml:space="preserve">“..extracts are potential alternative stains..” (Lexical Adjective - Epistemic Caution)</w:t>
-      </w:r>
-    </w:p>
-    <w:p>
-      <w:pPr>
-        <w:spacing w:before="0" w:after="0" w:line="480" w:lineRule="auto"/>
-        <w:jc w:val="both"/>
-        <w:ind w:left="0" w:firstLine="720"/>
-      </w:pPr>
-      <w:r>
-        <w:rPr>
-          <w:rFonts w:ascii="Georgia" w:hAnsi="Georgia" w:cs="Georgia" w:eastAsia="Georgia"/>
-          <w:sz w:val="22"/>
-          <w:szCs w:val="22"/>
-        </w:rPr>
-        <w:t xml:space="preserve">Excluded: </w:t>
-      </w:r>
-      <w:r>
-        <w:rPr>
-          <w:rFonts w:ascii="Georgia" w:hAnsi="Georgia" w:cs="Georgia" w:eastAsia="Georgia"/>
-          <w:sz w:val="22"/>
-          <w:szCs w:val="22"/>
-        </w:rPr>
-        <w:t xml:space="preserve">“approximately two and one-half” (Procedural measurement, not epistemic).</w:t>
-      </w:r>
-    </w:p>
-    <w:p>
-      <w:pPr>
-        <w:spacing w:before="0" w:after="0" w:line="480" w:lineRule="auto"/>
-        <w:ind w:left="0" w:firstLine="0"/>
-      </w:pPr>
-    </w:p>
-    <w:p>
-      <w:pPr>
-        <w:spacing w:before="0" w:after="0" w:line="480" w:lineRule="auto"/>
-        <w:jc w:val="left"/>
-        <w:ind w:left="0" w:firstLine="0"/>
-        <w:keepNext/>
-      </w:pPr>
-      <w:r>
-        <w:rPr>
-          <w:rFonts w:ascii="Georgia" w:hAnsi="Georgia" w:cs="Georgia" w:eastAsia="Georgia"/>
-          <w:b/>
-          <w:bCs/>
-          <w:sz w:val="24"/>
-          <w:szCs w:val="24"/>
-        </w:rPr>
-        <w:t xml:space="preserve">Sample 3: Agriculture (Animal Science)</w:t>
-      </w:r>
-      <w:r>
-        <w:rPr>
-          <w:rFonts w:ascii="Georgia" w:hAnsi="Georgia" w:cs="Georgia" w:eastAsia="Georgia"/>
-          <w:b/>
-          <w:bCs/>
-          <w:sz w:val="24"/>
-          <w:szCs w:val="24"/>
-        </w:rPr>
-      </w:r>
-    </w:p>
-    <w:p>
-      <w:pPr>
-        <w:spacing w:before="0" w:after="0" w:line="480" w:lineRule="auto"/>
-        <w:jc w:val="both"/>
-        <w:ind w:left="0" w:firstLine="720"/>
-      </w:pPr>
-      <w:r>
-        <w:rPr>
-          <w:rFonts w:ascii="Georgia" w:hAnsi="Georgia" w:cs="Georgia" w:eastAsia="Georgia"/>
-          <w:sz w:val="22"/>
-          <w:szCs w:val="22"/>
-        </w:rPr>
-        <w:t xml:space="preserve">The study was conducted for 7 days from July 07 to July 13, 2022 at [REDACTED]. The general objective of the study was to determine the acceptability and palatability of duck ham subjected to different curing process. Specifically, it aimed to find the sensory evaluation: appearance, aroma, taste/ flavor, texture, and over-all acceptability. A total of eight (8) Muscovy ducks were used in this study. The study used Hedonic Likert Scale and was subjected to Desriptive analysis. Factor A = Type of curing and Factor B = Spice rub. The treatments used in this study are the following. A₁ B₁ - Dry curing + Oregano, A₁ B₂ - Dry curing + Lemon grass, A₂ B₁ - Liquid curing + Oregano and A₁ B₂ - Liquid curing + Lemon grass. The sensory evaluation was conducted at Pampanga State Agricultural University, PAC, Magalang, Pampanga. Ten (10) college students, ten (10) teachers and ten (10) people who don’t eat duck were selected as respondents to evaluate the sample treatments. The data collected from the sensory evaluation were analysed using descriptive statistics.</w:t>
-      </w:r>
-    </w:p>
-    <w:p>
-      <w:pPr>
-        <w:spacing w:before="0" w:after="0" w:line="480" w:lineRule="auto"/>
-        <w:jc w:val="both"/>
-        <w:ind w:left="0" w:firstLine="720"/>
-      </w:pPr>
-      <w:r>
-        <w:rPr>
-          <w:rFonts w:ascii="Georgia" w:hAnsi="Georgia" w:cs="Georgia" w:eastAsia="Georgia"/>
-          <w:sz w:val="22"/>
-          <w:szCs w:val="22"/>
-        </w:rPr>
-        <w:t xml:space="preserve">Results of the study showed that Comparison on Curing Methods Using Oregano - dry cured duck ham had the highest rating with regards to appearance, texture and overall acceptability. While liquid cure duck ham got the highest rating in terms of aroma and taste/flavor. Comparison on Curing Methods Using Lemon Grass - liquid cured duck ham had the highest rating in terms of appearance, aroma, taste/flavor, texture and overall acceptability. Comparison of Spices on Dry Curing (Smoking) - dry cure duck ham smoked in lemon grass had the highest rating in terms of appearance, aroma, taste/flavor, texture and overall acceptability. Comparison of Spices on Liquid Smoke - liquid cured duck ham smoked in lemon grass had the highest rating in relation to appearance, aroma, taste/flavor, texture and overall acceptability. Descriptive rating revealed that all the treatment with regards to appearance, aroma, taste/flavor, texture and overall acceptability were rated moderately like.</w:t>
-      </w:r>
-    </w:p>
-    <w:p>
-      <w:pPr>
-        <w:spacing w:before="0" w:after="0" w:line="480" w:lineRule="auto"/>
-        <w:ind w:left="0" w:firstLine="0"/>
-      </w:pPr>
-    </w:p>
-    <w:p>
-      <w:pPr>
-        <w:spacing w:before="0" w:after="0" w:line="480" w:lineRule="auto"/>
-        <w:jc w:val="left"/>
-        <w:ind w:left="0" w:firstLine="0"/>
-        <w:keepNext/>
-      </w:pPr>
-      <w:r>
-        <w:rPr>
-          <w:rFonts w:ascii="Georgia" w:hAnsi="Georgia" w:cs="Georgia" w:eastAsia="Georgia"/>
-          <w:b/>
-          <w:bCs/>
-          <w:sz w:val="24"/>
-          <w:szCs w:val="24"/>
-        </w:rPr>
-        <w:t xml:space="preserve">Hedge Count: 0</w:t>
-      </w:r>
-      <w:r>
-        <w:rPr>
-          <w:rFonts w:ascii="Georgia" w:hAnsi="Georgia" w:cs="Georgia" w:eastAsia="Georgia"/>
-          <w:b/>
-          <w:bCs/>
-          <w:sz w:val="24"/>
-          <w:szCs w:val="24"/>
-        </w:rPr>
-      </w:r>
-    </w:p>
-    <w:p>
-      <w:pPr>
-        <w:spacing w:before="0" w:after="0" w:line="480" w:lineRule="auto"/>
-        <w:jc w:val="both"/>
-        <w:ind w:left="0" w:firstLine="720"/>
-      </w:pPr>
-      <w:r>
-        <w:rPr>
-          <w:rFonts w:ascii="Georgia" w:hAnsi="Georgia" w:cs="Georgia" w:eastAsia="Georgia"/>
-          <w:sz w:val="22"/>
-          <w:szCs w:val="22"/>
-        </w:rPr>
-        <w:t xml:space="preserve">Analysis: The abstract uses factive reporting verbs (showed, revealed). Sensory evaluation ratings are reported as absolute data points. The term “moderately like” describes a Likert scale variable, not an epistemic qualification.</w:t>
-      </w:r>
-    </w:p>
-    <w:p>
-      <w:pPr>
-        <w:spacing w:before="0" w:after="0" w:line="480" w:lineRule="auto"/>
-        <w:jc w:val="both"/>
-        <w:ind w:left="0" w:firstLine="720"/>
-      </w:pPr>
-      <w:r>
-        <w:rPr>
-          <w:rFonts w:ascii="Georgia" w:hAnsi="Georgia" w:cs="Georgia" w:eastAsia="Georgia"/>
-          <w:sz w:val="22"/>
-          <w:szCs w:val="22"/>
-        </w:rPr>
-        <w:t xml:space="preserve">Key Excerpt: </w:t>
-      </w:r>
-      <w:r>
-        <w:rPr>
-          <w:rFonts w:ascii="Georgia" w:hAnsi="Georgia" w:cs="Georgia" w:eastAsia="Georgia"/>
-          <w:sz w:val="22"/>
-          <w:szCs w:val="22"/>
-        </w:rPr>
-        <w:t xml:space="preserve">“Results of the study showed that Comparison on Curing Methods…”</w:t>
-      </w:r>
-    </w:p>
-    <w:p>
-      <w:pPr>
-        <w:spacing w:before="0" w:after="0" w:line="480" w:lineRule="auto"/>
-        <w:ind w:left="0" w:firstLine="0"/>
-      </w:pPr>
-    </w:p>
-    <w:p>
-      <w:pPr>
-        <w:spacing w:before="0" w:after="0" w:line="480" w:lineRule="auto"/>
-        <w:jc w:val="left"/>
-        <w:ind w:left="0" w:firstLine="0"/>
-        <w:keepNext/>
-      </w:pPr>
-      <w:r>
-        <w:rPr>
-          <w:rFonts w:ascii="Georgia" w:hAnsi="Georgia" w:cs="Georgia" w:eastAsia="Georgia"/>
-          <w:b/>
-          <w:bCs/>
-          <w:sz w:val="24"/>
-          <w:szCs w:val="24"/>
-        </w:rPr>
-        <w:t xml:space="preserve">Sample 4: Agriculture (Crop Science)</w:t>
-      </w:r>
-      <w:r>
-        <w:rPr>
-          <w:rFonts w:ascii="Georgia" w:hAnsi="Georgia" w:cs="Georgia" w:eastAsia="Georgia"/>
-          <w:b/>
-          <w:bCs/>
-          <w:sz w:val="24"/>
-          <w:szCs w:val="24"/>
-        </w:rPr>
-      </w:r>
-    </w:p>
-    <w:p>
-      <w:pPr>
-        <w:spacing w:before="0" w:after="0" w:line="480" w:lineRule="auto"/>
-        <w:jc w:val="both"/>
-        <w:ind w:left="0" w:firstLine="720"/>
-      </w:pPr>
-      <w:r>
-        <w:rPr>
-          <w:rFonts w:ascii="Georgia" w:hAnsi="Georgia" w:cs="Georgia" w:eastAsia="Georgia"/>
-          <w:sz w:val="22"/>
-          <w:szCs w:val="22"/>
-        </w:rPr>
-        <w:t xml:space="preserve">The study was conducted from June to July 2022 to determine the influence of the different sources of nutrients to rice straw mushrooms. The field experiment was conducted in [REDACTED]. The experiment was laid out using Complete Randomize Design (CRD), with four treatments replicated four times. The treatments were as follows: T₀- Untreated banana leaves substrate submerged in 55 gallon of water (Control). T₁- Banana leaves substrate submerged in mixture of 100 grams of Urea and 55 gallons of water. T₂- Banana leaves substrate submerged in mixture of 250 ml of fish amino acid and 55 gallons of water, and, T₃- Banana leaves substrate submerged in mixture of 250 ml of fermented plant juice and 55 gallons of water.</w:t>
-      </w:r>
-    </w:p>
-    <w:p>
-      <w:pPr>
-        <w:spacing w:before="0" w:after="0" w:line="480" w:lineRule="auto"/>
-        <w:jc w:val="both"/>
-        <w:ind w:left="0" w:firstLine="720"/>
-      </w:pPr>
-      <w:r>
-        <w:rPr>
-          <w:rFonts w:ascii="Georgia" w:hAnsi="Georgia" w:cs="Georgia" w:eastAsia="Georgia"/>
-          <w:sz w:val="22"/>
-          <w:szCs w:val="22"/>
-        </w:rPr>
-        <w:t xml:space="preserve">Results of the study revealed significant differences in the following parameters: average weight of button harvested, number of buttons harvested, average yield per harvest, and biological efficiency of rice straw mushroom. However, insignificant differences were observed on the days of pinhead appearance and days of harvesting. The highest ROI was obtained in T₁- Banana leaves substrate submerged in a mixture of 100 grams of Urea and 55 gallons of water with every peso of investment 1.01 pesos of net income return.</w:t>
-      </w:r>
-    </w:p>
-    <w:p>
-      <w:pPr>
-        <w:spacing w:before="0" w:after="0" w:line="480" w:lineRule="auto"/>
-        <w:ind w:left="0" w:firstLine="0"/>
-      </w:pPr>
-    </w:p>
-    <w:p>
-      <w:pPr>
-        <w:spacing w:before="0" w:after="0" w:line="480" w:lineRule="auto"/>
-        <w:jc w:val="left"/>
-        <w:ind w:left="0" w:firstLine="0"/>
-        <w:keepNext/>
-      </w:pPr>
-      <w:r>
-        <w:rPr>
-          <w:rFonts w:ascii="Georgia" w:hAnsi="Georgia" w:cs="Georgia" w:eastAsia="Georgia"/>
-          <w:b/>
-          <w:bCs/>
-          <w:sz w:val="24"/>
-          <w:szCs w:val="24"/>
-        </w:rPr>
-        <w:t xml:space="preserve">Hedge Count: 0</w:t>
-      </w:r>
-      <w:r>
-        <w:rPr>
-          <w:rFonts w:ascii="Georgia" w:hAnsi="Georgia" w:cs="Georgia" w:eastAsia="Georgia"/>
-          <w:b/>
-          <w:bCs/>
-          <w:sz w:val="24"/>
-          <w:szCs w:val="24"/>
-        </w:rPr>
-      </w:r>
-    </w:p>
-    <w:p>
-      <w:pPr>
-        <w:spacing w:before="0" w:after="0" w:line="480" w:lineRule="auto"/>
-        <w:jc w:val="both"/>
-        <w:ind w:left="0" w:firstLine="720"/>
-      </w:pPr>
-      <w:r>
-        <w:rPr>
-          <w:rFonts w:ascii="Georgia" w:hAnsi="Georgia" w:cs="Georgia" w:eastAsia="Georgia"/>
-          <w:sz w:val="22"/>
-          <w:szCs w:val="22"/>
-        </w:rPr>
-        <w:t xml:space="preserve">Analysis: Statistical significance is reported as fact (revealed significant differences). No devices are used to qualify the biological efficiency or yield claims.</w:t>
-      </w:r>
-    </w:p>
-    <w:p>
-      <w:pPr>
-        <w:spacing w:before="0" w:after="0" w:line="480" w:lineRule="auto"/>
-        <w:jc w:val="both"/>
-        <w:ind w:left="0" w:firstLine="720"/>
-      </w:pPr>
-      <w:r>
-        <w:rPr>
-          <w:rFonts w:ascii="Georgia" w:hAnsi="Georgia" w:cs="Georgia" w:eastAsia="Georgia"/>
-          <w:sz w:val="22"/>
-          <w:szCs w:val="22"/>
-        </w:rPr>
-        <w:t xml:space="preserve">Key Excerpt: “Results of the study revealed significant differences.. The highest ROI was obtained…”</w:t>
-      </w:r>
-    </w:p>
-    <w:p>
-      <w:pPr>
-        <w:spacing w:before="0" w:after="0" w:line="480" w:lineRule="auto"/>
-        <w:jc w:val="both"/>
-        <w:ind w:left="0" w:firstLine="720"/>
-      </w:pPr>
-      <w:r>
-        <w:rPr>
-          <w:rFonts w:ascii="Georgia" w:hAnsi="Georgia" w:cs="Georgia" w:eastAsia="Georgia"/>
-          <w:sz w:val="22"/>
-          <w:szCs w:val="22"/>
-        </w:rPr>
-        <w:t xml:space="preserve">General Observation From The Pilot</w:t>
-      </w:r>
-      <w:r>
-        <w:rPr>
-          <w:rFonts w:ascii="Georgia" w:hAnsi="Georgia" w:cs="Georgia" w:eastAsia="Georgia"/>
-          <w:sz w:val="22"/>
-          <w:szCs w:val="22"/>
-        </w:rPr>
-      </w:r>
-    </w:p>
-    <w:p>
-      <w:pPr>
         <w:sectPr>
-          <w:headerReference r:id="rId55" w:type="default"/>
-          <w:headerReference r:id="rId56" w:type="first"/>
-          <w:footerReference r:id="rId57" w:type="default"/>
-          <w:footerReference r:id="rId58" w:type="first"/>
           <w:type w:val="nextPage"/>
           <w:pgSz w:h="16838" w:w="11906" w:orient="portrait"/>
           <w:pgMar w:bottom="1440" w:top="1440" w:left="2160" w:right="1440" w:header="720" w:footer="720"/>
           <w:titlePg w:val="1"/>
         </w:sectPr>
+      </w:pPr>
+      <w:r>
+        <w:rPr>
+          <w:rFonts w:ascii="Georgia" w:hAnsi="Georgia" w:cs="Georgia" w:eastAsia="Georgia"/>
+          <w:sz w:val="22"/>
+          <w:szCs w:val="22"/>
+        </w:rPr>
+        <w:t xml:space="preserve">• FP tab. </w:t>
+      </w:r>
+      <w:r>
+        <w:rPr>
+          <w:rFonts w:ascii="Georgia" w:hAnsi="Georgia" w:cs="Georgia" w:eastAsia="Georgia"/>
+          <w:sz w:val="22"/>
+          <w:szCs w:val="22"/>
+        </w:rPr>
+        <w:t xml:space="preserve">Optional Rejected Candidates tab for FP traceability.</w:t>
+      </w:r>
+      <w:r>
+        <w:rPr>
+          <w:rFonts w:ascii="Georgia" w:hAnsi="Georgia" w:cs="Georgia" w:eastAsia="Georgia"/>
+          <w:sz w:val="22"/>
+          <w:szCs w:val="22"/>
+        </w:rPr>
+      </w:r>
+      <w:r>
+        <w:rPr>
+          <w:rFonts w:ascii="Georgia" w:hAnsi="Georgia" w:cs="Georgia" w:eastAsia="Georgia"/>
+          <w:sz w:val="22"/>
+          <w:szCs w:val="22"/>
+        </w:rPr>
+      </w:r>
+    </w:p>
+    <w:p>
+      <w:pPr>
+        <w:spacing w:before="0" w:after="0" w:line="480" w:lineRule="auto"/>
+        <w:jc w:val="center"/>
+        <w:ind w:left="0" w:firstLine="0"/>
+      </w:pPr>
+      <w:r>
+        <w:rPr>
+          <w:rFonts w:ascii="Georgia" w:hAnsi="Georgia" w:cs="Georgia" w:eastAsia="Georgia"/>
+          <w:b/>
+          <w:bCs/>
+          <w:sz w:val="28"/>
+          <w:szCs w:val="28"/>
+        </w:rPr>
+        <w:t xml:space="preserve">APPENDIX B: PILOT SAMPLE ANALYSIS AND CODING VERIFICATION</w:t>
+      </w:r>
+      <w:r>
+        <w:rPr>
+          <w:rFonts w:ascii="Georgia" w:hAnsi="Georgia" w:cs="Georgia" w:eastAsia="Georgia"/>
+          <w:b/>
+          <w:bCs/>
+          <w:sz w:val="28"/>
+          <w:szCs w:val="28"/>
+        </w:rPr>
+      </w:r>
+    </w:p>
+    <w:p>
+      <w:pPr>
+        <w:spacing w:before="0" w:after="0" w:line="480" w:lineRule="auto"/>
+      </w:pPr>
+      <w:r>
+        <w:rPr>
+          <w:rtl w:val="0"/>
+        </w:rPr>
+      </w:r>
+    </w:p>
+    <w:p>
+      <w:pPr>
         <w:spacing w:before="0" w:after="0" w:line="480" w:lineRule="auto"/>
         <w:jc w:val="both"/>
         <w:ind w:left="0" w:firstLine="720"/>
@@ -31517,36 +30821,628 @@
           <w:sz w:val="22"/>
           <w:szCs w:val="22"/>
         </w:rPr>
-        <w:t xml:space="preserve">Three of the four pilot abstracts contained no coded hedges. The pattern pointed to a high base rate of zero-hedge writing in the local undergraduate abstract genre and confirmed that a descriptive baseline study was warranted. The same decision rules and Working Test were carried forward into the main coding of the 60-abstract corpus.</w:t>
-      </w:r>
-      <w:r>
-        <w:rPr>
-          <w:rFonts w:ascii="Georgia" w:hAnsi="Georgia" w:cs="Georgia" w:eastAsia="Georgia"/>
-          <w:sz w:val="22"/>
-          <w:szCs w:val="22"/>
-        </w:rPr>
-        <w:br w:type="page"/>
-      </w:r>
-      <w:r>
-        <w:rPr>
-          <w:rFonts w:ascii="Georgia" w:hAnsi="Georgia" w:cs="Georgia" w:eastAsia="Georgia"/>
-          <w:sz w:val="22"/>
-          <w:szCs w:val="22"/>
-        </w:rPr>
-      </w:r>
-    </w:p>
-    <w:p>
-      <w:pPr>
+        <w:t xml:space="preserve">Four abstracts drawn from the pre-2023 pool were coded before the main corpus. The goal was to test the scheme, settle borderline cases, and see whether zero-hedge abstracts were common enough to shape the study design. Each abstract is given below with its coding summary.</w:t>
+      </w:r>
+    </w:p>
+    <w:p>
+      <w:pPr>
+        <w:spacing w:before="0" w:after="0" w:line="480" w:lineRule="auto"/>
+        <w:ind w:left="0" w:firstLine="0"/>
+      </w:pPr>
+    </w:p>
+    <w:p>
+      <w:pPr>
+        <w:spacing w:before="0" w:after="0" w:line="480" w:lineRule="auto"/>
+        <w:jc w:val="left"/>
+        <w:ind w:left="0" w:firstLine="0"/>
+        <w:keepNext/>
+      </w:pPr>
+      <w:r>
+        <w:rPr>
+          <w:rFonts w:ascii="Georgia" w:hAnsi="Georgia" w:cs="Georgia" w:eastAsia="Georgia"/>
+          <w:b/>
+          <w:bCs/>
+          <w:sz w:val="24"/>
+          <w:szCs w:val="24"/>
+        </w:rPr>
+        <w:t xml:space="preserve">Sample 1: Biology</w:t>
+      </w:r>
+      <w:r>
+        <w:rPr>
+          <w:rFonts w:ascii="Georgia" w:hAnsi="Georgia" w:cs="Georgia" w:eastAsia="Georgia"/>
+          <w:b/>
+          <w:bCs/>
+          <w:sz w:val="24"/>
+          <w:szCs w:val="24"/>
+        </w:rPr>
+      </w:r>
+    </w:p>
+    <w:p>
+      <w:pPr>
+        <w:spacing w:before="0" w:after="0" w:line="480" w:lineRule="auto"/>
+        <w:jc w:val="both"/>
+        <w:ind w:left="0" w:firstLine="720"/>
+      </w:pPr>
+      <w:r>
+        <w:rPr>
+          <w:rFonts w:ascii="Georgia" w:hAnsi="Georgia" w:cs="Georgia" w:eastAsia="Georgia"/>
+          <w:sz w:val="22"/>
+          <w:szCs w:val="22"/>
+        </w:rPr>
+        <w:t xml:space="preserve">A field and laboratory monitoring was conducted at the Bureau of Fisheries and Aquatic Resources Regional Fish Health Laboratory 3 (BFAR RFHL3) and Zambales, Philippines to compare the effectiveness of Nested Polymerase Chain Reaction and Micro-Insulated Isothermal PCR (Pocket) in monitoring Acute Hepatopancreatic Necrosis Disease.</w:t>
+      </w:r>
+    </w:p>
+    <w:p>
+      <w:pPr>
+        <w:spacing w:before="0" w:after="0" w:line="480" w:lineRule="auto"/>
+        <w:jc w:val="both"/>
+        <w:ind w:left="0" w:firstLine="720"/>
+      </w:pPr>
+      <w:r>
+        <w:rPr>
+          <w:rFonts w:ascii="Georgia" w:hAnsi="Georgia" w:cs="Georgia" w:eastAsia="Georgia"/>
+          <w:sz w:val="22"/>
+          <w:szCs w:val="22"/>
+        </w:rPr>
+        <w:t xml:space="preserve">A total of 33 samples were used in this study to compare the results of Nested Polymerase Chain Reaction and Micro-Insulated Isothermal Polymerase Chain Reaction (POCKIT) in monitoring Acute Hepatopancreatic Necrosis Disease-causing Vibrio parahaemolyticus. The study used collected shrimp samples, pre-detected samples, and positive and negative standards for the detection of Acute Hepatopancreatic Necrosis Disease-causing Vibrio parahaemolyticus on shrimp samples, bacterial culture for vibrio sp. was also conducted as well as dna sequencing for the confirmation of the results. The result showed negative results on all the shrimp samples that led to the conclusion that all shrimp farms were free from Acute Hepatopancreatic Necrosis Disease-causing Vibrio parahaemolyticus.</w:t>
+      </w:r>
+    </w:p>
+    <w:p>
+      <w:pPr>
+        <w:spacing w:before="0" w:after="0" w:line="480" w:lineRule="auto"/>
+        <w:ind w:left="0" w:firstLine="0"/>
+      </w:pPr>
+    </w:p>
+    <w:p>
+      <w:pPr>
+        <w:spacing w:before="0" w:after="0" w:line="480" w:lineRule="auto"/>
+        <w:jc w:val="left"/>
+        <w:ind w:left="0" w:firstLine="0"/>
+        <w:keepNext/>
+      </w:pPr>
+      <w:r>
+        <w:rPr>
+          <w:rFonts w:ascii="Georgia" w:hAnsi="Georgia" w:cs="Georgia" w:eastAsia="Georgia"/>
+          <w:b/>
+          <w:bCs/>
+          <w:sz w:val="24"/>
+          <w:szCs w:val="24"/>
+        </w:rPr>
+        <w:t xml:space="preserve">Hedge Count: 0</w:t>
+      </w:r>
+      <w:r>
+        <w:rPr>
+          <w:rFonts w:ascii="Georgia" w:hAnsi="Georgia" w:cs="Georgia" w:eastAsia="Georgia"/>
+          <w:b/>
+          <w:bCs/>
+          <w:sz w:val="24"/>
+          <w:szCs w:val="24"/>
+        </w:rPr>
+      </w:r>
+    </w:p>
+    <w:p>
+      <w:pPr>
+        <w:spacing w:before="0" w:after="0" w:line="480" w:lineRule="auto"/>
+        <w:jc w:val="both"/>
+        <w:ind w:left="0" w:firstLine="720"/>
+      </w:pPr>
+      <w:r>
+        <w:rPr>
+          <w:rFonts w:ascii="Georgia" w:hAnsi="Georgia" w:cs="Georgia" w:eastAsia="Georgia"/>
+          <w:sz w:val="22"/>
+          <w:szCs w:val="22"/>
+        </w:rPr>
+        <w:t xml:space="preserve">Analysis: The abstract relies entirely on factive verbs (conducted, showed, led to the conclusion). The final claim is presented as categorical with no qualification.</w:t>
+      </w:r>
+    </w:p>
+    <w:p>
+      <w:pPr>
+        <w:spacing w:before="0" w:after="0" w:line="480" w:lineRule="auto"/>
+        <w:jc w:val="both"/>
+        <w:ind w:left="0" w:firstLine="720"/>
+      </w:pPr>
+      <w:r>
+        <w:rPr>
+          <w:rFonts w:ascii="Georgia" w:hAnsi="Georgia" w:cs="Georgia" w:eastAsia="Georgia"/>
+          <w:sz w:val="22"/>
+          <w:szCs w:val="22"/>
+        </w:rPr>
+        <w:t xml:space="preserve">Key Excerpt: </w:t>
+      </w:r>
+      <w:r>
+        <w:rPr>
+          <w:rFonts w:ascii="Georgia" w:hAnsi="Georgia" w:cs="Georgia" w:eastAsia="Georgia"/>
+          <w:sz w:val="22"/>
+          <w:szCs w:val="22"/>
+        </w:rPr>
+        <w:t xml:space="preserve">“The result showed negative results that led to the conclusion that all shrimp farms were free…”</w:t>
+      </w:r>
+    </w:p>
+    <w:p>
+      <w:pPr>
+        <w:spacing w:before="0" w:after="0" w:line="480" w:lineRule="auto"/>
+        <w:ind w:left="0" w:firstLine="0"/>
+      </w:pPr>
+    </w:p>
+    <w:p>
+      <w:pPr>
+        <w:spacing w:before="0" w:after="0" w:line="480" w:lineRule="auto"/>
+        <w:jc w:val="left"/>
+        <w:ind w:left="0" w:firstLine="0"/>
+        <w:keepNext/>
+      </w:pPr>
+      <w:r>
+        <w:rPr>
+          <w:rFonts w:ascii="Georgia" w:hAnsi="Georgia" w:cs="Georgia" w:eastAsia="Georgia"/>
+          <w:b/>
+          <w:bCs/>
+          <w:sz w:val="24"/>
+          <w:szCs w:val="24"/>
+        </w:rPr>
+        <w:t xml:space="preserve">Sample 2: Veterinary Medicine</w:t>
+      </w:r>
+      <w:r>
+        <w:rPr>
+          <w:rFonts w:ascii="Georgia" w:hAnsi="Georgia" w:cs="Georgia" w:eastAsia="Georgia"/>
+          <w:b/>
+          <w:bCs/>
+          <w:sz w:val="24"/>
+          <w:szCs w:val="24"/>
+        </w:rPr>
+      </w:r>
+    </w:p>
+    <w:p>
+      <w:pPr>
+        <w:spacing w:before="0" w:after="0" w:line="480" w:lineRule="auto"/>
+        <w:jc w:val="both"/>
+        <w:ind w:left="0" w:firstLine="720"/>
+      </w:pPr>
+      <w:r>
+        <w:rPr>
+          <w:rFonts w:ascii="Georgia" w:hAnsi="Georgia" w:cs="Georgia" w:eastAsia="Georgia"/>
+          <w:sz w:val="22"/>
+          <w:szCs w:val="22"/>
+        </w:rPr>
+        <w:t xml:space="preserve">The study was conducted to determine and compare the staining effect of C. longa, I. batatas and M. acuminata aqueous extracts for gonad examination of Nile tilapia. Twelve Nile tilapia fingerlings, with approximately two and one-half to four-inch size, were divided into four treatments with three replicates each. Treatment 1 was assigned as the positive control, which were stained with malachite green, while Treatments 2, 3 and 4 were stained with C. longa, I. batatas and M. acuminata extracts, respectively. The prepared slides of stained gonads were randomly distributed on the microscopes using completely randomized design (CRD). Blind examination and evaluation by five faculty members was done on the stained unlabeled tissues under the microscopes. The tissues were evaluated according to five parameters: hue, saturation, contrast, clarity and overall appearance. A scoring scheme was followed, i.e. 1 to 2 - very poor, 3 to 4 - poor, 5 to 6 - average, 7 to 8 - good, and 9 to 10 - excellent. Data gathered were subjected to one-way analysis of variance (ANOVA). The results suggested that C. longa, I. batatas and M. acuminata extracts are potential alternative stains for gonadal examination of Nile tilapia with M. acuminata as the most preferred.</w:t>
+      </w:r>
+    </w:p>
+    <w:p>
+      <w:pPr>
+        <w:spacing w:before="0" w:after="0" w:line="480" w:lineRule="auto"/>
+        <w:ind w:left="0" w:firstLine="0"/>
+      </w:pPr>
+    </w:p>
+    <w:p>
+      <w:pPr>
+        <w:spacing w:before="0" w:after="0" w:line="480" w:lineRule="auto"/>
+        <w:jc w:val="left"/>
+        <w:ind w:left="0" w:firstLine="0"/>
+        <w:keepNext/>
+      </w:pPr>
+      <w:r>
+        <w:rPr>
+          <w:rFonts w:ascii="Georgia" w:hAnsi="Georgia" w:cs="Georgia" w:eastAsia="Georgia"/>
+          <w:b/>
+          <w:bCs/>
+          <w:sz w:val="24"/>
+          <w:szCs w:val="24"/>
+        </w:rPr>
+        <w:t xml:space="preserve">Hedge Count: 2</w:t>
+      </w:r>
+      <w:r>
+        <w:rPr>
+          <w:rFonts w:ascii="Georgia" w:hAnsi="Georgia" w:cs="Georgia" w:eastAsia="Georgia"/>
+          <w:b/>
+          <w:bCs/>
+          <w:sz w:val="24"/>
+          <w:szCs w:val="24"/>
+        </w:rPr>
+      </w:r>
+    </w:p>
+    <w:p>
+      <w:pPr>
+        <w:spacing w:before="0" w:after="0" w:line="480" w:lineRule="auto"/>
+        <w:jc w:val="both"/>
+        <w:ind w:left="0" w:firstLine="720"/>
+      </w:pPr>
+      <w:r>
+        <w:rPr>
+          <w:rFonts w:ascii="Georgia" w:hAnsi="Georgia" w:cs="Georgia" w:eastAsia="Georgia"/>
+          <w:sz w:val="22"/>
+          <w:szCs w:val="22"/>
+        </w:rPr>
+        <w:t xml:space="preserve">Analysis: This abstract demonstrates awareness of claim management. Both hedges serve to qualify the final conclusion.</w:t>
+      </w:r>
+    </w:p>
+    <w:p>
+      <w:pPr>
+        <w:spacing w:before="0" w:after="0" w:line="480" w:lineRule="auto"/>
+        <w:jc w:val="both"/>
+        <w:ind w:left="0" w:firstLine="720"/>
+      </w:pPr>
+      <w:r>
+        <w:rPr>
+          <w:rFonts w:ascii="Georgia" w:hAnsi="Georgia" w:cs="Georgia" w:eastAsia="Georgia"/>
+          <w:sz w:val="22"/>
+          <w:szCs w:val="22"/>
+        </w:rPr>
+        <w:t xml:space="preserve">Coded Instances:</w:t>
+      </w:r>
+      <w:r>
+        <w:rPr>
+          <w:rFonts w:ascii="Georgia" w:hAnsi="Georgia" w:cs="Georgia" w:eastAsia="Georgia"/>
+          <w:sz w:val="22"/>
+          <w:szCs w:val="22"/>
+        </w:rPr>
+      </w:r>
+    </w:p>
+    <w:p>
+      <w:pPr>
+        <w:spacing w:before="0" w:after="0" w:line="480" w:lineRule="auto"/>
+        <w:jc w:val="both"/>
+        <w:ind w:left="0" w:firstLine="720"/>
+      </w:pPr>
+      <w:r>
+        <w:rPr>
+          <w:rFonts w:ascii="Georgia" w:hAnsi="Georgia" w:cs="Georgia" w:eastAsia="Georgia"/>
+          <w:sz w:val="22"/>
+          <w:szCs w:val="22"/>
+        </w:rPr>
+        <w:t xml:space="preserve">“The results suggested that..” (Lexical Verb - Epistemic Caution)</w:t>
+      </w:r>
+    </w:p>
+    <w:p>
+      <w:pPr>
+        <w:spacing w:before="0" w:after="0" w:line="480" w:lineRule="auto"/>
+        <w:jc w:val="both"/>
+        <w:ind w:left="0" w:firstLine="720"/>
+      </w:pPr>
+      <w:r>
+        <w:rPr>
+          <w:rFonts w:ascii="Georgia" w:hAnsi="Georgia" w:cs="Georgia" w:eastAsia="Georgia"/>
+          <w:sz w:val="22"/>
+          <w:szCs w:val="22"/>
+        </w:rPr>
+        <w:t xml:space="preserve">“..extracts are potential alternative stains..” (Lexical Adjective - Epistemic Caution)</w:t>
+      </w:r>
+    </w:p>
+    <w:p>
+      <w:pPr>
+        <w:spacing w:before="0" w:after="0" w:line="480" w:lineRule="auto"/>
+        <w:jc w:val="both"/>
+        <w:ind w:left="0" w:firstLine="720"/>
+      </w:pPr>
+      <w:r>
+        <w:rPr>
+          <w:rFonts w:ascii="Georgia" w:hAnsi="Georgia" w:cs="Georgia" w:eastAsia="Georgia"/>
+          <w:sz w:val="22"/>
+          <w:szCs w:val="22"/>
+        </w:rPr>
+        <w:t xml:space="preserve">Excluded: </w:t>
+      </w:r>
+      <w:r>
+        <w:rPr>
+          <w:rFonts w:ascii="Georgia" w:hAnsi="Georgia" w:cs="Georgia" w:eastAsia="Georgia"/>
+          <w:sz w:val="22"/>
+          <w:szCs w:val="22"/>
+        </w:rPr>
+        <w:t xml:space="preserve">“approximately two and one-half” (Procedural measurement, not epistemic).</w:t>
+      </w:r>
+    </w:p>
+    <w:p>
+      <w:pPr>
+        <w:spacing w:before="0" w:after="0" w:line="480" w:lineRule="auto"/>
+        <w:ind w:left="0" w:firstLine="0"/>
+      </w:pPr>
+    </w:p>
+    <w:p>
+      <w:pPr>
+        <w:spacing w:before="0" w:after="0" w:line="480" w:lineRule="auto"/>
+        <w:jc w:val="left"/>
+        <w:ind w:left="0" w:firstLine="0"/>
+        <w:keepNext/>
+      </w:pPr>
+      <w:r>
+        <w:rPr>
+          <w:rFonts w:ascii="Georgia" w:hAnsi="Georgia" w:cs="Georgia" w:eastAsia="Georgia"/>
+          <w:b/>
+          <w:bCs/>
+          <w:sz w:val="24"/>
+          <w:szCs w:val="24"/>
+        </w:rPr>
+        <w:t xml:space="preserve">Sample 3: Agriculture (Animal Science)</w:t>
+      </w:r>
+      <w:r>
+        <w:rPr>
+          <w:rFonts w:ascii="Georgia" w:hAnsi="Georgia" w:cs="Georgia" w:eastAsia="Georgia"/>
+          <w:b/>
+          <w:bCs/>
+          <w:sz w:val="24"/>
+          <w:szCs w:val="24"/>
+        </w:rPr>
+      </w:r>
+    </w:p>
+    <w:p>
+      <w:pPr>
+        <w:spacing w:before="0" w:after="0" w:line="480" w:lineRule="auto"/>
+        <w:jc w:val="both"/>
+        <w:ind w:left="0" w:firstLine="720"/>
+      </w:pPr>
+      <w:r>
+        <w:rPr>
+          <w:rFonts w:ascii="Georgia" w:hAnsi="Georgia" w:cs="Georgia" w:eastAsia="Georgia"/>
+          <w:sz w:val="22"/>
+          <w:szCs w:val="22"/>
+        </w:rPr>
+        <w:t xml:space="preserve">The study was conducted for 7 days from July 07 to July 13, 2022 at [REDACTED]. The general objective of the study was to determine the acceptability and palatability of duck ham subjected to different curing process. Specifically, it aimed to find the sensory evaluation: appearance, aroma, taste/ flavor, texture, and over-all acceptability. A total of eight (8) Muscovy ducks were used in this study. The study used Hedonic Likert Scale and was subjected to Desriptive analysis. Factor A = Type of curing and Factor B = Spice rub. The treatments used in this study are the following. A₁ B₁ - Dry curing + Oregano, A₁ B₂ - Dry curing + Lemon grass, A₂ B₁ - Liquid curing + Oregano and A₁ B₂ - Liquid curing + Lemon grass. The sensory evaluation was conducted at Pampanga State Agricultural University, PAC, Magalang, Pampanga. Ten (10) college students, ten (10) teachers and ten (10) people who don’t eat duck were selected as respondents to evaluate the sample treatments. The data collected from the sensory evaluation were analysed using descriptive statistics.</w:t>
+      </w:r>
+    </w:p>
+    <w:p>
+      <w:pPr>
+        <w:spacing w:before="0" w:after="0" w:line="480" w:lineRule="auto"/>
+        <w:jc w:val="both"/>
+        <w:ind w:left="0" w:firstLine="720"/>
+      </w:pPr>
+      <w:r>
+        <w:rPr>
+          <w:rFonts w:ascii="Georgia" w:hAnsi="Georgia" w:cs="Georgia" w:eastAsia="Georgia"/>
+          <w:sz w:val="22"/>
+          <w:szCs w:val="22"/>
+        </w:rPr>
+        <w:t xml:space="preserve">Results of the study showed that Comparison on Curing Methods Using Oregano - dry cured duck ham had the highest rating with regards to appearance, texture and overall acceptability. While liquid cure duck ham got the highest rating in terms of aroma and taste/flavor. Comparison on Curing Methods Using Lemon Grass - liquid cured duck ham had the highest rating in terms of appearance, aroma, taste/flavor, texture and overall acceptability. Comparison of Spices on Dry Curing (Smoking) - dry cure duck ham smoked in lemon grass had the highest rating in terms of appearance, aroma, taste/flavor, texture and overall acceptability. Comparison of Spices on Liquid Smoke - liquid cured duck ham smoked in lemon grass had the highest rating in relation to appearance, aroma, taste/flavor, texture and overall acceptability. Descriptive rating revealed that all the treatment with regards to appearance, aroma, taste/flavor, texture and overall acceptability were rated moderately like.</w:t>
+      </w:r>
+    </w:p>
+    <w:p>
+      <w:pPr>
+        <w:spacing w:before="0" w:after="0" w:line="480" w:lineRule="auto"/>
+        <w:ind w:left="0" w:firstLine="0"/>
+      </w:pPr>
+    </w:p>
+    <w:p>
+      <w:pPr>
+        <w:spacing w:before="0" w:after="0" w:line="480" w:lineRule="auto"/>
+        <w:jc w:val="left"/>
+        <w:ind w:left="0" w:firstLine="0"/>
+        <w:keepNext/>
+      </w:pPr>
+      <w:r>
+        <w:rPr>
+          <w:rFonts w:ascii="Georgia" w:hAnsi="Georgia" w:cs="Georgia" w:eastAsia="Georgia"/>
+          <w:b/>
+          <w:bCs/>
+          <w:sz w:val="24"/>
+          <w:szCs w:val="24"/>
+        </w:rPr>
+        <w:t xml:space="preserve">Hedge Count: 0</w:t>
+      </w:r>
+      <w:r>
+        <w:rPr>
+          <w:rFonts w:ascii="Georgia" w:hAnsi="Georgia" w:cs="Georgia" w:eastAsia="Georgia"/>
+          <w:b/>
+          <w:bCs/>
+          <w:sz w:val="24"/>
+          <w:szCs w:val="24"/>
+        </w:rPr>
+      </w:r>
+    </w:p>
+    <w:p>
+      <w:pPr>
+        <w:spacing w:before="0" w:after="0" w:line="480" w:lineRule="auto"/>
+        <w:jc w:val="both"/>
+        <w:ind w:left="0" w:firstLine="720"/>
+      </w:pPr>
+      <w:r>
+        <w:rPr>
+          <w:rFonts w:ascii="Georgia" w:hAnsi="Georgia" w:cs="Georgia" w:eastAsia="Georgia"/>
+          <w:sz w:val="22"/>
+          <w:szCs w:val="22"/>
+        </w:rPr>
+        <w:t xml:space="preserve">Analysis: The abstract uses factive reporting verbs (showed, revealed). Sensory evaluation ratings are reported as absolute data points. The term “moderately like” describes a Likert scale variable, not an epistemic qualification.</w:t>
+      </w:r>
+    </w:p>
+    <w:p>
+      <w:pPr>
+        <w:spacing w:before="0" w:after="0" w:line="480" w:lineRule="auto"/>
+        <w:jc w:val="both"/>
+        <w:ind w:left="0" w:firstLine="720"/>
+      </w:pPr>
+      <w:r>
+        <w:rPr>
+          <w:rFonts w:ascii="Georgia" w:hAnsi="Georgia" w:cs="Georgia" w:eastAsia="Georgia"/>
+          <w:sz w:val="22"/>
+          <w:szCs w:val="22"/>
+        </w:rPr>
+        <w:t xml:space="preserve">Key Excerpt: </w:t>
+      </w:r>
+      <w:r>
+        <w:rPr>
+          <w:rFonts w:ascii="Georgia" w:hAnsi="Georgia" w:cs="Georgia" w:eastAsia="Georgia"/>
+          <w:sz w:val="22"/>
+          <w:szCs w:val="22"/>
+        </w:rPr>
+        <w:t xml:space="preserve">“Results of the study showed that Comparison on Curing Methods…”</w:t>
+      </w:r>
+    </w:p>
+    <w:p>
+      <w:pPr>
+        <w:spacing w:before="0" w:after="0" w:line="480" w:lineRule="auto"/>
+        <w:ind w:left="0" w:firstLine="0"/>
+      </w:pPr>
+    </w:p>
+    <w:p>
+      <w:pPr>
+        <w:spacing w:before="0" w:after="0" w:line="480" w:lineRule="auto"/>
+        <w:jc w:val="left"/>
+        <w:ind w:left="0" w:firstLine="0"/>
+        <w:keepNext/>
+      </w:pPr>
+      <w:r>
+        <w:rPr>
+          <w:rFonts w:ascii="Georgia" w:hAnsi="Georgia" w:cs="Georgia" w:eastAsia="Georgia"/>
+          <w:b/>
+          <w:bCs/>
+          <w:sz w:val="24"/>
+          <w:szCs w:val="24"/>
+        </w:rPr>
+        <w:t xml:space="preserve">Sample 4: Agriculture (Crop Science)</w:t>
+      </w:r>
+      <w:r>
+        <w:rPr>
+          <w:rFonts w:ascii="Georgia" w:hAnsi="Georgia" w:cs="Georgia" w:eastAsia="Georgia"/>
+          <w:b/>
+          <w:bCs/>
+          <w:sz w:val="24"/>
+          <w:szCs w:val="24"/>
+        </w:rPr>
+      </w:r>
+    </w:p>
+    <w:p>
+      <w:pPr>
+        <w:spacing w:before="0" w:after="0" w:line="480" w:lineRule="auto"/>
+        <w:jc w:val="both"/>
+        <w:ind w:left="0" w:firstLine="720"/>
+      </w:pPr>
+      <w:r>
+        <w:rPr>
+          <w:rFonts w:ascii="Georgia" w:hAnsi="Georgia" w:cs="Georgia" w:eastAsia="Georgia"/>
+          <w:sz w:val="22"/>
+          <w:szCs w:val="22"/>
+        </w:rPr>
+        <w:t xml:space="preserve">The study was conducted from June to July 2022 to determine the influence of the different sources of nutrients to rice straw mushrooms. The field experiment was conducted in [REDACTED]. The experiment was laid out using Complete Randomize Design (CRD), with four treatments replicated four times. The treatments were as follows: T₀- Untreated banana leaves substrate submerged in 55 gallon of water (Control). T₁- Banana leaves substrate submerged in mixture of 100 grams of Urea and 55 gallons of water. T₂- Banana leaves substrate submerged in mixture of 250 ml of fish amino acid and 55 gallons of water, and, T₃- Banana leaves substrate submerged in mixture of 250 ml of fermented plant juice and 55 gallons of water.</w:t>
+      </w:r>
+    </w:p>
+    <w:p>
+      <w:pPr>
+        <w:spacing w:before="0" w:after="0" w:line="480" w:lineRule="auto"/>
+        <w:jc w:val="both"/>
+        <w:ind w:left="0" w:firstLine="720"/>
+      </w:pPr>
+      <w:r>
+        <w:rPr>
+          <w:rFonts w:ascii="Georgia" w:hAnsi="Georgia" w:cs="Georgia" w:eastAsia="Georgia"/>
+          <w:sz w:val="22"/>
+          <w:szCs w:val="22"/>
+        </w:rPr>
+        <w:t xml:space="preserve">Results of the study revealed significant differences in the following parameters: average weight of button harvested, number of buttons harvested, average yield per harvest, and biological efficiency of rice straw mushroom. However, insignificant differences were observed on the days of pinhead appearance and days of harvesting. The highest ROI was obtained in T₁- Banana leaves substrate submerged in a mixture of 100 grams of Urea and 55 gallons of water with every peso of investment 1.01 pesos of net income return.</w:t>
+      </w:r>
+    </w:p>
+    <w:p>
+      <w:pPr>
+        <w:spacing w:before="0" w:after="0" w:line="480" w:lineRule="auto"/>
+        <w:ind w:left="0" w:firstLine="0"/>
+      </w:pPr>
+    </w:p>
+    <w:p>
+      <w:pPr>
+        <w:spacing w:before="0" w:after="0" w:line="480" w:lineRule="auto"/>
+        <w:jc w:val="left"/>
+        <w:ind w:left="0" w:firstLine="0"/>
+        <w:keepNext/>
+      </w:pPr>
+      <w:r>
+        <w:rPr>
+          <w:rFonts w:ascii="Georgia" w:hAnsi="Georgia" w:cs="Georgia" w:eastAsia="Georgia"/>
+          <w:b/>
+          <w:bCs/>
+          <w:sz w:val="24"/>
+          <w:szCs w:val="24"/>
+        </w:rPr>
+        <w:t xml:space="preserve">Hedge Count: 0</w:t>
+      </w:r>
+      <w:r>
+        <w:rPr>
+          <w:rFonts w:ascii="Georgia" w:hAnsi="Georgia" w:cs="Georgia" w:eastAsia="Georgia"/>
+          <w:b/>
+          <w:bCs/>
+          <w:sz w:val="24"/>
+          <w:szCs w:val="24"/>
+        </w:rPr>
+      </w:r>
+    </w:p>
+    <w:p>
+      <w:pPr>
+        <w:spacing w:before="0" w:after="0" w:line="480" w:lineRule="auto"/>
+        <w:jc w:val="both"/>
+        <w:ind w:left="0" w:firstLine="720"/>
+      </w:pPr>
+      <w:r>
+        <w:rPr>
+          <w:rFonts w:ascii="Georgia" w:hAnsi="Georgia" w:cs="Georgia" w:eastAsia="Georgia"/>
+          <w:sz w:val="22"/>
+          <w:szCs w:val="22"/>
+        </w:rPr>
+        <w:t xml:space="preserve">Analysis: Statistical significance is reported as fact (revealed significant differences). No devices are used to qualify the biological efficiency or yield claims.</w:t>
+      </w:r>
+    </w:p>
+    <w:p>
+      <w:pPr>
+        <w:spacing w:before="0" w:after="0" w:line="480" w:lineRule="auto"/>
+        <w:jc w:val="both"/>
+        <w:ind w:left="0" w:firstLine="720"/>
+      </w:pPr>
+      <w:r>
+        <w:rPr>
+          <w:rFonts w:ascii="Georgia" w:hAnsi="Georgia" w:cs="Georgia" w:eastAsia="Georgia"/>
+          <w:sz w:val="22"/>
+          <w:szCs w:val="22"/>
+        </w:rPr>
+        <w:t xml:space="preserve">Key Excerpt: “Results of the study revealed significant differences.. The highest ROI was obtained…”</w:t>
+      </w:r>
+    </w:p>
+    <w:p>
+      <w:pPr>
+        <w:spacing w:before="0" w:after="0" w:line="480" w:lineRule="auto"/>
+        <w:jc w:val="both"/>
+        <w:ind w:left="0" w:firstLine="720"/>
+      </w:pPr>
+      <w:r>
+        <w:rPr>
+          <w:rFonts w:ascii="Georgia" w:hAnsi="Georgia" w:cs="Georgia" w:eastAsia="Georgia"/>
+          <w:sz w:val="22"/>
+          <w:szCs w:val="22"/>
+        </w:rPr>
+        <w:t xml:space="preserve">General Observation From The Pilot</w:t>
+      </w:r>
+      <w:r>
+        <w:rPr>
+          <w:rFonts w:ascii="Georgia" w:hAnsi="Georgia" w:cs="Georgia" w:eastAsia="Georgia"/>
+          <w:sz w:val="22"/>
+          <w:szCs w:val="22"/>
+        </w:rPr>
+      </w:r>
+    </w:p>
+    <w:p>
+      <w:pPr>
+        <w:spacing w:before="0" w:after="0" w:line="480" w:lineRule="auto"/>
+        <w:jc w:val="both"/>
+        <w:ind w:left="0" w:firstLine="720"/>
         <w:sectPr>
           <w:type w:val="nextPage"/>
           <w:pgSz w:h="16838" w:w="11906" w:orient="portrait"/>
           <w:pgMar w:bottom="1440" w:top="1440" w:left="2160" w:right="1440" w:header="720" w:footer="720"/>
+          <w:titlePg w:val="1"/>
         </w:sectPr>
-        <w:spacing w:before="0" w:after="0" w:line="480" w:lineRule="auto"/>
-      </w:pPr>
-      <w:r>
-        <w:rPr>
-          <w:rtl w:val="0"/>
+      </w:pPr>
+      <w:r>
+        <w:rPr>
+          <w:rFonts w:ascii="Georgia" w:hAnsi="Georgia" w:cs="Georgia" w:eastAsia="Georgia"/>
+          <w:sz w:val="22"/>
+          <w:szCs w:val="22"/>
+        </w:rPr>
+        <w:t xml:space="preserve">Three of the four pilot abstracts contained no coded hedges. The pattern pointed to a high base rate of zero-hedge writing in the local undergraduate abstract genre and confirmed that a descriptive baseline study was warranted. The same decision rules and Working Test were carried forward into the main coding of the 60-abstract corpus.</w:t>
+      </w:r>
+      <w:r>
+        <w:rPr>
+          <w:rFonts w:ascii="Georgia" w:hAnsi="Georgia" w:cs="Georgia" w:eastAsia="Georgia"/>
+          <w:sz w:val="22"/>
+          <w:szCs w:val="22"/>
+        </w:rPr>
+      </w:r>
+      <w:r>
+        <w:rPr>
+          <w:rFonts w:ascii="Georgia" w:hAnsi="Georgia" w:cs="Georgia" w:eastAsia="Georgia"/>
+          <w:sz w:val="22"/>
+          <w:szCs w:val="22"/>
         </w:rPr>
       </w:r>
     </w:p>
@@ -37523,10 +37419,6 @@
       </w:r>
     </w:p>
     <w:sectPr>
-      <w:headerReference r:id="rId59" w:type="default"/>
-      <w:headerReference r:id="rId60" w:type="first"/>
-      <w:footerReference r:id="rId61" w:type="default"/>
-      <w:footerReference r:id="rId62" w:type="first"/>
       <w:pgSz w:h="16838" w:w="11906" w:orient="portrait"/>
       <w:pgMar w:bottom="1440" w:top="1440" w:left="2160" w:right="1440" w:header="720" w:footer="720"/>
       <w:titlePg w:val="1"/>

</xml_diff>

<commit_message>
Draft_127_body: restore color legends (type swatches, function colors, App C key)
</commit_message>
<xml_diff>
--- a/thesis/003_ThesisProposal_Draft_127_body.docx
+++ b/thesis/003_ThesisProposal_Draft_127_body.docx
@@ -25143,15 +25143,15 @@
           <w:sz w:val="22"/>
           <w:szCs w:val="22"/>
         </w:rPr>
-        <w:t xml:space="preserve">• Highlights = type background on the token. </w:t>
-      </w:r>
-      <w:r>
-        <w:rPr>
-          <w:rFonts w:ascii="Georgia" w:hAnsi="Georgia" w:cs="Georgia" w:eastAsia="Georgia"/>
-          <w:sz w:val="22"/>
-          <w:szCs w:val="22"/>
-        </w:rPr>
-        <w:t xml:space="preserve">Colored text labels = function. Grey = unhedged verb. Strike + grey code = FP.</w:t>
+        <w:t xml:space="preserve">• Highlights = type background on the token (Blue = Modal, Red = Lexical, Yellow = Adverbial, Green = Clause-level). Colored text labels = function (EC = orange, P = purple). Grey = unhedged verb. Strike + grey code = FP.</w:t>
+      </w:r>
+      <w:r>
+        <w:rPr>
+          <w:rFonts w:ascii="Georgia" w:hAnsi="Georgia" w:cs="Georgia" w:eastAsia="Georgia"/>
+          <w:sz w:val="22"/>
+          <w:szCs w:val="22"/>
+        </w:rPr>
+        <w:t xml:space="preserve"/>
       </w:r>
     </w:p>
     <w:tbl>
@@ -25271,7 +25271,9 @@
           <w:tblHeader w:val="0"/>
         </w:trPr>
         <w:tc>
-          <w:tcPr/>
+          <w:tcPr>
+            <w:shd w:val="clear" w:color="auto" w:fill="BDD7EE"/>
+          </w:tcPr>
           <w:p>
             <w:pPr>
               <w:keepNext w:val="1"/>
@@ -25892,23 +25894,23 @@
           <w:sz w:val="22"/>
           <w:szCs w:val="22"/>
         </w:rPr>
-        <w:t xml:space="preserve">Shows:</w:t>
-      </w:r>
-      <w:r>
-        <w:rPr>
-          <w:rFonts w:ascii="Georgia" w:hAnsi="Georgia" w:cs="Georgia" w:eastAsia="Georgia"/>
-          <w:sz w:val="22"/>
-          <w:szCs w:val="22"/>
-        </w:rPr>
-        <w:t xml:space="preserve"> </w:t>
-      </w:r>
-      <w:r>
-        <w:rPr>
-          <w:rFonts w:ascii="Georgia" w:hAnsi="Georgia" w:cs="Georgia" w:eastAsia="Georgia"/>
-          <w:sz w:val="22"/>
-          <w:szCs w:val="22"/>
-        </w:rPr>
-        <w:t xml:space="preserve">Lexical+Modal types. EC and P functions. FP-Cap, FP-Rec, and framing FP. Type = highlight on the token, function = colored label (EC/P). FP = strike + reason code. Not every abstract will contain P, the P slot is illustrated for coding practice.</w:t>
+        <w:t xml:space="preserve">Shows: Lexical+Modal types; EC and P functions; FP-Cap, FP-Rec, and framing FP. Type = highlight color on the token (see Primary Colors table); function = colored label (EC orange / P purple). FP = strike + reason code. Not every abstract will contain P; the P slot is illustrated for coding practice.</w:t>
+      </w:r>
+      <w:r>
+        <w:rPr>
+          <w:rFonts w:ascii="Georgia" w:hAnsi="Georgia" w:cs="Georgia" w:eastAsia="Georgia"/>
+          <w:sz w:val="22"/>
+          <w:szCs w:val="22"/>
+        </w:rPr>
+        <w:t xml:space="preserve"/>
+      </w:r>
+      <w:r>
+        <w:rPr>
+          <w:rFonts w:ascii="Georgia" w:hAnsi="Georgia" w:cs="Georgia" w:eastAsia="Georgia"/>
+          <w:sz w:val="22"/>
+          <w:szCs w:val="22"/>
+        </w:rPr>
+        <w:t xml:space="preserve"/>
       </w:r>
       <w:r>
         <w:rPr>
@@ -26286,7 +26288,7 @@
           <w:sz w:val="22"/>
           <w:szCs w:val="22"/>
         </w:rPr>
-        <w:t>Highlight each retained hedge token in the color for its grammatical form. Exclusions follow the Decision Rules for Ambiguous Cases in Methodology (Table 1).</w:t>
+        <w:t xml:space="preserve">Highlight each retained hedge token in the color for its grammatical form: Blue = Modal Verbs, Red = Lexical Hedges, Yellow = Adverbial Hedges, Green = Clause-Level Hedges. Exclusions follow the Decision Rules.</w:t>
       </w:r>
     </w:p>
     <w:tbl>
@@ -26484,7 +26486,9 @@
           <w:tblHeader w:val="0"/>
         </w:trPr>
         <w:tc>
-          <w:tcPr/>
+          <w:tcPr>
+            <w:shd w:val="clear" w:color="auto" w:fill="BDD7EE"/>
+          </w:tcPr>
           <w:p>
             <w:pPr>
               <w:spacing w:after="60" w:before="60" w:line="240" w:lineRule="auto"/>
@@ -26501,7 +26505,7 @@
                 <w:sz w:val="22"/>
                 <w:szCs w:val="22"/>
               </w:rPr>
-              <w:t xml:space="preserve">      </w:t>
+              <w:t xml:space="preserve">Blue</w:t>
             </w:r>
             <w:r>
               <w:rPr>
@@ -26608,7 +26612,9 @@
           <w:tblHeader w:val="0"/>
         </w:trPr>
         <w:tc>
-          <w:tcPr/>
+          <w:tcPr>
+            <w:shd w:val="clear" w:color="auto" w:fill="F8CBAD"/>
+          </w:tcPr>
           <w:p>
             <w:pPr>
               <w:spacing w:after="60" w:before="60" w:line="240" w:lineRule="auto"/>
@@ -26625,7 +26631,7 @@
                 <w:sz w:val="22"/>
                 <w:szCs w:val="22"/>
               </w:rPr>
-              <w:t xml:space="preserve">      </w:t>
+              <w:t xml:space="preserve">Red</w:t>
             </w:r>
             <w:r>
               <w:rPr>
@@ -26732,7 +26738,9 @@
           <w:tblHeader w:val="0"/>
         </w:trPr>
         <w:tc>
-          <w:tcPr/>
+          <w:tcPr>
+            <w:shd w:val="clear" w:color="auto" w:fill="FFE699"/>
+          </w:tcPr>
           <w:p>
             <w:pPr>
               <w:spacing w:after="60" w:before="60" w:line="240" w:lineRule="auto"/>
@@ -26749,7 +26757,7 @@
                 <w:sz w:val="22"/>
                 <w:szCs w:val="22"/>
               </w:rPr>
-              <w:t xml:space="preserve">      </w:t>
+              <w:t xml:space="preserve">Yellow</w:t>
             </w:r>
             <w:r>
               <w:rPr>
@@ -26860,6 +26868,7 @@
             <w:tcBorders>
               <w:bottom w:val="single" w:sz="18" w:color="000000" w:space="0"/>
             </w:tcBorders>
+            <w:shd w:val="clear" w:color="auto" w:fill="C6EFCE"/>
           </w:tcPr>
           <w:p>
             <w:pPr>
@@ -26877,7 +26886,7 @@
                 <w:sz w:val="22"/>
                 <w:szCs w:val="22"/>
               </w:rPr>
-              <w:t xml:space="preserve">      </w:t>
+              <w:t xml:space="preserve">Green</w:t>
             </w:r>
             <w:r>
               <w:rPr>
@@ -27266,7 +27275,9 @@
           <w:tblHeader w:val="0"/>
         </w:trPr>
         <w:tc>
-          <w:tcPr/>
+          <w:tcPr>
+            <w:shd w:val="clear" w:color="auto" w:fill="FCE4D6"/>
+          </w:tcPr>
           <w:p>
             <w:pPr>
               <w:spacing w:after="60" w:before="60" w:line="240" w:lineRule="auto"/>
@@ -27282,6 +27293,7 @@
                 <w:rFonts w:ascii="Georgia" w:hAnsi="Georgia" w:cs="Georgia" w:eastAsia="Georgia"/>
                 <w:sz w:val="22"/>
                 <w:szCs w:val="22"/>
+                <w:color w:val="ED7D31"/>
               </w:rPr>
               <w:t xml:space="preserve">EC</w:t>
             </w:r>
@@ -27290,6 +27302,7 @@
                 <w:rFonts w:ascii="Georgia" w:hAnsi="Georgia" w:cs="Georgia" w:eastAsia="Georgia"/>
                 <w:sz w:val="22"/>
                 <w:szCs w:val="22"/>
+                <w:color w:val="ED7D31"/>
               </w:rPr>
             </w:r>
           </w:p>
@@ -27406,7 +27419,9 @@
           <w:tblHeader w:val="0"/>
         </w:trPr>
         <w:tc>
-          <w:tcPr/>
+          <w:tcPr>
+            <w:shd w:val="clear" w:color="auto" w:fill="E2D5F1"/>
+          </w:tcPr>
           <w:p>
             <w:pPr>
               <w:spacing w:after="60" w:before="60" w:line="240" w:lineRule="auto"/>
@@ -27422,6 +27437,7 @@
                 <w:rFonts w:ascii="Georgia" w:hAnsi="Georgia" w:cs="Georgia" w:eastAsia="Georgia"/>
                 <w:sz w:val="22"/>
                 <w:szCs w:val="22"/>
+                <w:color w:val="7030A0"/>
               </w:rPr>
               <w:t xml:space="preserve">P</w:t>
             </w:r>
@@ -27430,6 +27446,7 @@
                 <w:rFonts w:ascii="Georgia" w:hAnsi="Georgia" w:cs="Georgia" w:eastAsia="Georgia"/>
                 <w:sz w:val="22"/>
                 <w:szCs w:val="22"/>
+                <w:color w:val="7030A0"/>
               </w:rPr>
             </w:r>
           </w:p>
@@ -27550,6 +27567,7 @@
             <w:tcBorders>
               <w:bottom w:val="single" w:sz="18" w:color="000000" w:space="0"/>
             </w:tcBorders>
+            <w:shd w:val="clear" w:color="auto" w:fill="D9D9D9"/>
           </w:tcPr>
           <w:p>
             <w:pPr>
@@ -27566,6 +27584,7 @@
                 <w:rFonts w:ascii="Georgia" w:hAnsi="Georgia" w:cs="Georgia" w:eastAsia="Georgia"/>
                 <w:sz w:val="22"/>
                 <w:szCs w:val="22"/>
+                <w:color w:val="808080"/>
               </w:rPr>
               <w:t xml:space="preserve">FP</w:t>
             </w:r>
@@ -27574,6 +27593,7 @@
                 <w:rFonts w:ascii="Georgia" w:hAnsi="Georgia" w:cs="Georgia" w:eastAsia="Georgia"/>
                 <w:sz w:val="22"/>
                 <w:szCs w:val="22"/>
+                <w:color w:val="808080"/>
               </w:rPr>
             </w:r>
           </w:p>
@@ -28799,7 +28819,9 @@
           <w:tblHeader w:val="0"/>
         </w:trPr>
         <w:tc>
-          <w:tcPr/>
+          <w:tcPr>
+            <w:shd w:val="clear" w:color="auto" w:fill="D9D9D9"/>
+          </w:tcPr>
           <w:p>
             <w:pPr>
               <w:spacing w:after="60" w:before="60" w:line="240" w:lineRule="auto"/>
@@ -28816,7 +28838,7 @@
                 <w:sz w:val="22"/>
                 <w:szCs w:val="22"/>
               </w:rPr>
-              <w:t xml:space="preserve">      </w:t>
+              <w:t xml:space="preserve">Grey</w:t>
             </w:r>
             <w:r>
               <w:rPr>
@@ -28916,7 +28938,9 @@
           <w:tblHeader w:val="0"/>
         </w:trPr>
         <w:tc>
-          <w:tcPr/>
+          <w:tcPr>
+            <w:shd w:val="clear" w:color="auto" w:fill="D9D9D9"/>
+          </w:tcPr>
           <w:p>
             <w:pPr>
               <w:spacing w:after="60" w:before="60" w:line="240" w:lineRule="auto"/>
@@ -28933,7 +28957,7 @@
                 <w:sz w:val="22"/>
                 <w:szCs w:val="22"/>
               </w:rPr>
-              <w:t xml:space="preserve">      </w:t>
+              <w:t xml:space="preserve">Grey</w:t>
             </w:r>
             <w:r>
               <w:rPr>
@@ -29037,6 +29061,7 @@
             <w:tcBorders>
               <w:bottom w:val="single" w:sz="18" w:color="000000" w:space="0"/>
             </w:tcBorders>
+            <w:shd w:val="clear" w:color="auto" w:fill="D9D9D9"/>
           </w:tcPr>
           <w:p>
             <w:pPr>
@@ -29054,7 +29079,7 @@
                 <w:sz w:val="22"/>
                 <w:szCs w:val="22"/>
               </w:rPr>
-              <w:t xml:space="preserve">      </w:t>
+              <w:t xml:space="preserve">Grey</w:t>
             </w:r>
             <w:r>
               <w:rPr>
@@ -31494,7 +31519,7 @@
           <w:sz w:val="22"/>
           <w:szCs w:val="22"/>
         </w:rPr>
-        <w:t xml:space="preserve">This appendix presents the 60 abstracts with all coding marks applied. Type marks = color highlight on hedge tokens (blue = Modal Verbs, red = Lexical Hedges, yellow = Adverbial Hedges, green = Clause-Level Hedges). Function marks = function label in colored text (EC = orange, P = purple). Function labels in this appendix are only EC and P. False positives = strikethrough + reason code in grey (e.g. FP-Rec = recommendation). Unhedged assertions = grey highlight + [G]/[C] bracket (warranted-but-absent caution only).</w:t>
+        <w:t xml:space="preserve">This appendix presents the 60 abstracts with all coding marks applied. Type marks = color highlight on hedge tokens (Blue = Modal Verbs, Red = Lexical Hedges, Yellow = Adverbial Hedges, Green = Clause-Level Hedges). Function marks = colored text labels (EC = orange, P = purple). False positives = strikethrough + reason code in grey (e.g. FP-Rec). Unhedged assertions = grey highlight + [G]/[C]/[R] bracket where marked. Function labels in this appendix are only EC and P; FP is not a function.</w:t>
       </w:r>
     </w:p>
     <w:p>

</xml_diff>

<commit_message>
Draft_127_body: rebuild QRL table (one type/function per row)
</commit_message>
<xml_diff>
--- a/thesis/003_ThesisProposal_Draft_127_body.docx
+++ b/thesis/003_ThesisProposal_Draft_127_body.docx
@@ -25156,467 +25156,319 @@
     </w:p>
     <w:tbl>
       <w:tblPr>
-        <w:tblStyle w:val="Table8"/>
-        <w:tblW w:w="8305.0" w:type="dxa"/>
-        <w:jc w:val="left"/>
-        <w:tblInd w:w="-148.0" w:type="dxa"/>
-        <w:tblLayout w:type="fixed"/>
-        <w:tblLook w:val="0400"/>
+        <w:tblW w:w="9360" w:type="dxa"/>
         <w:tblBorders>
-          <w:top w:val="single" w:color="000000" w:space="0" w:sz="18"/>
-          <w:left w:val="nil" w:color="000000" w:space="0" w:sz="0"/>
-          <w:bottom w:val="single" w:color="000000" w:space="0" w:sz="18"/>
-          <w:right w:val="nil" w:color="000000" w:space="0" w:sz="0"/>
-          <w:insideH w:val="nil" w:color="000000" w:space="0" w:sz="0"/>
-          <w:insideV w:val="nil" w:color="000000" w:space="0" w:sz="0"/>
+          <w:top w:val="single" w:sz="4" w:space="0" w:color="000000"/>
+          <w:left w:val="single" w:sz="4" w:space="0" w:color="000000"/>
+          <w:bottom w:val="single" w:sz="4" w:space="0" w:color="000000"/>
+          <w:right w:val="single" w:sz="4" w:space="0" w:color="000000"/>
+          <w:insideH w:val="single" w:sz="4" w:space="0" w:color="000000"/>
+          <w:insideV w:val="single" w:sz="4" w:space="0" w:color="000000"/>
         </w:tblBorders>
       </w:tblPr>
       <w:tblGrid>
-        <w:gridCol w:w="4153"/>
-        <w:gridCol w:w="4152"/>
-        <w:tblGridChange w:id="0">
-          <w:tblGrid>
-            <w:gridCol w:w="4153"/>
-            <w:gridCol w:w="4152"/>
-          </w:tblGrid>
-        </w:tblGridChange>
+        <w:gridCol w:w="4680"/>
+        <w:gridCol w:w="4680"/>
       </w:tblGrid>
       <w:tr>
-        <w:trPr>
-          <w:cantSplit w:val="1"/>
-          <w:tblHeader w:val="1"/>
-        </w:trPr>
-        <w:tc>
-          <w:tcPr>
-            <w:shd w:val="clear" w:color="auto" w:fill="D9E2F3"/>
-            <w:tcBorders>
-              <w:bottom w:val="single" w:sz="4" w:color="000000" w:space="0"/>
-            </w:tcBorders>
-          </w:tcPr>
-          <w:p>
-            <w:pPr>
-              <w:keepNext w:val="1"/>
-              <w:spacing w:after="60" w:before="60" w:line="240" w:lineRule="auto"/>
-              <w:jc w:val="both"/>
-              <w:rPr>
+        <w:tc>
+          <w:tcPr>
+            <w:tcW w:w="4680" w:type="dxa"/>
+            <w:shd w:val="clear" w:color="auto" w:fill="f2f4f6"/>
+          </w:tcPr>
+          <w:p>
+            <w:pPr>
+              <w:spacing w:before="0" w:after="0" w:line="240" w:lineRule="auto"/>
+              <w:jc w:val="center"/>
+            </w:pPr>
+            <w:r>
+              <w:rPr>
+                <w:rFonts w:ascii="Georgia" w:hAnsi="Georgia"/>
+                <w:sz w:val="20"/>
+                <w:szCs w:val="20"/>
+                <w:b/>
+              </w:rPr>
+              <w:t xml:space="preserve">TYPE (Highlight)</w:t>
+            </w:r>
+          </w:p>
+        </w:tc>
+        <w:tc>
+          <w:tcPr>
+            <w:tcW w:w="4680" w:type="dxa"/>
+            <w:shd w:val="clear" w:color="auto" w:fill="f2f4f6"/>
+          </w:tcPr>
+          <w:p>
+            <w:pPr>
+              <w:spacing w:before="0" w:after="0" w:line="240" w:lineRule="auto"/>
+              <w:jc w:val="center"/>
+            </w:pPr>
+            <w:r>
+              <w:rPr>
+                <w:rFonts w:ascii="Georgia" w:hAnsi="Georgia"/>
+                <w:sz w:val="20"/>
+                <w:szCs w:val="20"/>
+                <w:b/>
+              </w:rPr>
+              <w:t xml:space="preserve">FUNCTION (Text)</w:t>
+            </w:r>
+          </w:p>
+        </w:tc>
+      </w:tr>
+      <w:tr>
+        <w:tc>
+          <w:tcPr>
+            <w:tcW w:w="4680" w:type="dxa"/>
+            <w:shd w:val="clear" w:color="auto" w:fill="00b0f0"/>
+          </w:tcPr>
+          <w:p>
+            <w:pPr>
+              <w:spacing w:before="0" w:after="0" w:line="240" w:lineRule="auto"/>
+            </w:pPr>
+            <w:r>
+              <w:rPr>
+                <w:rFonts w:ascii="Georgia" w:hAnsi="Georgia"/>
+                <w:sz w:val="20"/>
+                <w:szCs w:val="20"/>
+                <w:b/>
+                <w:color w:val="000000"/>
+              </w:rPr>
+              <w:t xml:space="preserve">Modal Verbs</w:t>
+            </w:r>
+          </w:p>
+        </w:tc>
+        <w:tc>
+          <w:tcPr>
+            <w:tcW w:w="4680" w:type="dxa"/>
+          </w:tcPr>
+          <w:p>
+            <w:pPr>
+              <w:spacing w:before="0" w:after="0" w:line="240" w:lineRule="auto"/>
+            </w:pPr>
+            <w:r>
+              <w:rPr>
+                <w:rFonts w:ascii="Georgia" w:hAnsi="Georgia"/>
+                <w:sz w:val="20"/>
+                <w:szCs w:val="20"/>
+                <w:b/>
+                <w:color w:val="ED7D31"/>
+              </w:rPr>
+              <w:t xml:space="preserve">EC  Epistemic Caution</w:t>
+            </w:r>
+          </w:p>
+        </w:tc>
+      </w:tr>
+      <w:tr>
+        <w:tc>
+          <w:tcPr>
+            <w:tcW w:w="4680" w:type="dxa"/>
+          </w:tcPr>
+          <w:p>
+            <w:pPr>
+              <w:spacing w:before="0" w:after="0" w:line="240" w:lineRule="auto"/>
+            </w:pPr>
+            <w:r>
+              <w:rPr>
+                <w:rFonts w:ascii="Georgia" w:hAnsi="Georgia"/>
+                <w:sz w:val="20"/>
+                <w:szCs w:val="20"/>
+                <w:b/>
+                <w:color w:val="FFFFFF"/>
+                <w:highlight w:val="red"/>
+              </w:rPr>
+              <w:t xml:space="preserve">Lexical Hedges</w:t>
+            </w:r>
+          </w:p>
+        </w:tc>
+        <w:tc>
+          <w:tcPr>
+            <w:tcW w:w="4680" w:type="dxa"/>
+          </w:tcPr>
+          <w:p>
+            <w:pPr>
+              <w:spacing w:before="0" w:after="0" w:line="240" w:lineRule="auto"/>
+            </w:pPr>
+            <w:r>
+              <w:rPr>
+                <w:rFonts w:ascii="Georgia" w:hAnsi="Georgia"/>
+                <w:sz w:val="20"/>
+                <w:szCs w:val="20"/>
+                <w:b/>
+                <w:color w:val="7030A0"/>
+              </w:rPr>
+              <w:t xml:space="preserve">P  Politeness / Deference</w:t>
+            </w:r>
+          </w:p>
+        </w:tc>
+      </w:tr>
+      <w:tr>
+        <w:tc>
+          <w:tcPr>
+            <w:tcW w:w="4680" w:type="dxa"/>
+          </w:tcPr>
+          <w:p>
+            <w:pPr>
+              <w:spacing w:before="0" w:after="0" w:line="240" w:lineRule="auto"/>
+            </w:pPr>
+            <w:r>
+              <w:rPr>
+                <w:rFonts w:ascii="Georgia" w:hAnsi="Georgia"/>
+                <w:sz w:val="20"/>
+                <w:szCs w:val="20"/>
+                <w:b/>
+                <w:color w:val="000000"/>
+                <w:highlight w:val="yellow"/>
+              </w:rPr>
+              <w:t xml:space="preserve">Adverbial Hedges</w:t>
+            </w:r>
+          </w:p>
+        </w:tc>
+        <w:tc>
+          <w:tcPr>
+            <w:tcW w:w="4680" w:type="dxa"/>
+          </w:tcPr>
+          <w:p>
+            <w:pPr>
+              <w:spacing w:before="0" w:after="0" w:line="240" w:lineRule="auto"/>
+            </w:pPr>
+            <w:r>
+              <w:rPr>
+                <w:rFonts w:ascii="Georgia" w:hAnsi="Georgia"/>
+                <w:sz w:val="20"/>
+                <w:szCs w:val="20"/>
+                <w:b/>
+                <w:color w:val="000000"/>
+              </w:rPr>
+              <w:t xml:space="preserve">—</w:t>
+            </w:r>
+          </w:p>
+        </w:tc>
+      </w:tr>
+      <w:tr>
+        <w:tc>
+          <w:tcPr>
+            <w:tcW w:w="4680" w:type="dxa"/>
+            <w:shd w:val="clear" w:color="auto" w:fill="00b050"/>
+          </w:tcPr>
+          <w:p>
+            <w:pPr>
+              <w:spacing w:before="0" w:after="0" w:line="240" w:lineRule="auto"/>
+            </w:pPr>
+            <w:r>
+              <w:rPr>
+                <w:rFonts w:ascii="Georgia" w:hAnsi="Georgia"/>
+                <w:sz w:val="20"/>
+                <w:szCs w:val="20"/>
+                <w:b/>
+                <w:color w:val="000000"/>
+              </w:rPr>
+              <w:t xml:space="preserve">Clause-Level Hedges</w:t>
+            </w:r>
+          </w:p>
+        </w:tc>
+        <w:tc>
+          <w:tcPr>
+            <w:tcW w:w="4680" w:type="dxa"/>
+          </w:tcPr>
+          <w:p>
+            <w:pPr>
+              <w:spacing w:before="0" w:after="0" w:line="240" w:lineRule="auto"/>
+            </w:pPr>
+            <w:r>
+              <w:rPr>
+                <w:rFonts w:ascii="Georgia" w:hAnsi="Georgia"/>
+                <w:sz w:val="20"/>
+                <w:szCs w:val="20"/>
+              </w:rPr>
+              <w:t xml:space="preserve"/>
+            </w:r>
+          </w:p>
+        </w:tc>
+      </w:tr>
+      <w:tr>
+        <w:tc>
+          <w:tcPr>
+            <w:tcW w:w="4680" w:type="dxa"/>
+            <w:shd w:val="clear" w:color="auto" w:fill="F2F2F2"/>
+          </w:tcPr>
+          <w:p>
+            <w:pPr>
+              <w:spacing w:before="0" w:after="0" w:line="240" w:lineRule="auto"/>
+            </w:pPr>
+            <w:r>
+              <w:rPr>
+                <w:rFonts w:ascii="Georgia" w:hAnsi="Georgia"/>
+                <w:sz w:val="20"/>
+                <w:szCs w:val="20"/>
+                <w:b/>
+                <w:shd w:val="clear" w:color="auto" w:fill="bfbfbf"/>
+              </w:rPr>
+              <w:t xml:space="preserve">UNHEDGED ASSERTIONS</w:t>
+            </w:r>
+            <w:r>
+              <w:rPr>
+                <w:rFonts w:ascii="Georgia" w:hAnsi="Georgia"/>
+                <w:sz w:val="20"/>
+                <w:szCs w:val="20"/>
+                <w:color w:val="404040"/>
+              </w:rPr>
+              <w:t xml:space="preserve"> (Grey highlight, optional)</w:t>
+            </w:r>
+          </w:p>
+          <w:p>
+            <w:pPr>
+              <w:spacing w:before="0" w:after="0" w:line="240" w:lineRule="auto"/>
+            </w:pPr>
+            <w:r>
+              <w:rPr>
+                <w:rFonts w:ascii="Georgia" w:hAnsi="Georgia"/>
                 <w:sz w:val="18"/>
                 <w:szCs w:val="18"/>
               </w:rPr>
-              <w:ind w:left="0" w:firstLine="0"/>
-            </w:pPr>
-            <w:r>
-              <w:rPr>
-                <w:rFonts w:ascii="Georgia" w:hAnsi="Georgia" w:cs="Georgia" w:eastAsia="Georgia"/>
+              <w:t xml:space="preserve">R = Result, G = Generalization, C = Causal. Bracket the subtype beside the mark.</w:t>
+            </w:r>
+          </w:p>
+        </w:tc>
+        <w:tc>
+          <w:tcPr>
+            <w:tcW w:w="4680" w:type="dxa"/>
+            <w:shd w:val="clear" w:color="auto" w:fill="F2F2F2"/>
+          </w:tcPr>
+          <w:p>
+            <w:pPr>
+              <w:spacing w:before="0" w:after="0" w:line="240" w:lineRule="auto"/>
+            </w:pPr>
+            <w:r>
+              <w:rPr>
+                <w:rFonts w:ascii="Georgia" w:hAnsi="Georgia"/>
+                <w:sz w:val="20"/>
+                <w:szCs w:val="20"/>
                 <w:b/>
-                <w:bCs/>
-                <w:sz w:val="22"/>
-                <w:szCs w:val="22"/>
-              </w:rPr>
-              <w:t xml:space="preserve">TYPE (Highlight)</w:t>
-            </w:r>
-            <w:r>
-              <w:rPr>
-                <w:rFonts w:ascii="Georgia" w:hAnsi="Georgia" w:cs="Georgia" w:eastAsia="Georgia"/>
-                <w:b/>
-                <w:bCs/>
-                <w:sz w:val="22"/>
-                <w:szCs w:val="22"/>
-              </w:rPr>
-            </w:r>
-          </w:p>
-        </w:tc>
-        <w:tc>
-          <w:tcPr>
-            <w:shd w:val="clear" w:color="auto" w:fill="D9E2F3"/>
-            <w:tcBorders>
-              <w:bottom w:val="single" w:sz="4" w:color="000000" w:space="0"/>
-            </w:tcBorders>
-          </w:tcPr>
-          <w:p>
-            <w:pPr>
-              <w:keepNext w:val="1"/>
-              <w:spacing w:after="60" w:before="60" w:line="240" w:lineRule="auto"/>
-              <w:jc w:val="both"/>
-              <w:rPr>
+                <w:color w:val="808080"/>
+                <w:strike/>
+              </w:rPr>
+              <w:t xml:space="preserve">FALSE POSITIVE</w:t>
+            </w:r>
+            <w:r>
+              <w:rPr>
+                <w:rFonts w:ascii="Georgia" w:hAnsi="Georgia"/>
+                <w:sz w:val="20"/>
+                <w:szCs w:val="20"/>
+                <w:color w:val="808080"/>
+              </w:rPr>
+              <w:t xml:space="preserve"> (Strikethrough)</w:t>
+            </w:r>
+          </w:p>
+          <w:p>
+            <w:pPr>
+              <w:spacing w:before="0" w:after="0" w:line="240" w:lineRule="auto"/>
+            </w:pPr>
+            <w:r>
+              <w:rPr>
+                <w:rFonts w:ascii="Georgia" w:hAnsi="Georgia"/>
                 <w:sz w:val="18"/>
                 <w:szCs w:val="18"/>
               </w:rPr>
-              <w:ind w:left="0" w:firstLine="0"/>
-            </w:pPr>
-            <w:r>
-              <w:rPr>
-                <w:rFonts w:ascii="Georgia" w:hAnsi="Georgia" w:cs="Georgia" w:eastAsia="Georgia"/>
-                <w:b/>
-                <w:bCs/>
-                <w:sz w:val="22"/>
-                <w:szCs w:val="22"/>
-              </w:rPr>
-              <w:t xml:space="preserve">FUNCTION (Text)</w:t>
-            </w:r>
-            <w:r>
-              <w:rPr>
-                <w:rFonts w:ascii="Georgia" w:hAnsi="Georgia" w:cs="Georgia" w:eastAsia="Georgia"/>
-                <w:b/>
-                <w:bCs/>
-                <w:sz w:val="22"/>
-                <w:szCs w:val="22"/>
-              </w:rPr>
-            </w:r>
-          </w:p>
-        </w:tc>
-      </w:tr>
-      <w:tr>
-        <w:trPr>
-          <w:cantSplit w:val="1"/>
-          <w:tblHeader w:val="0"/>
-        </w:trPr>
-        <w:tc>
-          <w:tcPr>
-            <w:shd w:val="clear" w:color="auto" w:fill="BDD7EE"/>
-          </w:tcPr>
-          <w:p>
-            <w:pPr>
-              <w:keepNext w:val="1"/>
-              <w:spacing w:after="60" w:before="60" w:line="240" w:lineRule="auto"/>
-              <w:jc w:val="both"/>
-              <w:rPr>
-                <w:sz w:val="18"/>
-                <w:szCs w:val="18"/>
-              </w:rPr>
-              <w:ind w:left="0" w:firstLine="0"/>
-            </w:pPr>
-            <w:r>
-              <w:rPr>
-                <w:rFonts w:ascii="Georgia" w:hAnsi="Georgia" w:cs="Georgia" w:eastAsia="Georgia"/>
-                <w:sz w:val="22"/>
-                <w:szCs w:val="22"/>
-              </w:rPr>
-              <w:t xml:space="preserve">      </w:t>
-            </w:r>
-            <w:r>
-              <w:rPr>
-                <w:rFonts w:ascii="Georgia" w:hAnsi="Georgia" w:cs="Georgia" w:eastAsia="Georgia"/>
-                <w:sz w:val="22"/>
-                <w:szCs w:val="22"/>
-              </w:rPr>
-              <w:t xml:space="preserve">  Modal Verbs</w:t>
-            </w:r>
-            <w:r>
-              <w:rPr>
-                <w:rFonts w:ascii="Georgia" w:hAnsi="Georgia" w:cs="Georgia" w:eastAsia="Georgia"/>
-                <w:sz w:val="22"/>
-                <w:szCs w:val="22"/>
-              </w:rPr>
-            </w:r>
-          </w:p>
-          <w:p>
-            <w:pPr>
-              <w:keepNext w:val="1"/>
-              <w:spacing w:after="60" w:before="60" w:line="240" w:lineRule="auto"/>
-              <w:jc w:val="both"/>
-              <w:rPr>
-                <w:sz w:val="18"/>
-                <w:szCs w:val="18"/>
-              </w:rPr>
-              <w:ind w:left="0" w:firstLine="0"/>
-            </w:pPr>
-            <w:r>
-              <w:rPr>
-                <w:rFonts w:ascii="Georgia" w:hAnsi="Georgia" w:cs="Georgia" w:eastAsia="Georgia"/>
-                <w:sz w:val="22"/>
-                <w:szCs w:val="22"/>
-              </w:rPr>
-              <w:t xml:space="preserve">      </w:t>
-            </w:r>
-            <w:r>
-              <w:rPr>
-                <w:rFonts w:ascii="Georgia" w:hAnsi="Georgia" w:cs="Georgia" w:eastAsia="Georgia"/>
-                <w:sz w:val="22"/>
-                <w:szCs w:val="22"/>
-              </w:rPr>
-              <w:t xml:space="preserve">  Lexical Hedges</w:t>
-            </w:r>
-            <w:r>
-              <w:rPr>
-                <w:rFonts w:ascii="Georgia" w:hAnsi="Georgia" w:cs="Georgia" w:eastAsia="Georgia"/>
-                <w:sz w:val="22"/>
-                <w:szCs w:val="22"/>
-              </w:rPr>
-            </w:r>
-          </w:p>
-          <w:p>
-            <w:pPr>
-              <w:keepNext w:val="1"/>
-              <w:spacing w:after="60" w:before="60" w:line="240" w:lineRule="auto"/>
-              <w:jc w:val="both"/>
-              <w:rPr>
-                <w:sz w:val="18"/>
-                <w:szCs w:val="18"/>
-              </w:rPr>
-              <w:ind w:left="0" w:firstLine="0"/>
-            </w:pPr>
-            <w:r>
-              <w:rPr>
-                <w:rFonts w:ascii="Georgia" w:hAnsi="Georgia" w:cs="Georgia" w:eastAsia="Georgia"/>
-                <w:sz w:val="22"/>
-                <w:szCs w:val="22"/>
-              </w:rPr>
-              <w:t xml:space="preserve">      </w:t>
-            </w:r>
-            <w:r>
-              <w:rPr>
-                <w:rFonts w:ascii="Georgia" w:hAnsi="Georgia" w:cs="Georgia" w:eastAsia="Georgia"/>
-                <w:sz w:val="22"/>
-                <w:szCs w:val="22"/>
-              </w:rPr>
-              <w:t xml:space="preserve">  Adverbial Hedges</w:t>
-            </w:r>
-            <w:r>
-              <w:rPr>
-                <w:rFonts w:ascii="Georgia" w:hAnsi="Georgia" w:cs="Georgia" w:eastAsia="Georgia"/>
-                <w:sz w:val="22"/>
-                <w:szCs w:val="22"/>
-              </w:rPr>
-            </w:r>
-          </w:p>
-          <w:p>
-            <w:pPr>
-              <w:keepNext w:val="1"/>
-              <w:spacing w:after="60" w:before="60" w:line="240" w:lineRule="auto"/>
-              <w:jc w:val="both"/>
-              <w:rPr>
-                <w:sz w:val="18"/>
-                <w:szCs w:val="18"/>
-              </w:rPr>
-              <w:ind w:left="0" w:firstLine="0"/>
-            </w:pPr>
-            <w:r>
-              <w:rPr>
-                <w:rFonts w:ascii="Georgia" w:hAnsi="Georgia" w:cs="Georgia" w:eastAsia="Georgia"/>
-                <w:sz w:val="22"/>
-                <w:szCs w:val="22"/>
-              </w:rPr>
-              <w:t xml:space="preserve">      </w:t>
-            </w:r>
-            <w:r>
-              <w:rPr>
-                <w:rFonts w:ascii="Georgia" w:hAnsi="Georgia" w:cs="Georgia" w:eastAsia="Georgia"/>
-                <w:sz w:val="22"/>
-                <w:szCs w:val="22"/>
-              </w:rPr>
-              <w:t xml:space="preserve">  Clause-Level Hedges</w:t>
-            </w:r>
-            <w:r>
-              <w:rPr>
-                <w:rFonts w:ascii="Georgia" w:hAnsi="Georgia" w:cs="Georgia" w:eastAsia="Georgia"/>
-                <w:sz w:val="22"/>
-                <w:szCs w:val="22"/>
-              </w:rPr>
-            </w:r>
-          </w:p>
-        </w:tc>
-        <w:tc>
-          <w:tcPr/>
-          <w:p>
-            <w:pPr>
-              <w:keepNext w:val="1"/>
-              <w:spacing w:after="60" w:before="60" w:line="240" w:lineRule="auto"/>
-              <w:jc w:val="both"/>
-              <w:rPr>
-                <w:sz w:val="18"/>
-                <w:szCs w:val="18"/>
-              </w:rPr>
-              <w:ind w:left="0" w:firstLine="0"/>
-            </w:pPr>
-            <w:r>
-              <w:rPr>
-                <w:rFonts w:ascii="Georgia" w:hAnsi="Georgia" w:cs="Georgia" w:eastAsia="Georgia"/>
-                <w:sz w:val="22"/>
-                <w:szCs w:val="22"/>
-              </w:rPr>
-              <w:t xml:space="preserve">EC</w:t>
-            </w:r>
-            <w:r>
-              <w:rPr>
-                <w:rFonts w:ascii="Georgia" w:hAnsi="Georgia" w:cs="Georgia" w:eastAsia="Georgia"/>
-                <w:sz w:val="22"/>
-                <w:szCs w:val="22"/>
-              </w:rPr>
-              <w:t xml:space="preserve">  Epistemic Caution</w:t>
-            </w:r>
-            <w:r>
-              <w:rPr>
-                <w:rFonts w:ascii="Georgia" w:hAnsi="Georgia" w:cs="Georgia" w:eastAsia="Georgia"/>
-                <w:sz w:val="22"/>
-                <w:szCs w:val="22"/>
-              </w:rPr>
-            </w:r>
-          </w:p>
-          <w:p>
-            <w:pPr>
-              <w:keepNext w:val="1"/>
-              <w:spacing w:after="60" w:before="60" w:line="240" w:lineRule="auto"/>
-              <w:jc w:val="both"/>
-              <w:rPr>
-                <w:sz w:val="18"/>
-                <w:szCs w:val="18"/>
-              </w:rPr>
-              <w:ind w:left="0" w:firstLine="0"/>
-            </w:pPr>
-            <w:r>
-              <w:rPr>
-                <w:rFonts w:ascii="Georgia" w:hAnsi="Georgia" w:cs="Georgia" w:eastAsia="Georgia"/>
-                <w:sz w:val="22"/>
-                <w:szCs w:val="22"/>
-              </w:rPr>
-              <w:t xml:space="preserve">P</w:t>
-            </w:r>
-            <w:r>
-              <w:rPr>
-                <w:rFonts w:ascii="Georgia" w:hAnsi="Georgia" w:cs="Georgia" w:eastAsia="Georgia"/>
-                <w:sz w:val="22"/>
-                <w:szCs w:val="22"/>
-              </w:rPr>
-              <w:t xml:space="preserve">  Politeness / Deference</w:t>
-            </w:r>
-            <w:r>
-              <w:rPr>
-                <w:rFonts w:ascii="Georgia" w:hAnsi="Georgia" w:cs="Georgia" w:eastAsia="Georgia"/>
-                <w:sz w:val="22"/>
-                <w:szCs w:val="22"/>
-              </w:rPr>
-            </w:r>
-          </w:p>
-          <w:p>
-            <w:pPr>
-              <w:keepNext w:val="1"/>
-              <w:spacing w:after="60" w:before="60" w:line="240" w:lineRule="auto"/>
-              <w:jc w:val="both"/>
-              <w:rPr>
-                <w:sz w:val="18"/>
-                <w:szCs w:val="18"/>
-              </w:rPr>
-              <w:ind w:left="0" w:firstLine="0"/>
-            </w:pPr>
-            <w:r>
-              <w:rPr>
-                <w:rFonts w:ascii="Georgia" w:hAnsi="Georgia" w:cs="Georgia" w:eastAsia="Georgia"/>
-                <w:sz w:val="22"/>
-                <w:szCs w:val="22"/>
-              </w:rPr>
-            </w:r>
-          </w:p>
-        </w:tc>
-      </w:tr>
-      <w:tr>
-        <w:trPr>
-          <w:cantSplit w:val="1"/>
-          <w:tblHeader w:val="0"/>
-        </w:trPr>
-        <w:tc>
-          <w:tcPr>
-            <w:tcBorders>
-              <w:bottom w:val="single" w:sz="18" w:color="000000" w:space="0"/>
-            </w:tcBorders>
-          </w:tcPr>
-          <w:p>
-            <w:pPr>
-              <w:spacing w:after="60" w:before="60" w:line="240" w:lineRule="auto"/>
-              <w:jc w:val="left"/>
-              <w:rPr>
-                <w:sz w:val="18"/>
-                <w:szCs w:val="18"/>
-              </w:rPr>
-              <w:ind w:left="0" w:firstLine="0"/>
-            </w:pPr>
-            <w:r>
-              <w:rPr>
-                <w:rFonts w:ascii="Georgia" w:hAnsi="Georgia" w:cs="Georgia" w:eastAsia="Georgia"/>
-                <w:sz w:val="22"/>
-                <w:szCs w:val="22"/>
-              </w:rPr>
-              <w:t xml:space="preserve">UNHEDGED ASSERTIONS (Grey Highlight, Optional)</w:t>
-            </w:r>
-            <w:r>
-              <w:rPr>
-                <w:rFonts w:ascii="Georgia" w:hAnsi="Georgia" w:cs="Georgia" w:eastAsia="Georgia"/>
-                <w:sz w:val="22"/>
-                <w:szCs w:val="22"/>
-              </w:rPr>
-            </w:r>
-          </w:p>
-          <w:p>
-            <w:pPr>
-              <w:keepNext w:val="1"/>
-              <w:spacing w:after="60" w:before="60" w:line="240" w:lineRule="auto"/>
-              <w:jc w:val="both"/>
-              <w:rPr>
-                <w:sz w:val="18"/>
-                <w:szCs w:val="18"/>
-              </w:rPr>
-              <w:ind w:left="0" w:firstLine="0"/>
-            </w:pPr>
-            <w:r>
-              <w:rPr>
-                <w:rFonts w:ascii="Georgia" w:hAnsi="Georgia" w:cs="Georgia" w:eastAsia="Georgia"/>
-                <w:sz w:val="22"/>
-                <w:szCs w:val="22"/>
-              </w:rPr>
-              <w:t xml:space="preserve">R = Result, G = Generalization, C = Causal. Bracket the subtype beside the mark.</w:t>
-            </w:r>
-          </w:p>
-        </w:tc>
-        <w:tc>
-          <w:tcPr>
-            <w:tcBorders>
-              <w:bottom w:val="single" w:sz="18" w:color="000000" w:space="0"/>
-            </w:tcBorders>
-          </w:tcPr>
-          <w:p>
-            <w:pPr>
-              <w:keepNext w:val="1"/>
-              <w:spacing w:after="60" w:before="60" w:line="240" w:lineRule="auto"/>
-              <w:jc w:val="left"/>
-              <w:rPr>
-                <w:sz w:val="18"/>
-                <w:szCs w:val="18"/>
-              </w:rPr>
-              <w:ind w:left="0" w:firstLine="0"/>
-            </w:pPr>
-            <w:r>
-              <w:rPr>
-                <w:rFonts w:ascii="Georgia" w:hAnsi="Georgia" w:cs="Georgia" w:eastAsia="Georgia"/>
-                <w:sz w:val="22"/>
-                <w:szCs w:val="22"/>
-              </w:rPr>
-              <w:t xml:space="preserve">FALSE POSITIVE (Strikethrough)</w:t>
-            </w:r>
-            <w:r>
-              <w:rPr>
-                <w:rFonts w:ascii="Georgia" w:hAnsi="Georgia" w:cs="Georgia" w:eastAsia="Georgia"/>
-                <w:sz w:val="22"/>
-                <w:szCs w:val="22"/>
-              </w:rPr>
-            </w:r>
-          </w:p>
-          <w:p>
-            <w:pPr>
-              <w:keepNext w:val="1"/>
-              <w:spacing w:after="60" w:before="60" w:line="240" w:lineRule="auto"/>
-              <w:jc w:val="both"/>
-              <w:rPr>
-                <w:sz w:val="18"/>
-                <w:szCs w:val="18"/>
-              </w:rPr>
-              <w:ind w:left="0" w:firstLine="0"/>
-            </w:pPr>
-            <w:r>
-              <w:rPr>
-                <w:rFonts w:ascii="Georgia" w:hAnsi="Georgia" w:cs="Georgia" w:eastAsia="Georgia"/>
-                <w:sz w:val="22"/>
-                <w:szCs w:val="22"/>
-              </w:rPr>
-              <w:t xml:space="preserve">No highlight. Strike through the token and write the reason code in grey text.</w:t>
+              <w:t xml:space="preserve">No type highlight. Strike the token and write the reason code in grey (FP-Rec, FP-Cap, FP-Proc, FP-Gen).</w:t>
             </w:r>
           </w:p>
         </w:tc>

</xml_diff>

<commit_message>
Draft_127_body: fix QRL and Hedge Function table colors (no spill)
</commit_message>
<xml_diff>
--- a/thesis/003_ThesisProposal_Draft_127_body.docx
+++ b/thesis/003_ThesisProposal_Draft_127_body.docx
@@ -25174,12 +25174,12 @@
         <w:tc>
           <w:tcPr>
             <w:tcW w:w="4680" w:type="dxa"/>
+            <w:vAlign w:val="center"/>
             <w:shd w:val="clear" w:color="auto" w:fill="f2f4f6"/>
           </w:tcPr>
           <w:p>
             <w:pPr>
-              <w:spacing w:before="0" w:after="0" w:line="240" w:lineRule="auto"/>
-              <w:jc w:val="center"/>
+              <w:spacing w:before="40" w:after="40" w:line="240" w:lineRule="auto"/>
             </w:pPr>
             <w:r>
               <w:rPr>
@@ -25195,12 +25195,12 @@
         <w:tc>
           <w:tcPr>
             <w:tcW w:w="4680" w:type="dxa"/>
+            <w:vAlign w:val="center"/>
             <w:shd w:val="clear" w:color="auto" w:fill="f2f4f6"/>
           </w:tcPr>
           <w:p>
             <w:pPr>
-              <w:spacing w:before="0" w:after="0" w:line="240" w:lineRule="auto"/>
-              <w:jc w:val="center"/>
+              <w:spacing w:before="40" w:after="40" w:line="240" w:lineRule="auto"/>
             </w:pPr>
             <w:r>
               <w:rPr>
@@ -25218,11 +25218,12 @@
         <w:tc>
           <w:tcPr>
             <w:tcW w:w="4680" w:type="dxa"/>
+            <w:vAlign w:val="center"/>
             <w:shd w:val="clear" w:color="auto" w:fill="00b0f0"/>
           </w:tcPr>
           <w:p>
             <w:pPr>
-              <w:spacing w:before="0" w:after="0" w:line="240" w:lineRule="auto"/>
+              <w:spacing w:before="40" w:after="40" w:line="240" w:lineRule="auto"/>
             </w:pPr>
             <w:r>
               <w:rPr>
@@ -25239,10 +25240,12 @@
         <w:tc>
           <w:tcPr>
             <w:tcW w:w="4680" w:type="dxa"/>
-          </w:tcPr>
-          <w:p>
-            <w:pPr>
-              <w:spacing w:before="0" w:after="0" w:line="240" w:lineRule="auto"/>
+            <w:vAlign w:val="center"/>
+            <w:shd w:val="clear" w:color="auto" w:fill="FCE4D6"/>
+          </w:tcPr>
+          <w:p>
+            <w:pPr>
+              <w:spacing w:before="40" w:after="40" w:line="240" w:lineRule="auto"/>
             </w:pPr>
             <w:r>
               <w:rPr>
@@ -25261,10 +25264,12 @@
         <w:tc>
           <w:tcPr>
             <w:tcW w:w="4680" w:type="dxa"/>
-          </w:tcPr>
-          <w:p>
-            <w:pPr>
-              <w:spacing w:before="0" w:after="0" w:line="240" w:lineRule="auto"/>
+            <w:vAlign w:val="center"/>
+            <w:shd w:val="clear" w:color="auto" w:fill="ff0000"/>
+          </w:tcPr>
+          <w:p>
+            <w:pPr>
+              <w:spacing w:before="40" w:after="40" w:line="240" w:lineRule="auto"/>
             </w:pPr>
             <w:r>
               <w:rPr>
@@ -25273,7 +25278,6 @@
                 <w:szCs w:val="20"/>
                 <w:b/>
                 <w:color w:val="FFFFFF"/>
-                <w:highlight w:val="red"/>
               </w:rPr>
               <w:t xml:space="preserve">Lexical Hedges</w:t>
             </w:r>
@@ -25282,10 +25286,12 @@
         <w:tc>
           <w:tcPr>
             <w:tcW w:w="4680" w:type="dxa"/>
-          </w:tcPr>
-          <w:p>
-            <w:pPr>
-              <w:spacing w:before="0" w:after="0" w:line="240" w:lineRule="auto"/>
+            <w:vAlign w:val="center"/>
+            <w:shd w:val="clear" w:color="auto" w:fill="E2D5F1"/>
+          </w:tcPr>
+          <w:p>
+            <w:pPr>
+              <w:spacing w:before="40" w:after="40" w:line="240" w:lineRule="auto"/>
             </w:pPr>
             <w:r>
               <w:rPr>
@@ -25304,10 +25310,12 @@
         <w:tc>
           <w:tcPr>
             <w:tcW w:w="4680" w:type="dxa"/>
-          </w:tcPr>
-          <w:p>
-            <w:pPr>
-              <w:spacing w:before="0" w:after="0" w:line="240" w:lineRule="auto"/>
+            <w:vAlign w:val="center"/>
+            <w:shd w:val="clear" w:color="auto" w:fill="ffff00"/>
+          </w:tcPr>
+          <w:p>
+            <w:pPr>
+              <w:spacing w:before="40" w:after="40" w:line="240" w:lineRule="auto"/>
             </w:pPr>
             <w:r>
               <w:rPr>
@@ -25316,7 +25324,6 @@
                 <w:szCs w:val="20"/>
                 <w:b/>
                 <w:color w:val="000000"/>
-                <w:highlight w:val="yellow"/>
               </w:rPr>
               <w:t xml:space="preserve">Adverbial Hedges</w:t>
             </w:r>
@@ -25325,10 +25332,11 @@
         <w:tc>
           <w:tcPr>
             <w:tcW w:w="4680" w:type="dxa"/>
-          </w:tcPr>
-          <w:p>
-            <w:pPr>
-              <w:spacing w:before="0" w:after="0" w:line="240" w:lineRule="auto"/>
+            <w:vAlign w:val="center"/>
+          </w:tcPr>
+          <w:p>
+            <w:pPr>
+              <w:spacing w:before="40" w:after="40" w:line="240" w:lineRule="auto"/>
             </w:pPr>
             <w:r>
               <w:rPr>
@@ -25347,11 +25355,33 @@
         <w:tc>
           <w:tcPr>
             <w:tcW w:w="4680" w:type="dxa"/>
+            <w:vAlign w:val="center"/>
             <w:shd w:val="clear" w:color="auto" w:fill="00b050"/>
           </w:tcPr>
           <w:p>
             <w:pPr>
-              <w:spacing w:before="0" w:after="0" w:line="240" w:lineRule="auto"/>
+              <w:spacing w:before="40" w:after="40" w:line="240" w:lineRule="auto"/>
+            </w:pPr>
+            <w:r>
+              <w:rPr>
+                <w:rFonts w:ascii="Georgia" w:hAnsi="Georgia"/>
+                <w:sz w:val="20"/>
+                <w:szCs w:val="20"/>
+                <w:b/>
+                <w:color w:val="FFFFFF"/>
+              </w:rPr>
+              <w:t xml:space="preserve">Clause-Level Hedges</w:t>
+            </w:r>
+          </w:p>
+        </w:tc>
+        <w:tc>
+          <w:tcPr>
+            <w:tcW w:w="4680" w:type="dxa"/>
+            <w:vAlign w:val="center"/>
+          </w:tcPr>
+          <w:p>
+            <w:pPr>
+              <w:spacing w:before="40" w:after="40" w:line="240" w:lineRule="auto"/>
             </w:pPr>
             <w:r>
               <w:rPr>
@@ -25361,25 +25391,7 @@
                 <w:b/>
                 <w:color w:val="000000"/>
               </w:rPr>
-              <w:t xml:space="preserve">Clause-Level Hedges</w:t>
-            </w:r>
-          </w:p>
-        </w:tc>
-        <w:tc>
-          <w:tcPr>
-            <w:tcW w:w="4680" w:type="dxa"/>
-          </w:tcPr>
-          <w:p>
-            <w:pPr>
-              <w:spacing w:before="0" w:after="0" w:line="240" w:lineRule="auto"/>
-            </w:pPr>
-            <w:r>
-              <w:rPr>
-                <w:rFonts w:ascii="Georgia" w:hAnsi="Georgia"/>
-                <w:sz w:val="20"/>
-                <w:szCs w:val="20"/>
-              </w:rPr>
-              <w:t xml:space="preserve"/>
+              <w:t xml:space="preserve">—</w:t>
             </w:r>
           </w:p>
         </w:tc>
@@ -25388,11 +25400,12 @@
         <w:tc>
           <w:tcPr>
             <w:tcW w:w="4680" w:type="dxa"/>
-            <w:shd w:val="clear" w:color="auto" w:fill="F2F2F2"/>
-          </w:tcPr>
-          <w:p>
-            <w:pPr>
-              <w:spacing w:before="0" w:after="0" w:line="240" w:lineRule="auto"/>
+            <w:vAlign w:val="center"/>
+            <w:shd w:val="clear" w:color="auto" w:fill="bfbfbf"/>
+          </w:tcPr>
+          <w:p>
+            <w:pPr>
+              <w:spacing w:before="40" w:after="40" w:line="240" w:lineRule="auto"/>
             </w:pPr>
             <w:r>
               <w:rPr>
@@ -25400,42 +25413,35 @@
                 <w:sz w:val="20"/>
                 <w:szCs w:val="20"/>
                 <w:b/>
-                <w:shd w:val="clear" w:color="auto" w:fill="bfbfbf"/>
+                <w:color w:val="000000"/>
               </w:rPr>
               <w:t xml:space="preserve">UNHEDGED ASSERTIONS</w:t>
             </w:r>
-            <w:r>
-              <w:rPr>
-                <w:rFonts w:ascii="Georgia" w:hAnsi="Georgia"/>
-                <w:sz w:val="20"/>
-                <w:szCs w:val="20"/>
-                <w:color w:val="404040"/>
-              </w:rPr>
-              <w:t xml:space="preserve"> (Grey highlight, optional)</w:t>
-            </w:r>
-          </w:p>
-          <w:p>
-            <w:pPr>
-              <w:spacing w:before="0" w:after="0" w:line="240" w:lineRule="auto"/>
+          </w:p>
+          <w:p>
+            <w:pPr>
+              <w:spacing w:before="40" w:after="40" w:line="240" w:lineRule="auto"/>
             </w:pPr>
             <w:r>
               <w:rPr>
                 <w:rFonts w:ascii="Georgia" w:hAnsi="Georgia"/>
                 <w:sz w:val="18"/>
                 <w:szCs w:val="18"/>
-              </w:rPr>
-              <w:t xml:space="preserve">R = Result, G = Generalization, C = Causal. Bracket the subtype beside the mark.</w:t>
+                <w:color w:val="404040"/>
+              </w:rPr>
+              <w:t xml:space="preserve">Grey fill. Optional. R / G / C brackets beside the mark.</w:t>
             </w:r>
           </w:p>
         </w:tc>
         <w:tc>
           <w:tcPr>
             <w:tcW w:w="4680" w:type="dxa"/>
+            <w:vAlign w:val="center"/>
             <w:shd w:val="clear" w:color="auto" w:fill="F2F2F2"/>
           </w:tcPr>
           <w:p>
             <w:pPr>
-              <w:spacing w:before="0" w:after="0" w:line="240" w:lineRule="auto"/>
+              <w:spacing w:before="40" w:after="40" w:line="240" w:lineRule="auto"/>
             </w:pPr>
             <w:r>
               <w:rPr>
@@ -25448,27 +25454,19 @@
               </w:rPr>
               <w:t xml:space="preserve">FALSE POSITIVE</w:t>
             </w:r>
-            <w:r>
-              <w:rPr>
-                <w:rFonts w:ascii="Georgia" w:hAnsi="Georgia"/>
-                <w:sz w:val="20"/>
-                <w:szCs w:val="20"/>
-                <w:color w:val="808080"/>
-              </w:rPr>
-              <w:t xml:space="preserve"> (Strikethrough)</w:t>
-            </w:r>
-          </w:p>
-          <w:p>
-            <w:pPr>
-              <w:spacing w:before="0" w:after="0" w:line="240" w:lineRule="auto"/>
+          </w:p>
+          <w:p>
+            <w:pPr>
+              <w:spacing w:before="40" w:after="40" w:line="240" w:lineRule="auto"/>
             </w:pPr>
             <w:r>
               <w:rPr>
                 <w:rFonts w:ascii="Georgia" w:hAnsi="Georgia"/>
                 <w:sz w:val="18"/>
                 <w:szCs w:val="18"/>
-              </w:rPr>
-              <w:t xml:space="preserve">No type highlight. Strike the token and write the reason code in grey (FP-Rec, FP-Cap, FP-Proc, FP-Gen).</w:t>
+                <w:color w:val="808080"/>
+              </w:rPr>
+              <w:t xml:space="preserve">Strikethrough + grey reason code (FP-Rec, FP-Cap, FP-Proc, FP-Gen). Not a function.</w:t>
             </w:r>
           </w:p>
         </w:tc>
@@ -27095,8 +27093,26 @@
           </w:tcPr>
           <w:p>
             <w:pPr>
-              <w:spacing w:after="60" w:before="60" w:line="240" w:lineRule="auto"/>
-              <w:jc w:val="left"/>
+              <w:spacing w:before="40" w:after="40" w:line="240" w:lineRule="auto"/>
+            </w:pPr>
+            <w:r>
+              <w:rPr>
+                <w:rFonts w:ascii="Georgia" w:hAnsi="Georgia"/>
+                <w:sz w:val="20"/>
+                <w:szCs w:val="20"/>
+                <w:b/>
+                <w:color w:val="ED7D31"/>
+              </w:rPr>
+              <w:t xml:space="preserve">EC</w:t>
+            </w:r>
+          </w:p>
+        </w:tc>
+        <w:tc>
+          <w:tcPr/>
+          <w:p>
+            <w:pPr>
+              <w:spacing w:after="60" w:before="60" w:line="240" w:lineRule="auto"/>
+              <w:jc w:val="both"/>
               <w:rPr>
                 <w:sz w:val="18"/>
                 <w:szCs w:val="18"/>
@@ -27108,17 +27124,8 @@
                 <w:rFonts w:ascii="Georgia" w:hAnsi="Georgia" w:cs="Georgia" w:eastAsia="Georgia"/>
                 <w:sz w:val="22"/>
                 <w:szCs w:val="22"/>
-                <w:color w:val="ED7D31"/>
-              </w:rPr>
-              <w:t xml:space="preserve">EC</w:t>
-            </w:r>
-            <w:r>
-              <w:rPr>
-                <w:rFonts w:ascii="Georgia" w:hAnsi="Georgia" w:cs="Georgia" w:eastAsia="Georgia"/>
-                <w:sz w:val="22"/>
-                <w:szCs w:val="22"/>
-                <w:color w:val="ED7D31"/>
-              </w:rPr>
+              </w:rPr>
+              <w:t xml:space="preserve">Epistemic Caution</w:t>
             </w:r>
           </w:p>
         </w:tc>
@@ -27140,7 +27147,7 @@
                 <w:sz w:val="22"/>
                 <w:szCs w:val="22"/>
               </w:rPr>
-              <w:t xml:space="preserve">Epistemic Caution</w:t>
+              <w:t xml:space="preserve">Expresses uncertainty about a claim’s truth.</w:t>
             </w:r>
           </w:p>
         </w:tc>
@@ -27148,82 +27155,50 @@
           <w:tcPr/>
           <w:p>
             <w:pPr>
-              <w:spacing w:after="60" w:before="60" w:line="240" w:lineRule="auto"/>
-              <w:jc w:val="both"/>
-              <w:rPr>
-                <w:sz w:val="18"/>
-                <w:szCs w:val="18"/>
-              </w:rPr>
-              <w:ind w:left="0" w:firstLine="0"/>
-            </w:pPr>
-            <w:r>
-              <w:rPr>
-                <w:rFonts w:ascii="Georgia" w:hAnsi="Georgia" w:cs="Georgia" w:eastAsia="Georgia"/>
-                <w:sz w:val="22"/>
-                <w:szCs w:val="22"/>
-              </w:rPr>
-              <w:t xml:space="preserve">Expresses uncertainty about a claim’s truth.</w:t>
-            </w:r>
-          </w:p>
-        </w:tc>
-        <w:tc>
-          <w:tcPr/>
-          <w:p>
-            <w:pPr>
-              <w:spacing w:after="60" w:before="60" w:line="240" w:lineRule="auto"/>
-              <w:jc w:val="both"/>
-              <w:rPr>
-                <w:sz w:val="18"/>
-                <w:szCs w:val="18"/>
-              </w:rPr>
-              <w:ind w:left="0" w:firstLine="0"/>
-            </w:pPr>
-            <w:r>
-              <w:rPr>
-                <w:rFonts w:ascii="Georgia" w:hAnsi="Georgia" w:cs="Georgia" w:eastAsia="Georgia"/>
-                <w:sz w:val="22"/>
-                <w:szCs w:val="22"/>
+              <w:spacing w:before="40" w:after="40" w:line="240" w:lineRule="auto"/>
+            </w:pPr>
+            <w:r>
+              <w:rPr>
+                <w:rFonts w:ascii="Georgia" w:hAnsi="Georgia"/>
+                <w:sz w:val="20"/>
+                <w:szCs w:val="20"/>
               </w:rPr>
               <w:t xml:space="preserve">“The treatment </w:t>
             </w:r>
             <w:r>
               <w:rPr>
-                <w:rFonts w:ascii="Georgia" w:hAnsi="Georgia" w:cs="Georgia" w:eastAsia="Georgia"/>
-                <w:sz w:val="22"/>
-                <w:szCs w:val="22"/>
+                <w:rFonts w:ascii="Georgia" w:hAnsi="Georgia"/>
+                <w:sz w:val="20"/>
+                <w:szCs w:val="20"/>
+                <w:shd w:val="clear" w:color="auto" w:fill="00b0f0"/>
               </w:rPr>
               <w:t xml:space="preserve">may</w:t>
             </w:r>
             <w:r>
               <w:rPr>
-                <w:rFonts w:ascii="Georgia" w:hAnsi="Georgia" w:cs="Georgia" w:eastAsia="Georgia"/>
-                <w:sz w:val="22"/>
-                <w:szCs w:val="22"/>
+                <w:rFonts w:ascii="Georgia" w:hAnsi="Georgia"/>
+                <w:sz w:val="20"/>
+                <w:szCs w:val="20"/>
               </w:rPr>
               <w:t xml:space="preserve"> reduce infection rates. </w:t>
             </w:r>
             <w:r>
               <w:rPr>
-                <w:rFonts w:ascii="Georgia" w:hAnsi="Georgia" w:cs="Georgia" w:eastAsia="Georgia"/>
-                <w:sz w:val="22"/>
-                <w:szCs w:val="22"/>
+                <w:rFonts w:ascii="Georgia" w:hAnsi="Georgia"/>
+                <w:sz w:val="20"/>
+                <w:szCs w:val="20"/>
+                <w:b/>
+                <w:color w:val="ED7D31"/>
               </w:rPr>
               <w:t xml:space="preserve">(EC)</w:t>
             </w:r>
             <w:r>
               <w:rPr>
-                <w:rFonts w:ascii="Georgia" w:hAnsi="Georgia" w:cs="Georgia" w:eastAsia="Georgia"/>
-                <w:sz w:val="22"/>
-                <w:szCs w:val="22"/>
+                <w:rFonts w:ascii="Georgia" w:hAnsi="Georgia"/>
+                <w:sz w:val="20"/>
+                <w:szCs w:val="20"/>
               </w:rPr>
               <w:t xml:space="preserve">”</w:t>
-            </w:r>
-            <w:r>
-              <w:rPr>
-                <w:rFonts w:ascii="Georgia" w:hAnsi="Georgia" w:cs="Georgia" w:eastAsia="Georgia"/>
-                <w:sz w:val="22"/>
-                <w:szCs w:val="22"/>
-              </w:rPr>
             </w:r>
           </w:p>
         </w:tc>
@@ -27239,8 +27214,26 @@
           </w:tcPr>
           <w:p>
             <w:pPr>
-              <w:spacing w:after="60" w:before="60" w:line="240" w:lineRule="auto"/>
-              <w:jc w:val="left"/>
+              <w:spacing w:before="40" w:after="40" w:line="240" w:lineRule="auto"/>
+            </w:pPr>
+            <w:r>
+              <w:rPr>
+                <w:rFonts w:ascii="Georgia" w:hAnsi="Georgia"/>
+                <w:sz w:val="20"/>
+                <w:szCs w:val="20"/>
+                <w:b/>
+                <w:color w:val="7030A0"/>
+              </w:rPr>
+              <w:t xml:space="preserve">P</w:t>
+            </w:r>
+          </w:p>
+        </w:tc>
+        <w:tc>
+          <w:tcPr/>
+          <w:p>
+            <w:pPr>
+              <w:spacing w:after="60" w:before="60" w:line="240" w:lineRule="auto"/>
+              <w:jc w:val="both"/>
               <w:rPr>
                 <w:sz w:val="18"/>
                 <w:szCs w:val="18"/>
@@ -27252,17 +27245,8 @@
                 <w:rFonts w:ascii="Georgia" w:hAnsi="Georgia" w:cs="Georgia" w:eastAsia="Georgia"/>
                 <w:sz w:val="22"/>
                 <w:szCs w:val="22"/>
-                <w:color w:val="7030A0"/>
-              </w:rPr>
-              <w:t xml:space="preserve">P</w:t>
-            </w:r>
-            <w:r>
-              <w:rPr>
-                <w:rFonts w:ascii="Georgia" w:hAnsi="Georgia" w:cs="Georgia" w:eastAsia="Georgia"/>
-                <w:sz w:val="22"/>
-                <w:szCs w:val="22"/>
-                <w:color w:val="7030A0"/>
-              </w:rPr>
+              </w:rPr>
+              <w:t xml:space="preserve">Politeness / Deference</w:t>
             </w:r>
           </w:p>
         </w:tc>
@@ -27284,7 +27268,7 @@
                 <w:sz w:val="22"/>
                 <w:szCs w:val="22"/>
               </w:rPr>
-              <w:t xml:space="preserve">Politeness / Deference</w:t>
+              <w:t xml:space="preserve">Shows respect to readers or prior research.</w:t>
             </w:r>
           </w:p>
         </w:tc>
@@ -27292,82 +27276,51 @@
           <w:tcPr/>
           <w:p>
             <w:pPr>
-              <w:spacing w:after="60" w:before="60" w:line="240" w:lineRule="auto"/>
-              <w:jc w:val="both"/>
-              <w:rPr>
-                <w:sz w:val="18"/>
-                <w:szCs w:val="18"/>
-              </w:rPr>
-              <w:ind w:left="0" w:firstLine="0"/>
-            </w:pPr>
-            <w:r>
-              <w:rPr>
-                <w:rFonts w:ascii="Georgia" w:hAnsi="Georgia" w:cs="Georgia" w:eastAsia="Georgia"/>
-                <w:sz w:val="22"/>
-                <w:szCs w:val="22"/>
-              </w:rPr>
-              <w:t xml:space="preserve">Shows respect to readers or prior research.</w:t>
-            </w:r>
-          </w:p>
-        </w:tc>
-        <w:tc>
-          <w:tcPr/>
-          <w:p>
-            <w:pPr>
-              <w:spacing w:after="60" w:before="60" w:line="240" w:lineRule="auto"/>
-              <w:jc w:val="both"/>
-              <w:rPr>
-                <w:sz w:val="18"/>
-                <w:szCs w:val="18"/>
-              </w:rPr>
-              <w:ind w:left="0" w:firstLine="0"/>
-            </w:pPr>
-            <w:r>
-              <w:rPr>
-                <w:rFonts w:ascii="Georgia" w:hAnsi="Georgia" w:cs="Georgia" w:eastAsia="Georgia"/>
-                <w:sz w:val="22"/>
-                <w:szCs w:val="22"/>
+              <w:spacing w:before="40" w:after="40" w:line="240" w:lineRule="auto"/>
+            </w:pPr>
+            <w:r>
+              <w:rPr>
+                <w:rFonts w:ascii="Georgia" w:hAnsi="Georgia"/>
+                <w:sz w:val="20"/>
+                <w:szCs w:val="20"/>
               </w:rPr>
               <w:t xml:space="preserve">“As </w:t>
             </w:r>
             <w:r>
               <w:rPr>
-                <w:rFonts w:ascii="Georgia" w:hAnsi="Georgia" w:cs="Georgia" w:eastAsia="Georgia"/>
-                <w:sz w:val="22"/>
-                <w:szCs w:val="22"/>
+                <w:rFonts w:ascii="Georgia" w:hAnsi="Georgia"/>
+                <w:sz w:val="20"/>
+                <w:szCs w:val="20"/>
+                <w:color w:val="FFFFFF"/>
+                <w:highlight w:val="red"/>
               </w:rPr>
               <w:t xml:space="preserve">suggested</w:t>
             </w:r>
             <w:r>
               <w:rPr>
-                <w:rFonts w:ascii="Georgia" w:hAnsi="Georgia" w:cs="Georgia" w:eastAsia="Georgia"/>
-                <w:sz w:val="22"/>
-                <w:szCs w:val="22"/>
+                <w:rFonts w:ascii="Georgia" w:hAnsi="Georgia"/>
+                <w:sz w:val="20"/>
+                <w:szCs w:val="20"/>
               </w:rPr>
               <w:t xml:space="preserve"> by Hyland (1998). </w:t>
             </w:r>
             <w:r>
               <w:rPr>
-                <w:rFonts w:ascii="Georgia" w:hAnsi="Georgia" w:cs="Georgia" w:eastAsia="Georgia"/>
-                <w:sz w:val="22"/>
-                <w:szCs w:val="22"/>
+                <w:rFonts w:ascii="Georgia" w:hAnsi="Georgia"/>
+                <w:sz w:val="20"/>
+                <w:szCs w:val="20"/>
+                <w:b/>
+                <w:color w:val="7030A0"/>
               </w:rPr>
               <w:t xml:space="preserve">(P)</w:t>
             </w:r>
             <w:r>
               <w:rPr>
-                <w:rFonts w:ascii="Georgia" w:hAnsi="Georgia" w:cs="Georgia" w:eastAsia="Georgia"/>
-                <w:sz w:val="22"/>
-                <w:szCs w:val="22"/>
+                <w:rFonts w:ascii="Georgia" w:hAnsi="Georgia"/>
+                <w:sz w:val="20"/>
+                <w:szCs w:val="20"/>
               </w:rPr>
               <w:t xml:space="preserve">”</w:t>
-            </w:r>
-            <w:r>
-              <w:rPr>
-                <w:rFonts w:ascii="Georgia" w:hAnsi="Georgia" w:cs="Georgia" w:eastAsia="Georgia"/>
-                <w:sz w:val="22"/>
-                <w:szCs w:val="22"/>
-              </w:rPr>
             </w:r>
           </w:p>
         </w:tc>
@@ -27386,8 +27339,30 @@
           </w:tcPr>
           <w:p>
             <w:pPr>
-              <w:spacing w:after="60" w:before="60" w:line="240" w:lineRule="auto"/>
-              <w:jc w:val="left"/>
+              <w:spacing w:before="40" w:after="40" w:line="240" w:lineRule="auto"/>
+            </w:pPr>
+            <w:r>
+              <w:rPr>
+                <w:rFonts w:ascii="Georgia" w:hAnsi="Georgia"/>
+                <w:sz w:val="20"/>
+                <w:szCs w:val="20"/>
+                <w:b/>
+                <w:color w:val="808080"/>
+              </w:rPr>
+              <w:t xml:space="preserve">FP</w:t>
+            </w:r>
+          </w:p>
+        </w:tc>
+        <w:tc>
+          <w:tcPr>
+            <w:tcBorders>
+              <w:bottom w:val="single" w:sz="18" w:color="000000" w:space="0"/>
+            </w:tcBorders>
+          </w:tcPr>
+          <w:p>
+            <w:pPr>
+              <w:spacing w:after="60" w:before="60" w:line="240" w:lineRule="auto"/>
+              <w:jc w:val="both"/>
               <w:rPr>
                 <w:sz w:val="18"/>
                 <w:szCs w:val="18"/>
@@ -27399,17 +27374,8 @@
                 <w:rFonts w:ascii="Georgia" w:hAnsi="Georgia" w:cs="Georgia" w:eastAsia="Georgia"/>
                 <w:sz w:val="22"/>
                 <w:szCs w:val="22"/>
-                <w:color w:val="808080"/>
-              </w:rPr>
-              <w:t xml:space="preserve">FP</w:t>
-            </w:r>
-            <w:r>
-              <w:rPr>
-                <w:rFonts w:ascii="Georgia" w:hAnsi="Georgia" w:cs="Georgia" w:eastAsia="Georgia"/>
-                <w:sz w:val="22"/>
-                <w:szCs w:val="22"/>
-                <w:color w:val="808080"/>
-              </w:rPr>
+              </w:rPr>
+              <w:t xml:space="preserve">(not a function)</w:t>
             </w:r>
           </w:p>
         </w:tc>
@@ -27435,7 +27401,7 @@
                 <w:sz w:val="22"/>
                 <w:szCs w:val="22"/>
               </w:rPr>
-              <w:t xml:space="preserve">(not a function)</w:t>
+              <w:t xml:space="preserve">Fails Working Test and Reader Test</w:t>
             </w:r>
           </w:p>
         </w:tc>
@@ -27447,54 +27413,33 @@
           </w:tcPr>
           <w:p>
             <w:pPr>
-              <w:spacing w:after="60" w:before="60" w:line="240" w:lineRule="auto"/>
-              <w:jc w:val="both"/>
-              <w:rPr>
-                <w:sz w:val="18"/>
-                <w:szCs w:val="18"/>
-              </w:rPr>
-              <w:ind w:left="0" w:firstLine="0"/>
-            </w:pPr>
-            <w:r>
-              <w:rPr>
-                <w:rFonts w:ascii="Georgia" w:hAnsi="Georgia" w:cs="Georgia" w:eastAsia="Georgia"/>
-                <w:sz w:val="22"/>
-                <w:szCs w:val="22"/>
-              </w:rPr>
-              <w:t xml:space="preserve">Fails Working Test and Reader Test</w:t>
-            </w:r>
-          </w:p>
-        </w:tc>
-        <w:tc>
-          <w:tcPr>
-            <w:tcBorders>
-              <w:bottom w:val="single" w:sz="18" w:color="000000" w:space="0"/>
-            </w:tcBorders>
-          </w:tcPr>
-          <w:p>
-            <w:pPr>
-              <w:spacing w:after="60" w:before="60" w:line="240" w:lineRule="auto"/>
-              <w:jc w:val="both"/>
-              <w:rPr>
-                <w:sz w:val="18"/>
-                <w:szCs w:val="18"/>
-              </w:rPr>
-              <w:ind w:left="0" w:firstLine="0"/>
-            </w:pPr>
-            <w:r>
-              <w:rPr>
-                <w:rFonts w:ascii="Georgia" w:hAnsi="Georgia" w:cs="Georgia" w:eastAsia="Georgia"/>
-                <w:sz w:val="22"/>
-                <w:szCs w:val="22"/>
-              </w:rPr>
-              <w:t xml:space="preserve">“In conclusion, T3 produced the highest yield.”</w:t>
-            </w:r>
-            <w:r>
-              <w:rPr>
-                <w:rFonts w:ascii="Georgia" w:hAnsi="Georgia" w:cs="Georgia" w:eastAsia="Georgia"/>
-                <w:sz w:val="22"/>
-                <w:szCs w:val="22"/>
-              </w:rPr>
+              <w:spacing w:before="40" w:after="40" w:line="240" w:lineRule="auto"/>
+            </w:pPr>
+            <w:r>
+              <w:rPr>
+                <w:rFonts w:ascii="Georgia" w:hAnsi="Georgia"/>
+                <w:sz w:val="20"/>
+                <w:szCs w:val="20"/>
+              </w:rPr>
+              <w:t xml:space="preserve">“</w:t>
+            </w:r>
+            <w:r>
+              <w:rPr>
+                <w:rFonts w:ascii="Georgia" w:hAnsi="Georgia"/>
+                <w:sz w:val="20"/>
+                <w:szCs w:val="20"/>
+                <w:color w:val="808080"/>
+                <w:strike/>
+              </w:rPr>
+              <w:t xml:space="preserve">In conclusion</w:t>
+            </w:r>
+            <w:r>
+              <w:rPr>
+                <w:rFonts w:ascii="Georgia" w:hAnsi="Georgia"/>
+                <w:sz w:val="20"/>
+                <w:szCs w:val="20"/>
+              </w:rPr>
+              <w:t xml:space="preserve">, T3 produced the highest yield.”</w:t>
             </w:r>
           </w:p>
         </w:tc>

</xml_diff>

<commit_message>
Draft_127_body: restore Appendix A as exact copy from 009_Appendices
</commit_message>
<xml_diff>
--- a/thesis/003_ThesisProposal_Draft_127_body.docx
+++ b/thesis/003_ThesisProposal_Draft_127_body.docx
@@ -24805,27 +24805,27 @@
     </w:p>
     <w:p>
       <w:pPr>
-        <w:spacing w:before="0" w:after="0" w:line="480" w:lineRule="auto"/>
-        <w:jc w:val="center"/>
-        <w:ind w:left="0" w:firstLine="0"/>
-      </w:pPr>
-      <w:r>
-        <w:rPr>
-          <w:rFonts w:ascii="Georgia" w:hAnsi="Georgia" w:cs="Georgia" w:eastAsia="Georgia"/>
-          <w:b/>
-          <w:bCs/>
-          <w:sz w:val="28"/>
-          <w:szCs w:val="28"/>
+        <w:pStyle w:val="Heading1"/>
+        <w:spacing w:after="40" w:before="0" w:line="480" w:lineRule="auto"/>
+        <w:jc w:val="left"/>
+        <w:rPr>
+          <w:sz w:val="24"/>
+          <w:szCs w:val="24"/>
+        </w:rPr>
+      </w:pPr>
+      <w:r>
+        <w:rPr>
+          <w:b w:val="1"/>
+          <w:bCs w:val="1"/>
+          <w:sz w:val="24"/>
+          <w:szCs w:val="24"/>
+          <w:rtl w:val="0"/>
         </w:rPr>
         <w:t xml:space="preserve">APPENDIX A: HEDGING CODEBOOK</w:t>
       </w:r>
       <w:r>
         <w:rPr>
-          <w:rFonts w:ascii="Georgia" w:hAnsi="Georgia" w:cs="Georgia" w:eastAsia="Georgia"/>
-          <w:b/>
-          <w:bCs/>
-          <w:sz w:val="28"/>
-          <w:szCs w:val="28"/>
+          <w:rtl w:val="0"/>
         </w:rPr>
       </w:r>
     </w:p>
@@ -25094,325 +25094,469 @@
           <w:bCs w:val="1"/>
           <w:rtl w:val="0"/>
         </w:rPr>
-        <w:t xml:space="preserve">• Highlights = type on the token as in 009_Appendices: Modal = cyan fill (#00B0F0); Lexical = red highlight + white text; Adverbial = yellow highlight; Clause-level = green fill (#00B050). Function labels: EC = orange (#ED7D31); P = purple (#7030A0). Grey fill = unhedged. Strike + grey code = FP.</w:t>
-      </w:r>
-      <w:r>
-        <w:rPr>
-          <w:rtl w:val="0"/>
-        </w:rPr>
-        <w:t xml:space="preserve"/>
+        <w:t xml:space="preserve">• Highlights = type background on the token. </w:t>
+      </w:r>
+      <w:r>
+        <w:rPr>
+          <w:rtl w:val="0"/>
+        </w:rPr>
+        <w:t xml:space="preserve">Colored text labels = function. Grey = unhedged verb. Strike + grey code = FP.</w:t>
       </w:r>
     </w:p>
     <w:tbl>
       <w:tblPr>
-        <w:tblW w:w="9360" w:type="dxa"/>
-        <w:tblBorders>
-          <w:top w:val="single" w:sz="4" w:space="0" w:color="000000"/>
-          <w:left w:val="single" w:sz="4" w:space="0" w:color="000000"/>
-          <w:bottom w:val="single" w:sz="4" w:space="0" w:color="000000"/>
-          <w:right w:val="single" w:sz="4" w:space="0" w:color="000000"/>
-          <w:insideH w:val="single" w:sz="4" w:space="0" w:color="000000"/>
-          <w:insideV w:val="single" w:sz="4" w:space="0" w:color="000000"/>
-        </w:tblBorders>
+        <w:tblStyle w:val="Table8"/>
+        <w:tblW w:w="8305.0" w:type="dxa"/>
+        <w:jc w:val="left"/>
+        <w:tblInd w:w="-148.0" w:type="dxa"/>
+        <w:tblLayout w:type="fixed"/>
+        <w:tblLook w:val="0400"/>
       </w:tblPr>
       <w:tblGrid>
-        <w:gridCol w:w="4680"/>
-        <w:gridCol w:w="4680"/>
+        <w:gridCol w:w="4153"/>
+        <w:gridCol w:w="4152"/>
+        <w:tblGridChange w:id="0">
+          <w:tblGrid>
+            <w:gridCol w:w="4153"/>
+            <w:gridCol w:w="4152"/>
+          </w:tblGrid>
+        </w:tblGridChange>
       </w:tblGrid>
       <w:tr>
-        <w:tc>
-          <w:tcPr>
-            <w:tcW w:w="4680" w:type="dxa"/>
-            <w:vAlign w:val="center"/>
-            <w:shd w:val="clear" w:color="auto" w:fill="f2f4f6"/>
-          </w:tcPr>
-          <w:p>
-            <w:pPr>
-              <w:spacing w:before="40" w:after="40" w:line="240" w:lineRule="auto"/>
-            </w:pPr>
-            <w:r>
-              <w:rPr>
-                <w:rFonts w:ascii="Georgia" w:hAnsi="Georgia"/>
-                <w:sz w:val="20"/>
-                <w:szCs w:val="20"/>
-                <w:b/>
+        <w:trPr>
+          <w:cantSplit w:val="1"/>
+          <w:tblHeader w:val="1"/>
+        </w:trPr>
+        <w:tc>
+          <w:tcPr>
+            <w:tcBorders>
+              <w:top w:color="000000" w:space="0" w:sz="18" w:val="single"/>
+              <w:bottom w:color="000000" w:space="0" w:sz="4" w:val="single"/>
+            </w:tcBorders>
+            <w:shd w:fill="f2f4f6" w:val="clear"/>
+          </w:tcPr>
+          <w:p>
+            <w:pPr>
+              <w:keepNext w:val="1"/>
+              <w:spacing w:after="0" w:before="0" w:line="480" w:lineRule="auto"/>
+              <w:jc w:val="both"/>
+              <w:rPr>
+                <w:sz w:val="18"/>
+                <w:szCs w:val="18"/>
+              </w:rPr>
+            </w:pPr>
+            <w:r>
+              <w:rPr>
+                <w:b w:val="1"/>
+                <w:bCs w:val="1"/>
+                <w:sz w:val="18"/>
+                <w:szCs w:val="18"/>
+                <w:rtl w:val="0"/>
               </w:rPr>
               <w:t xml:space="preserve">TYPE (Highlight)</w:t>
             </w:r>
-          </w:p>
-        </w:tc>
-        <w:tc>
-          <w:tcPr>
-            <w:tcW w:w="4680" w:type="dxa"/>
-            <w:vAlign w:val="center"/>
-            <w:shd w:val="clear" w:color="auto" w:fill="f2f4f6"/>
-          </w:tcPr>
-          <w:p>
-            <w:pPr>
-              <w:spacing w:before="40" w:after="40" w:line="240" w:lineRule="auto"/>
-            </w:pPr>
-            <w:r>
-              <w:rPr>
-                <w:rFonts w:ascii="Georgia" w:hAnsi="Georgia"/>
-                <w:sz w:val="20"/>
-                <w:szCs w:val="20"/>
-                <w:b/>
+            <w:r>
+              <w:rPr>
+                <w:rtl w:val="0"/>
+              </w:rPr>
+            </w:r>
+          </w:p>
+        </w:tc>
+        <w:tc>
+          <w:tcPr>
+            <w:tcBorders>
+              <w:top w:color="000000" w:space="0" w:sz="18" w:val="single"/>
+              <w:bottom w:color="000000" w:space="0" w:sz="4" w:val="single"/>
+            </w:tcBorders>
+            <w:shd w:fill="f2f4f6" w:val="clear"/>
+          </w:tcPr>
+          <w:p>
+            <w:pPr>
+              <w:keepNext w:val="1"/>
+              <w:spacing w:after="0" w:before="0" w:line="480" w:lineRule="auto"/>
+              <w:jc w:val="both"/>
+              <w:rPr>
+                <w:sz w:val="18"/>
+                <w:szCs w:val="18"/>
+              </w:rPr>
+            </w:pPr>
+            <w:r>
+              <w:rPr>
+                <w:b w:val="1"/>
+                <w:bCs w:val="1"/>
+                <w:sz w:val="18"/>
+                <w:szCs w:val="18"/>
+                <w:rtl w:val="0"/>
               </w:rPr>
               <w:t xml:space="preserve">FUNCTION (Text)</w:t>
+            </w:r>
+            <w:r>
+              <w:rPr>
+                <w:rtl w:val="0"/>
+              </w:rPr>
             </w:r>
           </w:p>
         </w:tc>
       </w:tr>
       <w:tr>
-        <w:tc>
-          <w:tcPr>
-            <w:tcW w:w="4680" w:type="dxa"/>
-            <w:vAlign w:val="center"/>
-            <w:shd w:val="clear" w:color="auto" w:fill="00b0f0"/>
-          </w:tcPr>
-          <w:p>
-            <w:pPr>
-              <w:spacing w:before="40" w:after="40" w:line="240" w:lineRule="auto"/>
-            </w:pPr>
-            <w:r>
-              <w:rPr>
-                <w:rFonts w:ascii="Georgia" w:hAnsi="Georgia"/>
-                <w:sz w:val="20"/>
-                <w:szCs w:val="20"/>
-                <w:b/>
+        <w:trPr>
+          <w:cantSplit w:val="1"/>
+          <w:tblHeader w:val="0"/>
+        </w:trPr>
+        <w:tc>
+          <w:tcPr/>
+          <w:p>
+            <w:pPr>
+              <w:keepNext w:val="1"/>
+              <w:spacing w:after="0" w:before="0" w:line="480" w:lineRule="auto"/>
+              <w:jc w:val="both"/>
+              <w:rPr>
+                <w:sz w:val="18"/>
+                <w:szCs w:val="18"/>
+              </w:rPr>
+            </w:pPr>
+            <w:r>
+              <w:rPr>
+                <w:sz w:val="18"/>
+                <w:szCs w:val="18"/>
+                <w:shd w:fill="00b0f0" w:val="clear"/>
+                <w:rtl w:val="0"/>
+              </w:rPr>
+              <w:t xml:space="preserve">      </w:t>
+            </w:r>
+            <w:r>
+              <w:rPr>
+                <w:i w:val="0"/>
+                <w:iCs w:val="0"/>
                 <w:color w:val="000000"/>
-              </w:rPr>
-              <w:t xml:space="preserve">Modal Verbs</w:t>
-            </w:r>
-          </w:p>
-        </w:tc>
-        <w:tc>
-          <w:tcPr>
-            <w:tcW w:w="4680" w:type="dxa"/>
-            <w:vAlign w:val="center"/>
-          </w:tcPr>
-          <w:p>
-            <w:pPr>
-              <w:spacing w:before="40" w:after="40" w:line="240" w:lineRule="auto"/>
-            </w:pPr>
-            <w:r>
-              <w:rPr>
-                <w:rFonts w:ascii="Georgia" w:hAnsi="Georgia"/>
-                <w:sz w:val="20"/>
-                <w:szCs w:val="20"/>
-                <w:b/>
+                <w:sz w:val="18"/>
+                <w:szCs w:val="18"/>
+                <w:rtl w:val="0"/>
+              </w:rPr>
+              <w:t xml:space="preserve">  Modal Verbs</w:t>
+            </w:r>
+            <w:r>
+              <w:rPr>
+                <w:rtl w:val="0"/>
+              </w:rPr>
+            </w:r>
+          </w:p>
+          <w:p>
+            <w:pPr>
+              <w:keepNext w:val="1"/>
+              <w:spacing w:after="0" w:before="0" w:line="480" w:lineRule="auto"/>
+              <w:jc w:val="both"/>
+              <w:rPr>
+                <w:sz w:val="18"/>
+                <w:szCs w:val="18"/>
+              </w:rPr>
+            </w:pPr>
+            <w:r>
+              <w:rPr>
+                <w:sz w:val="18"/>
+                <w:szCs w:val="18"/>
+                <w:highlight w:val="red"/>
+                <w:rtl w:val="0"/>
+              </w:rPr>
+              <w:t xml:space="preserve">      </w:t>
+            </w:r>
+            <w:r>
+              <w:rPr>
+                <w:i w:val="0"/>
+                <w:iCs w:val="0"/>
+                <w:color w:val="000000"/>
+                <w:sz w:val="18"/>
+                <w:szCs w:val="18"/>
+                <w:rtl w:val="0"/>
+              </w:rPr>
+              <w:t xml:space="preserve">  Lexical Hedges</w:t>
+            </w:r>
+            <w:r>
+              <w:rPr>
+                <w:rtl w:val="0"/>
+              </w:rPr>
+            </w:r>
+          </w:p>
+          <w:p>
+            <w:pPr>
+              <w:keepNext w:val="1"/>
+              <w:spacing w:after="0" w:before="0" w:line="480" w:lineRule="auto"/>
+              <w:jc w:val="both"/>
+              <w:rPr>
+                <w:sz w:val="18"/>
+                <w:szCs w:val="18"/>
+              </w:rPr>
+            </w:pPr>
+            <w:r>
+              <w:rPr>
+                <w:sz w:val="18"/>
+                <w:szCs w:val="18"/>
+                <w:highlight w:val="yellow"/>
+                <w:rtl w:val="0"/>
+              </w:rPr>
+              <w:t xml:space="preserve">      </w:t>
+            </w:r>
+            <w:r>
+              <w:rPr>
+                <w:i w:val="0"/>
+                <w:iCs w:val="0"/>
+                <w:color w:val="000000"/>
+                <w:sz w:val="18"/>
+                <w:szCs w:val="18"/>
+                <w:rtl w:val="0"/>
+              </w:rPr>
+              <w:t xml:space="preserve">  Adverbial Hedges</w:t>
+            </w:r>
+            <w:r>
+              <w:rPr>
+                <w:rtl w:val="0"/>
+              </w:rPr>
+            </w:r>
+          </w:p>
+          <w:p>
+            <w:pPr>
+              <w:keepNext w:val="1"/>
+              <w:spacing w:after="0" w:before="0" w:line="480" w:lineRule="auto"/>
+              <w:jc w:val="both"/>
+              <w:rPr>
+                <w:sz w:val="18"/>
+                <w:szCs w:val="18"/>
+              </w:rPr>
+            </w:pPr>
+            <w:r>
+              <w:rPr>
+                <w:sz w:val="18"/>
+                <w:szCs w:val="18"/>
+                <w:shd w:fill="00b050" w:val="clear"/>
+                <w:rtl w:val="0"/>
+              </w:rPr>
+              <w:t xml:space="preserve">      </w:t>
+            </w:r>
+            <w:r>
+              <w:rPr>
+                <w:i w:val="0"/>
+                <w:iCs w:val="0"/>
+                <w:color w:val="000000"/>
+                <w:sz w:val="18"/>
+                <w:szCs w:val="18"/>
+                <w:rtl w:val="0"/>
+              </w:rPr>
+              <w:t xml:space="preserve">  Clause-Level Hedges</w:t>
+            </w:r>
+            <w:r>
+              <w:rPr>
+                <w:rtl w:val="0"/>
+              </w:rPr>
+            </w:r>
+          </w:p>
+        </w:tc>
+        <w:tc>
+          <w:tcPr/>
+          <w:p>
+            <w:pPr>
+              <w:keepNext w:val="1"/>
+              <w:spacing w:after="0" w:before="0" w:line="480" w:lineRule="auto"/>
+              <w:jc w:val="both"/>
+              <w:rPr>
+                <w:sz w:val="18"/>
+                <w:szCs w:val="18"/>
+              </w:rPr>
+            </w:pPr>
+            <w:r>
+              <w:rPr>
+                <w:i w:val="0"/>
+                <w:iCs w:val="0"/>
                 <w:color w:val="ed7d31"/>
-              </w:rPr>
-              <w:t xml:space="preserve">EC  Epistemic Caution</w:t>
+                <w:sz w:val="18"/>
+                <w:szCs w:val="18"/>
+                <w:rtl w:val="0"/>
+              </w:rPr>
+              <w:t xml:space="preserve">EC</w:t>
+            </w:r>
+            <w:r>
+              <w:rPr>
+                <w:i w:val="0"/>
+                <w:iCs w:val="0"/>
+                <w:color w:val="000000"/>
+                <w:sz w:val="18"/>
+                <w:szCs w:val="18"/>
+                <w:rtl w:val="0"/>
+              </w:rPr>
+              <w:t xml:space="preserve">  Epistemic Caution</w:t>
+            </w:r>
+            <w:r>
+              <w:rPr>
+                <w:rtl w:val="0"/>
+              </w:rPr>
+            </w:r>
+          </w:p>
+          <w:p>
+            <w:pPr>
+              <w:keepNext w:val="1"/>
+              <w:spacing w:after="0" w:before="0" w:line="480" w:lineRule="auto"/>
+              <w:jc w:val="both"/>
+              <w:rPr>
+                <w:sz w:val="18"/>
+                <w:szCs w:val="18"/>
+              </w:rPr>
+            </w:pPr>
+            <w:r>
+              <w:rPr>
+                <w:i w:val="0"/>
+                <w:iCs w:val="0"/>
+                <w:color w:val="7030a0"/>
+                <w:sz w:val="18"/>
+                <w:szCs w:val="18"/>
+                <w:rtl w:val="0"/>
+              </w:rPr>
+              <w:t xml:space="preserve">P</w:t>
+            </w:r>
+            <w:r>
+              <w:rPr>
+                <w:i w:val="0"/>
+                <w:iCs w:val="0"/>
+                <w:color w:val="000000"/>
+                <w:sz w:val="18"/>
+                <w:szCs w:val="18"/>
+                <w:rtl w:val="0"/>
+              </w:rPr>
+              <w:t xml:space="preserve">  Politeness / Deference</w:t>
+            </w:r>
+            <w:r>
+              <w:rPr>
+                <w:rtl w:val="0"/>
+              </w:rPr>
+            </w:r>
+          </w:p>
+          <w:p>
+            <w:pPr>
+              <w:keepNext w:val="1"/>
+              <w:spacing w:after="0" w:before="0" w:line="480" w:lineRule="auto"/>
+              <w:jc w:val="both"/>
+              <w:rPr>
+                <w:sz w:val="18"/>
+                <w:szCs w:val="18"/>
+              </w:rPr>
+            </w:pPr>
+            <w:r>
+              <w:rPr>
+                <w:rtl w:val="0"/>
+              </w:rPr>
             </w:r>
           </w:p>
         </w:tc>
       </w:tr>
       <w:tr>
-        <w:tc>
-          <w:tcPr>
-            <w:tcW w:w="4680" w:type="dxa"/>
-            <w:vAlign w:val="center"/>
-            <w:shd w:val="clear" w:color="auto" w:fill="ff0000"/>
-          </w:tcPr>
-          <w:p>
-            <w:pPr>
-              <w:spacing w:before="40" w:after="40" w:line="240" w:lineRule="auto"/>
-            </w:pPr>
-            <w:r>
-              <w:rPr>
-                <w:rFonts w:ascii="Georgia" w:hAnsi="Georgia"/>
-                <w:sz w:val="20"/>
-                <w:szCs w:val="20"/>
-                <w:b/>
-                <w:color w:val="FFFFFF"/>
-              </w:rPr>
-              <w:t xml:space="preserve">Lexical Hedges</w:t>
-            </w:r>
-          </w:p>
-        </w:tc>
-        <w:tc>
-          <w:tcPr>
-            <w:tcW w:w="4680" w:type="dxa"/>
-            <w:vAlign w:val="center"/>
-          </w:tcPr>
-          <w:p>
-            <w:pPr>
-              <w:spacing w:before="40" w:after="40" w:line="240" w:lineRule="auto"/>
-            </w:pPr>
-            <w:r>
-              <w:rPr>
-                <w:rFonts w:ascii="Georgia" w:hAnsi="Georgia"/>
-                <w:sz w:val="20"/>
-                <w:szCs w:val="20"/>
-                <w:b/>
-                <w:color w:val="7030a0"/>
-              </w:rPr>
-              <w:t xml:space="preserve">P  Politeness / Deference</w:t>
-            </w:r>
-          </w:p>
-        </w:tc>
-      </w:tr>
-      <w:tr>
-        <w:tc>
-          <w:tcPr>
-            <w:tcW w:w="4680" w:type="dxa"/>
-            <w:vAlign w:val="center"/>
-            <w:shd w:val="clear" w:color="auto" w:fill="ffff00"/>
-          </w:tcPr>
-          <w:p>
-            <w:pPr>
-              <w:spacing w:before="40" w:after="40" w:line="240" w:lineRule="auto"/>
-            </w:pPr>
-            <w:r>
-              <w:rPr>
-                <w:rFonts w:ascii="Georgia" w:hAnsi="Georgia"/>
-                <w:sz w:val="20"/>
-                <w:szCs w:val="20"/>
-                <w:b/>
-                <w:color w:val="000000"/>
-              </w:rPr>
-              <w:t xml:space="preserve">Adverbial Hedges</w:t>
-            </w:r>
-          </w:p>
-        </w:tc>
-        <w:tc>
-          <w:tcPr>
-            <w:tcW w:w="4680" w:type="dxa"/>
-            <w:vAlign w:val="center"/>
-          </w:tcPr>
-          <w:p>
-            <w:pPr>
-              <w:spacing w:before="40" w:after="40" w:line="240" w:lineRule="auto"/>
-            </w:pPr>
-            <w:r>
-              <w:rPr>
-                <w:rFonts w:ascii="Georgia" w:hAnsi="Georgia"/>
-                <w:sz w:val="20"/>
-                <w:szCs w:val="20"/>
-                <w:b/>
-                <w:color w:val="000000"/>
-              </w:rPr>
-              <w:t xml:space="preserve">—</w:t>
-            </w:r>
-          </w:p>
-        </w:tc>
-      </w:tr>
-      <w:tr>
-        <w:tc>
-          <w:tcPr>
-            <w:tcW w:w="4680" w:type="dxa"/>
-            <w:vAlign w:val="center"/>
-            <w:shd w:val="clear" w:color="auto" w:fill="00b050"/>
-          </w:tcPr>
-          <w:p>
-            <w:pPr>
-              <w:spacing w:before="40" w:after="40" w:line="240" w:lineRule="auto"/>
-            </w:pPr>
-            <w:r>
-              <w:rPr>
-                <w:rFonts w:ascii="Georgia" w:hAnsi="Georgia"/>
-                <w:sz w:val="20"/>
-                <w:szCs w:val="20"/>
-                <w:b/>
-                <w:color w:val="FFFFFF"/>
-              </w:rPr>
-              <w:t xml:space="preserve">Clause-Level Hedges</w:t>
-            </w:r>
-          </w:p>
-        </w:tc>
-        <w:tc>
-          <w:tcPr>
-            <w:tcW w:w="4680" w:type="dxa"/>
-            <w:vAlign w:val="center"/>
-          </w:tcPr>
-          <w:p>
-            <w:pPr>
-              <w:spacing w:before="40" w:after="40" w:line="240" w:lineRule="auto"/>
-            </w:pPr>
-            <w:r>
-              <w:rPr>
-                <w:rFonts w:ascii="Georgia" w:hAnsi="Georgia"/>
-                <w:sz w:val="20"/>
-                <w:szCs w:val="20"/>
-                <w:b/>
-                <w:color w:val="000000"/>
-              </w:rPr>
-              <w:t xml:space="preserve">—</w:t>
-            </w:r>
-          </w:p>
-        </w:tc>
-      </w:tr>
-      <w:tr>
-        <w:tc>
-          <w:tcPr>
-            <w:tcW w:w="4680" w:type="dxa"/>
-            <w:vAlign w:val="center"/>
-            <w:shd w:val="clear" w:color="auto" w:fill="bfbfbf"/>
-          </w:tcPr>
-          <w:p>
-            <w:pPr>
-              <w:spacing w:before="40" w:after="40" w:line="240" w:lineRule="auto"/>
-            </w:pPr>
-            <w:r>
-              <w:rPr>
-                <w:rFonts w:ascii="Georgia" w:hAnsi="Georgia"/>
-                <w:sz w:val="20"/>
-                <w:szCs w:val="20"/>
-                <w:b/>
-              </w:rPr>
-              <w:t xml:space="preserve">UNHEDGED ASSERTIONS</w:t>
-            </w:r>
-          </w:p>
-          <w:p>
-            <w:pPr>
-              <w:spacing w:before="40" w:after="40" w:line="240" w:lineRule="auto"/>
-            </w:pPr>
-            <w:r>
-              <w:rPr>
-                <w:rFonts w:ascii="Georgia" w:hAnsi="Georgia"/>
+        <w:trPr>
+          <w:cantSplit w:val="1"/>
+          <w:tblHeader w:val="0"/>
+        </w:trPr>
+        <w:tc>
+          <w:tcPr>
+            <w:tcBorders>
+              <w:bottom w:color="000000" w:space="0" w:sz="18" w:val="single"/>
+            </w:tcBorders>
+          </w:tcPr>
+          <w:p>
+            <w:pPr>
+              <w:spacing w:after="0" w:before="0" w:line="480" w:lineRule="auto"/>
+              <w:jc w:val="left"/>
+              <w:rPr>
                 <w:sz w:val="18"/>
                 <w:szCs w:val="18"/>
-                <w:color w:val="404040"/>
-              </w:rPr>
-              <w:t xml:space="preserve">Grey fill. Optional. R / G / C beside mark.</w:t>
-            </w:r>
-          </w:p>
-        </w:tc>
-        <w:tc>
-          <w:tcPr>
-            <w:tcW w:w="4680" w:type="dxa"/>
-            <w:vAlign w:val="center"/>
-            <w:shd w:val="clear" w:color="auto" w:fill="f2f4f6"/>
-          </w:tcPr>
-          <w:p>
-            <w:pPr>
-              <w:spacing w:before="40" w:after="40" w:line="240" w:lineRule="auto"/>
-            </w:pPr>
-            <w:r>
-              <w:rPr>
-                <w:rFonts w:ascii="Georgia" w:hAnsi="Georgia"/>
-                <w:sz w:val="20"/>
-                <w:szCs w:val="20"/>
-                <w:b/>
-                <w:color w:val="808080"/>
-                <w:strike/>
-              </w:rPr>
-              <w:t xml:space="preserve">FALSE POSITIVE</w:t>
-            </w:r>
-          </w:p>
-          <w:p>
-            <w:pPr>
-              <w:spacing w:before="40" w:after="40" w:line="240" w:lineRule="auto"/>
-            </w:pPr>
-            <w:r>
-              <w:rPr>
-                <w:rFonts w:ascii="Georgia" w:hAnsi="Georgia"/>
+              </w:rPr>
+            </w:pPr>
+            <w:r>
+              <w:rPr>
+                <w:b w:val="1"/>
+                <w:bCs w:val="1"/>
+                <w:i w:val="0"/>
+                <w:iCs w:val="0"/>
+                <w:color w:val="000000"/>
                 <w:sz w:val="18"/>
                 <w:szCs w:val="18"/>
-                <w:color w:val="808080"/>
-              </w:rPr>
-              <w:t xml:space="preserve">Strikethrough + grey reason code. Not a function.</w:t>
+                <w:rtl w:val="0"/>
+              </w:rPr>
+              <w:t xml:space="preserve">UNHEDGED ASSERTIONS (Grey Highlight, Optional)</w:t>
+            </w:r>
+            <w:r>
+              <w:rPr>
+                <w:rtl w:val="0"/>
+              </w:rPr>
+            </w:r>
+          </w:p>
+          <w:p>
+            <w:pPr>
+              <w:keepNext w:val="1"/>
+              <w:spacing w:after="0" w:before="0" w:line="480" w:lineRule="auto"/>
+              <w:jc w:val="both"/>
+              <w:rPr>
+                <w:sz w:val="18"/>
+                <w:szCs w:val="18"/>
+              </w:rPr>
+            </w:pPr>
+            <w:r>
+              <w:rPr>
+                <w:sz w:val="18"/>
+                <w:szCs w:val="18"/>
+                <w:rtl w:val="0"/>
+              </w:rPr>
+              <w:t xml:space="preserve">R = Result, G = Generalization, C = Causal. Bracket the subtype beside the mark.</w:t>
+            </w:r>
+          </w:p>
+        </w:tc>
+        <w:tc>
+          <w:tcPr>
+            <w:tcBorders>
+              <w:bottom w:color="000000" w:space="0" w:sz="18" w:val="single"/>
+            </w:tcBorders>
+          </w:tcPr>
+          <w:p>
+            <w:pPr>
+              <w:keepNext w:val="1"/>
+              <w:spacing w:after="0" w:before="0" w:line="480" w:lineRule="auto"/>
+              <w:jc w:val="left"/>
+              <w:rPr>
+                <w:sz w:val="18"/>
+                <w:szCs w:val="18"/>
+              </w:rPr>
+            </w:pPr>
+            <w:r>
+              <w:rPr>
+                <w:b w:val="1"/>
+                <w:bCs w:val="1"/>
+                <w:i w:val="0"/>
+                <w:iCs w:val="0"/>
+                <w:color w:val="000000"/>
+                <w:sz w:val="18"/>
+                <w:szCs w:val="18"/>
+                <w:rtl w:val="0"/>
+              </w:rPr>
+              <w:t xml:space="preserve">FALSE POSITIVE (Strikethrough)</w:t>
+            </w:r>
+            <w:r>
+              <w:rPr>
+                <w:rtl w:val="0"/>
+              </w:rPr>
+            </w:r>
+          </w:p>
+          <w:p>
+            <w:pPr>
+              <w:keepNext w:val="1"/>
+              <w:spacing w:after="0" w:before="0" w:line="480" w:lineRule="auto"/>
+              <w:jc w:val="both"/>
+              <w:rPr>
+                <w:sz w:val="18"/>
+                <w:szCs w:val="18"/>
+              </w:rPr>
+            </w:pPr>
+            <w:r>
+              <w:rPr>
+                <w:sz w:val="18"/>
+                <w:szCs w:val="18"/>
+                <w:rtl w:val="0"/>
+              </w:rPr>
+              <w:t xml:space="preserve">No highlight. Strike through the token and write the reason code in grey text.</w:t>
             </w:r>
           </w:p>
         </w:tc>
@@ -26204,7 +26348,7 @@
                 <w:shd w:fill="00b0f0" w:val="clear"/>
                 <w:rtl w:val="0"/>
               </w:rPr>
-              <w:t xml:space="preserve">Blue</w:t>
+              <w:t xml:space="preserve">      </w:t>
             </w:r>
             <w:r>
               <w:rPr>
@@ -26333,14 +26477,12 @@
                 <w:szCs w:val="18"/>
                 <w:highlight w:val="red"/>
                 <w:rtl w:val="0"/>
-                <w:color w:val="FFFFFF"/>
-              </w:rPr>
-              <w:t xml:space="preserve">Red</w:t>
-            </w:r>
-            <w:r>
-              <w:rPr>
-                <w:rtl w:val="0"/>
-                <w:color w:val="FFFFFF"/>
+              </w:rPr>
+              <w:t xml:space="preserve">      </w:t>
+            </w:r>
+            <w:r>
+              <w:rPr>
+                <w:rtl w:val="0"/>
               </w:rPr>
             </w:r>
           </w:p>
@@ -26466,7 +26608,7 @@
                 <w:highlight w:val="yellow"/>
                 <w:rtl w:val="0"/>
               </w:rPr>
-              <w:t xml:space="preserve">Yellow</w:t>
+              <w:t xml:space="preserve">      </w:t>
             </w:r>
             <w:r>
               <w:rPr>
@@ -26598,14 +26740,12 @@
                 <w:szCs w:val="18"/>
                 <w:shd w:fill="00b050" w:val="clear"/>
                 <w:rtl w:val="0"/>
-                <w:color w:val="FFFFFF"/>
-              </w:rPr>
-              <w:t xml:space="preserve">Green</w:t>
-            </w:r>
-            <w:r>
-              <w:rPr>
-                <w:rtl w:val="0"/>
-                <w:color w:val="FFFFFF"/>
+              </w:rPr>
+              <w:t xml:space="preserve">      </w:t>
+            </w:r>
+            <w:r>
+              <w:rPr>
+                <w:rtl w:val="0"/>
               </w:rPr>
             </w:r>
           </w:p>
@@ -26989,8 +27129,6 @@
             <w:r>
               <w:rPr>
                 <w:rtl w:val="0"/>
-                <w:color w:val="ed7d31"/>
-                <w:b/>
               </w:rPr>
             </w:r>
           </w:p>
@@ -27147,8 +27285,6 @@
             <w:r>
               <w:rPr>
                 <w:rtl w:val="0"/>
-                <w:color w:val="7030a0"/>
-                <w:b/>
               </w:rPr>
             </w:r>
           </w:p>
@@ -27302,15 +27438,12 @@
                 <w:sz w:val="18"/>
                 <w:szCs w:val="18"/>
                 <w:rtl w:val="0"/>
-                <w:color w:val="808080"/>
               </w:rPr>
               <w:t xml:space="preserve">FP</w:t>
             </w:r>
             <w:r>
               <w:rPr>
                 <w:rtl w:val="0"/>
-                <w:color w:val="808080"/>
-                <w:b/>
               </w:rPr>
             </w:r>
           </w:p>

</xml_diff>

<commit_message>
Draft_127_body: restore major spacers, appendix header format, section breaks
</commit_message>
<xml_diff>
--- a/thesis/003_ThesisProposal_Draft_127_body.docx
+++ b/thesis/003_ThesisProposal_Draft_127_body.docx
@@ -2,19 +2,6 @@
 <file path=word/document.xml><?xml version="1.0" encoding="utf-8"?>
 <w:document xmlns:mc="http://schemas.openxmlformats.org/markup-compatibility/2006" xmlns:o="urn:schemas-microsoft-com:office:office" xmlns:r="http://schemas.openxmlformats.org/officeDocument/2006/relationships" xmlns:m="http://schemas.openxmlformats.org/officeDocument/2006/math" xmlns:v="urn:schemas-microsoft-com:vml" xmlns:wp="http://schemas.openxmlformats.org/drawingml/2006/wordprocessingDrawing" xmlns:w10="urn:schemas-microsoft-com:office:word" xmlns:w="http://schemas.openxmlformats.org/wordprocessingml/2006/main" xmlns:wne="http://schemas.microsoft.com/office/word/2006/wordml" xmlns:sl="http://schemas.openxmlformats.org/schemaLibrary/2006/main" xmlns:a="http://schemas.openxmlformats.org/drawingml/2006/main" xmlns:pic="http://schemas.openxmlformats.org/drawingml/2006/picture" xmlns:c="http://schemas.openxmlformats.org/drawingml/2006/chart" xmlns:lc="http://schemas.openxmlformats.org/drawingml/2006/lockedCanvas" xmlns:dgm="http://schemas.openxmlformats.org/drawingml/2006/diagram" xmlns:wps="http://schemas.microsoft.com/office/word/2010/wordprocessingShape" xmlns:wpg="http://schemas.microsoft.com/office/word/2010/wordprocessingGroup" xmlns:w14="http://schemas.microsoft.com/office/word/2010/wordml" xmlns:w15="http://schemas.microsoft.com/office/word/2012/wordml" xmlns:w16="http://schemas.microsoft.com/office/word/2018/wordml" xmlns:w16cex="http://schemas.microsoft.com/office/word/2018/wordml/cex" xmlns:w16cid="http://schemas.microsoft.com/office/word/2016/wordml/cid" xmlns="http://schemas.microsoft.com/office/tasks/2019/documenttasks" xmlns:cr="http://schemas.microsoft.com/office/comments/2020/reactions">
   <w:body>
-    <w:p>
-      <w:pPr>
-        <w:spacing w:after="0" w:before="0" w:line="360" w:lineRule="auto"/>
-        <w:ind w:left="0" w:right="0" w:firstLine="0"/>
-        <w:jc w:val="center"/>
-        <w:rPr/>
-      </w:pPr>
-      <w:r>
-        <w:rPr>
-          <w:rtl w:val="0"/>
-        </w:rPr>
-      </w:r>
-    </w:p>
     <w:p>
       <w:pPr>
         <w:spacing w:after="0" w:before="0" w:line="360" w:lineRule="auto"/>
@@ -108,19 +95,6 @@
       </w:pPr>
       <w:r>
         <w:rPr>
-          <w:rtl w:val="0"/>
-        </w:rPr>
-      </w:r>
-    </w:p>
-    <w:p>
-      <w:pPr>
-        <w:spacing w:after="0" w:before="0" w:line="360" w:lineRule="auto"/>
-        <w:ind w:left="0" w:right="0" w:firstLine="0"/>
-        <w:jc w:val="center"/>
-        <w:rPr/>
-      </w:pPr>
-      <w:r>
-        <w:rPr>
           <w:rFonts w:ascii="Georgia" w:cs="Georgia" w:eastAsia="Georgia" w:hAnsi="Georgia"/>
           <w:b w:val="0"/>
           <w:bCs w:val="0"/>
@@ -290,19 +264,6 @@
       </w:pPr>
       <w:r>
         <w:rPr>
-          <w:rtl w:val="0"/>
-        </w:rPr>
-      </w:r>
-    </w:p>
-    <w:p>
-      <w:pPr>
-        <w:spacing w:after="0" w:before="0" w:line="360" w:lineRule="auto"/>
-        <w:ind w:left="0" w:right="0" w:firstLine="0"/>
-        <w:jc w:val="center"/>
-        <w:rPr/>
-      </w:pPr>
-      <w:r>
-        <w:rPr>
           <w:rFonts w:ascii="Georgia" w:cs="Georgia" w:eastAsia="Georgia" w:hAnsi="Georgia"/>
           <w:b w:val="0"/>
           <w:bCs w:val="0"/>
@@ -394,19 +355,6 @@
       </w:pPr>
       <w:r>
         <w:rPr>
-          <w:rtl w:val="0"/>
-        </w:rPr>
-      </w:r>
-    </w:p>
-    <w:p>
-      <w:pPr>
-        <w:spacing w:after="0" w:before="0" w:line="360" w:lineRule="auto"/>
-        <w:ind w:left="0" w:right="0" w:firstLine="0"/>
-        <w:jc w:val="center"/>
-        <w:rPr/>
-      </w:pPr>
-      <w:r>
-        <w:rPr>
           <w:rFonts w:ascii="Georgia" w:cs="Georgia" w:eastAsia="Georgia" w:hAnsi="Georgia"/>
           <w:b w:val="0"/>
           <w:bCs w:val="0"/>
@@ -418,58 +366,6 @@
         </w:rPr>
         <w:t xml:space="preserve">By</w:t>
       </w:r>
-      <w:r>
-        <w:rPr>
-          <w:rtl w:val="0"/>
-        </w:rPr>
-      </w:r>
-    </w:p>
-    <w:p>
-      <w:pPr>
-        <w:spacing w:after="0" w:before="0" w:line="360" w:lineRule="auto"/>
-        <w:ind w:left="0" w:right="0" w:firstLine="0"/>
-        <w:jc w:val="center"/>
-        <w:rPr/>
-      </w:pPr>
-      <w:r>
-        <w:rPr>
-          <w:rtl w:val="0"/>
-        </w:rPr>
-      </w:r>
-    </w:p>
-    <w:p>
-      <w:pPr>
-        <w:spacing w:after="0" w:before="0" w:line="360" w:lineRule="auto"/>
-        <w:ind w:left="0" w:right="0" w:firstLine="0"/>
-        <w:jc w:val="center"/>
-        <w:rPr/>
-      </w:pPr>
-      <w:r>
-        <w:rPr>
-          <w:rtl w:val="0"/>
-        </w:rPr>
-      </w:r>
-    </w:p>
-    <w:p>
-      <w:pPr>
-        <w:spacing w:after="0" w:before="0" w:line="360" w:lineRule="auto"/>
-        <w:ind w:left="0" w:right="0" w:firstLine="0"/>
-        <w:jc w:val="center"/>
-        <w:rPr/>
-      </w:pPr>
-      <w:r>
-        <w:rPr>
-          <w:rtl w:val="0"/>
-        </w:rPr>
-      </w:r>
-    </w:p>
-    <w:p>
-      <w:pPr>
-        <w:spacing w:after="0" w:before="0" w:line="360" w:lineRule="auto"/>
-        <w:ind w:left="0" w:right="0" w:firstLine="0"/>
-        <w:jc w:val="center"/>
-        <w:rPr/>
-      </w:pPr>
       <w:r>
         <w:rPr>
           <w:rtl w:val="0"/>
@@ -550,7 +446,6 @@
     <w:p>
       <w:pPr>
         <w:spacing w:after="0" w:before="0" w:line="480" w:lineRule="auto"/>
-        <w:ind w:left="0" w:right="0" w:firstLine="0"/>
         <w:jc w:val="center"/>
         <w:rPr>
           <w:sz w:val="28"/>
@@ -573,6 +468,10 @@
       <w:r>
         <w:rPr>
           <w:rtl w:val="0"/>
+          <w:rFonts w:ascii="Georgia" w:hAnsi="Georgia"/>
+          <w:sz w:val="28"/>
+          <w:szCs w:val="28"/>
+          <w:b/>
         </w:rPr>
       </w:r>
     </w:p>
@@ -3555,7 +3454,6 @@
     <w:p>
       <w:pPr>
         <w:spacing w:after="0" w:before="0" w:line="480" w:lineRule="auto"/>
-        <w:ind w:left="0" w:right="0" w:firstLine="0"/>
         <w:jc w:val="center"/>
         <w:rPr>
           <w:sz w:val="28"/>
@@ -3578,6 +3476,10 @@
       <w:r>
         <w:rPr>
           <w:rtl w:val="0"/>
+          <w:rFonts w:ascii="Georgia" w:hAnsi="Georgia"/>
+          <w:sz w:val="28"/>
+          <w:szCs w:val="28"/>
+          <w:b/>
         </w:rPr>
       </w:r>
     </w:p>
@@ -6566,7 +6468,6 @@
     <w:p>
       <w:pPr>
         <w:spacing w:after="0" w:before="0" w:line="480" w:lineRule="auto"/>
-        <w:ind w:left="0" w:right="0" w:firstLine="0"/>
         <w:jc w:val="center"/>
         <w:rPr>
           <w:sz w:val="28"/>
@@ -6589,6 +6490,10 @@
       <w:r>
         <w:rPr>
           <w:rtl w:val="0"/>
+          <w:rFonts w:ascii="Georgia" w:hAnsi="Georgia"/>
+          <w:sz w:val="28"/>
+          <w:szCs w:val="28"/>
+          <w:b/>
         </w:rPr>
       </w:r>
     </w:p>
@@ -23031,7 +22936,6 @@
     <w:p>
       <w:pPr>
         <w:spacing w:after="0" w:before="0" w:line="480" w:lineRule="auto"/>
-        <w:ind w:left="0" w:right="0" w:firstLine="0"/>
         <w:jc w:val="center"/>
         <w:rPr>
           <w:sz w:val="28"/>
@@ -23054,6 +22958,10 @@
       <w:r>
         <w:rPr>
           <w:rtl w:val="0"/>
+          <w:rFonts w:ascii="Georgia" w:hAnsi="Georgia"/>
+          <w:sz w:val="28"/>
+          <w:szCs w:val="28"/>
+          <w:b/>
         </w:rPr>
       </w:r>
     </w:p>
@@ -23357,7 +23265,6 @@
     <w:p>
       <w:pPr>
         <w:spacing w:after="0" w:before="0" w:line="480" w:lineRule="auto"/>
-        <w:ind w:left="0" w:right="0" w:firstLine="0"/>
         <w:jc w:val="center"/>
         <w:rPr>
           <w:sz w:val="28"/>
@@ -23380,6 +23287,10 @@
       <w:r>
         <w:rPr>
           <w:rtl w:val="0"/>
+          <w:rFonts w:ascii="Georgia" w:hAnsi="Georgia"/>
+          <w:sz w:val="28"/>
+          <w:szCs w:val="28"/>
+          <w:b/>
         </w:rPr>
       </w:r>
     </w:p>
@@ -24806,7 +24717,67 @@
     <w:p>
       <w:pPr>
         <w:pStyle w:val="Heading1"/>
-        <w:spacing w:after="40" w:before="0" w:line="480" w:lineRule="auto"/>
+        <w:spacing w:after="0" w:before="0" w:line="480" w:lineRule="auto"/>
+        <w:jc w:val="center"/>
+        <w:rPr>
+          <w:sz w:val="24"/>
+          <w:szCs w:val="24"/>
+        </w:rPr>
+      </w:pPr>
+      <w:r>
+        <w:rPr>
+          <w:b w:val="1"/>
+          <w:bCs w:val="1"/>
+          <w:sz w:val="28"/>
+          <w:szCs w:val="28"/>
+          <w:rtl w:val="0"/>
+          <w:rFonts w:ascii="Georgia" w:hAnsi="Georgia"/>
+        </w:rPr>
+        <w:t xml:space="preserve">APPENDIX A: HEDGING CODEBOOK</w:t>
+      </w:r>
+      <w:r>
+        <w:rPr>
+          <w:rtl w:val="0"/>
+          <w:rFonts w:ascii="Georgia" w:hAnsi="Georgia"/>
+          <w:sz w:val="28"/>
+          <w:szCs w:val="28"/>
+          <w:b/>
+        </w:rPr>
+      </w:r>
+    </w:p>
+    <w:p>
+      <w:pPr>
+        <w:spacing w:before="0" w:after="0" w:line="480" w:lineRule="auto"/>
+      </w:pPr>
+      <w:r>
+        <w:t xml:space="preserve"/>
+      </w:r>
+    </w:p>
+    <w:p>
+      <w:pPr>
+        <w:spacing w:after="0" w:before="0" w:line="480" w:lineRule="auto"/>
+        <w:ind w:left="360" w:firstLine="0"/>
+        <w:jc w:val="both"/>
+        <w:rPr/>
+      </w:pPr>
+      <w:r>
+        <w:rPr>
+          <w:b w:val="1"/>
+          <w:bCs w:val="1"/>
+          <w:rtl w:val="0"/>
+        </w:rPr>
+        <w:t xml:space="preserve">• Lookup: </w:t>
+      </w:r>
+      <w:r>
+        <w:rPr>
+          <w:rtl w:val="0"/>
+        </w:rPr>
+        <w:t xml:space="preserve">Quick-Reference + Legend (p. 1-2). Full Codebook from p. 3. Coding sheet columns at end.</w:t>
+      </w:r>
+    </w:p>
+    <w:p>
+      <w:pPr>
+        <w:spacing w:after="0" w:before="0" w:line="480" w:lineRule="auto"/>
         <w:jc w:val="left"/>
         <w:rPr>
           <w:sz w:val="24"/>
@@ -24821,17 +24792,17 @@
           <w:szCs w:val="24"/>
           <w:rtl w:val="0"/>
         </w:rPr>
-        <w:t xml:space="preserve">APPENDIX A: HEDGING CODEBOOK</w:t>
-      </w:r>
-      <w:r>
-        <w:rPr>
-          <w:rtl w:val="0"/>
-        </w:rPr>
-      </w:r>
-    </w:p>
-    <w:p>
-      <w:pPr>
-        <w:spacing w:after="20" w:before="0" w:line="480" w:lineRule="auto"/>
+        <w:t xml:space="preserve">Quick-Reference</w:t>
+      </w:r>
+      <w:r>
+        <w:rPr>
+          <w:rtl w:val="0"/>
+        </w:rPr>
+      </w:r>
+    </w:p>
+    <w:p>
+      <w:pPr>
+        <w:spacing w:after="0" w:before="0" w:line="480" w:lineRule="auto"/>
         <w:ind w:left="360" w:firstLine="0"/>
         <w:jc w:val="both"/>
         <w:rPr/>
@@ -24842,18 +24813,174 @@
           <w:bCs w:val="1"/>
           <w:rtl w:val="0"/>
         </w:rPr>
-        <w:t xml:space="preserve">• Lookup: </w:t>
-      </w:r>
-      <w:r>
-        <w:rPr>
-          <w:rtl w:val="0"/>
-        </w:rPr>
-        <w:t xml:space="preserve">Quick-Reference + Legend (p. 1-2). Full Codebook from p. 3. Coding sheet columns at end.</w:t>
-      </w:r>
-    </w:p>
-    <w:p>
-      <w:pPr>
-        <w:spacing w:after="20" w:before="120" w:line="480" w:lineRule="auto"/>
+        <w:t xml:space="preserve">• Context decides. </w:t>
+      </w:r>
+      <w:r>
+        <w:rPr>
+          <w:rtl w:val="0"/>
+        </w:rPr>
+        <w:t xml:space="preserve">A listed word is a hedge only when it works as one in the sentence.</w:t>
+      </w:r>
+    </w:p>
+    <w:p>
+      <w:pPr>
+        <w:spacing w:after="0" w:before="0" w:line="480" w:lineRule="auto"/>
+        <w:jc w:val="left"/>
+        <w:rPr/>
+      </w:pPr>
+      <w:r>
+        <w:rPr>
+          <w:b w:val="1"/>
+          <w:bCs w:val="1"/>
+          <w:rtl w:val="0"/>
+        </w:rPr>
+        <w:t xml:space="preserve">Types</w:t>
+      </w:r>
+      <w:r>
+        <w:rPr>
+          <w:rtl w:val="0"/>
+        </w:rPr>
+      </w:r>
+    </w:p>
+    <w:p>
+      <w:pPr>
+        <w:spacing w:after="0" w:before="0" w:line="480" w:lineRule="auto"/>
+        <w:ind w:left="360" w:firstLine="0"/>
+        <w:jc w:val="both"/>
+        <w:rPr/>
+      </w:pPr>
+      <w:r>
+        <w:rPr>
+          <w:b w:val="1"/>
+          <w:bCs w:val="1"/>
+          <w:rtl w:val="0"/>
+        </w:rPr>
+        <w:t xml:space="preserve">• Modal: </w:t>
+      </w:r>
+      <w:r>
+        <w:rPr>
+          <w:rtl w:val="0"/>
+        </w:rPr>
+        <w:t xml:space="preserve">may, might, could, would, should, can (possibility only, not capability or obligation).</w:t>
+      </w:r>
+    </w:p>
+    <w:p>
+      <w:pPr>
+        <w:spacing w:after="0" w:before="0" w:line="480" w:lineRule="auto"/>
+        <w:ind w:left="360" w:firstLine="0"/>
+        <w:jc w:val="both"/>
+        <w:rPr/>
+      </w:pPr>
+      <w:r>
+        <w:rPr>
+          <w:b w:val="1"/>
+          <w:bCs w:val="1"/>
+          <w:rtl w:val="0"/>
+        </w:rPr>
+        <w:t xml:space="preserve">• Lexical: </w:t>
+      </w:r>
+      <w:r>
+        <w:rPr>
+          <w:rtl w:val="0"/>
+        </w:rPr>
+        <w:t xml:space="preserve">suggest, indicate, appear, seem, possible, likely, potential (when they qualify a claim and pass Step 2).</w:t>
+      </w:r>
+    </w:p>
+    <w:p>
+      <w:pPr>
+        <w:spacing w:after="0" w:before="0" w:line="480" w:lineRule="auto"/>
+        <w:ind w:left="360" w:firstLine="0"/>
+        <w:jc w:val="both"/>
+        <w:rPr/>
+      </w:pPr>
+      <w:r>
+        <w:rPr>
+          <w:b w:val="1"/>
+          <w:bCs w:val="1"/>
+          <w:rtl w:val="0"/>
+        </w:rPr>
+        <w:t xml:space="preserve">• Adverbial: </w:t>
+      </w:r>
+      <w:r>
+        <w:rPr>
+          <w:rtl w:val="0"/>
+        </w:rPr>
+        <w:t xml:space="preserve">generally, typically, possibly, probably (scope or certainty, not procedural routine).</w:t>
+      </w:r>
+    </w:p>
+    <w:p>
+      <w:pPr>
+        <w:spacing w:after="0" w:before="0" w:line="480" w:lineRule="auto"/>
+        <w:ind w:left="360" w:firstLine="0"/>
+        <w:jc w:val="both"/>
+        <w:rPr/>
+      </w:pPr>
+      <w:r>
+        <w:rPr>
+          <w:b w:val="1"/>
+          <w:bCs w:val="1"/>
+          <w:rtl w:val="0"/>
+        </w:rPr>
+        <w:t xml:space="preserve">• Clause-level: </w:t>
+      </w:r>
+      <w:r>
+        <w:rPr>
+          <w:rtl w:val="0"/>
+        </w:rPr>
+        <w:t xml:space="preserve">it seems that, it is possible that, to some extent.</w:t>
+      </w:r>
+    </w:p>
+    <w:p>
+      <w:pPr>
+        <w:spacing w:after="0" w:before="0" w:line="480" w:lineRule="auto"/>
+        <w:ind w:firstLine="0"/>
+        <w:jc w:val="both"/>
+        <w:rPr/>
+      </w:pPr>
+      <w:r>
+        <w:rPr>
+          <w:rtl w:val="0"/>
+        </w:rPr>
+        <w:t xml:space="preserve">Functions: EC = uncertainty about a claim’s truth. P = interpersonal softening of a claim. FP = fails the claim condition or both checks.</w:t>
+      </w:r>
+    </w:p>
+    <w:p>
+      <w:pPr>
+        <w:spacing w:after="0" w:before="0" w:line="480" w:lineRule="auto"/>
+        <w:jc w:val="both"/>
+        <w:rPr/>
+      </w:pPr>
+      <w:r>
+        <w:rPr>
+          <w:rFonts w:ascii="Cardo" w:cs="Cardo" w:eastAsia="Cardo" w:hAnsi="Cardo"/>
+          <w:rtl w:val="0"/>
+        </w:rPr>
+        <w:t xml:space="preserve">Core rules: suggest/indicate finding→hedge, recommendation→FP-Rec, can/may possibility→hedge, capability→FP-Cap, generally/typically claim-limit→hedge, procedural→FP-Proc, appear/seem result-uncertainty→hedge, location→FP-Gen.</w:t>
+      </w:r>
+    </w:p>
+    <w:p>
+      <w:pPr>
+        <w:spacing w:after="0" w:before="0" w:line="480" w:lineRule="auto"/>
+        <w:jc w:val="both"/>
+        <w:rPr/>
+      </w:pPr>
+      <w:r>
+        <w:rPr>
+          <w:rFonts w:ascii="Cardo" w:cs="Cardo" w:eastAsia="Cardo" w:hAnsi="Cardo"/>
+          <w:rtl w:val="0"/>
+        </w:rPr>
+        <w:t xml:space="preserve">Steps 1-3: Step 1 wide-net candidates. Step 2 = claim condition, then Working Test + Reader Test → EC, P, or FP. Step 3 = type on retained P and EC.</w:t>
+      </w:r>
+      <w:r/>
+      <w:r>
+        <w:rPr>
+          <w:rtl w:val="0"/>
+        </w:rPr>
+      </w:r>
+    </w:p>
+    <w:p>
+      <w:pPr>
+        <w:spacing w:after="0" w:before="0" w:line="480" w:lineRule="auto"/>
         <w:jc w:val="left"/>
         <w:rPr>
           <w:sz w:val="24"/>
@@ -24868,211 +24995,6 @@
           <w:szCs w:val="24"/>
           <w:rtl w:val="0"/>
         </w:rPr>
-        <w:t xml:space="preserve">Quick-Reference</w:t>
-      </w:r>
-      <w:r>
-        <w:rPr>
-          <w:rtl w:val="0"/>
-        </w:rPr>
-      </w:r>
-    </w:p>
-    <w:p>
-      <w:pPr>
-        <w:spacing w:after="20" w:before="0" w:line="480" w:lineRule="auto"/>
-        <w:ind w:left="360" w:firstLine="0"/>
-        <w:jc w:val="both"/>
-        <w:rPr/>
-      </w:pPr>
-      <w:r>
-        <w:rPr>
-          <w:b w:val="1"/>
-          <w:bCs w:val="1"/>
-          <w:rtl w:val="0"/>
-        </w:rPr>
-        <w:t xml:space="preserve">• Context decides. </w:t>
-      </w:r>
-      <w:r>
-        <w:rPr>
-          <w:rtl w:val="0"/>
-        </w:rPr>
-        <w:t xml:space="preserve">A listed word is a hedge only when it works as one in the sentence.</w:t>
-      </w:r>
-    </w:p>
-    <w:p>
-      <w:pPr>
-        <w:spacing w:after="20" w:before="0" w:line="480" w:lineRule="auto"/>
-        <w:jc w:val="left"/>
-        <w:rPr/>
-      </w:pPr>
-      <w:r>
-        <w:rPr>
-          <w:b w:val="1"/>
-          <w:bCs w:val="1"/>
-          <w:rtl w:val="0"/>
-        </w:rPr>
-        <w:t xml:space="preserve">Types</w:t>
-      </w:r>
-      <w:r>
-        <w:rPr>
-          <w:rtl w:val="0"/>
-        </w:rPr>
-      </w:r>
-    </w:p>
-    <w:p>
-      <w:pPr>
-        <w:spacing w:after="20" w:before="0" w:line="480" w:lineRule="auto"/>
-        <w:ind w:left="360" w:firstLine="0"/>
-        <w:jc w:val="both"/>
-        <w:rPr/>
-      </w:pPr>
-      <w:r>
-        <w:rPr>
-          <w:b w:val="1"/>
-          <w:bCs w:val="1"/>
-          <w:rtl w:val="0"/>
-        </w:rPr>
-        <w:t xml:space="preserve">• Modal: </w:t>
-      </w:r>
-      <w:r>
-        <w:rPr>
-          <w:rtl w:val="0"/>
-        </w:rPr>
-        <w:t xml:space="preserve">may, might, could, would, should, can (possibility only, not capability or obligation).</w:t>
-      </w:r>
-    </w:p>
-    <w:p>
-      <w:pPr>
-        <w:spacing w:after="20" w:before="0" w:line="480" w:lineRule="auto"/>
-        <w:ind w:left="360" w:firstLine="0"/>
-        <w:jc w:val="both"/>
-        <w:rPr/>
-      </w:pPr>
-      <w:r>
-        <w:rPr>
-          <w:b w:val="1"/>
-          <w:bCs w:val="1"/>
-          <w:rtl w:val="0"/>
-        </w:rPr>
-        <w:t xml:space="preserve">• Lexical: </w:t>
-      </w:r>
-      <w:r>
-        <w:rPr>
-          <w:rtl w:val="0"/>
-        </w:rPr>
-        <w:t xml:space="preserve">suggest, indicate, appear, seem, possible, likely, potential (when they qualify a claim and pass Step 2).</w:t>
-      </w:r>
-    </w:p>
-    <w:p>
-      <w:pPr>
-        <w:spacing w:after="20" w:before="0" w:line="480" w:lineRule="auto"/>
-        <w:ind w:left="360" w:firstLine="0"/>
-        <w:jc w:val="both"/>
-        <w:rPr/>
-      </w:pPr>
-      <w:r>
-        <w:rPr>
-          <w:b w:val="1"/>
-          <w:bCs w:val="1"/>
-          <w:rtl w:val="0"/>
-        </w:rPr>
-        <w:t xml:space="preserve">• Adverbial: </w:t>
-      </w:r>
-      <w:r>
-        <w:rPr>
-          <w:rtl w:val="0"/>
-        </w:rPr>
-        <w:t xml:space="preserve">generally, typically, possibly, probably (scope or certainty, not procedural routine).</w:t>
-      </w:r>
-    </w:p>
-    <w:p>
-      <w:pPr>
-        <w:spacing w:after="20" w:before="0" w:line="480" w:lineRule="auto"/>
-        <w:ind w:left="360" w:firstLine="0"/>
-        <w:jc w:val="both"/>
-        <w:rPr/>
-      </w:pPr>
-      <w:r>
-        <w:rPr>
-          <w:b w:val="1"/>
-          <w:bCs w:val="1"/>
-          <w:rtl w:val="0"/>
-        </w:rPr>
-        <w:t xml:space="preserve">• Clause-level: </w:t>
-      </w:r>
-      <w:r>
-        <w:rPr>
-          <w:rtl w:val="0"/>
-        </w:rPr>
-        <w:t xml:space="preserve">it seems that, it is possible that, to some extent.</w:t>
-      </w:r>
-    </w:p>
-    <w:p>
-      <w:pPr>
-        <w:spacing w:after="20" w:before="0" w:line="480" w:lineRule="auto"/>
-        <w:ind w:firstLine="0"/>
-        <w:jc w:val="both"/>
-        <w:rPr/>
-      </w:pPr>
-      <w:r>
-        <w:rPr>
-          <w:rtl w:val="0"/>
-        </w:rPr>
-        <w:t xml:space="preserve">Functions: EC = uncertainty about a claim’s truth. P = interpersonal softening of a claim. FP = fails the claim condition or both checks.</w:t>
-      </w:r>
-    </w:p>
-    <w:p>
-      <w:pPr>
-        <w:spacing w:after="20" w:before="0" w:line="480" w:lineRule="auto"/>
-        <w:jc w:val="both"/>
-        <w:rPr/>
-      </w:pPr>
-      <w:r>
-        <w:rPr>
-          <w:rFonts w:ascii="Cardo" w:cs="Cardo" w:eastAsia="Cardo" w:hAnsi="Cardo"/>
-          <w:rtl w:val="0"/>
-        </w:rPr>
-        <w:t xml:space="preserve">Core rules: suggest/indicate finding→hedge, recommendation→FP-Rec, can/may possibility→hedge, capability→FP-Cap, generally/typically claim-limit→hedge, procedural→FP-Proc, appear/seem result-uncertainty→hedge, location→FP-Gen.</w:t>
-      </w:r>
-    </w:p>
-    <w:p>
-      <w:pPr>
-        <w:spacing w:after="20" w:before="0" w:line="480" w:lineRule="auto"/>
-        <w:jc w:val="both"/>
-        <w:rPr/>
-      </w:pPr>
-      <w:r>
-        <w:rPr>
-          <w:rFonts w:ascii="Cardo" w:cs="Cardo" w:eastAsia="Cardo" w:hAnsi="Cardo"/>
-          <w:rtl w:val="0"/>
-        </w:rPr>
-        <w:t xml:space="preserve">Steps 1-3: Step 1 wide-net candidates. Step 2 = claim condition, then Working Test + Reader Test → EC, P, or FP. Step 3 = type on retained P and EC.</w:t>
-      </w:r>
-      <w:r>
-        <w:br w:type="page"/>
-      </w:r>
-      <w:r>
-        <w:rPr>
-          <w:rtl w:val="0"/>
-        </w:rPr>
-      </w:r>
-    </w:p>
-    <w:p>
-      <w:pPr>
-        <w:spacing w:after="20" w:before="120" w:line="480" w:lineRule="auto"/>
-        <w:jc w:val="left"/>
-        <w:rPr>
-          <w:sz w:val="24"/>
-          <w:szCs w:val="24"/>
-        </w:rPr>
-      </w:pPr>
-      <w:r>
-        <w:rPr>
-          <w:b w:val="1"/>
-          <w:bCs w:val="1"/>
-          <w:sz w:val="24"/>
-          <w:szCs w:val="24"/>
-          <w:rtl w:val="0"/>
-        </w:rPr>
         <w:t xml:space="preserve">Quick-Reference Legend</w:t>
       </w:r>
       <w:r>
@@ -25083,7 +25005,7 @@
     </w:p>
     <w:p>
       <w:pPr>
-        <w:spacing w:after="20" w:before="0" w:line="480" w:lineRule="auto"/>
+        <w:spacing w:after="0" w:before="0" w:line="480" w:lineRule="auto"/>
         <w:ind w:left="360" w:firstLine="0"/>
         <w:jc w:val="both"/>
         <w:rPr/>
@@ -25581,7 +25503,7 @@
     <w:p>
       <w:pPr>
         <w:keepNext w:val="1"/>
-        <w:spacing w:after="20" w:before="60" w:line="480" w:lineRule="auto"/>
+        <w:spacing w:after="0" w:before="0" w:line="480" w:lineRule="auto"/>
         <w:jc w:val="left"/>
         <w:rPr/>
       </w:pPr>
@@ -25602,7 +25524,7 @@
     <w:p>
       <w:pPr>
         <w:keepNext w:val="1"/>
-        <w:spacing w:after="20" w:before="0" w:line="480" w:lineRule="auto"/>
+        <w:spacing w:after="0" w:before="0" w:line="480" w:lineRule="auto"/>
         <w:jc w:val="both"/>
         <w:rPr/>
       </w:pPr>
@@ -25788,7 +25710,7 @@
     <w:p>
       <w:pPr>
         <w:keepNext w:val="1"/>
-        <w:spacing w:after="40" w:before="0" w:line="480" w:lineRule="auto"/>
+        <w:spacing w:after="0" w:before="0" w:line="480" w:lineRule="auto"/>
         <w:jc w:val="both"/>
         <w:rPr>
           <w:i w:val="1"/>
@@ -25869,7 +25791,7 @@
     </w:p>
     <w:p>
       <w:pPr>
-        <w:spacing w:after="40" w:before="0" w:line="480" w:lineRule="auto"/>
+        <w:spacing w:after="0" w:before="0" w:line="480" w:lineRule="auto"/>
         <w:ind w:firstLine="0"/>
         <w:jc w:val="left"/>
         <w:rPr/>
@@ -25892,7 +25814,7 @@
     <w:p>
       <w:pPr>
         <w:keepNext w:val="1"/>
-        <w:spacing w:after="40" w:before="200" w:line="480" w:lineRule="auto"/>
+        <w:spacing w:after="0" w:before="0" w:line="480" w:lineRule="auto"/>
         <w:ind w:firstLine="0"/>
         <w:jc w:val="left"/>
         <w:rPr/>
@@ -25913,7 +25835,7 @@
     </w:p>
     <w:p>
       <w:pPr>
-        <w:spacing w:after="40" w:before="0" w:line="480" w:lineRule="auto"/>
+        <w:spacing w:after="0" w:before="0" w:line="480" w:lineRule="auto"/>
         <w:ind w:firstLine="0"/>
         <w:jc w:val="left"/>
         <w:rPr/>
@@ -25935,7 +25857,7 @@
     </w:p>
     <w:p>
       <w:pPr>
-        <w:spacing w:after="40" w:before="0" w:line="480" w:lineRule="auto"/>
+        <w:spacing w:after="0" w:before="0" w:line="480" w:lineRule="auto"/>
         <w:ind w:firstLine="0"/>
         <w:jc w:val="left"/>
         <w:rPr/>
@@ -25957,7 +25879,7 @@
     </w:p>
     <w:p>
       <w:pPr>
-        <w:spacing w:after="40" w:before="0" w:line="480" w:lineRule="auto"/>
+        <w:spacing w:after="0" w:before="0" w:line="480" w:lineRule="auto"/>
         <w:ind w:firstLine="0"/>
         <w:jc w:val="left"/>
         <w:rPr/>
@@ -25979,7 +25901,7 @@
     </w:p>
     <w:p>
       <w:pPr>
-        <w:spacing w:after="40" w:before="0" w:line="480" w:lineRule="auto"/>
+        <w:spacing w:after="0" w:before="0" w:line="480" w:lineRule="auto"/>
         <w:ind w:firstLine="0"/>
         <w:jc w:val="left"/>
         <w:rPr/>
@@ -26003,7 +25925,7 @@
     <w:p>
       <w:pPr>
         <w:keepNext w:val="1"/>
-        <w:spacing w:after="40" w:before="200" w:line="480" w:lineRule="auto"/>
+        <w:spacing w:after="0" w:before="0" w:line="480" w:lineRule="auto"/>
         <w:ind w:firstLine="0"/>
         <w:jc w:val="left"/>
         <w:rPr/>
@@ -26024,7 +25946,7 @@
     </w:p>
     <w:p>
       <w:pPr>
-        <w:spacing w:after="40" w:before="0" w:line="480" w:lineRule="auto"/>
+        <w:spacing w:after="0" w:before="0" w:line="480" w:lineRule="auto"/>
         <w:ind w:firstLine="0"/>
         <w:jc w:val="left"/>
         <w:rPr/>
@@ -26047,7 +25969,7 @@
     </w:p>
     <w:p>
       <w:pPr>
-        <w:spacing w:after="40" w:before="0" w:line="480" w:lineRule="auto"/>
+        <w:spacing w:after="0" w:before="0" w:line="480" w:lineRule="auto"/>
         <w:ind w:firstLine="0"/>
         <w:jc w:val="left"/>
         <w:rPr/>
@@ -26069,7 +25991,7 @@
     </w:p>
     <w:p>
       <w:pPr>
-        <w:spacing w:after="40" w:before="0" w:line="480" w:lineRule="auto"/>
+        <w:spacing w:after="0" w:before="0" w:line="480" w:lineRule="auto"/>
         <w:ind w:firstLine="0"/>
         <w:jc w:val="left"/>
         <w:rPr/>
@@ -26092,7 +26014,7 @@
     </w:p>
     <w:p>
       <w:pPr>
-        <w:spacing w:after="40" w:before="0" w:line="480" w:lineRule="auto"/>
+        <w:spacing w:after="0" w:before="0" w:line="480" w:lineRule="auto"/>
         <w:ind w:firstLine="0"/>
         <w:jc w:val="left"/>
         <w:rPr/>
@@ -26112,18 +26034,16 @@
         </w:rPr>
         <w:t xml:space="preserve">“Farmers should adopt the treatment” is a directive → FP-Rec.</w:t>
       </w:r>
-      <w:r>
-        <w:br w:type="page"/>
-      </w:r>
-      <w:r>
-        <w:rPr>
-          <w:rtl w:val="0"/>
-        </w:rPr>
-      </w:r>
-    </w:p>
-    <w:p>
-      <w:pPr>
-        <w:spacing w:after="40" w:before="0" w:line="480" w:lineRule="auto"/>
+      <w:r/>
+      <w:r>
+        <w:rPr>
+          <w:rtl w:val="0"/>
+        </w:rPr>
+      </w:r>
+    </w:p>
+    <w:p>
+      <w:pPr>
+        <w:spacing w:after="0" w:before="0" w:line="480" w:lineRule="auto"/>
         <w:ind w:firstLine="0"/>
         <w:jc w:val="left"/>
         <w:rPr>
@@ -26149,7 +26069,7 @@
     </w:p>
     <w:p>
       <w:pPr>
-        <w:spacing w:after="40" w:before="0" w:line="480" w:lineRule="auto"/>
+        <w:spacing w:after="0" w:before="0" w:line="480" w:lineRule="auto"/>
         <w:ind w:firstLine="0"/>
         <w:jc w:val="left"/>
         <w:rPr/>
@@ -26877,7 +26797,7 @@
     </w:p>
     <w:p>
       <w:pPr>
-        <w:spacing w:after="40" w:before="0" w:line="480" w:lineRule="auto"/>
+        <w:spacing w:after="0" w:before="0" w:line="480" w:lineRule="auto"/>
         <w:ind w:firstLine="0"/>
         <w:jc w:val="left"/>
         <w:rPr/>
@@ -26896,9 +26816,7 @@
         </w:rPr>
         <w:t xml:space="preserve">imply/implies/implying = suggest. can be concluded/derived/stated = inferential hedge (not capability can). potentially = adverbial. potential + noun: topic-naming in aims/methods = FP-Gen, qualifying a finding in results/conclusion = Lexical EC if removal changes commitment.</w:t>
       </w:r>
-      <w:r>
-        <w:br w:type="page"/>
-      </w:r>
+      <w:r/>
       <w:r>
         <w:rPr>
           <w:rtl w:val="0"/>
@@ -26908,7 +26826,7 @@
     <w:p>
       <w:pPr>
         <w:keepNext w:val="1"/>
-        <w:spacing w:after="40" w:before="200" w:line="480" w:lineRule="auto"/>
+        <w:spacing w:after="0" w:before="0" w:line="480" w:lineRule="auto"/>
         <w:ind w:firstLine="0"/>
         <w:jc w:val="left"/>
         <w:rPr>
@@ -27552,6 +27470,20 @@
     </w:p>
     <w:p>
       <w:pPr>
+        <w:spacing w:after="0" w:before="0" w:line="480" w:lineRule="auto"/>
+        <w:ind w:firstLine="0"/>
+        <w:jc w:val="left"/>
+        <w:rPr/>
+      </w:pPr>
+      <w:r>
+        <w:rPr>
+          <w:rtl w:val="0"/>
+        </w:rPr>
+        <w:t xml:space="preserve">Use the table below for FP reason codes after the claim condition or both tests fail.</w:t>
+      </w:r>
+    </w:p>
+    <w:p>
+      <w:pPr>
         <w:spacing w:after="40" w:before="0" w:line="480" w:lineRule="auto"/>
         <w:ind w:firstLine="0"/>
         <w:jc w:val="left"/>
@@ -27561,12 +27493,11 @@
         <w:rPr>
           <w:rtl w:val="0"/>
         </w:rPr>
-        <w:t xml:space="preserve">Use the table below for FP reason codes after the claim condition or both tests fail.</w:t>
-      </w:r>
-    </w:p>
-    <w:p>
-      <w:pPr>
-        <w:spacing w:after="40" w:before="0" w:line="480" w:lineRule="auto"/>
+      </w:r>
+    </w:p>
+    <w:p>
+      <w:pPr>
+        <w:spacing w:after="0" w:before="0" w:line="480" w:lineRule="auto"/>
         <w:ind w:firstLine="0"/>
         <w:jc w:val="left"/>
         <w:rPr/>
@@ -27575,27 +27506,14 @@
         <w:rPr>
           <w:rtl w:val="0"/>
         </w:rPr>
-      </w:r>
-    </w:p>
-    <w:p>
-      <w:pPr>
-        <w:spacing w:after="40" w:before="0" w:line="480" w:lineRule="auto"/>
+        <w:t xml:space="preserve">Never hedges: ability, future procedure, and procedural necessity (a step required by the method itself).</w:t>
+      </w:r>
+    </w:p>
+    <w:p>
+      <w:pPr>
+        <w:spacing w:after="0" w:before="0" w:line="480" w:lineRule="auto"/>
         <w:ind w:firstLine="0"/>
         <w:jc w:val="left"/>
-        <w:rPr/>
-      </w:pPr>
-      <w:r>
-        <w:rPr>
-          <w:rtl w:val="0"/>
-        </w:rPr>
-        <w:t xml:space="preserve">Never hedges: ability, future procedure, and procedural necessity (a step required by the method itself).</w:t>
-      </w:r>
-    </w:p>
-    <w:p>
-      <w:pPr>
-        <w:spacing w:after="40" w:before="0" w:line="480" w:lineRule="auto"/>
-        <w:ind w:firstLine="0"/>
-        <w:jc w:val="left"/>
         <w:rPr>
           <w:b w:val="1"/>
           <w:bCs w:val="1"/>
@@ -27616,7 +27534,7 @@
     <w:p>
       <w:pPr>
         <w:keepNext w:val="1"/>
-        <w:spacing w:after="40" w:before="200" w:line="480" w:lineRule="auto"/>
+        <w:spacing w:after="0" w:before="0" w:line="480" w:lineRule="auto"/>
         <w:ind w:firstLine="0"/>
         <w:jc w:val="left"/>
         <w:rPr>
@@ -27642,7 +27560,7 @@
     </w:p>
     <w:p>
       <w:pPr>
-        <w:spacing w:after="40" w:before="0" w:line="480" w:lineRule="auto"/>
+        <w:spacing w:after="0" w:before="0" w:line="480" w:lineRule="auto"/>
         <w:ind w:firstLine="0"/>
         <w:jc w:val="left"/>
         <w:rPr/>
@@ -28366,7 +28284,7 @@
     <w:p>
       <w:pPr>
         <w:keepNext w:val="1"/>
-        <w:spacing w:after="40" w:before="200" w:line="480" w:lineRule="auto"/>
+        <w:spacing w:after="0" w:before="0" w:line="480" w:lineRule="auto"/>
         <w:ind w:firstLine="0"/>
         <w:jc w:val="left"/>
         <w:rPr>
@@ -28392,7 +28310,7 @@
     </w:p>
     <w:p>
       <w:pPr>
-        <w:spacing w:after="40" w:before="0" w:line="480" w:lineRule="auto"/>
+        <w:spacing w:after="0" w:before="0" w:line="480" w:lineRule="auto"/>
         <w:ind w:firstLine="0"/>
         <w:jc w:val="left"/>
         <w:rPr/>
@@ -28414,7 +28332,7 @@
     </w:p>
     <w:p>
       <w:pPr>
-        <w:spacing w:after="40" w:before="0" w:line="480" w:lineRule="auto"/>
+        <w:spacing w:after="0" w:before="0" w:line="480" w:lineRule="auto"/>
         <w:ind w:firstLine="0"/>
         <w:jc w:val="left"/>
         <w:rPr/>
@@ -28436,7 +28354,7 @@
     </w:p>
     <w:p>
       <w:pPr>
-        <w:spacing w:after="40" w:before="0" w:line="480" w:lineRule="auto"/>
+        <w:spacing w:after="0" w:before="0" w:line="480" w:lineRule="auto"/>
         <w:ind w:firstLine="0"/>
         <w:jc w:val="left"/>
         <w:rPr/>
@@ -28458,7 +28376,7 @@
     </w:p>
     <w:p>
       <w:pPr>
-        <w:spacing w:after="40" w:before="0" w:line="480" w:lineRule="auto"/>
+        <w:spacing w:after="0" w:before="0" w:line="480" w:lineRule="auto"/>
         <w:ind w:firstLine="0"/>
         <w:jc w:val="left"/>
         <w:rPr/>
@@ -28480,7 +28398,7 @@
     </w:p>
     <w:p>
       <w:pPr>
-        <w:spacing w:after="40" w:before="0" w:line="480" w:lineRule="auto"/>
+        <w:spacing w:after="0" w:before="0" w:line="480" w:lineRule="auto"/>
         <w:ind w:firstLine="0"/>
         <w:jc w:val="left"/>
         <w:rPr/>
@@ -29029,7 +28947,7 @@
     <w:p>
       <w:pPr>
         <w:keepNext w:val="1"/>
-        <w:spacing w:after="40" w:before="200" w:line="480" w:lineRule="auto"/>
+        <w:spacing w:after="0" w:before="0" w:line="480" w:lineRule="auto"/>
         <w:ind w:firstLine="0"/>
         <w:jc w:val="left"/>
         <w:rPr>
@@ -29037,9 +28955,7 @@
           <w:szCs w:val="24"/>
         </w:rPr>
       </w:pPr>
-      <w:r>
-        <w:br w:type="page"/>
-      </w:r>
+      <w:r/>
       <w:r>
         <w:rPr>
           <w:b w:val="1"/>
@@ -30414,7 +30330,7 @@
     </w:p>
     <w:p>
       <w:pPr>
-        <w:spacing w:after="40" w:before="0" w:line="480" w:lineRule="auto"/>
+        <w:spacing w:after="0" w:before="0" w:line="480" w:lineRule="auto"/>
         <w:ind w:firstLine="0"/>
         <w:jc w:val="left"/>
         <w:rPr/>
@@ -30436,7 +30352,7 @@
     </w:p>
     <w:p>
       <w:pPr>
-        <w:spacing w:after="40" w:before="0" w:line="480" w:lineRule="auto"/>
+        <w:spacing w:after="0" w:before="0" w:line="480" w:lineRule="auto"/>
         <w:ind w:firstLine="0"/>
         <w:jc w:val="left"/>
         <w:rPr/>
@@ -30458,7 +30374,7 @@
     </w:p>
     <w:p>
       <w:pPr>
-        <w:spacing w:after="40" w:before="0" w:line="480" w:lineRule="auto"/>
+        <w:spacing w:after="0" w:before="0" w:line="480" w:lineRule="auto"/>
         <w:ind w:firstLine="0"/>
         <w:jc w:val="left"/>
         <w:rPr/>
@@ -30480,10 +30396,16 @@
     </w:p>
     <w:p>
       <w:pPr>
-        <w:spacing w:after="40" w:before="0" w:line="480" w:lineRule="auto"/>
+        <w:spacing w:after="0" w:before="0" w:line="480" w:lineRule="auto"/>
         <w:ind w:firstLine="0"/>
         <w:jc w:val="left"/>
         <w:rPr/>
+        <w:sectPr>
+          <w:type w:val="nextPage"/>
+          <w:pgSz w:h="16838" w:w="11906" w:orient="portrait"/>
+          <w:pgMar w:bottom="1440" w:top="1440" w:left="2160" w:right="1440" w:header="720" w:footer="720"/>
+          <w:titlePg w:val="1"/>
+        </w:sectPr>
       </w:pPr>
       <w:r>
         <w:rPr>
@@ -30499,9 +30421,7 @@
         </w:rPr>
         <w:t xml:space="preserve">Optional Rejected Candidates tab for FP traceability.</w:t>
       </w:r>
-      <w:r>
-        <w:br w:type="page"/>
-      </w:r>
+      <w:r/>
       <w:r>
         <w:rPr>
           <w:rtl w:val="0"/>
@@ -30530,7 +30450,6 @@
       <w:pPr>
         <w:spacing w:before="0" w:after="0" w:line="480" w:lineRule="auto"/>
         <w:jc w:val="center"/>
-        <w:ind w:left="0" w:firstLine="0"/>
       </w:pPr>
       <w:r>
         <w:rPr>
@@ -31203,7 +31122,6 @@
       <w:pPr>
         <w:spacing w:before="0" w:after="0" w:line="480" w:lineRule="auto"/>
         <w:jc w:val="center"/>
-        <w:ind w:left="0" w:firstLine="0"/>
       </w:pPr>
       <w:r>
         <w:rPr>

</xml_diff>

<commit_message>
Draft_127_body: move section breaks off Token/body onto spacers
</commit_message>
<xml_diff>
--- a/thesis/003_ThesisProposal_Draft_127_body.docx
+++ b/thesis/003_ThesisProposal_Draft_127_body.docx
@@ -412,12 +412,6 @@
         <w:ind w:left="0" w:right="0" w:firstLine="0"/>
         <w:jc w:val="center"/>
         <w:rPr/>
-        <w:sectPr>
-          <w:type w:val="nextPage"/>
-          <w:pgSz w:h="16838" w:w="11906" w:orient="portrait"/>
-          <w:pgMar w:bottom="1440" w:top="1440" w:left="2160" w:right="1440" w:header="720" w:footer="720"/>
-          <w:titlePg w:val="1"/>
-        </w:sectPr>
       </w:pPr>
       <w:r>
         <w:rPr>
@@ -436,6 +430,20 @@
         <w:rPr>
           <w:rtl w:val="0"/>
         </w:rPr>
+      </w:r>
+    </w:p>
+    <w:p>
+      <w:pPr>
+        <w:spacing w:before="0" w:after="0" w:line="480" w:lineRule="auto"/>
+        <w:sectPr>
+          <w:type w:val="nextPage"/>
+          <w:pgSz w:h="16838" w:w="11906" w:orient="portrait"/>
+          <w:pgMar w:bottom="1440" w:top="1440" w:left="2160" w:right="1440" w:header="720" w:footer="720"/>
+          <w:titlePg w:val="1"/>
+        </w:sectPr>
+      </w:pPr>
+      <w:r>
+        <w:t xml:space="preserve"/>
       </w:r>
     </w:p>
     <w:p>
@@ -3386,12 +3394,6 @@
         <w:ind w:left="0" w:firstLine="720"/>
         <w:jc w:val="both"/>
         <w:rPr/>
-        <w:sectPr>
-          <w:type w:val="nextPage"/>
-          <w:pgSz w:h="16838" w:w="11906" w:orient="portrait"/>
-          <w:pgMar w:bottom="1440" w:top="1440" w:left="2160" w:right="1440" w:header="720" w:footer="720"/>
-          <w:titlePg w:val="1"/>
-        </w:sectPr>
       </w:pPr>
       <w:r>
         <w:rPr>
@@ -3423,6 +3425,20 @@
         <w:rPr>
           <w:rtl w:val="0"/>
         </w:rPr>
+      </w:r>
+    </w:p>
+    <w:p>
+      <w:pPr>
+        <w:spacing w:before="0" w:after="0" w:line="480" w:lineRule="auto"/>
+        <w:sectPr>
+          <w:type w:val="nextPage"/>
+          <w:pgSz w:h="16838" w:w="11906" w:orient="portrait"/>
+          <w:pgMar w:bottom="1440" w:top="1440" w:left="2160" w:right="1440" w:header="720" w:footer="720"/>
+          <w:titlePg w:val="1"/>
+        </w:sectPr>
+      </w:pPr>
+      <w:r>
+        <w:t xml:space="preserve"/>
       </w:r>
     </w:p>
     <w:p>
@@ -6358,12 +6374,6 @@
         <w:ind w:left="0" w:firstLine="720"/>
         <w:jc w:val="both"/>
         <w:rPr/>
-        <w:sectPr>
-          <w:type w:val="nextPage"/>
-          <w:pgSz w:h="16838" w:w="11906" w:orient="portrait"/>
-          <w:pgMar w:bottom="1440" w:top="1440" w:left="2160" w:right="1440" w:header="720" w:footer="720"/>
-          <w:titlePg w:val="1"/>
-        </w:sectPr>
       </w:pPr>
       <w:r>
         <w:rPr>
@@ -6382,6 +6392,20 @@
         <w:rPr>
           <w:rtl w:val="0"/>
         </w:rPr>
+      </w:r>
+    </w:p>
+    <w:p>
+      <w:pPr>
+        <w:spacing w:before="0" w:after="0" w:line="480" w:lineRule="auto"/>
+        <w:sectPr>
+          <w:type w:val="nextPage"/>
+          <w:pgSz w:h="16838" w:w="11906" w:orient="portrait"/>
+          <w:pgMar w:bottom="1440" w:top="1440" w:left="2160" w:right="1440" w:header="720" w:footer="720"/>
+          <w:titlePg w:val="1"/>
+        </w:sectPr>
+      </w:pPr>
+      <w:r>
+        <w:t xml:space="preserve"/>
       </w:r>
     </w:p>
     <w:p>
@@ -22464,12 +22488,6 @@
         <w:ind w:left="0" w:firstLine="720"/>
         <w:jc w:val="both"/>
         <w:rPr/>
-        <w:sectPr>
-          <w:type w:val="nextPage"/>
-          <w:pgSz w:h="16838" w:w="11906" w:orient="portrait"/>
-          <w:pgMar w:bottom="1440" w:top="1440" w:left="2160" w:right="1440" w:header="720" w:footer="720"/>
-          <w:titlePg w:val="1"/>
-        </w:sectPr>
       </w:pPr>
       <w:r>
         <w:rPr>
@@ -22492,6 +22510,20 @@
     </w:p>
     <w:p>
       <w:pPr>
+        <w:spacing w:before="0" w:after="0" w:line="480" w:lineRule="auto"/>
+        <w:sectPr>
+          <w:type w:val="nextPage"/>
+          <w:pgSz w:h="16838" w:w="11906" w:orient="portrait"/>
+          <w:pgMar w:bottom="1440" w:top="1440" w:left="2160" w:right="1440" w:header="720" w:footer="720"/>
+          <w:titlePg w:val="1"/>
+        </w:sectPr>
+      </w:pPr>
+      <w:r>
+        <w:t xml:space="preserve"/>
+      </w:r>
+    </w:p>
+    <w:p>
+      <w:pPr>
         <w:spacing w:after="0" w:before="0" w:line="480" w:lineRule="auto"/>
         <w:jc w:val="center"/>
         <w:rPr>
@@ -22789,12 +22821,6 @@
         <w:ind w:left="0" w:firstLine="720"/>
         <w:jc w:val="both"/>
         <w:rPr/>
-        <w:sectPr>
-          <w:type w:val="nextPage"/>
-          <w:pgSz w:h="16838" w:w="11906" w:orient="portrait"/>
-          <w:pgMar w:bottom="1440" w:top="1440" w:left="2160" w:right="1440" w:header="720" w:footer="720"/>
-          <w:titlePg w:val="1"/>
-        </w:sectPr>
       </w:pPr>
       <w:r>
         <w:rPr>
@@ -22813,6 +22839,20 @@
         <w:rPr>
           <w:rtl w:val="0"/>
         </w:rPr>
+      </w:r>
+    </w:p>
+    <w:p>
+      <w:pPr>
+        <w:spacing w:before="0" w:after="0" w:line="480" w:lineRule="auto"/>
+        <w:sectPr>
+          <w:type w:val="nextPage"/>
+          <w:pgSz w:h="16838" w:w="11906" w:orient="portrait"/>
+          <w:pgMar w:bottom="1440" w:top="1440" w:left="2160" w:right="1440" w:header="720" w:footer="720"/>
+          <w:titlePg w:val="1"/>
+        </w:sectPr>
+      </w:pPr>
+      <w:r>
+        <w:t xml:space="preserve"/>
       </w:r>
     </w:p>
     <w:p>
@@ -24241,12 +24281,6 @@
         <w:ind w:left="720" w:hanging="720"/>
         <w:jc w:val="both"/>
         <w:rPr/>
-        <w:sectPr>
-          <w:type w:val="nextPage"/>
-          <w:pgSz w:h="16838" w:w="11906" w:orient="portrait"/>
-          <w:pgMar w:bottom="1440" w:top="1440" w:left="2160" w:right="1440" w:header="720" w:footer="720"/>
-          <w:titlePg w:val="1"/>
-        </w:sectPr>
       </w:pPr>
       <w:r>
         <w:rPr>
@@ -24265,6 +24299,20 @@
         <w:rPr>
           <w:rtl w:val="0"/>
         </w:rPr>
+      </w:r>
+    </w:p>
+    <w:p>
+      <w:pPr>
+        <w:spacing w:before="0" w:after="0" w:line="480" w:lineRule="auto"/>
+        <w:sectPr>
+          <w:type w:val="nextPage"/>
+          <w:pgSz w:h="16838" w:w="11906" w:orient="portrait"/>
+          <w:pgMar w:bottom="1440" w:top="1440" w:left="2160" w:right="1440" w:header="720" w:footer="720"/>
+          <w:titlePg w:val="1"/>
+        </w:sectPr>
+      </w:pPr>
+      <w:r>
+        <w:t xml:space="preserve"/>
       </w:r>
     </w:p>
     <w:p>
@@ -29930,6 +29978,31 @@
         <w:ind w:firstLine="0"/>
         <w:jc w:val="left"/>
         <w:rPr/>
+      </w:pPr>
+      <w:r>
+        <w:rPr>
+          <w:b w:val="1"/>
+          <w:bCs w:val="1"/>
+          <w:rtl w:val="0"/>
+        </w:rPr>
+        <w:t xml:space="preserve">• FP tab. </w:t>
+      </w:r>
+      <w:r>
+        <w:rPr>
+          <w:rtl w:val="0"/>
+        </w:rPr>
+        <w:t xml:space="preserve">Optional Rejected Candidates tab for FP traceability.</w:t>
+      </w:r>
+      <w:r/>
+      <w:r>
+        <w:rPr>
+          <w:rtl w:val="0"/>
+        </w:rPr>
+      </w:r>
+    </w:p>
+    <w:p>
+      <w:pPr>
+        <w:spacing w:before="0" w:after="0" w:line="480" w:lineRule="auto"/>
         <w:sectPr>
           <w:type w:val="nextPage"/>
           <w:pgSz w:h="16838" w:w="11906" w:orient="portrait"/>
@@ -29938,41 +30011,7 @@
         </w:sectPr>
       </w:pPr>
       <w:r>
-        <w:rPr>
-          <w:b w:val="1"/>
-          <w:bCs w:val="1"/>
-          <w:rtl w:val="0"/>
-        </w:rPr>
-        <w:t xml:space="preserve">• FP tab. </w:t>
-      </w:r>
-      <w:r>
-        <w:rPr>
-          <w:rtl w:val="0"/>
-        </w:rPr>
-        <w:t xml:space="preserve">Optional Rejected Candidates tab for FP traceability.</w:t>
-      </w:r>
-      <w:r/>
-      <w:r>
-        <w:rPr>
-          <w:rtl w:val="0"/>
-        </w:rPr>
-      </w:r>
-    </w:p>
-    <w:p>
-      <w:pPr>
-        <w:spacing w:after="0" w:before="0" w:line="480" w:lineRule="auto"/>
-        <w:jc w:val="center"/>
-        <w:rPr>
-          <w:b w:val="1"/>
-          <w:bCs w:val="1"/>
-          <w:sz w:val="28"/>
-          <w:szCs w:val="28"/>
-        </w:rPr>
-      </w:pPr>
-      <w:r>
-        <w:rPr>
-          <w:rtl w:val="0"/>
-        </w:rPr>
+        <w:t xml:space="preserve"/>
       </w:r>
     </w:p>
     <w:p>
@@ -30601,6 +30640,33 @@
         <w:spacing w:before="0" w:after="0" w:line="480" w:lineRule="auto"/>
         <w:jc w:val="both"/>
         <w:ind w:left="0" w:firstLine="720"/>
+      </w:pPr>
+      <w:r>
+        <w:rPr>
+          <w:rFonts w:ascii="Georgia" w:hAnsi="Georgia" w:cs="Georgia" w:eastAsia="Georgia"/>
+          <w:sz w:val="22"/>
+          <w:szCs w:val="22"/>
+        </w:rPr>
+        <w:t xml:space="preserve">Three of the four pilot abstracts contained no coded hedges. The pattern pointed to a high base rate of zero-hedge writing in the local undergraduate abstract genre and confirmed that a descriptive baseline study was warranted. The same decision rules and Working Test were carried forward into the main coding of the 60-abstract corpus.</w:t>
+      </w:r>
+      <w:r>
+        <w:rPr>
+          <w:rFonts w:ascii="Georgia" w:hAnsi="Georgia" w:cs="Georgia" w:eastAsia="Georgia"/>
+          <w:sz w:val="22"/>
+          <w:szCs w:val="22"/>
+        </w:rPr>
+      </w:r>
+      <w:r>
+        <w:rPr>
+          <w:rFonts w:ascii="Georgia" w:hAnsi="Georgia" w:cs="Georgia" w:eastAsia="Georgia"/>
+          <w:sz w:val="22"/>
+          <w:szCs w:val="22"/>
+        </w:rPr>
+      </w:r>
+    </w:p>
+    <w:p>
+      <w:pPr>
+        <w:spacing w:before="0" w:after="0" w:line="480" w:lineRule="auto"/>
         <w:sectPr>
           <w:type w:val="nextPage"/>
           <w:pgSz w:h="16838" w:w="11906" w:orient="portrait"/>
@@ -30609,26 +30675,7 @@
         </w:sectPr>
       </w:pPr>
       <w:r>
-        <w:rPr>
-          <w:rFonts w:ascii="Georgia" w:hAnsi="Georgia" w:cs="Georgia" w:eastAsia="Georgia"/>
-          <w:sz w:val="22"/>
-          <w:szCs w:val="22"/>
-        </w:rPr>
-        <w:t xml:space="preserve">Three of the four pilot abstracts contained no coded hedges. The pattern pointed to a high base rate of zero-hedge writing in the local undergraduate abstract genre and confirmed that a descriptive baseline study was warranted. The same decision rules and Working Test were carried forward into the main coding of the 60-abstract corpus.</w:t>
-      </w:r>
-      <w:r>
-        <w:rPr>
-          <w:rFonts w:ascii="Georgia" w:hAnsi="Georgia" w:cs="Georgia" w:eastAsia="Georgia"/>
-          <w:sz w:val="22"/>
-          <w:szCs w:val="22"/>
-        </w:rPr>
-      </w:r>
-      <w:r>
-        <w:rPr>
-          <w:rFonts w:ascii="Georgia" w:hAnsi="Georgia" w:cs="Georgia" w:eastAsia="Georgia"/>
-          <w:sz w:val="22"/>
-          <w:szCs w:val="22"/>
-        </w:rPr>
+        <w:t xml:space="preserve"/>
       </w:r>
     </w:p>
     <w:p>

</xml_diff>

<commit_message>
Draft_127_body: major spacers on new page (3 visible above + 3 below)
</commit_message>
<xml_diff>
--- a/thesis/003_ThesisProposal_Draft_127_body.docx
+++ b/thesis/003_ThesisProposal_Draft_127_body.docx
@@ -352,42 +352,6 @@
           <w:sz w:val="24"/>
           <w:szCs w:val="24"/>
         </w:rPr>
-      </w:r>
-    </w:p>
-    <w:p>
-      <w:pPr>
-        <w:spacing w:before="0" w:after="0" w:line="360" w:lineRule="auto"/>
-        <w:jc w:val="center"/>
-      </w:pPr>
-      <w:r>
-        <w:rPr>
-          <w:rFonts w:ascii="Georgia" w:hAnsi="Georgia" w:cs="Georgia"/>
-          <w:sz w:val="24"/>
-          <w:szCs w:val="24"/>
-        </w:rPr>
-        <w:t xml:space="preserve"/>
-      </w:r>
-    </w:p>
-    <w:p>
-      <w:pPr>
-        <w:spacing w:before="0" w:after="0" w:line="480" w:lineRule="auto"/>
-      </w:pPr>
-      <w:r>
-        <w:rPr>
-          <w:rFonts w:ascii="Georgia" w:hAnsi="Georgia" w:cs="Georgia"/>
-        </w:rPr>
-        <w:t xml:space="preserve"/>
-      </w:r>
-    </w:p>
-    <w:p>
-      <w:pPr>
-        <w:spacing w:before="0" w:after="0" w:line="480" w:lineRule="auto"/>
-      </w:pPr>
-      <w:r>
-        <w:rPr>
-          <w:rFonts w:ascii="Georgia" w:hAnsi="Georgia" w:cs="Georgia"/>
-        </w:rPr>
-        <w:t xml:space="preserve"/>
       </w:r>
     </w:p>
     <w:p>
@@ -402,7 +366,44 @@
       </w:pPr>
       <w:r>
         <w:rPr>
-          <w:rFonts w:ascii="Georgia" w:hAnsi="Georgia" w:cs="Georgia"/>
+          <w:rFonts w:ascii="Georgia" w:hAnsi="Georgia"/>
+          <w:sz w:val="22"/>
+        </w:rPr>
+        <w:t xml:space="preserve"/>
+      </w:r>
+    </w:p>
+    <w:p>
+      <w:pPr>
+        <w:spacing w:before="0" w:after="0" w:line="480" w:lineRule="auto"/>
+      </w:pPr>
+      <w:r>
+        <w:rPr>
+          <w:rFonts w:ascii="Georgia" w:hAnsi="Georgia"/>
+          <w:sz w:val="22"/>
+        </w:rPr>
+        <w:t xml:space="preserve"/>
+      </w:r>
+    </w:p>
+    <w:p>
+      <w:pPr>
+        <w:spacing w:before="0" w:after="0" w:line="480" w:lineRule="auto"/>
+      </w:pPr>
+      <w:r>
+        <w:rPr>
+          <w:rFonts w:ascii="Georgia" w:hAnsi="Georgia"/>
+          <w:sz w:val="22"/>
+        </w:rPr>
+        <w:t xml:space="preserve"/>
+      </w:r>
+    </w:p>
+    <w:p>
+      <w:pPr>
+        <w:spacing w:before="0" w:after="0" w:line="480" w:lineRule="auto"/>
+      </w:pPr>
+      <w:r>
+        <w:rPr>
+          <w:rFonts w:ascii="Georgia" w:hAnsi="Georgia"/>
+          <w:sz w:val="22"/>
         </w:rPr>
         <w:t xml:space="preserve"/>
       </w:r>
@@ -440,7 +441,8 @@
       </w:pPr>
       <w:r>
         <w:rPr>
-          <w:rFonts w:ascii="Georgia" w:hAnsi="Georgia" w:cs="Georgia"/>
+          <w:rFonts w:ascii="Georgia" w:hAnsi="Georgia"/>
+          <w:sz w:val="22"/>
         </w:rPr>
         <w:t xml:space="preserve"/>
       </w:r>
@@ -451,7 +453,8 @@
       </w:pPr>
       <w:r>
         <w:rPr>
-          <w:rFonts w:ascii="Georgia" w:hAnsi="Georgia" w:cs="Georgia"/>
+          <w:rFonts w:ascii="Georgia" w:hAnsi="Georgia"/>
+          <w:sz w:val="22"/>
         </w:rPr>
         <w:t xml:space="preserve"/>
       </w:r>
@@ -462,7 +465,8 @@
       </w:pPr>
       <w:r>
         <w:rPr>
-          <w:rFonts w:ascii="Georgia" w:hAnsi="Georgia" w:cs="Georgia"/>
+          <w:rFonts w:ascii="Georgia" w:hAnsi="Georgia"/>
+          <w:sz w:val="22"/>
         </w:rPr>
         <w:t xml:space="preserve"/>
       </w:r>
@@ -3583,28 +3587,6 @@
     <w:p>
       <w:pPr>
         <w:spacing w:before="0" w:after="0" w:line="480" w:lineRule="auto"/>
-      </w:pPr>
-      <w:r>
-        <w:rPr>
-          <w:rFonts w:ascii="Georgia" w:hAnsi="Georgia" w:cs="Georgia"/>
-        </w:rPr>
-        <w:t xml:space="preserve"/>
-      </w:r>
-    </w:p>
-    <w:p>
-      <w:pPr>
-        <w:spacing w:before="0" w:after="0" w:line="480" w:lineRule="auto"/>
-      </w:pPr>
-      <w:r>
-        <w:rPr>
-          <w:rFonts w:ascii="Georgia" w:hAnsi="Georgia" w:cs="Georgia"/>
-        </w:rPr>
-        <w:t xml:space="preserve"/>
-      </w:r>
-    </w:p>
-    <w:p>
-      <w:pPr>
-        <w:spacing w:before="0" w:after="0" w:line="480" w:lineRule="auto"/>
         <w:sectPr>
           <w:type w:val="nextPage"/>
           <w:pgSz w:h="16838" w:w="11906" w:orient="portrait"/>
@@ -3614,7 +3596,44 @@
       </w:pPr>
       <w:r>
         <w:rPr>
-          <w:rFonts w:ascii="Georgia" w:hAnsi="Georgia" w:cs="Georgia"/>
+          <w:rFonts w:ascii="Georgia" w:hAnsi="Georgia"/>
+          <w:sz w:val="22"/>
+        </w:rPr>
+        <w:t xml:space="preserve"/>
+      </w:r>
+    </w:p>
+    <w:p>
+      <w:pPr>
+        <w:spacing w:before="0" w:after="0" w:line="480" w:lineRule="auto"/>
+      </w:pPr>
+      <w:r>
+        <w:rPr>
+          <w:rFonts w:ascii="Georgia" w:hAnsi="Georgia"/>
+          <w:sz w:val="22"/>
+        </w:rPr>
+        <w:t xml:space="preserve"/>
+      </w:r>
+    </w:p>
+    <w:p>
+      <w:pPr>
+        <w:spacing w:before="0" w:after="0" w:line="480" w:lineRule="auto"/>
+      </w:pPr>
+      <w:r>
+        <w:rPr>
+          <w:rFonts w:ascii="Georgia" w:hAnsi="Georgia"/>
+          <w:sz w:val="22"/>
+        </w:rPr>
+        <w:t xml:space="preserve"/>
+      </w:r>
+    </w:p>
+    <w:p>
+      <w:pPr>
+        <w:spacing w:before="0" w:after="0" w:line="480" w:lineRule="auto"/>
+      </w:pPr>
+      <w:r>
+        <w:rPr>
+          <w:rFonts w:ascii="Georgia" w:hAnsi="Georgia"/>
+          <w:sz w:val="22"/>
         </w:rPr>
         <w:t xml:space="preserve"/>
       </w:r>
@@ -3652,7 +3671,8 @@
       </w:pPr>
       <w:r>
         <w:rPr>
-          <w:rFonts w:ascii="Georgia" w:hAnsi="Georgia" w:cs="Georgia"/>
+          <w:rFonts w:ascii="Georgia" w:hAnsi="Georgia"/>
+          <w:sz w:val="22"/>
         </w:rPr>
         <w:t xml:space="preserve"/>
       </w:r>
@@ -3663,7 +3683,8 @@
       </w:pPr>
       <w:r>
         <w:rPr>
-          <w:rFonts w:ascii="Georgia" w:hAnsi="Georgia" w:cs="Georgia"/>
+          <w:rFonts w:ascii="Georgia" w:hAnsi="Georgia"/>
+          <w:sz w:val="22"/>
         </w:rPr>
         <w:t xml:space="preserve"/>
       </w:r>
@@ -3674,7 +3695,8 @@
       </w:pPr>
       <w:r>
         <w:rPr>
-          <w:rFonts w:ascii="Georgia" w:hAnsi="Georgia" w:cs="Georgia"/>
+          <w:rFonts w:ascii="Georgia" w:hAnsi="Georgia"/>
+          <w:sz w:val="22"/>
         </w:rPr>
         <w:t xml:space="preserve"/>
       </w:r>
@@ -6514,28 +6536,6 @@
     <w:p>
       <w:pPr>
         <w:spacing w:before="0" w:after="0" w:line="480" w:lineRule="auto"/>
-      </w:pPr>
-      <w:r>
-        <w:rPr>
-          <w:rFonts w:ascii="Georgia" w:hAnsi="Georgia" w:cs="Georgia"/>
-        </w:rPr>
-        <w:t xml:space="preserve"/>
-      </w:r>
-    </w:p>
-    <w:p>
-      <w:pPr>
-        <w:spacing w:before="0" w:after="0" w:line="480" w:lineRule="auto"/>
-      </w:pPr>
-      <w:r>
-        <w:rPr>
-          <w:rFonts w:ascii="Georgia" w:hAnsi="Georgia" w:cs="Georgia"/>
-        </w:rPr>
-        <w:t xml:space="preserve"/>
-      </w:r>
-    </w:p>
-    <w:p>
-      <w:pPr>
-        <w:spacing w:before="0" w:after="0" w:line="480" w:lineRule="auto"/>
         <w:sectPr>
           <w:type w:val="nextPage"/>
           <w:pgSz w:h="16838" w:w="11906" w:orient="portrait"/>
@@ -6545,7 +6545,44 @@
       </w:pPr>
       <w:r>
         <w:rPr>
-          <w:rFonts w:ascii="Georgia" w:hAnsi="Georgia" w:cs="Georgia"/>
+          <w:rFonts w:ascii="Georgia" w:hAnsi="Georgia"/>
+          <w:sz w:val="22"/>
+        </w:rPr>
+        <w:t xml:space="preserve"/>
+      </w:r>
+    </w:p>
+    <w:p>
+      <w:pPr>
+        <w:spacing w:before="0" w:after="0" w:line="480" w:lineRule="auto"/>
+      </w:pPr>
+      <w:r>
+        <w:rPr>
+          <w:rFonts w:ascii="Georgia" w:hAnsi="Georgia"/>
+          <w:sz w:val="22"/>
+        </w:rPr>
+        <w:t xml:space="preserve"/>
+      </w:r>
+    </w:p>
+    <w:p>
+      <w:pPr>
+        <w:spacing w:before="0" w:after="0" w:line="480" w:lineRule="auto"/>
+      </w:pPr>
+      <w:r>
+        <w:rPr>
+          <w:rFonts w:ascii="Georgia" w:hAnsi="Georgia"/>
+          <w:sz w:val="22"/>
+        </w:rPr>
+        <w:t xml:space="preserve"/>
+      </w:r>
+    </w:p>
+    <w:p>
+      <w:pPr>
+        <w:spacing w:before="0" w:after="0" w:line="480" w:lineRule="auto"/>
+      </w:pPr>
+      <w:r>
+        <w:rPr>
+          <w:rFonts w:ascii="Georgia" w:hAnsi="Georgia"/>
+          <w:sz w:val="22"/>
         </w:rPr>
         <w:t xml:space="preserve"/>
       </w:r>
@@ -6583,7 +6620,8 @@
       </w:pPr>
       <w:r>
         <w:rPr>
-          <w:rFonts w:ascii="Georgia" w:hAnsi="Georgia" w:cs="Georgia"/>
+          <w:rFonts w:ascii="Georgia" w:hAnsi="Georgia"/>
+          <w:sz w:val="22"/>
         </w:rPr>
         <w:t xml:space="preserve"/>
       </w:r>
@@ -6594,7 +6632,8 @@
       </w:pPr>
       <w:r>
         <w:rPr>
-          <w:rFonts w:ascii="Georgia" w:hAnsi="Georgia" w:cs="Georgia"/>
+          <w:rFonts w:ascii="Georgia" w:hAnsi="Georgia"/>
+          <w:sz w:val="22"/>
         </w:rPr>
         <w:t xml:space="preserve"/>
       </w:r>
@@ -6605,7 +6644,8 @@
       </w:pPr>
       <w:r>
         <w:rPr>
-          <w:rFonts w:ascii="Georgia" w:hAnsi="Georgia" w:cs="Georgia"/>
+          <w:rFonts w:ascii="Georgia" w:hAnsi="Georgia"/>
+          <w:sz w:val="22"/>
         </w:rPr>
         <w:t xml:space="preserve"/>
       </w:r>
@@ -21352,28 +21392,6 @@
     <w:p>
       <w:pPr>
         <w:spacing w:before="0" w:after="0" w:line="480" w:lineRule="auto"/>
-      </w:pPr>
-      <w:r>
-        <w:rPr>
-          <w:rFonts w:ascii="Georgia" w:hAnsi="Georgia" w:cs="Georgia"/>
-        </w:rPr>
-        <w:t xml:space="preserve"/>
-      </w:r>
-    </w:p>
-    <w:p>
-      <w:pPr>
-        <w:spacing w:before="0" w:after="0" w:line="480" w:lineRule="auto"/>
-      </w:pPr>
-      <w:r>
-        <w:rPr>
-          <w:rFonts w:ascii="Georgia" w:hAnsi="Georgia" w:cs="Georgia"/>
-        </w:rPr>
-        <w:t xml:space="preserve"/>
-      </w:r>
-    </w:p>
-    <w:p>
-      <w:pPr>
-        <w:spacing w:before="0" w:after="0" w:line="480" w:lineRule="auto"/>
         <w:sectPr>
           <w:type w:val="nextPage"/>
           <w:pgSz w:h="16838" w:w="11906" w:orient="portrait"/>
@@ -21383,7 +21401,44 @@
       </w:pPr>
       <w:r>
         <w:rPr>
-          <w:rFonts w:ascii="Georgia" w:hAnsi="Georgia" w:cs="Georgia"/>
+          <w:rFonts w:ascii="Georgia" w:hAnsi="Georgia"/>
+          <w:sz w:val="22"/>
+        </w:rPr>
+        <w:t xml:space="preserve"/>
+      </w:r>
+    </w:p>
+    <w:p>
+      <w:pPr>
+        <w:spacing w:before="0" w:after="0" w:line="480" w:lineRule="auto"/>
+      </w:pPr>
+      <w:r>
+        <w:rPr>
+          <w:rFonts w:ascii="Georgia" w:hAnsi="Georgia"/>
+          <w:sz w:val="22"/>
+        </w:rPr>
+        <w:t xml:space="preserve"/>
+      </w:r>
+    </w:p>
+    <w:p>
+      <w:pPr>
+        <w:spacing w:before="0" w:after="0" w:line="480" w:lineRule="auto"/>
+      </w:pPr>
+      <w:r>
+        <w:rPr>
+          <w:rFonts w:ascii="Georgia" w:hAnsi="Georgia"/>
+          <w:sz w:val="22"/>
+        </w:rPr>
+        <w:t xml:space="preserve"/>
+      </w:r>
+    </w:p>
+    <w:p>
+      <w:pPr>
+        <w:spacing w:before="0" w:after="0" w:line="480" w:lineRule="auto"/>
+      </w:pPr>
+      <w:r>
+        <w:rPr>
+          <w:rFonts w:ascii="Georgia" w:hAnsi="Georgia"/>
+          <w:sz w:val="22"/>
         </w:rPr>
         <w:t xml:space="preserve"/>
       </w:r>
@@ -21421,7 +21476,8 @@
       </w:pPr>
       <w:r>
         <w:rPr>
-          <w:rFonts w:ascii="Georgia" w:hAnsi="Georgia" w:cs="Georgia"/>
+          <w:rFonts w:ascii="Georgia" w:hAnsi="Georgia"/>
+          <w:sz w:val="22"/>
         </w:rPr>
         <w:t xml:space="preserve"/>
       </w:r>
@@ -21432,7 +21488,8 @@
       </w:pPr>
       <w:r>
         <w:rPr>
-          <w:rFonts w:ascii="Georgia" w:hAnsi="Georgia" w:cs="Georgia"/>
+          <w:rFonts w:ascii="Georgia" w:hAnsi="Georgia"/>
+          <w:sz w:val="22"/>
         </w:rPr>
         <w:t xml:space="preserve"/>
       </w:r>
@@ -21443,7 +21500,8 @@
       </w:pPr>
       <w:r>
         <w:rPr>
-          <w:rFonts w:ascii="Georgia" w:hAnsi="Georgia" w:cs="Georgia"/>
+          <w:rFonts w:ascii="Georgia" w:hAnsi="Georgia"/>
+          <w:sz w:val="22"/>
         </w:rPr>
         <w:t xml:space="preserve"/>
       </w:r>
@@ -21728,28 +21786,6 @@
           <w:sz w:val="22"/>
           <w:szCs w:val="22"/>
         </w:rPr>
-      </w:r>
-    </w:p>
-    <w:p>
-      <w:pPr>
-        <w:spacing w:before="0" w:after="0" w:line="480" w:lineRule="auto"/>
-      </w:pPr>
-      <w:r>
-        <w:rPr>
-          <w:rFonts w:ascii="Georgia" w:hAnsi="Georgia" w:cs="Georgia"/>
-        </w:rPr>
-        <w:t xml:space="preserve"/>
-      </w:r>
-    </w:p>
-    <w:p>
-      <w:pPr>
-        <w:spacing w:before="0" w:after="0" w:line="480" w:lineRule="auto"/>
-      </w:pPr>
-      <w:r>
-        <w:rPr>
-          <w:rFonts w:ascii="Georgia" w:hAnsi="Georgia" w:cs="Georgia"/>
-        </w:rPr>
-        <w:t xml:space="preserve"/>
       </w:r>
     </w:p>
     <w:p>
@@ -21764,7 +21800,44 @@
       </w:pPr>
       <w:r>
         <w:rPr>
-          <w:rFonts w:ascii="Georgia" w:hAnsi="Georgia" w:cs="Georgia"/>
+          <w:rFonts w:ascii="Georgia" w:hAnsi="Georgia"/>
+          <w:sz w:val="22"/>
+        </w:rPr>
+        <w:t xml:space="preserve"/>
+      </w:r>
+    </w:p>
+    <w:p>
+      <w:pPr>
+        <w:spacing w:before="0" w:after="0" w:line="480" w:lineRule="auto"/>
+      </w:pPr>
+      <w:r>
+        <w:rPr>
+          <w:rFonts w:ascii="Georgia" w:hAnsi="Georgia"/>
+          <w:sz w:val="22"/>
+        </w:rPr>
+        <w:t xml:space="preserve"/>
+      </w:r>
+    </w:p>
+    <w:p>
+      <w:pPr>
+        <w:spacing w:before="0" w:after="0" w:line="480" w:lineRule="auto"/>
+      </w:pPr>
+      <w:r>
+        <w:rPr>
+          <w:rFonts w:ascii="Georgia" w:hAnsi="Georgia"/>
+          <w:sz w:val="22"/>
+        </w:rPr>
+        <w:t xml:space="preserve"/>
+      </w:r>
+    </w:p>
+    <w:p>
+      <w:pPr>
+        <w:spacing w:before="0" w:after="0" w:line="480" w:lineRule="auto"/>
+      </w:pPr>
+      <w:r>
+        <w:rPr>
+          <w:rFonts w:ascii="Georgia" w:hAnsi="Georgia"/>
+          <w:sz w:val="22"/>
         </w:rPr>
         <w:t xml:space="preserve"/>
       </w:r>
@@ -21802,7 +21875,8 @@
       </w:pPr>
       <w:r>
         <w:rPr>
-          <w:rFonts w:ascii="Georgia" w:hAnsi="Georgia" w:cs="Georgia"/>
+          <w:rFonts w:ascii="Georgia" w:hAnsi="Georgia"/>
+          <w:sz w:val="22"/>
         </w:rPr>
         <w:t xml:space="preserve"/>
       </w:r>
@@ -21813,7 +21887,8 @@
       </w:pPr>
       <w:r>
         <w:rPr>
-          <w:rFonts w:ascii="Georgia" w:hAnsi="Georgia" w:cs="Georgia"/>
+          <w:rFonts w:ascii="Georgia" w:hAnsi="Georgia"/>
+          <w:sz w:val="22"/>
         </w:rPr>
         <w:t xml:space="preserve"/>
       </w:r>
@@ -21824,7 +21899,8 @@
       </w:pPr>
       <w:r>
         <w:rPr>
-          <w:rFonts w:ascii="Georgia" w:hAnsi="Georgia" w:cs="Georgia"/>
+          <w:rFonts w:ascii="Georgia" w:hAnsi="Georgia"/>
+          <w:sz w:val="22"/>
         </w:rPr>
         <w:t xml:space="preserve"/>
       </w:r>
@@ -23311,28 +23387,6 @@
     <w:p>
       <w:pPr>
         <w:spacing w:before="0" w:after="0" w:line="480" w:lineRule="auto"/>
-      </w:pPr>
-      <w:r>
-        <w:rPr>
-          <w:rFonts w:ascii="Georgia" w:hAnsi="Georgia" w:cs="Georgia"/>
-        </w:rPr>
-        <w:t xml:space="preserve"/>
-      </w:r>
-    </w:p>
-    <w:p>
-      <w:pPr>
-        <w:spacing w:before="0" w:after="0" w:line="480" w:lineRule="auto"/>
-      </w:pPr>
-      <w:r>
-        <w:rPr>
-          <w:rFonts w:ascii="Georgia" w:hAnsi="Georgia" w:cs="Georgia"/>
-        </w:rPr>
-        <w:t xml:space="preserve"/>
-      </w:r>
-    </w:p>
-    <w:p>
-      <w:pPr>
-        <w:spacing w:before="0" w:after="0" w:line="480" w:lineRule="auto"/>
         <w:sectPr>
           <w:type w:val="nextPage"/>
           <w:pgSz w:h="16838" w:w="11906" w:orient="portrait"/>
@@ -23342,7 +23396,44 @@
       </w:pPr>
       <w:r>
         <w:rPr>
-          <w:rFonts w:ascii="Georgia" w:hAnsi="Georgia" w:cs="Georgia"/>
+          <w:rFonts w:ascii="Georgia" w:hAnsi="Georgia"/>
+          <w:sz w:val="22"/>
+        </w:rPr>
+        <w:t xml:space="preserve"/>
+      </w:r>
+    </w:p>
+    <w:p>
+      <w:pPr>
+        <w:spacing w:before="0" w:after="0" w:line="480" w:lineRule="auto"/>
+      </w:pPr>
+      <w:r>
+        <w:rPr>
+          <w:rFonts w:ascii="Georgia" w:hAnsi="Georgia"/>
+          <w:sz w:val="22"/>
+        </w:rPr>
+        <w:t xml:space="preserve"/>
+      </w:r>
+    </w:p>
+    <w:p>
+      <w:pPr>
+        <w:spacing w:before="0" w:after="0" w:line="480" w:lineRule="auto"/>
+      </w:pPr>
+      <w:r>
+        <w:rPr>
+          <w:rFonts w:ascii="Georgia" w:hAnsi="Georgia"/>
+          <w:sz w:val="22"/>
+        </w:rPr>
+        <w:t xml:space="preserve"/>
+      </w:r>
+    </w:p>
+    <w:p>
+      <w:pPr>
+        <w:spacing w:before="0" w:after="0" w:line="480" w:lineRule="auto"/>
+      </w:pPr>
+      <w:r>
+        <w:rPr>
+          <w:rFonts w:ascii="Georgia" w:hAnsi="Georgia"/>
+          <w:sz w:val="22"/>
         </w:rPr>
         <w:t xml:space="preserve"/>
       </w:r>
@@ -23380,7 +23471,8 @@
       </w:pPr>
       <w:r>
         <w:rPr>
-          <w:rFonts w:ascii="Georgia" w:hAnsi="Georgia" w:cs="Georgia"/>
+          <w:rFonts w:ascii="Georgia" w:hAnsi="Georgia"/>
+          <w:sz w:val="22"/>
         </w:rPr>
         <w:t xml:space="preserve"/>
       </w:r>
@@ -23391,7 +23483,8 @@
       </w:pPr>
       <w:r>
         <w:rPr>
-          <w:rFonts w:ascii="Georgia" w:hAnsi="Georgia" w:cs="Georgia"/>
+          <w:rFonts w:ascii="Georgia" w:hAnsi="Georgia"/>
+          <w:sz w:val="22"/>
         </w:rPr>
         <w:t xml:space="preserve"/>
       </w:r>
@@ -23402,7 +23495,8 @@
       </w:pPr>
       <w:r>
         <w:rPr>
-          <w:rFonts w:ascii="Georgia" w:hAnsi="Georgia" w:cs="Georgia"/>
+          <w:rFonts w:ascii="Georgia" w:hAnsi="Georgia"/>
+          <w:sz w:val="22"/>
         </w:rPr>
         <w:t xml:space="preserve"/>
       </w:r>
@@ -29842,28 +29936,6 @@
     <w:p>
       <w:pPr>
         <w:spacing w:before="0" w:after="0" w:line="480" w:lineRule="auto"/>
-      </w:pPr>
-      <w:r>
-        <w:rPr>
-          <w:rFonts w:ascii="Georgia" w:hAnsi="Georgia" w:cs="Georgia"/>
-        </w:rPr>
-        <w:t xml:space="preserve"/>
-      </w:r>
-    </w:p>
-    <w:p>
-      <w:pPr>
-        <w:spacing w:before="0" w:after="0" w:line="480" w:lineRule="auto"/>
-      </w:pPr>
-      <w:r>
-        <w:rPr>
-          <w:rFonts w:ascii="Georgia" w:hAnsi="Georgia" w:cs="Georgia"/>
-        </w:rPr>
-        <w:t xml:space="preserve"/>
-      </w:r>
-    </w:p>
-    <w:p>
-      <w:pPr>
-        <w:spacing w:before="0" w:after="0" w:line="480" w:lineRule="auto"/>
         <w:sectPr>
           <w:type w:val="nextPage"/>
           <w:pgSz w:h="16838" w:w="11906" w:orient="portrait"/>
@@ -29873,7 +29945,44 @@
       </w:pPr>
       <w:r>
         <w:rPr>
-          <w:rFonts w:ascii="Georgia" w:hAnsi="Georgia" w:cs="Georgia"/>
+          <w:rFonts w:ascii="Georgia" w:hAnsi="Georgia"/>
+          <w:sz w:val="22"/>
+        </w:rPr>
+        <w:t xml:space="preserve"/>
+      </w:r>
+    </w:p>
+    <w:p>
+      <w:pPr>
+        <w:spacing w:before="0" w:after="0" w:line="480" w:lineRule="auto"/>
+      </w:pPr>
+      <w:r>
+        <w:rPr>
+          <w:rFonts w:ascii="Georgia" w:hAnsi="Georgia"/>
+          <w:sz w:val="22"/>
+        </w:rPr>
+        <w:t xml:space="preserve"/>
+      </w:r>
+    </w:p>
+    <w:p>
+      <w:pPr>
+        <w:spacing w:before="0" w:after="0" w:line="480" w:lineRule="auto"/>
+      </w:pPr>
+      <w:r>
+        <w:rPr>
+          <w:rFonts w:ascii="Georgia" w:hAnsi="Georgia"/>
+          <w:sz w:val="22"/>
+        </w:rPr>
+        <w:t xml:space="preserve"/>
+      </w:r>
+    </w:p>
+    <w:p>
+      <w:pPr>
+        <w:spacing w:before="0" w:after="0" w:line="480" w:lineRule="auto"/>
+      </w:pPr>
+      <w:r>
+        <w:rPr>
+          <w:rFonts w:ascii="Georgia" w:hAnsi="Georgia"/>
+          <w:sz w:val="22"/>
         </w:rPr>
         <w:t xml:space="preserve"/>
       </w:r>
@@ -29909,7 +30018,8 @@
       </w:pPr>
       <w:r>
         <w:rPr>
-          <w:rFonts w:ascii="Georgia" w:hAnsi="Georgia" w:cs="Georgia"/>
+          <w:rFonts w:ascii="Georgia" w:hAnsi="Georgia"/>
+          <w:sz w:val="22"/>
         </w:rPr>
         <w:t xml:space="preserve"/>
       </w:r>
@@ -29920,7 +30030,8 @@
       </w:pPr>
       <w:r>
         <w:rPr>
-          <w:rFonts w:ascii="Georgia" w:hAnsi="Georgia" w:cs="Georgia"/>
+          <w:rFonts w:ascii="Georgia" w:hAnsi="Georgia"/>
+          <w:sz w:val="22"/>
         </w:rPr>
         <w:t xml:space="preserve"/>
       </w:r>
@@ -29931,7 +30042,8 @@
       </w:pPr>
       <w:r>
         <w:rPr>
-          <w:rFonts w:ascii="Georgia" w:hAnsi="Georgia" w:cs="Georgia"/>
+          <w:rFonts w:ascii="Georgia" w:hAnsi="Georgia"/>
+          <w:sz w:val="22"/>
         </w:rPr>
         <w:t xml:space="preserve"/>
       </w:r>
@@ -30509,28 +30621,6 @@
           <w:sz w:val="22"/>
           <w:szCs w:val="22"/>
         </w:rPr>
-      </w:r>
-    </w:p>
-    <w:p>
-      <w:pPr>
-        <w:spacing w:before="0" w:after="0" w:line="480" w:lineRule="auto"/>
-      </w:pPr>
-      <w:r>
-        <w:rPr>
-          <w:rFonts w:ascii="Georgia" w:hAnsi="Georgia" w:cs="Georgia"/>
-        </w:rPr>
-        <w:t xml:space="preserve"/>
-      </w:r>
-    </w:p>
-    <w:p>
-      <w:pPr>
-        <w:spacing w:before="0" w:after="0" w:line="480" w:lineRule="auto"/>
-      </w:pPr>
-      <w:r>
-        <w:rPr>
-          <w:rFonts w:ascii="Georgia" w:hAnsi="Georgia" w:cs="Georgia"/>
-        </w:rPr>
-        <w:t xml:space="preserve"/>
       </w:r>
     </w:p>
     <w:p>
@@ -30545,7 +30635,44 @@
       </w:pPr>
       <w:r>
         <w:rPr>
-          <w:rFonts w:ascii="Georgia" w:hAnsi="Georgia" w:cs="Georgia"/>
+          <w:rFonts w:ascii="Georgia" w:hAnsi="Georgia"/>
+          <w:sz w:val="22"/>
+        </w:rPr>
+        <w:t xml:space="preserve"/>
+      </w:r>
+    </w:p>
+    <w:p>
+      <w:pPr>
+        <w:spacing w:before="0" w:after="0" w:line="480" w:lineRule="auto"/>
+      </w:pPr>
+      <w:r>
+        <w:rPr>
+          <w:rFonts w:ascii="Georgia" w:hAnsi="Georgia"/>
+          <w:sz w:val="22"/>
+        </w:rPr>
+        <w:t xml:space="preserve"/>
+      </w:r>
+    </w:p>
+    <w:p>
+      <w:pPr>
+        <w:spacing w:before="0" w:after="0" w:line="480" w:lineRule="auto"/>
+      </w:pPr>
+      <w:r>
+        <w:rPr>
+          <w:rFonts w:ascii="Georgia" w:hAnsi="Georgia"/>
+          <w:sz w:val="22"/>
+        </w:rPr>
+        <w:t xml:space="preserve"/>
+      </w:r>
+    </w:p>
+    <w:p>
+      <w:pPr>
+        <w:spacing w:before="0" w:after="0" w:line="480" w:lineRule="auto"/>
+      </w:pPr>
+      <w:r>
+        <w:rPr>
+          <w:rFonts w:ascii="Georgia" w:hAnsi="Georgia"/>
+          <w:sz w:val="22"/>
         </w:rPr>
         <w:t xml:space="preserve"/>
       </w:r>
@@ -30581,7 +30708,8 @@
       </w:pPr>
       <w:r>
         <w:rPr>
-          <w:rFonts w:ascii="Georgia" w:hAnsi="Georgia" w:cs="Georgia"/>
+          <w:rFonts w:ascii="Georgia" w:hAnsi="Georgia"/>
+          <w:sz w:val="22"/>
         </w:rPr>
         <w:t xml:space="preserve"/>
       </w:r>
@@ -30592,7 +30720,8 @@
       </w:pPr>
       <w:r>
         <w:rPr>
-          <w:rFonts w:ascii="Georgia" w:hAnsi="Georgia" w:cs="Georgia"/>
+          <w:rFonts w:ascii="Georgia" w:hAnsi="Georgia"/>
+          <w:sz w:val="22"/>
         </w:rPr>
         <w:t xml:space="preserve"/>
       </w:r>
@@ -30603,7 +30732,8 @@
       </w:pPr>
       <w:r>
         <w:rPr>
-          <w:rFonts w:ascii="Georgia" w:hAnsi="Georgia" w:cs="Georgia"/>
+          <w:rFonts w:ascii="Georgia" w:hAnsi="Georgia"/>
+          <w:sz w:val="22"/>
         </w:rPr>
         <w:t xml:space="preserve"/>
       </w:r>

</xml_diff>

<commit_message>
Draft_127_body: title page spacer layout per user spec
</commit_message>
<xml_diff>
--- a/thesis/003_ThesisProposal_Draft_127_body.docx
+++ b/thesis/003_ThesisProposal_Draft_127_body.docx
@@ -9,11 +9,10 @@
       </w:pPr>
       <w:r>
         <w:rPr>
-          <w:rtl w:val="0"/>
-          <w:rFonts w:ascii="Georgia" w:hAnsi="Georgia" w:cs="Georgia"/>
+          <w:rFonts w:ascii="Georgia" w:hAnsi="Georgia"/>
           <w:sz w:val="24"/>
-          <w:szCs w:val="24"/>
-        </w:rPr>
+        </w:rPr>
+        <w:t xml:space="preserve"/>
       </w:r>
     </w:p>
     <w:p>
@@ -23,24 +22,39 @@
       </w:pPr>
       <w:r>
         <w:rPr>
-          <w:rFonts w:ascii="Georgia" w:cs="Georgia" w:eastAsia="Georgia" w:hAnsi="Georgia"/>
-          <w:b w:val="1"/>
-          <w:bCs w:val="1"/>
-          <w:sz w:val="28"/>
-          <w:szCs w:val="28"/>
-          <w:rtl w:val="0"/>
-        </w:rPr>
-        <w:t xml:space="preserve">THE USE OF HEDGES IN RESEARCH ABSTRACTS</w:t>
-      </w:r>
-      <w:r>
-        <w:rPr>
-          <w:rtl w:val="0"/>
+          <w:rFonts w:ascii="Georgia" w:hAnsi="Georgia"/>
+          <w:sz w:val="24"/>
+        </w:rPr>
+        <w:t xml:space="preserve"/>
+      </w:r>
+    </w:p>
+    <w:p>
+      <w:pPr>
+        <w:spacing w:before="0" w:after="0" w:line="360" w:lineRule="auto"/>
+        <w:jc w:val="center"/>
+      </w:pPr>
+      <w:r>
+        <w:rPr>
+          <w:rFonts w:ascii="Georgia" w:hAnsi="Georgia"/>
+          <w:sz w:val="24"/>
+        </w:rPr>
+        <w:t xml:space="preserve"/>
+      </w:r>
+    </w:p>
+    <w:p>
+      <w:pPr>
+        <w:spacing w:before="0" w:after="0" w:line="360" w:lineRule="auto"/>
+        <w:jc w:val="center"/>
+      </w:pPr>
+      <w:r>
+        <w:rPr>
           <w:rFonts w:ascii="Georgia" w:hAnsi="Georgia" w:cs="Georgia"/>
           <w:sz w:val="28"/>
           <w:szCs w:val="28"/>
           <w:b/>
           <w:bCs/>
         </w:rPr>
+        <w:t xml:space="preserve">THE USE OF HEDGES IN RESEARCH ABSTRACTS</w:t>
       </w:r>
     </w:p>
     <w:p>
@@ -50,24 +64,13 @@
       </w:pPr>
       <w:r>
         <w:rPr>
-          <w:rFonts w:ascii="Georgia" w:cs="Georgia" w:eastAsia="Georgia" w:hAnsi="Georgia"/>
-          <w:b w:val="1"/>
-          <w:bCs w:val="1"/>
-          <w:sz w:val="28"/>
-          <w:szCs w:val="28"/>
-          <w:rtl w:val="0"/>
-        </w:rPr>
-        <w:t xml:space="preserve">ACROSS APPLIED LIFE SCIENCES</w:t>
-      </w:r>
-      <w:r>
-        <w:rPr>
-          <w:rtl w:val="0"/>
           <w:rFonts w:ascii="Georgia" w:hAnsi="Georgia" w:cs="Georgia"/>
           <w:sz w:val="28"/>
           <w:szCs w:val="28"/>
           <w:b/>
           <w:bCs/>
         </w:rPr>
+        <w:t xml:space="preserve">ACROSS APPLIED LIFE SCIENCES</w:t>
       </w:r>
     </w:p>
     <w:p>
@@ -77,20 +80,64 @@
       </w:pPr>
       <w:r>
         <w:rPr>
-          <w:rFonts w:ascii="Georgia" w:cs="Georgia" w:eastAsia="Georgia" w:hAnsi="Georgia"/>
+          <w:rFonts w:ascii="Georgia" w:hAnsi="Georgia"/>
+          <w:sz w:val="24"/>
+        </w:rPr>
+        <w:t xml:space="preserve"/>
+      </w:r>
+    </w:p>
+    <w:p>
+      <w:pPr>
+        <w:spacing w:before="0" w:after="0" w:line="360" w:lineRule="auto"/>
+        <w:jc w:val="center"/>
+      </w:pPr>
+      <w:r>
+        <w:rPr>
+          <w:rFonts w:ascii="Georgia" w:hAnsi="Georgia"/>
+          <w:sz w:val="24"/>
+        </w:rPr>
+        <w:t xml:space="preserve"/>
+      </w:r>
+    </w:p>
+    <w:p>
+      <w:pPr>
+        <w:spacing w:before="0" w:after="0" w:line="360" w:lineRule="auto"/>
+        <w:jc w:val="center"/>
+      </w:pPr>
+      <w:r>
+        <w:rPr>
+          <w:rFonts w:ascii="Georgia" w:hAnsi="Georgia"/>
+          <w:sz w:val="24"/>
+        </w:rPr>
+        <w:t xml:space="preserve"/>
+      </w:r>
+    </w:p>
+    <w:p>
+      <w:pPr>
+        <w:spacing w:before="0" w:after="0" w:line="360" w:lineRule="auto"/>
+        <w:jc w:val="center"/>
+      </w:pPr>
+      <w:r>
+        <w:rPr>
+          <w:rFonts w:ascii="Georgia" w:hAnsi="Georgia" w:cs="Georgia"/>
           <w:sz w:val="24"/>
           <w:szCs w:val="24"/>
-          <w:rtl w:val="0"/>
         </w:rPr>
         <w:t xml:space="preserve">A Thesis</w:t>
       </w:r>
-      <w:r>
-        <w:rPr>
-          <w:rtl w:val="0"/>
+    </w:p>
+    <w:p>
+      <w:pPr>
+        <w:spacing w:before="0" w:after="0" w:line="360" w:lineRule="auto"/>
+        <w:jc w:val="center"/>
+      </w:pPr>
+      <w:r>
+        <w:rPr>
           <w:rFonts w:ascii="Georgia" w:hAnsi="Georgia" w:cs="Georgia"/>
           <w:sz w:val="24"/>
           <w:szCs w:val="24"/>
         </w:rPr>
+        <w:t xml:space="preserve">Presented to the Faculty of</w:t>
       </w:r>
     </w:p>
     <w:p>
@@ -100,20 +147,25 @@
       </w:pPr>
       <w:r>
         <w:rPr>
-          <w:rFonts w:ascii="Georgia" w:cs="Georgia" w:eastAsia="Georgia" w:hAnsi="Georgia"/>
+          <w:rFonts w:ascii="Georgia" w:hAnsi="Georgia" w:cs="Georgia"/>
           <w:sz w:val="24"/>
           <w:szCs w:val="24"/>
-          <w:rtl w:val="0"/>
-        </w:rPr>
-        <w:t xml:space="preserve">Presented to the Faculty of</w:t>
-      </w:r>
-      <w:r>
-        <w:rPr>
-          <w:rtl w:val="0"/>
+        </w:rPr>
+        <w:t xml:space="preserve">Department of English</w:t>
+      </w:r>
+    </w:p>
+    <w:p>
+      <w:pPr>
+        <w:spacing w:before="0" w:after="0" w:line="360" w:lineRule="auto"/>
+        <w:jc w:val="center"/>
+      </w:pPr>
+      <w:r>
+        <w:rPr>
           <w:rFonts w:ascii="Georgia" w:hAnsi="Georgia" w:cs="Georgia"/>
           <w:sz w:val="24"/>
           <w:szCs w:val="24"/>
         </w:rPr>
+        <w:t xml:space="preserve">College of Arts and Sciences</w:t>
       </w:r>
     </w:p>
     <w:p>
@@ -123,20 +175,25 @@
       </w:pPr>
       <w:r>
         <w:rPr>
-          <w:rFonts w:ascii="Georgia" w:cs="Georgia" w:eastAsia="Georgia" w:hAnsi="Georgia"/>
+          <w:rFonts w:ascii="Georgia" w:hAnsi="Georgia" w:cs="Georgia"/>
           <w:sz w:val="24"/>
           <w:szCs w:val="24"/>
-          <w:rtl w:val="0"/>
-        </w:rPr>
-        <w:t xml:space="preserve">Department of English</w:t>
-      </w:r>
-      <w:r>
-        <w:rPr>
-          <w:rtl w:val="0"/>
+        </w:rPr>
+        <w:t xml:space="preserve">Pampanga State Agricultural University</w:t>
+      </w:r>
+    </w:p>
+    <w:p>
+      <w:pPr>
+        <w:spacing w:before="0" w:after="0" w:line="360" w:lineRule="auto"/>
+        <w:jc w:val="center"/>
+      </w:pPr>
+      <w:r>
+        <w:rPr>
           <w:rFonts w:ascii="Georgia" w:hAnsi="Georgia" w:cs="Georgia"/>
           <w:sz w:val="24"/>
           <w:szCs w:val="24"/>
         </w:rPr>
+        <w:t xml:space="preserve">Magalang, Pampanga</w:t>
       </w:r>
     </w:p>
     <w:p>
@@ -146,20 +203,64 @@
       </w:pPr>
       <w:r>
         <w:rPr>
-          <w:rFonts w:ascii="Georgia" w:cs="Georgia" w:eastAsia="Georgia" w:hAnsi="Georgia"/>
+          <w:rFonts w:ascii="Georgia" w:hAnsi="Georgia"/>
+          <w:sz w:val="24"/>
+        </w:rPr>
+        <w:t xml:space="preserve"/>
+      </w:r>
+    </w:p>
+    <w:p>
+      <w:pPr>
+        <w:spacing w:before="0" w:after="0" w:line="360" w:lineRule="auto"/>
+        <w:jc w:val="center"/>
+      </w:pPr>
+      <w:r>
+        <w:rPr>
+          <w:rFonts w:ascii="Georgia" w:hAnsi="Georgia"/>
+          <w:sz w:val="24"/>
+        </w:rPr>
+        <w:t xml:space="preserve"/>
+      </w:r>
+    </w:p>
+    <w:p>
+      <w:pPr>
+        <w:spacing w:before="0" w:after="0" w:line="360" w:lineRule="auto"/>
+        <w:jc w:val="center"/>
+      </w:pPr>
+      <w:r>
+        <w:rPr>
+          <w:rFonts w:ascii="Georgia" w:hAnsi="Georgia"/>
+          <w:sz w:val="24"/>
+        </w:rPr>
+        <w:t xml:space="preserve"/>
+      </w:r>
+    </w:p>
+    <w:p>
+      <w:pPr>
+        <w:spacing w:before="0" w:after="0" w:line="360" w:lineRule="auto"/>
+        <w:jc w:val="center"/>
+      </w:pPr>
+      <w:r>
+        <w:rPr>
+          <w:rFonts w:ascii="Georgia" w:hAnsi="Georgia" w:cs="Georgia"/>
           <w:sz w:val="24"/>
           <w:szCs w:val="24"/>
-          <w:rtl w:val="0"/>
-        </w:rPr>
-        <w:t xml:space="preserve">College of Arts and Sciences</w:t>
-      </w:r>
-      <w:r>
-        <w:rPr>
-          <w:rtl w:val="0"/>
+        </w:rPr>
+        <w:t xml:space="preserve">In Partial Fulfillment</w:t>
+      </w:r>
+    </w:p>
+    <w:p>
+      <w:pPr>
+        <w:spacing w:before="0" w:after="0" w:line="360" w:lineRule="auto"/>
+        <w:jc w:val="center"/>
+      </w:pPr>
+      <w:r>
+        <w:rPr>
           <w:rFonts w:ascii="Georgia" w:hAnsi="Georgia" w:cs="Georgia"/>
           <w:sz w:val="24"/>
           <w:szCs w:val="24"/>
         </w:rPr>
+        <w:t xml:space="preserve">of the Requirements for the Degree</w:t>
       </w:r>
     </w:p>
     <w:p>
@@ -169,20 +270,64 @@
       </w:pPr>
       <w:r>
         <w:rPr>
-          <w:rFonts w:ascii="Georgia" w:cs="Georgia" w:eastAsia="Georgia" w:hAnsi="Georgia"/>
+          <w:rFonts w:ascii="Georgia" w:hAnsi="Georgia" w:cs="Georgia"/>
           <w:sz w:val="24"/>
           <w:szCs w:val="24"/>
-          <w:rtl w:val="0"/>
-        </w:rPr>
-        <w:t xml:space="preserve">Pampanga State Agricultural University</w:t>
-      </w:r>
-      <w:r>
-        <w:rPr>
-          <w:rtl w:val="0"/>
+        </w:rPr>
+        <w:t xml:space="preserve">BACHELOR OF ARTS IN ENGLISH LANGUAGE STUDIES</w:t>
+      </w:r>
+    </w:p>
+    <w:p>
+      <w:pPr>
+        <w:spacing w:before="0" w:after="0" w:line="360" w:lineRule="auto"/>
+        <w:jc w:val="center"/>
+      </w:pPr>
+      <w:r>
+        <w:rPr>
+          <w:rFonts w:ascii="Georgia" w:hAnsi="Georgia"/>
+          <w:sz w:val="24"/>
+        </w:rPr>
+        <w:t xml:space="preserve"/>
+      </w:r>
+    </w:p>
+    <w:p>
+      <w:pPr>
+        <w:spacing w:before="0" w:after="0" w:line="360" w:lineRule="auto"/>
+        <w:jc w:val="center"/>
+      </w:pPr>
+      <w:r>
+        <w:rPr>
+          <w:rFonts w:ascii="Georgia" w:hAnsi="Georgia"/>
+          <w:sz w:val="24"/>
+        </w:rPr>
+        <w:t xml:space="preserve"/>
+      </w:r>
+    </w:p>
+    <w:p>
+      <w:pPr>
+        <w:spacing w:before="0" w:after="0" w:line="360" w:lineRule="auto"/>
+        <w:jc w:val="center"/>
+      </w:pPr>
+      <w:r>
+        <w:rPr>
+          <w:rFonts w:ascii="Georgia" w:hAnsi="Georgia"/>
+          <w:sz w:val="24"/>
+        </w:rPr>
+        <w:t xml:space="preserve"/>
+      </w:r>
+    </w:p>
+    <w:p>
+      <w:pPr>
+        <w:spacing w:before="0" w:after="0" w:line="360" w:lineRule="auto"/>
+        <w:jc w:val="center"/>
+      </w:pPr>
+      <w:r>
+        <w:rPr>
           <w:rFonts w:ascii="Georgia" w:hAnsi="Georgia" w:cs="Georgia"/>
           <w:sz w:val="24"/>
           <w:szCs w:val="24"/>
         </w:rPr>
+        <w:t xml:space="preserve">By</w:t>
       </w:r>
     </w:p>
     <w:p>
@@ -192,166 +337,129 @@
       </w:pPr>
       <w:r>
         <w:rPr>
-          <w:rFonts w:ascii="Georgia" w:cs="Georgia" w:eastAsia="Georgia" w:hAnsi="Georgia"/>
+          <w:rFonts w:ascii="Georgia" w:hAnsi="Georgia"/>
+          <w:sz w:val="24"/>
+        </w:rPr>
+        <w:t xml:space="preserve"/>
+      </w:r>
+    </w:p>
+    <w:p>
+      <w:pPr>
+        <w:spacing w:before="0" w:after="0" w:line="360" w:lineRule="auto"/>
+        <w:jc w:val="center"/>
+      </w:pPr>
+      <w:r>
+        <w:rPr>
+          <w:rFonts w:ascii="Georgia" w:hAnsi="Georgia"/>
+          <w:sz w:val="24"/>
+        </w:rPr>
+        <w:t xml:space="preserve"/>
+      </w:r>
+    </w:p>
+    <w:p>
+      <w:pPr>
+        <w:spacing w:before="0" w:after="0" w:line="360" w:lineRule="auto"/>
+        <w:jc w:val="center"/>
+      </w:pPr>
+      <w:r>
+        <w:rPr>
+          <w:rFonts w:ascii="Georgia" w:hAnsi="Georgia"/>
+          <w:sz w:val="24"/>
+        </w:rPr>
+        <w:t xml:space="preserve"/>
+      </w:r>
+    </w:p>
+    <w:p>
+      <w:pPr>
+        <w:spacing w:before="0" w:after="0" w:line="360" w:lineRule="auto"/>
+        <w:jc w:val="center"/>
+      </w:pPr>
+      <w:r>
+        <w:rPr>
+          <w:rFonts w:ascii="Georgia" w:hAnsi="Georgia"/>
+          <w:sz w:val="24"/>
+        </w:rPr>
+        <w:t xml:space="preserve"/>
+      </w:r>
+    </w:p>
+    <w:p>
+      <w:pPr>
+        <w:spacing w:before="0" w:after="0" w:line="360" w:lineRule="auto"/>
+        <w:jc w:val="center"/>
+      </w:pPr>
+      <w:r>
+        <w:rPr>
+          <w:rFonts w:ascii="Georgia" w:hAnsi="Georgia"/>
+          <w:sz w:val="24"/>
+        </w:rPr>
+        <w:t xml:space="preserve"/>
+      </w:r>
+    </w:p>
+    <w:p>
+      <w:pPr>
+        <w:spacing w:before="0" w:after="0" w:line="360" w:lineRule="auto"/>
+        <w:jc w:val="center"/>
+      </w:pPr>
+      <w:r>
+        <w:rPr>
+          <w:rFonts w:ascii="Georgia" w:hAnsi="Georgia"/>
+          <w:sz w:val="24"/>
+        </w:rPr>
+        <w:t xml:space="preserve"/>
+      </w:r>
+    </w:p>
+    <w:p>
+      <w:pPr>
+        <w:spacing w:before="0" w:after="0" w:line="360" w:lineRule="auto"/>
+        <w:jc w:val="center"/>
+      </w:pPr>
+      <w:r>
+        <w:rPr>
+          <w:rFonts w:ascii="Georgia" w:hAnsi="Georgia"/>
+          <w:sz w:val="24"/>
+        </w:rPr>
+        <w:t xml:space="preserve"/>
+      </w:r>
+    </w:p>
+    <w:p>
+      <w:pPr>
+        <w:spacing w:before="0" w:after="0" w:line="360" w:lineRule="auto"/>
+        <w:jc w:val="center"/>
+      </w:pPr>
+      <w:r>
+        <w:rPr>
+          <w:rFonts w:ascii="Georgia" w:hAnsi="Georgia"/>
+          <w:sz w:val="24"/>
+        </w:rPr>
+        <w:t xml:space="preserve"/>
+      </w:r>
+    </w:p>
+    <w:p>
+      <w:pPr>
+        <w:spacing w:before="0" w:after="0" w:line="360" w:lineRule="auto"/>
+        <w:jc w:val="center"/>
+      </w:pPr>
+      <w:r>
+        <w:rPr>
+          <w:rFonts w:ascii="Georgia" w:hAnsi="Georgia" w:cs="Georgia"/>
           <w:sz w:val="24"/>
           <w:szCs w:val="24"/>
-          <w:rtl w:val="0"/>
-        </w:rPr>
-        <w:t xml:space="preserve">Magalang, Pampanga</w:t>
-      </w:r>
-      <w:r>
-        <w:rPr>
-          <w:rtl w:val="0"/>
+        </w:rPr>
+        <w:t xml:space="preserve">CHRYZ KEAN F. MANUEL</w:t>
+      </w:r>
+    </w:p>
+    <w:p>
+      <w:pPr>
+        <w:spacing w:before="0" w:after="0" w:line="360" w:lineRule="auto"/>
+        <w:jc w:val="center"/>
+      </w:pPr>
+      <w:r>
+        <w:rPr>
           <w:rFonts w:ascii="Georgia" w:hAnsi="Georgia" w:cs="Georgia"/>
           <w:sz w:val="24"/>
           <w:szCs w:val="24"/>
         </w:rPr>
-      </w:r>
-    </w:p>
-    <w:p>
-      <w:pPr>
-        <w:spacing w:before="0" w:after="0" w:line="360" w:lineRule="auto"/>
-        <w:jc w:val="center"/>
-      </w:pPr>
-      <w:r>
-        <w:rPr>
-          <w:rFonts w:ascii="Georgia" w:cs="Georgia" w:eastAsia="Georgia" w:hAnsi="Georgia"/>
-          <w:sz w:val="24"/>
-          <w:szCs w:val="24"/>
-          <w:rtl w:val="0"/>
-        </w:rPr>
-        <w:t xml:space="preserve">In Partial Fulfillment</w:t>
-      </w:r>
-      <w:r>
-        <w:rPr>
-          <w:rtl w:val="0"/>
-          <w:rFonts w:ascii="Georgia" w:hAnsi="Georgia" w:cs="Georgia"/>
-          <w:sz w:val="24"/>
-          <w:szCs w:val="24"/>
-        </w:rPr>
-      </w:r>
-    </w:p>
-    <w:p>
-      <w:pPr>
-        <w:spacing w:before="0" w:after="0" w:line="360" w:lineRule="auto"/>
-        <w:jc w:val="center"/>
-      </w:pPr>
-      <w:r>
-        <w:rPr>
-          <w:rFonts w:ascii="Georgia" w:cs="Georgia" w:eastAsia="Georgia" w:hAnsi="Georgia"/>
-          <w:sz w:val="24"/>
-          <w:szCs w:val="24"/>
-          <w:rtl w:val="0"/>
-        </w:rPr>
-        <w:t xml:space="preserve">of the Requirements for the Degree</w:t>
-      </w:r>
-      <w:r>
-        <w:rPr>
-          <w:rtl w:val="0"/>
-          <w:rFonts w:ascii="Georgia" w:hAnsi="Georgia" w:cs="Georgia"/>
-          <w:sz w:val="24"/>
-          <w:szCs w:val="24"/>
-        </w:rPr>
-      </w:r>
-    </w:p>
-    <w:p>
-      <w:pPr>
-        <w:spacing w:before="0" w:after="0" w:line="360" w:lineRule="auto"/>
-        <w:jc w:val="center"/>
-      </w:pPr>
-      <w:r>
-        <w:rPr>
-          <w:rFonts w:ascii="Georgia" w:cs="Georgia" w:eastAsia="Georgia" w:hAnsi="Georgia"/>
-          <w:b w:val="0"/>
-          <w:bCs w:val="0"/>
-          <w:sz w:val="28"/>
-          <w:szCs w:val="28"/>
-          <w:rtl w:val="0"/>
-        </w:rPr>
-        <w:t xml:space="preserve">BACHELOR OF ARTS IN ENGLISH LANGUAGE STUDIES</w:t>
-      </w:r>
-      <w:r>
-        <w:rPr>
-          <w:rtl w:val="0"/>
-          <w:rFonts w:ascii="Georgia" w:hAnsi="Georgia" w:cs="Georgia"/>
-          <w:sz w:val="28"/>
-          <w:szCs w:val="28"/>
-          <w:b/>
-          <w:bCs/>
-        </w:rPr>
-      </w:r>
-    </w:p>
-    <w:p>
-      <w:pPr>
-        <w:spacing w:before="0" w:after="0" w:line="360" w:lineRule="auto"/>
-        <w:jc w:val="center"/>
-      </w:pPr>
-      <w:r>
-        <w:rPr>
-          <w:rFonts w:ascii="Georgia" w:cs="Georgia" w:eastAsia="Georgia" w:hAnsi="Georgia"/>
-          <w:sz w:val="24"/>
-          <w:szCs w:val="24"/>
-          <w:rtl w:val="0"/>
-        </w:rPr>
-        <w:t xml:space="preserve">By</w:t>
-      </w:r>
-      <w:r>
-        <w:rPr>
-          <w:rtl w:val="0"/>
-          <w:rFonts w:ascii="Georgia" w:hAnsi="Georgia" w:cs="Georgia"/>
-          <w:sz w:val="24"/>
-          <w:szCs w:val="24"/>
-        </w:rPr>
-      </w:r>
-    </w:p>
-    <w:p>
-      <w:pPr>
-        <w:spacing w:before="0" w:after="0" w:line="360" w:lineRule="auto"/>
-        <w:jc w:val="center"/>
-      </w:pPr>
-      <w:r>
-        <w:rPr>
-          <w:rFonts w:ascii="Georgia" w:cs="Georgia" w:eastAsia="Georgia" w:hAnsi="Georgia"/>
-          <w:b w:val="0"/>
-          <w:bCs w:val="0"/>
-          <w:sz w:val="28"/>
-          <w:szCs w:val="28"/>
-          <w:rtl w:val="0"/>
-        </w:rPr>
-        <w:t xml:space="preserve">CHRYZ KEAN F. MANUEL</w:t>
-      </w:r>
-      <w:r>
-        <w:rPr>
-          <w:rtl w:val="0"/>
-          <w:rFonts w:ascii="Georgia" w:hAnsi="Georgia" w:cs="Georgia"/>
-          <w:sz w:val="28"/>
-          <w:szCs w:val="28"/>
-          <w:b/>
-          <w:bCs/>
-        </w:rPr>
-      </w:r>
-    </w:p>
-    <w:p>
-      <w:pPr>
-        <w:spacing w:before="0" w:after="0" w:line="360" w:lineRule="auto"/>
-        <w:jc w:val="center"/>
-      </w:pPr>
-      <w:r>
-        <w:rPr>
-          <w:rFonts w:ascii="Georgia" w:cs="Georgia" w:eastAsia="Georgia" w:hAnsi="Georgia"/>
-          <w:sz w:val="24"/>
-          <w:szCs w:val="24"/>
-          <w:rtl w:val="0"/>
-        </w:rPr>
         <w:t xml:space="preserve">October 2026</w:t>
-      </w:r>
-      <w:r>
-        <w:rPr>
-          <w:rtl w:val="0"/>
-          <w:rFonts w:ascii="Georgia" w:hAnsi="Georgia" w:cs="Georgia"/>
-          <w:sz w:val="24"/>
-          <w:szCs w:val="24"/>
-        </w:rPr>
       </w:r>
     </w:p>
     <w:p>

</xml_diff>

<commit_message>
Draft_127_body: table/minor spacer clarifications; formatting.md binding
</commit_message>
<xml_diff>
--- a/thesis/003_ThesisProposal_Draft_127_body.docx
+++ b/thesis/003_ThesisProposal_Draft_127_body.docx
@@ -2299,17 +2299,6 @@
           <w:sz w:val="22"/>
           <w:szCs w:val="22"/>
         </w:rPr>
-      </w:r>
-    </w:p>
-    <w:p>
-      <w:pPr>
-        <w:spacing w:before="0" w:after="0" w:line="480" w:lineRule="auto"/>
-      </w:pPr>
-      <w:r>
-        <w:rPr>
-          <w:rFonts w:ascii="Georgia" w:hAnsi="Georgia" w:cs="Georgia"/>
-        </w:rPr>
-        <w:t xml:space="preserve"/>
       </w:r>
     </w:p>
     <w:tbl>
@@ -2343,6 +2332,14 @@
             </w:tcBorders>
             <w:vAlign w:val="center"/>
           </w:tcPr>
+          <w:p>
+            <w:pPr>
+              <w:spacing w:before="0" w:after="0" w:line="480" w:lineRule="auto"/>
+            </w:pPr>
+            <w:r>
+              <w:t xml:space="preserve"/>
+            </w:r>
+          </w:p>
           <w:p>
             <w:pPr>
               <w:spacing w:before="40" w:after="40" w:line="276" w:lineRule="auto"/>
@@ -2442,6 +2439,14 @@
               </w:rPr>
             </w:r>
           </w:p>
+          <w:p>
+            <w:pPr>
+              <w:spacing w:before="0" w:after="0" w:line="480" w:lineRule="auto"/>
+            </w:pPr>
+            <w:r>
+              <w:t xml:space="preserve"/>
+            </w:r>
+          </w:p>
         </w:tc>
       </w:tr>
     </w:tbl>
@@ -4305,17 +4310,6 @@
           <w:sz w:val="22"/>
           <w:szCs w:val="22"/>
         </w:rPr>
-      </w:r>
-    </w:p>
-    <w:p>
-      <w:pPr>
-        <w:spacing w:before="0" w:after="0" w:line="480" w:lineRule="auto"/>
-      </w:pPr>
-      <w:r>
-        <w:rPr>
-          <w:rFonts w:ascii="Georgia" w:hAnsi="Georgia" w:cs="Georgia"/>
-        </w:rPr>
-        <w:t xml:space="preserve"/>
       </w:r>
     </w:p>
     <w:tbl>
@@ -5074,6 +5068,18 @@
     </w:p>
     <w:p>
       <w:pPr>
+        <w:spacing w:before="0" w:after="0" w:line="480" w:lineRule="auto"/>
+      </w:pPr>
+      <w:r>
+        <w:rPr>
+          <w:rFonts w:ascii="Georgia" w:hAnsi="Georgia"/>
+          <w:sz w:val="22"/>
+        </w:rPr>
+        <w:t xml:space="preserve"/>
+      </w:r>
+    </w:p>
+    <w:p>
+      <w:pPr>
         <w:keepNext/>
         <w:spacing w:before="0" w:after="0" w:line="360" w:lineRule="auto"/>
         <w:jc w:val="left"/>
@@ -5118,17 +5124,6 @@
           <w:sz w:val="22"/>
           <w:szCs w:val="22"/>
         </w:rPr>
-      </w:r>
-    </w:p>
-    <w:p>
-      <w:pPr>
-        <w:spacing w:before="0" w:after="0" w:line="480" w:lineRule="auto"/>
-      </w:pPr>
-      <w:r>
-        <w:rPr>
-          <w:rFonts w:ascii="Georgia" w:hAnsi="Georgia" w:cs="Georgia"/>
-        </w:rPr>
-        <w:t xml:space="preserve"/>
       </w:r>
     </w:p>
     <w:tbl>
@@ -6788,6 +6783,18 @@
     </w:p>
     <w:p>
       <w:pPr>
+        <w:spacing w:before="0" w:after="0" w:line="480" w:lineRule="auto"/>
+      </w:pPr>
+      <w:r>
+        <w:rPr>
+          <w:rFonts w:ascii="Georgia" w:hAnsi="Georgia"/>
+          <w:sz w:val="22"/>
+        </w:rPr>
+        <w:t xml:space="preserve"/>
+      </w:r>
+    </w:p>
+    <w:p>
+      <w:pPr>
         <w:keepNext/>
         <w:spacing w:before="0" w:after="0" w:line="360" w:lineRule="auto"/>
         <w:jc w:val="left"/>
@@ -6832,17 +6839,6 @@
           <w:sz w:val="22"/>
           <w:szCs w:val="22"/>
         </w:rPr>
-      </w:r>
-    </w:p>
-    <w:p>
-      <w:pPr>
-        <w:spacing w:before="0" w:after="0" w:line="480" w:lineRule="auto"/>
-      </w:pPr>
-      <w:r>
-        <w:rPr>
-          <w:rFonts w:ascii="Georgia" w:hAnsi="Georgia" w:cs="Georgia"/>
-        </w:rPr>
-        <w:t xml:space="preserve"/>
       </w:r>
     </w:p>
     <w:tbl>
@@ -8433,6 +8429,18 @@
     </w:p>
     <w:p>
       <w:pPr>
+        <w:spacing w:before="0" w:after="0" w:line="480" w:lineRule="auto"/>
+      </w:pPr>
+      <w:r>
+        <w:rPr>
+          <w:rFonts w:ascii="Georgia" w:hAnsi="Georgia"/>
+          <w:sz w:val="22"/>
+        </w:rPr>
+        <w:t xml:space="preserve"/>
+      </w:r>
+    </w:p>
+    <w:p>
+      <w:pPr>
         <w:keepNext/>
         <w:spacing w:before="0" w:after="0" w:line="360" w:lineRule="auto"/>
         <w:jc w:val="left"/>
@@ -8477,17 +8485,6 @@
           <w:sz w:val="22"/>
           <w:szCs w:val="22"/>
         </w:rPr>
-      </w:r>
-    </w:p>
-    <w:p>
-      <w:pPr>
-        <w:spacing w:before="0" w:after="0" w:line="480" w:lineRule="auto"/>
-      </w:pPr>
-      <w:r>
-        <w:rPr>
-          <w:rFonts w:ascii="Georgia" w:hAnsi="Georgia" w:cs="Georgia"/>
-        </w:rPr>
-        <w:t xml:space="preserve"/>
       </w:r>
     </w:p>
     <w:tbl>
@@ -11536,6 +11533,18 @@
     </w:p>
     <w:p>
       <w:pPr>
+        <w:spacing w:before="0" w:after="0" w:line="480" w:lineRule="auto"/>
+      </w:pPr>
+      <w:r>
+        <w:rPr>
+          <w:rFonts w:ascii="Georgia" w:hAnsi="Georgia"/>
+          <w:sz w:val="22"/>
+        </w:rPr>
+        <w:t xml:space="preserve"/>
+      </w:r>
+    </w:p>
+    <w:p>
+      <w:pPr>
         <w:keepNext/>
         <w:spacing w:before="0" w:after="0" w:line="360" w:lineRule="auto"/>
         <w:jc w:val="left"/>
@@ -11580,17 +11589,6 @@
           <w:sz w:val="22"/>
           <w:szCs w:val="22"/>
         </w:rPr>
-      </w:r>
-    </w:p>
-    <w:p>
-      <w:pPr>
-        <w:spacing w:before="0" w:after="0" w:line="480" w:lineRule="auto"/>
-      </w:pPr>
-      <w:r>
-        <w:rPr>
-          <w:rFonts w:ascii="Georgia" w:hAnsi="Georgia" w:cs="Georgia"/>
-        </w:rPr>
-        <w:t xml:space="preserve"/>
       </w:r>
     </w:p>
     <w:tbl>
@@ -13302,6 +13300,18 @@
     </w:p>
     <w:p>
       <w:pPr>
+        <w:spacing w:before="0" w:after="0" w:line="480" w:lineRule="auto"/>
+      </w:pPr>
+      <w:r>
+        <w:rPr>
+          <w:rFonts w:ascii="Georgia" w:hAnsi="Georgia"/>
+          <w:sz w:val="22"/>
+        </w:rPr>
+        <w:t xml:space="preserve"/>
+      </w:r>
+    </w:p>
+    <w:p>
+      <w:pPr>
         <w:keepNext/>
         <w:spacing w:before="0" w:after="0" w:line="360" w:lineRule="auto"/>
         <w:jc w:val="left"/>
@@ -13346,17 +13356,6 @@
           <w:sz w:val="22"/>
           <w:szCs w:val="22"/>
         </w:rPr>
-      </w:r>
-    </w:p>
-    <w:p>
-      <w:pPr>
-        <w:spacing w:before="0" w:after="0" w:line="480" w:lineRule="auto"/>
-      </w:pPr>
-      <w:r>
-        <w:rPr>
-          <w:rFonts w:ascii="Georgia" w:hAnsi="Georgia" w:cs="Georgia"/>
-        </w:rPr>
-        <w:t xml:space="preserve"/>
       </w:r>
     </w:p>
     <w:tbl>
@@ -14570,17 +14569,6 @@
     </w:p>
     <w:p>
       <w:pPr>
-        <w:spacing w:before="0" w:after="0" w:line="480" w:lineRule="auto"/>
-      </w:pPr>
-      <w:r>
-        <w:rPr>
-          <w:rFonts w:ascii="Georgia" w:hAnsi="Georgia" w:cs="Georgia"/>
-        </w:rPr>
-        <w:t xml:space="preserve"/>
-      </w:r>
-    </w:p>
-    <w:p>
-      <w:pPr>
         <w:keepNext/>
         <w:spacing w:before="0" w:after="0" w:line="480" w:lineRule="auto"/>
         <w:jc w:val="left"/>
@@ -14637,6 +14625,18 @@
     </w:p>
     <w:p>
       <w:pPr>
+        <w:spacing w:before="0" w:after="0" w:line="480" w:lineRule="auto"/>
+      </w:pPr>
+      <w:r>
+        <w:rPr>
+          <w:rFonts w:ascii="Georgia" w:hAnsi="Georgia"/>
+          <w:sz w:val="22"/>
+        </w:rPr>
+        <w:t xml:space="preserve"/>
+      </w:r>
+    </w:p>
+    <w:p>
+      <w:pPr>
         <w:keepNext/>
         <w:spacing w:before="0" w:after="0" w:line="360" w:lineRule="auto"/>
         <w:jc w:val="left"/>
@@ -14681,17 +14681,6 @@
           <w:sz w:val="22"/>
           <w:szCs w:val="22"/>
         </w:rPr>
-      </w:r>
-    </w:p>
-    <w:p>
-      <w:pPr>
-        <w:spacing w:before="0" w:after="0" w:line="480" w:lineRule="auto"/>
-      </w:pPr>
-      <w:r>
-        <w:rPr>
-          <w:rFonts w:ascii="Georgia" w:hAnsi="Georgia" w:cs="Georgia"/>
-        </w:rPr>
-        <w:t xml:space="preserve"/>
       </w:r>
     </w:p>
     <w:tbl>
@@ -15438,6 +15427,18 @@
     </w:p>
     <w:p>
       <w:pPr>
+        <w:spacing w:before="0" w:after="0" w:line="480" w:lineRule="auto"/>
+      </w:pPr>
+      <w:r>
+        <w:rPr>
+          <w:rFonts w:ascii="Georgia" w:hAnsi="Georgia"/>
+          <w:sz w:val="22"/>
+        </w:rPr>
+        <w:t xml:space="preserve"/>
+      </w:r>
+    </w:p>
+    <w:p>
+      <w:pPr>
         <w:keepNext/>
         <w:spacing w:before="0" w:after="0" w:line="360" w:lineRule="auto"/>
         <w:jc w:val="left"/>
@@ -15497,17 +15498,6 @@
           <w:i/>
           <w:iCs/>
         </w:rPr>
-      </w:r>
-    </w:p>
-    <w:p>
-      <w:pPr>
-        <w:spacing w:before="0" w:after="0" w:line="480" w:lineRule="auto"/>
-      </w:pPr>
-      <w:r>
-        <w:rPr>
-          <w:rFonts w:ascii="Georgia" w:hAnsi="Georgia" w:cs="Georgia"/>
-        </w:rPr>
-        <w:t xml:space="preserve"/>
       </w:r>
     </w:p>
     <w:tbl>
@@ -16962,6 +16952,18 @@
     </w:p>
     <w:p>
       <w:pPr>
+        <w:spacing w:before="0" w:after="0" w:line="480" w:lineRule="auto"/>
+      </w:pPr>
+      <w:r>
+        <w:rPr>
+          <w:rFonts w:ascii="Georgia" w:hAnsi="Georgia"/>
+          <w:sz w:val="22"/>
+        </w:rPr>
+        <w:t xml:space="preserve"/>
+      </w:r>
+    </w:p>
+    <w:p>
+      <w:pPr>
         <w:keepNext/>
         <w:spacing w:before="0" w:after="0" w:line="360" w:lineRule="auto"/>
         <w:jc w:val="left"/>
@@ -17006,17 +17008,6 @@
           <w:sz w:val="22"/>
           <w:szCs w:val="22"/>
         </w:rPr>
-      </w:r>
-    </w:p>
-    <w:p>
-      <w:pPr>
-        <w:spacing w:before="0" w:after="0" w:line="480" w:lineRule="auto"/>
-      </w:pPr>
-      <w:r>
-        <w:rPr>
-          <w:rFonts w:ascii="Georgia" w:hAnsi="Georgia" w:cs="Georgia"/>
-        </w:rPr>
-        <w:t xml:space="preserve"/>
       </w:r>
     </w:p>
     <w:tbl>
@@ -18325,6 +18316,18 @@
     </w:p>
     <w:p>
       <w:pPr>
+        <w:spacing w:before="0" w:after="0" w:line="480" w:lineRule="auto"/>
+      </w:pPr>
+      <w:r>
+        <w:rPr>
+          <w:rFonts w:ascii="Georgia" w:hAnsi="Georgia"/>
+          <w:sz w:val="22"/>
+        </w:rPr>
+        <w:t xml:space="preserve"/>
+      </w:r>
+    </w:p>
+    <w:p>
+      <w:pPr>
         <w:keepNext/>
         <w:spacing w:before="0" w:after="0" w:line="360" w:lineRule="auto"/>
         <w:jc w:val="left"/>
@@ -18369,17 +18372,6 @@
           <w:sz w:val="22"/>
           <w:szCs w:val="22"/>
         </w:rPr>
-      </w:r>
-    </w:p>
-    <w:p>
-      <w:pPr>
-        <w:spacing w:before="0" w:after="0" w:line="480" w:lineRule="auto"/>
-      </w:pPr>
-      <w:r>
-        <w:rPr>
-          <w:rFonts w:ascii="Georgia" w:hAnsi="Georgia" w:cs="Georgia"/>
-        </w:rPr>
-        <w:t xml:space="preserve"/>
       </w:r>
     </w:p>
     <w:tbl>
@@ -19895,6 +19887,18 @@
     </w:p>
     <w:p>
       <w:pPr>
+        <w:spacing w:before="0" w:after="0" w:line="480" w:lineRule="auto"/>
+      </w:pPr>
+      <w:r>
+        <w:rPr>
+          <w:rFonts w:ascii="Georgia" w:hAnsi="Georgia"/>
+          <w:sz w:val="22"/>
+        </w:rPr>
+        <w:t xml:space="preserve"/>
+      </w:r>
+    </w:p>
+    <w:p>
+      <w:pPr>
         <w:keepNext/>
         <w:spacing w:before="0" w:after="0" w:line="360" w:lineRule="auto"/>
         <w:jc w:val="left"/>
@@ -19939,17 +19943,6 @@
           <w:sz w:val="22"/>
           <w:szCs w:val="22"/>
         </w:rPr>
-      </w:r>
-    </w:p>
-    <w:p>
-      <w:pPr>
-        <w:spacing w:before="0" w:after="0" w:line="480" w:lineRule="auto"/>
-      </w:pPr>
-      <w:r>
-        <w:rPr>
-          <w:rFonts w:ascii="Georgia" w:hAnsi="Georgia" w:cs="Georgia"/>
-        </w:rPr>
-        <w:t xml:space="preserve"/>
       </w:r>
     </w:p>
     <w:tbl>
@@ -23939,17 +23932,6 @@
         <w:t xml:space="preserve">Colored text labels = function. Grey = unhedged verb. Strike + grey code = FP.</w:t>
       </w:r>
     </w:p>
-    <w:p>
-      <w:pPr>
-        <w:spacing w:before="0" w:after="0" w:line="480" w:lineRule="auto"/>
-      </w:pPr>
-      <w:r>
-        <w:rPr>
-          <w:rFonts w:ascii="Georgia" w:hAnsi="Georgia" w:cs="Georgia"/>
-        </w:rPr>
-        <w:t xml:space="preserve"/>
-      </w:r>
-    </w:p>
     <w:tbl>
       <w:tblPr>
         <w:tblStyle w:val="Table8"/>
@@ -25152,17 +25134,6 @@
           <w:szCs w:val="22"/>
         </w:rPr>
         <w:t>Highlight each retained hedge token in the color for its grammatical form. Exclusions follow the Decision Rules for Ambiguous Cases in Methodology (Table 1).</w:t>
-      </w:r>
-    </w:p>
-    <w:p>
-      <w:pPr>
-        <w:spacing w:before="0" w:after="0" w:line="480" w:lineRule="auto"/>
-      </w:pPr>
-      <w:r>
-        <w:rPr>
-          <w:rFonts w:ascii="Georgia" w:hAnsi="Georgia" w:cs="Georgia"/>
-        </w:rPr>
-        <w:t xml:space="preserve"/>
       </w:r>
     </w:p>
     <w:tbl>
@@ -26050,17 +26021,6 @@
         </w:rPr>
       </w:r>
     </w:p>
-    <w:p>
-      <w:pPr>
-        <w:spacing w:before="0" w:after="0" w:line="480" w:lineRule="auto"/>
-      </w:pPr>
-      <w:r>
-        <w:rPr>
-          <w:rFonts w:ascii="Georgia" w:hAnsi="Georgia" w:cs="Georgia"/>
-        </w:rPr>
-        <w:t xml:space="preserve"/>
-      </w:r>
-    </w:p>
     <w:tbl>
       <w:tblPr>
         <w:tblStyle w:val="Table10"/>
@@ -26853,17 +26813,6 @@
         <w:t xml:space="preserve">Strike through the token. Write the reason code beside it in grey text.</w:t>
       </w:r>
     </w:p>
-    <w:p>
-      <w:pPr>
-        <w:spacing w:before="0" w:after="0" w:line="480" w:lineRule="auto"/>
-      </w:pPr>
-      <w:r>
-        <w:rPr>
-          <w:rFonts w:ascii="Georgia" w:hAnsi="Georgia" w:cs="Georgia"/>
-        </w:rPr>
-        <w:t xml:space="preserve"/>
-      </w:r>
-    </w:p>
     <w:tbl>
       <w:tblPr>
         <w:tblStyle w:val="Table12"/>
@@ -27838,17 +27787,6 @@
           <w:szCs w:val="22"/>
         </w:rPr>
         <w:t xml:space="preserve">Full clause in the coding sheet.</w:t>
-      </w:r>
-    </w:p>
-    <w:p>
-      <w:pPr>
-        <w:spacing w:before="0" w:after="0" w:line="480" w:lineRule="auto"/>
-      </w:pPr>
-      <w:r>
-        <w:rPr>
-          <w:rFonts w:ascii="Georgia" w:hAnsi="Georgia" w:cs="Georgia"/>
-        </w:rPr>
-        <w:t xml:space="preserve"/>
       </w:r>
     </w:p>
     <w:tbl>
@@ -28488,17 +28426,6 @@
           <w:sz w:val="22"/>
           <w:szCs w:val="22"/>
         </w:rPr>
-      </w:r>
-    </w:p>
-    <w:p>
-      <w:pPr>
-        <w:spacing w:before="0" w:after="0" w:line="480" w:lineRule="auto"/>
-      </w:pPr>
-      <w:r>
-        <w:rPr>
-          <w:rFonts w:ascii="Georgia" w:hAnsi="Georgia" w:cs="Georgia"/>
-        </w:rPr>
-        <w:t xml:space="preserve"/>
       </w:r>
     </w:p>
     <w:tbl>
@@ -28925,7 +28852,8 @@
       </w:pPr>
       <w:r>
         <w:rPr>
-          <w:rFonts w:ascii="Georgia" w:hAnsi="Georgia" w:cs="Georgia"/>
+          <w:rFonts w:ascii="Georgia" w:hAnsi="Georgia"/>
+          <w:sz w:val="22"/>
         </w:rPr>
         <w:t xml:space="preserve"/>
       </w:r>
@@ -29354,7 +29282,8 @@
       </w:pPr>
       <w:r>
         <w:rPr>
-          <w:rFonts w:ascii="Georgia" w:hAnsi="Georgia" w:cs="Georgia"/>
+          <w:rFonts w:ascii="Georgia" w:hAnsi="Georgia"/>
+          <w:sz w:val="22"/>
         </w:rPr>
         <w:t xml:space="preserve"/>
       </w:r>

</xml_diff>

<commit_message>
Draft_127_body: fix thematic headings (12pt italic left keepNext)
</commit_message>
<xml_diff>
--- a/thesis/003_ThesisProposal_Draft_127_body.docx
+++ b/thesis/003_ThesisProposal_Draft_127_body.docx
@@ -616,10 +616,6 @@
       <w:r>
         <w:rPr>
           <w:rFonts w:ascii="Georgia" w:cs="Georgia" w:eastAsia="Georgia" w:hAnsi="Georgia"/>
-          <w:b w:val="0"/>
-          <w:bCs w:val="0"/>
-          <w:i w:val="0"/>
-          <w:iCs w:val="0"/>
           <w:sz w:val="22"/>
           <w:szCs w:val="22"/>
           <w:rtl w:val="0"/>
@@ -644,10 +640,6 @@
       <w:r>
         <w:rPr>
           <w:rFonts w:ascii="Georgia" w:cs="Georgia" w:eastAsia="Georgia" w:hAnsi="Georgia"/>
-          <w:b w:val="0"/>
-          <w:bCs w:val="0"/>
-          <w:i w:val="0"/>
-          <w:iCs w:val="0"/>
           <w:sz w:val="22"/>
           <w:szCs w:val="22"/>
           <w:rtl w:val="0"/>
@@ -672,10 +664,6 @@
       <w:r>
         <w:rPr>
           <w:rFonts w:ascii="Georgia" w:cs="Georgia" w:eastAsia="Georgia" w:hAnsi="Georgia"/>
-          <w:b w:val="0"/>
-          <w:bCs w:val="0"/>
-          <w:i w:val="0"/>
-          <w:iCs w:val="0"/>
           <w:sz w:val="22"/>
           <w:szCs w:val="22"/>
           <w:rtl w:val="0"/>
@@ -700,10 +688,6 @@
       <w:r>
         <w:rPr>
           <w:rFonts w:ascii="Georgia" w:cs="Georgia" w:eastAsia="Georgia" w:hAnsi="Georgia"/>
-          <w:b w:val="0"/>
-          <w:bCs w:val="0"/>
-          <w:i w:val="0"/>
-          <w:iCs w:val="0"/>
           <w:sz w:val="22"/>
           <w:szCs w:val="22"/>
           <w:rtl w:val="0"/>
@@ -756,10 +740,6 @@
       <w:r>
         <w:rPr>
           <w:rFonts w:ascii="Georgia" w:cs="Georgia" w:eastAsia="Georgia" w:hAnsi="Georgia"/>
-          <w:b w:val="0"/>
-          <w:bCs w:val="0"/>
-          <w:i w:val="0"/>
-          <w:iCs w:val="0"/>
           <w:sz w:val="22"/>
           <w:szCs w:val="22"/>
           <w:rtl w:val="0"/>
@@ -784,10 +764,6 @@
       <w:r>
         <w:rPr>
           <w:rFonts w:ascii="Georgia" w:cs="Georgia" w:eastAsia="Georgia" w:hAnsi="Georgia"/>
-          <w:b w:val="0"/>
-          <w:bCs w:val="0"/>
-          <w:i w:val="0"/>
-          <w:iCs w:val="0"/>
           <w:sz w:val="22"/>
           <w:szCs w:val="22"/>
           <w:rtl w:val="0"/>
@@ -812,10 +788,6 @@
       <w:r>
         <w:rPr>
           <w:rFonts w:ascii="Georgia" w:cs="Georgia" w:eastAsia="Georgia" w:hAnsi="Georgia"/>
-          <w:b w:val="0"/>
-          <w:bCs w:val="0"/>
-          <w:i w:val="0"/>
-          <w:iCs w:val="0"/>
           <w:sz w:val="22"/>
           <w:szCs w:val="22"/>
           <w:rtl w:val="0"/>
@@ -840,10 +812,6 @@
       <w:r>
         <w:rPr>
           <w:rFonts w:ascii="Georgia" w:cs="Georgia" w:eastAsia="Georgia" w:hAnsi="Georgia"/>
-          <w:b w:val="0"/>
-          <w:bCs w:val="0"/>
-          <w:i w:val="0"/>
-          <w:iCs w:val="0"/>
           <w:sz w:val="22"/>
           <w:szCs w:val="22"/>
           <w:rtl w:val="0"/>
@@ -868,15 +836,323 @@
       <w:r>
         <w:rPr>
           <w:rFonts w:ascii="Georgia" w:cs="Georgia" w:eastAsia="Georgia" w:hAnsi="Georgia"/>
-          <w:b w:val="0"/>
-          <w:bCs w:val="0"/>
-          <w:i w:val="0"/>
-          <w:iCs w:val="0"/>
           <w:sz w:val="22"/>
           <w:szCs w:val="22"/>
           <w:rtl w:val="0"/>
         </w:rPr>
         <w:t xml:space="preserve">Taken together, these studies show that undergraduate and master’s-level writers often under-deploy hedges, lean on a limited set of forms (often modals), and may differ by program without matching expert disciplinary profiles. Clear gaps remain for the present work: only a few of these studies examined abstracts specifically, and most of those focused on English or language majors rather than applied science programs. Others analyzed discussion sections or full papers, where rhetorical space is wider. None is set in a Philippine context for Agriculture, Veterinary Medicine, and Biology undergraduate thesis abstracts.</w:t>
+      </w:r>
+      <w:r>
+        <w:rPr>
+          <w:rtl w:val="0"/>
+          <w:rFonts w:ascii="Georgia" w:hAnsi="Georgia" w:cs="Georgia"/>
+          <w:sz w:val="22"/>
+          <w:szCs w:val="22"/>
+        </w:rPr>
+      </w:r>
+    </w:p>
+    <w:p>
+      <w:pPr>
+        <w:spacing w:before="0" w:after="0" w:line="480" w:lineRule="auto"/>
+        <w:ind w:firstLine="720"/>
+        <w:jc w:val="both"/>
+      </w:pPr>
+      <w:r>
+        <w:rPr>
+          <w:rFonts w:ascii="Georgia" w:cs="Georgia" w:eastAsia="Georgia" w:hAnsi="Georgia"/>
+          <w:sz w:val="22"/>
+          <w:szCs w:val="22"/>
+          <w:rtl w:val="0"/>
+        </w:rPr>
+        <w:t xml:space="preserve">Disciplinary Variation in Scientific and Medical Writing</w:t>
+      </w:r>
+      <w:r>
+        <w:rPr>
+          <w:rtl w:val="0"/>
+          <w:rFonts w:ascii="Georgia" w:hAnsi="Georgia" w:cs="Georgia"/>
+          <w:sz w:val="22"/>
+          <w:szCs w:val="22"/>
+        </w:rPr>
+      </w:r>
+    </w:p>
+    <w:p>
+      <w:pPr>
+        <w:spacing w:before="0" w:after="0" w:line="480" w:lineRule="auto"/>
+        <w:ind w:firstLine="720"/>
+        <w:jc w:val="both"/>
+      </w:pPr>
+      <w:r>
+        <w:rPr>
+          <w:rFonts w:ascii="Georgia" w:cs="Georgia" w:eastAsia="Georgia" w:hAnsi="Georgia"/>
+          <w:sz w:val="22"/>
+          <w:szCs w:val="22"/>
+          <w:rtl w:val="0"/>
+        </w:rPr>
+        <w:t xml:space="preserve">Field norms shape expert hedging, but not along a simple hard-or-soft divide. Hyland (1996) grounds that claim in scientific research writing itself. In a corpus of 26 molecular biology research articles, he shows that hedging is central to gaining reader acceptance of claims. Writers use hedges to state findings with precision, caution, and deference to colleagues rather than as optional politeness. Lexical forms carry most of the load: about 79% of hedging instances are lexical, mainly verbs, adjectives, and adverbs, rather than modal verbs alone. That formal profile matters for later comparison with undergraduate biology and applied-life-science abstracts that may lean more heavily on a small modal set.</w:t>
+      </w:r>
+      <w:r>
+        <w:rPr>
+          <w:rtl w:val="0"/>
+          <w:rFonts w:ascii="Georgia" w:hAnsi="Georgia" w:cs="Georgia"/>
+          <w:sz w:val="22"/>
+          <w:szCs w:val="22"/>
+        </w:rPr>
+      </w:r>
+    </w:p>
+    <w:p>
+      <w:pPr>
+        <w:spacing w:before="0" w:after="0" w:line="480" w:lineRule="auto"/>
+        <w:ind w:firstLine="720"/>
+        <w:jc w:val="both"/>
+      </w:pPr>
+      <w:r>
+        <w:rPr>
+          <w:rFonts w:ascii="Georgia" w:cs="Georgia" w:eastAsia="Georgia" w:hAnsi="Georgia"/>
+          <w:sz w:val="22"/>
+          <w:szCs w:val="22"/>
+          <w:rtl w:val="0"/>
+        </w:rPr>
+        <w:t xml:space="preserve">Afshar et al. (2014) scale the comparison across fields. They examined Discussion sections of 180 research articles from Humanities (Law, Persian literature, TEFL), Basic Sciences (Biology, Applied Chemistry, Geology), and Agriculture (Biotechnology, Soil Sciences, Horticulture), with 20 articles per sub-field, using Salager-Meyer’s (1994) taxonomy. Significant differences appeared both among the three fields and among sub-fields within each field. Humanities articles carried the highest overall hedge counts. Agriculture and Basic Sciences sat lower, with further unevenness inside each label. The study therefore does more than rank soft above hard. It shows that sub-field matters even when articles share a broad disciplinary name.</w:t>
+      </w:r>
+      <w:r>
+        <w:rPr>
+          <w:rtl w:val="0"/>
+          <w:rFonts w:ascii="Georgia" w:hAnsi="Georgia" w:cs="Georgia"/>
+          <w:sz w:val="22"/>
+          <w:szCs w:val="22"/>
+        </w:rPr>
+      </w:r>
+    </w:p>
+    <w:p>
+      <w:pPr>
+        <w:spacing w:before="0" w:after="0" w:line="480" w:lineRule="auto"/>
+        <w:ind w:firstLine="720"/>
+        <w:jc w:val="both"/>
+      </w:pPr>
+      <w:r>
+        <w:rPr>
+          <w:rFonts w:ascii="Georgia" w:cs="Georgia" w:eastAsia="Georgia" w:hAnsi="Georgia"/>
+          <w:sz w:val="22"/>
+          <w:szCs w:val="22"/>
+          <w:rtl w:val="0"/>
+        </w:rPr>
+        <w:t xml:space="preserve">Mohammed (2011) takes a different cut by comparing lexical hedges in biochemistry and applied-linguistics research articles by American and Arabic authors. The study found that American writers used more hedging forms than Arabic writers in both disciplines. Linguists used considerably fewer hedges than scientists, and biochemistry articles were more heavily hedged than applied-linguistics articles. Discussion sections contained more hedges than introductions. Because Mohammed focuses on lexical hedges rather than Salager-Meyer’s full taxonomy, the ranking cannot be stacked directly onto Afshar et al.’s field totals. What the two studies share is that density tracks the pairing under analysis and the coding scheme, not a single universal hard-or-soft scale.</w:t>
+      </w:r>
+      <w:r>
+        <w:rPr>
+          <w:rtl w:val="0"/>
+          <w:rFonts w:ascii="Georgia" w:hAnsi="Georgia" w:cs="Georgia"/>
+          <w:sz w:val="22"/>
+          <w:szCs w:val="22"/>
+        </w:rPr>
+      </w:r>
+    </w:p>
+    <w:p>
+      <w:pPr>
+        <w:spacing w:before="0" w:after="0" w:line="480" w:lineRule="auto"/>
+        <w:ind w:firstLine="720"/>
+        <w:jc w:val="both"/>
+      </w:pPr>
+      <w:r>
+        <w:rPr>
+          <w:rFonts w:ascii="Georgia" w:cs="Georgia" w:eastAsia="Georgia" w:hAnsi="Georgia"/>
+          <w:sz w:val="22"/>
+          <w:szCs w:val="22"/>
+          <w:rtl w:val="0"/>
+        </w:rPr>
+        <w:t xml:space="preserve">Rezvani and Javadi (2021) test hard-versus-soft differences in abstracts by Iranian writers of English. They sampled 200 research-article abstracts, 50 each from chemistry, mathematics, philosophy, and English, grouped as hard and soft sciences under Biglan’s (1973) typology. Soft-science abstracts used more hedge expressions overall, and soft writers drew more on modals, verbs, nouns, adjectives, and adverbs, while hard-science writers used more conditional expressions. Epistemic and cognition verbs were the most frequent hedging expressions in both groups. The study supports disciplinary differentiation inside the compressed abstract genre and shows that form mix, not only density, separates the two clusters.</w:t>
+      </w:r>
+      <w:r>
+        <w:rPr>
+          <w:rtl w:val="0"/>
+          <w:rFonts w:ascii="Georgia" w:hAnsi="Georgia" w:cs="Georgia"/>
+          <w:sz w:val="22"/>
+          <w:szCs w:val="22"/>
+        </w:rPr>
+      </w:r>
+    </w:p>
+    <w:p>
+      <w:pPr>
+        <w:spacing w:before="0" w:after="0" w:line="480" w:lineRule="auto"/>
+        <w:ind w:firstLine="720"/>
+        <w:jc w:val="both"/>
+      </w:pPr>
+      <w:r>
+        <w:rPr>
+          <w:rFonts w:ascii="Georgia" w:cs="Georgia" w:eastAsia="Georgia" w:hAnsi="Georgia"/>
+          <w:sz w:val="22"/>
+          <w:szCs w:val="22"/>
+          <w:rtl w:val="0"/>
+        </w:rPr>
+        <w:t xml:space="preserve">Bonyadi, Gholami, and Nasiri (2012) keep the lens on an applied science close to agriculture. They compared hedges in Discussion sections of 60 environmental-sciences research articles: 20 by English research writers, 20 by Iranian writers in English, and 20 by Iranian writers in Farsi, coded with Salager-Meyer’s (1994) taxonomy. English and Iranian English articles did not differ significantly in hedge use, but English and Farsi articles did. The authors link the English-Farsi gap to rhetorical preference in Farsi for less hedged, more categorically validated prose, a pattern that sits at odds with international environmental-science discourse expectations. For the present corpus, the study is a reminder that applied-science hedging norms are international as well as disciplinary, and that L1 background can still shape English research writing in the same field.</w:t>
+      </w:r>
+      <w:r>
+        <w:rPr>
+          <w:rtl w:val="0"/>
+          <w:rFonts w:ascii="Georgia" w:hAnsi="Georgia" w:cs="Georgia"/>
+          <w:sz w:val="22"/>
+          <w:szCs w:val="22"/>
+        </w:rPr>
+      </w:r>
+    </w:p>
+    <w:p>
+      <w:pPr>
+        <w:spacing w:before="0" w:after="0" w:line="480" w:lineRule="auto"/>
+        <w:ind w:firstLine="720"/>
+        <w:jc w:val="both"/>
+      </w:pPr>
+      <w:r>
+        <w:rPr>
+          <w:rFonts w:ascii="Georgia" w:cs="Georgia" w:eastAsia="Georgia" w:hAnsi="Georgia"/>
+          <w:sz w:val="22"/>
+          <w:szCs w:val="22"/>
+          <w:rtl w:val="0"/>
+        </w:rPr>
+        <w:t xml:space="preserve">Within life sciences proper, Souici and Slougui (2022) examined 31 biology research articles by Algerian authors from five locally published journals. Main verbs were the most prominent hedge category. Within that category, non-factive reporting verbs ranked highest. Writers relied on those verbs to support and frame findings rather than on a wide modal set alone. Hamidi et al. (2025) compared conclusion sections of basic-science and clinical-science papers in the Medical Journal of the Islamic Republic of Iran. Clinical papers used more hedge tokens (330 versus 154), yet an inferential test found no statistically significant difference. Journal standards and cultural factors, the authors argue, shape hedging as much as the basic-versus-clinical split.</w:t>
+      </w:r>
+      <w:r>
+        <w:rPr>
+          <w:rtl w:val="0"/>
+          <w:rFonts w:ascii="Georgia" w:hAnsi="Georgia" w:cs="Georgia"/>
+          <w:sz w:val="22"/>
+          <w:szCs w:val="22"/>
+        </w:rPr>
+      </w:r>
+    </w:p>
+    <w:p>
+      <w:pPr>
+        <w:spacing w:before="0" w:after="0" w:line="480" w:lineRule="auto"/>
+        <w:ind w:firstLine="720"/>
+        <w:jc w:val="both"/>
+      </w:pPr>
+      <w:r>
+        <w:rPr>
+          <w:rFonts w:ascii="Georgia" w:cs="Georgia" w:eastAsia="Georgia" w:hAnsi="Georgia"/>
+          <w:sz w:val="22"/>
+          <w:szCs w:val="22"/>
+          <w:rtl w:val="0"/>
+        </w:rPr>
+        <w:t xml:space="preserve">Salager-Meyer (1994) anchors much of this comparative work in medical English. In research papers and case reports from leading medical journals, hedge frequency and category distribution shifted with rhetorical section. Discussion and Comment sections were the most heavily hedged. Methods and case-report body sections were among the least. Shields, approximators, and compound hedges accounted for the great majority of devices. Introductions favored shields, especially epistemic verbs, as writers carved an early niche for the study. That section pattern matters for how medical writers present results. Directly measured findings often remain categorical, and hedging rises where writers move from measurement to interpretation, generalization, or clinical implication. The same medical discourse can therefore look firm in the results strip and still manage claim responsibility in the interpretive strip.</w:t>
+      </w:r>
+      <w:r>
+        <w:rPr>
+          <w:rtl w:val="0"/>
+          <w:rFonts w:ascii="Georgia" w:hAnsi="Georgia" w:cs="Georgia"/>
+          <w:sz w:val="22"/>
+          <w:szCs w:val="22"/>
+        </w:rPr>
+      </w:r>
+    </w:p>
+    <w:p>
+      <w:pPr>
+        <w:spacing w:before="0" w:after="0" w:line="480" w:lineRule="auto"/>
+        <w:ind w:firstLine="720"/>
+        <w:jc w:val="both"/>
+      </w:pPr>
+      <w:r>
+        <w:rPr>
+          <w:rFonts w:ascii="Georgia" w:cs="Georgia" w:eastAsia="Georgia" w:hAnsi="Georgia"/>
+          <w:sz w:val="22"/>
+          <w:szCs w:val="22"/>
+          <w:rtl w:val="0"/>
+        </w:rPr>
+        <w:t xml:space="preserve">Corpus work on medical Results and Discussion sections supports that reading. Doğan and Akbaş (2021) analysed about 215,000 words from the Results and Discussion sections of 100 medical research articles across fields from anatomy to endocrinology. Medical writers used modal auxiliaries frequently to mark stance. They did not rely on a matching surge of boosters to amplify commitment. Where boosters appeared, they were often strategic, used to support credibility and reader engagement rather than as a default claim of certainty. Medical scientific English in those sections is therefore better described as calibrated commitment than as either blanket tentativeness or blanket conviction.</w:t>
+      </w:r>
+      <w:r>
+        <w:rPr>
+          <w:rtl w:val="0"/>
+          <w:rFonts w:ascii="Georgia" w:hAnsi="Georgia" w:cs="Georgia"/>
+          <w:sz w:val="22"/>
+          <w:szCs w:val="22"/>
+        </w:rPr>
+      </w:r>
+    </w:p>
+    <w:p>
+      <w:pPr>
+        <w:spacing w:before="0" w:after="0" w:line="480" w:lineRule="auto"/>
+        <w:ind w:firstLine="720"/>
+        <w:jc w:val="both"/>
+      </w:pPr>
+      <w:r>
+        <w:rPr>
+          <w:rFonts w:ascii="Georgia" w:cs="Georgia" w:eastAsia="Georgia" w:hAnsi="Georgia"/>
+          <w:sz w:val="22"/>
+          <w:szCs w:val="22"/>
+          <w:rtl w:val="0"/>
+        </w:rPr>
+        <w:t xml:space="preserve">Lingard (2026) makes the same point in pedagogical terms for health-professions research writing. High authorial commitment is appropriate when the warrant is strong. Heavy hedging on a well-supported measurement can read as unnecessary softening. Low commitment remains necessary when the claim outruns the data. The issue is match of stance to warrant, not a medical culture of always agreeing or disagreeing more bluntly than other sciences.</w:t>
+      </w:r>
+      <w:r>
+        <w:rPr>
+          <w:rtl w:val="0"/>
+          <w:rFonts w:ascii="Georgia" w:hAnsi="Georgia" w:cs="Georgia"/>
+          <w:sz w:val="22"/>
+          <w:szCs w:val="22"/>
+        </w:rPr>
+      </w:r>
+    </w:p>
+    <w:p>
+      <w:pPr>
+        <w:spacing w:before="0" w:after="0" w:line="480" w:lineRule="auto"/>
+        <w:ind w:firstLine="720"/>
+        <w:jc w:val="both"/>
+      </w:pPr>
+      <w:r>
+        <w:rPr>
+          <w:rFonts w:ascii="Georgia" w:cs="Georgia" w:eastAsia="Georgia" w:hAnsi="Georgia"/>
+          <w:sz w:val="22"/>
+          <w:szCs w:val="22"/>
+          <w:rtl w:val="0"/>
+        </w:rPr>
+        <w:t xml:space="preserve">Cross-field comparisons complicate any simple medical-versus-other ranking, as Sepehri, Hajijalili, and Namaziandost (2019) compared hedges and boosters in 30 medical and 30 engineering research articles and found a significant disciplinary difference, with medical articles carrying more hedge tokens overall in their sample. Medical writing is not uniformly under-hedged relative to other technical fields. What remains distinctive is the reporting pattern inside the article: categorical presentation of measured results, denser hedging where interpretation and generalization begin. Hu and Cao (2011) add publication medium and evidence type outside medicine. In applied-linguistics journal abstracts, English-medium texts featured markedly more hedges than Chinese-medium texts, and empirical research abstracts used significantly more boosters than non-empirical articles. Stance choices therefore track section, medium, and evidence type as well as discipline.</w:t>
+      </w:r>
+      <w:r>
+        <w:rPr>
+          <w:rtl w:val="0"/>
+          <w:rFonts w:ascii="Georgia" w:hAnsi="Georgia" w:cs="Georgia"/>
+          <w:sz w:val="22"/>
+          <w:szCs w:val="22"/>
+        </w:rPr>
+      </w:r>
+    </w:p>
+    <w:p>
+      <w:pPr>
+        <w:spacing w:before="0" w:after="0" w:line="480" w:lineRule="auto"/>
+        <w:ind w:firstLine="720"/>
+        <w:jc w:val="both"/>
+      </w:pPr>
+      <w:r>
+        <w:rPr>
+          <w:rFonts w:ascii="Georgia" w:cs="Georgia" w:eastAsia="Georgia" w:hAnsi="Georgia"/>
+          <w:sz w:val="22"/>
+          <w:szCs w:val="22"/>
+          <w:rtl w:val="0"/>
+        </w:rPr>
+        <w:t xml:space="preserve">Smirnova and Pérez-Guerra (2025) ask whether formal stance features alone can recover hard-versus-soft disciplinary groups. Their corpus covers about 1.6 million words of research articles from eight disciplines: chemistry, physics, engineering, and mathematics on the hard side, and business studies, history, linguistics, and political science on the soft side. Grammatical and lexical stance features, including hedges, boosters, and self-mention, were quantified and modelled. Multivariate analysis identified features that significantly contributed to hard-versus-soft variation. Clustering on those formal frequencies alone grouped the eight disciplines into two clusters matching the original hard and soft division. The result strengthens the claim that disciplinary variation in stance is systematic enough to classify fields, even when meaning-based interpretation is set aside.</w:t>
+      </w:r>
+      <w:r>
+        <w:rPr>
+          <w:rtl w:val="0"/>
+          <w:rFonts w:ascii="Georgia" w:hAnsi="Georgia" w:cs="Georgia"/>
+          <w:sz w:val="22"/>
+          <w:szCs w:val="22"/>
+        </w:rPr>
+      </w:r>
+    </w:p>
+    <w:p>
+      <w:pPr>
+        <w:spacing w:before="0" w:after="0" w:line="480" w:lineRule="auto"/>
+        <w:ind w:firstLine="720"/>
+        <w:jc w:val="both"/>
+      </w:pPr>
+      <w:r>
+        <w:rPr>
+          <w:rFonts w:ascii="Georgia" w:cs="Georgia" w:eastAsia="Georgia" w:hAnsi="Georgia"/>
+          <w:sz w:val="22"/>
+          <w:szCs w:val="22"/>
+          <w:rtl w:val="0"/>
+        </w:rPr>
+        <w:t xml:space="preserve">Expert scientific English therefore shows measurable variation, but the variation is local to how each field, section, medium, and publication context handles evidence and claim risk. In medical and clinical writing, that local pattern includes categorical reporting of measured results and denser hedging when claims move into interpretation. For developing writers in second-language settings, the expert picture is a target rather than a description of current practice. The present study asks whether PSAU undergraduates in three applied programs already show any of that field-sensitive differentiation in the compressed genre of the thesis abstract.</w:t>
       </w:r>
       <w:r>
         <w:rPr>
@@ -904,7 +1180,7 @@
           <w:szCs w:val="22"/>
           <w:rtl w:val="0"/>
         </w:rPr>
-        <w:t xml:space="preserve">Disciplinary Variation in Scientific and Medical Writing</w:t>
+        <w:t xml:space="preserve">Hedging in L2 and EFL Contexts</w:t>
       </w:r>
       <w:r>
         <w:rPr>
@@ -924,15 +1200,11 @@
       <w:r>
         <w:rPr>
           <w:rFonts w:ascii="Georgia" w:cs="Georgia" w:eastAsia="Georgia" w:hAnsi="Georgia"/>
-          <w:b w:val="0"/>
-          <w:bCs w:val="0"/>
-          <w:i w:val="0"/>
-          <w:iCs w:val="0"/>
-          <w:sz w:val="22"/>
-          <w:szCs w:val="22"/>
-          <w:rtl w:val="0"/>
-        </w:rPr>
-        <w:t xml:space="preserve">Field norms shape expert hedging, but not along a simple hard-or-soft divide. Hyland (1996) grounds that claim in scientific research writing itself. In a corpus of 26 molecular biology research articles, he shows that hedging is central to gaining reader acceptance of claims. Writers use hedges to state findings with precision, caution, and deference to colleagues rather than as optional politeness. Lexical forms carry most of the load: about 79% of hedging instances are lexical, mainly verbs, adjectives, and adverbs, rather than modal verbs alone. That formal profile matters for later comparison with undergraduate biology and applied-life-science abstracts that may lean more heavily on a small modal set.</w:t>
+          <w:sz w:val="22"/>
+          <w:szCs w:val="22"/>
+          <w:rtl w:val="0"/>
+        </w:rPr>
+        <w:t xml:space="preserve">English is the medium of academic writing at PSAU, but it is not the home language for most students. Research on second-language academic writing has long treated hedging as a point of difficulty rather than as a simple vocabulary gap. Hyland and Milton (1997) compared expressions of doubt and certainty in a one-million-word corpus of examination scripts from 900 Cantonese-speaking school leavers writing in English and 770 British learners of similar age and educational level. The L2 writers relied on a more limited range of epistemic items, offered stronger commitments, and showed greater difficulty conveying a precise degree of certainty than their L1 peers. That pattern remains a baseline across EFL research. L2 academic writers often under-qualify claims or overuse a small set of strong forms.</w:t>
       </w:r>
       <w:r>
         <w:rPr>
@@ -952,15 +1224,11 @@
       <w:r>
         <w:rPr>
           <w:rFonts w:ascii="Georgia" w:cs="Georgia" w:eastAsia="Georgia" w:hAnsi="Georgia"/>
-          <w:b w:val="0"/>
-          <w:bCs w:val="0"/>
-          <w:i w:val="0"/>
-          <w:iCs w:val="0"/>
-          <w:sz w:val="22"/>
-          <w:szCs w:val="22"/>
-          <w:rtl w:val="0"/>
-        </w:rPr>
-        <w:t xml:space="preserve">Afshar et al. (2014) scale the comparison across fields. They examined Discussion sections of 180 research articles from Humanities (Law, Persian literature, TEFL), Basic Sciences (Biology, Applied Chemistry, Geology), and Agriculture (Biotechnology, Soil Sciences, Horticulture), with 20 articles per sub-field, using Salager-Meyer’s (1994) taxonomy. Significant differences appeared both among the three fields and among sub-fields within each field. Humanities articles carried the highest overall hedge counts. Agriculture and Basic Sciences sat lower, with further unevenness inside each label. The study therefore does more than rank soft above hard. It shows that sub-field matters even when articles share a broad disciplinary name.</w:t>
+          <w:sz w:val="22"/>
+          <w:szCs w:val="22"/>
+          <w:rtl w:val="0"/>
+        </w:rPr>
+        <w:t xml:space="preserve">Hinkel (2005) sharpens the formal picture with a large student-essay corpus of 745 essays and about 221,000 words. L2 writers used a limited range of hedging devices, many of them associated with conversational rather than formal written discourse. The same essays showed a prevalence of conversational intensifiers and overstatements that are common in informal speech but rare in academic prose. Demir (2018) compared lexical hedges in academic texts by English L1 and L2 writers and reported significant differences across modal, verbal, adjectival, adverbial, quantifier, and noun hedges, as well as in total hedge use. Taken together, these studies show that the L2 issue is not only density. It is range, register, and the balance between caution and overstatement.</w:t>
       </w:r>
       <w:r>
         <w:rPr>
@@ -980,15 +1248,11 @@
       <w:r>
         <w:rPr>
           <w:rFonts w:ascii="Georgia" w:cs="Georgia" w:eastAsia="Georgia" w:hAnsi="Georgia"/>
-          <w:b w:val="0"/>
-          <w:bCs w:val="0"/>
-          <w:i w:val="0"/>
-          <w:iCs w:val="0"/>
-          <w:sz w:val="22"/>
-          <w:szCs w:val="22"/>
-          <w:rtl w:val="0"/>
-        </w:rPr>
-        <w:t xml:space="preserve">Mohammed (2011) takes a different cut by comparing lexical hedges in biochemistry and applied-linguistics research articles by American and Arabic authors. The study found that American writers used more hedging forms than Arabic writers in both disciplines. Linguists used considerably fewer hedges than scientists, and biochemistry articles were more heavily hedged than applied-linguistics articles. Discussion sections contained more hedges than introductions. Because Mohammed focuses on lexical hedges rather than Salager-Meyer’s full taxonomy, the ranking cannot be stacked directly onto Afshar et al.’s field totals. What the two studies share is that density tracks the pairing under analysis and the coding scheme, not a single universal hard-or-soft scale.</w:t>
+          <w:sz w:val="22"/>
+          <w:szCs w:val="22"/>
+          <w:rtl w:val="0"/>
+        </w:rPr>
+        <w:t xml:space="preserve">Takimoto (2015) adds a recognition layer. In a corpus comparison of academic essays by Japanese EFL learners and English L1 writers, the EFL group used more boosters than hedges and preferred straightforward, explicit expressions, whereas English L1 writers were more tentative. A follow-up task suggested that certainty items were more visible to the learners than possibility and probability items, which they often misapprehended. Underuse of hedges can therefore coexist with limited pragmatic awareness of what the missing forms do. Luo (2021), in a systematic review of undergraduate English language learners' hedging, reaches a similar aggregate conclusion. ELLs generally use fewer hedges than English L1 writers, draw on a narrower inventory, and face combined challenges of academic experience and L2 form control.</w:t>
       </w:r>
       <w:r>
         <w:rPr>
@@ -1008,15 +1272,11 @@
       <w:r>
         <w:rPr>
           <w:rFonts w:ascii="Georgia" w:cs="Georgia" w:eastAsia="Georgia" w:hAnsi="Georgia"/>
-          <w:b w:val="0"/>
-          <w:bCs w:val="0"/>
-          <w:i w:val="0"/>
-          <w:iCs w:val="0"/>
-          <w:sz w:val="22"/>
-          <w:szCs w:val="22"/>
-          <w:rtl w:val="0"/>
-        </w:rPr>
-        <w:t xml:space="preserve">Rezvani and Javadi (2021) test hard-versus-soft differences in abstracts by Iranian writers of English. They sampled 200 research-article abstracts, 50 each from chemistry, mathematics, philosophy, and English, grouped as hard and soft sciences under Biglan’s (1973) typology. Soft-science abstracts used more hedge expressions overall, and soft writers drew more on modals, verbs, nouns, adjectives, and adverbs, while hard-science writers used more conditional expressions. Epistemic and cognition verbs were the most frequent hedging expressions in both groups. The study supports disciplinary differentiation inside the compressed abstract genre and shows that form mix, not only density, separates the two clusters.</w:t>
+          <w:sz w:val="22"/>
+          <w:szCs w:val="22"/>
+          <w:rtl w:val="0"/>
+        </w:rPr>
+        <w:t xml:space="preserve">Alonso (2019) approaches the same problem through a multicompetence design rather than an L2-only comparison. She examined hedges in academic writing by 24 Spanish learners of English, collecting data from the same participants in both Spanish and English, and compared them with monolingual Spanish and monolingual English control groups of 24 speakers each. Hedges were coded following Hyland's (1994) typology. Chi-square analyses showed differences between English and Spanish speakers, and between English speakers and L2 learners, especially in impersonal expressions and lexical verbs. Evidence of crosslinguistic influence appeared, and similarity in the use of adverbs across the learners' L1 and L2 pointed to L1-L2 convergence. The design matters for the present study because it shows that L2 hedging patterns cannot be read as a pure deficit against English L1 norms without also considering the writer's full language system. Publication medium and cultural writing tradition can widen the same gap. Hu and Cao (2011) found that applied-linguistics abstracts in English-medium journals carried markedly more hedges than those in Chinese-medium journals, a difference they link jointly to rhetorical convention and epistemological belief.</w:t>
       </w:r>
       <w:r>
         <w:rPr>
@@ -1036,15 +1296,11 @@
       <w:r>
         <w:rPr>
           <w:rFonts w:ascii="Georgia" w:cs="Georgia" w:eastAsia="Georgia" w:hAnsi="Georgia"/>
-          <w:b w:val="0"/>
-          <w:bCs w:val="0"/>
-          <w:i w:val="0"/>
-          <w:iCs w:val="0"/>
-          <w:sz w:val="22"/>
-          <w:szCs w:val="22"/>
-          <w:rtl w:val="0"/>
-        </w:rPr>
-        <w:t xml:space="preserve">Bonyadi, Gholami, and Nasiri (2012) keep the lens on an applied science close to agriculture. They compared hedges in Discussion sections of 60 environmental-sciences research articles: 20 by English research writers, 20 by Iranian writers in English, and 20 by Iranian writers in Farsi, coded with Salager-Meyer’s (1994) taxonomy. English and Iranian English articles did not differ significantly in hedge use, but English and Farsi articles did. The authors link the English-Farsi gap to rhetorical preference in Farsi for less hedged, more categorically validated prose, a pattern that sits at odds with international environmental-science discourse expectations. For the present corpus, the study is a reminder that applied-science hedging norms are international as well as disciplinary, and that L1 background can still shape English research writing in the same field.</w:t>
+          <w:sz w:val="22"/>
+          <w:szCs w:val="22"/>
+          <w:rtl w:val="0"/>
+        </w:rPr>
+        <w:t xml:space="preserve">Undergraduate thesis abstracts, the genre closest to the present corpus, show the same L2 pressures. As reviewed under undergraduate writing, Mazidah et al. (2022) and Ghia et al. (2022) report that L2 thesis abstracts often carry fewer hedges and stronger certainty marking than L1 comparison groups, even among language-oriented programs. Bayraktar-Cepni and Kulaksiz (2022) compared hedging in discussion sections of ELT MA and PhD theses and found that MA theses contained significantly more hedges than PhD theses, a difference they link to developing writers' stronger need to soften stance. Level of academic experience, not only L1 versus L2 status, therefore shapes how much caution writers encode.</w:t>
       </w:r>
       <w:r>
         <w:rPr>
@@ -1064,15 +1320,11 @@
       <w:r>
         <w:rPr>
           <w:rFonts w:ascii="Georgia" w:cs="Georgia" w:eastAsia="Georgia" w:hAnsi="Georgia"/>
-          <w:b w:val="0"/>
-          <w:bCs w:val="0"/>
-          <w:i w:val="0"/>
-          <w:iCs w:val="0"/>
-          <w:sz w:val="22"/>
-          <w:szCs w:val="22"/>
-          <w:rtl w:val="0"/>
-        </w:rPr>
-        <w:t xml:space="preserve">Within life sciences proper, Souici and Slougui (2022) examined 31 biology research articles by Algerian authors from five locally published journals. Main verbs were the most prominent hedge category. Within that category, non-factive reporting verbs ranked highest. Writers relied on those verbs to support and frame findings rather than on a wide modal set alone. Hamidi et al. (2025) compared conclusion sections of basic-science and clinical-science papers in the Medical Journal of the Islamic Republic of Iran. Clinical papers used more hedge tokens (330 versus 154), yet an inferential test found no statistically significant difference. Journal standards and cultural factors, the authors argue, shape hedging as much as the basic-versus-clinical split.</w:t>
+          <w:sz w:val="22"/>
+          <w:szCs w:val="22"/>
+          <w:rtl w:val="0"/>
+        </w:rPr>
+        <w:t xml:space="preserve">Instructional research points in the same direction. Petchkij (2019) argues that explicit teaching of hedges can raise their use in Thai EFL contexts, though modal forms often remain dominant. Loi and Lim (2015) analysed hedging orientations in discussion sections from the Journal of English for Academic Purposes and elicited specialist views on L2 difficulty. Those specialists attributed second-language learners' difficulty modulating claims to socio-cultural factors, classroom instruction, disciplinary culture, and disciplinary appeals, and stressed that pragmatic fluency in hedging is teachable rather than automatic. Regional ASEAN and Philippine learner studies, taken up in the next section, likewise report limited hedge inventories and frequent booster preference in student academic English (Ningrum et al., 2024; Lopez et al., 2025; Escalona, 2025). Since the present study does not measure English proficiency independently, observed patterns in the PSAU corpus may reflect L2 constraints, disciplinary socialization, instructional history, or some combination of these. The aim is a descriptive baseline of how stance is worded in ratified undergraduate thesis abstracts, not a test of which single factor causes the pattern.</w:t>
       </w:r>
       <w:r>
         <w:rPr>
@@ -1092,15 +1344,11 @@
       <w:r>
         <w:rPr>
           <w:rFonts w:ascii="Georgia" w:cs="Georgia" w:eastAsia="Georgia" w:hAnsi="Georgia"/>
-          <w:b w:val="0"/>
-          <w:bCs w:val="0"/>
-          <w:i w:val="0"/>
-          <w:iCs w:val="0"/>
-          <w:sz w:val="22"/>
-          <w:szCs w:val="22"/>
-          <w:rtl w:val="0"/>
-        </w:rPr>
-        <w:t xml:space="preserve">Salager-Meyer (1994) anchors much of this comparative work in medical English. In research papers and case reports from leading medical journals, hedge frequency and category distribution shifted with rhetorical section. Discussion and Comment sections were the most heavily hedged. Methods and case-report body sections were among the least. Shields, approximators, and compound hedges accounted for the great majority of devices. Introductions favored shields, especially epistemic verbs, as writers carved an early niche for the study. That section pattern matters for how medical writers present results. Directly measured findings often remain categorical, and hedging rises where writers move from measurement to interpretation, generalization, or clinical implication. The same medical discourse can therefore look firm in the results strip and still manage claim responsibility in the interpretive strip.</w:t>
+          <w:sz w:val="22"/>
+          <w:szCs w:val="22"/>
+          <w:rtl w:val="0"/>
+        </w:rPr>
+        <w:t xml:space="preserve">Hedging in Philippine Academic Writing Contexts</w:t>
       </w:r>
       <w:r>
         <w:rPr>
@@ -1120,15 +1368,11 @@
       <w:r>
         <w:rPr>
           <w:rFonts w:ascii="Georgia" w:cs="Georgia" w:eastAsia="Georgia" w:hAnsi="Georgia"/>
-          <w:b w:val="0"/>
-          <w:bCs w:val="0"/>
-          <w:i w:val="0"/>
-          <w:iCs w:val="0"/>
-          <w:sz w:val="22"/>
-          <w:szCs w:val="22"/>
-          <w:rtl w:val="0"/>
-        </w:rPr>
-        <w:t xml:space="preserve">Corpus work on medical Results and Discussion sections supports that reading. Doğan and Akbaş (2021) analysed about 215,000 words from the Results and Discussion sections of 100 medical research articles across fields from anatomy to endocrinology. Medical writers used modal auxiliaries frequently to mark stance. They did not rely on a matching surge of boosters to amplify commitment. Where boosters appeared, they were often strategic, used to support credibility and reader engagement rather than as a default claim of certainty. Medical scientific English in those sections is therefore better described as calibrated commitment than as either blanket tentativeness or blanket conviction.</w:t>
+          <w:sz w:val="22"/>
+          <w:szCs w:val="22"/>
+          <w:rtl w:val="0"/>
+        </w:rPr>
+        <w:t xml:space="preserve">Philippine and regional findings align with the broader picture of English-medium student writing while adding local detail. Ningrum et al. (2024) analysed academic writing from the ICNALE learner corpus across ten ASEAN contexts, including the Philippines. ASEAN EFL learners preferred boosters over hedges. Overused boosters included completely, really, and always, while the most frequent hedges included usually, often, and maybe. The pattern suggests that regional learners often encode confidence more readily than caution in academic prose.</w:t>
       </w:r>
       <w:r>
         <w:rPr>
@@ -1148,15 +1392,11 @@
       <w:r>
         <w:rPr>
           <w:rFonts w:ascii="Georgia" w:cs="Georgia" w:eastAsia="Georgia" w:hAnsi="Georgia"/>
-          <w:b w:val="0"/>
-          <w:bCs w:val="0"/>
-          <w:i w:val="0"/>
-          <w:iCs w:val="0"/>
-          <w:sz w:val="22"/>
-          <w:szCs w:val="22"/>
-          <w:rtl w:val="0"/>
-        </w:rPr>
-        <w:t xml:space="preserve">Lingard (2026) makes the same point in pedagogical terms for health-professions research writing. High authorial commitment is appropriate when the warrant is strong. Heavy hedging on a well-supported measurement can read as unnecessary softening. Low commitment remains necessary when the claim outruns the data. The issue is match of stance to warrant, not a medical culture of always agreeing or disagreeing more bluntly than other sciences.</w:t>
+          <w:sz w:val="22"/>
+          <w:szCs w:val="22"/>
+          <w:rtl w:val="0"/>
+        </w:rPr>
+        <w:t xml:space="preserve">Local college essay studies point in the same direction. Lopez et al. (2025) examined 50 argumentative essays by English Language Studies majors at a northern Philippine state university. Students showed developing-stage control of hedges and boosters, with epistemic modal verbs the most frequent forms across proficiency levels. Escalona (2025) compared hedges and boosters in essays by AB-English and BS-Information Technology students and found that female writers used hedges more often than male writers, while overall frequencies remained relatively consistent across major fields. Both studies examine essays rather than thesis abstracts, so they cannot be read as direct predictions for the present corpus. They do show that Philippine undergraduate academic English often leans on a small modal set and mixes intensifying moves with limited softening.</w:t>
       </w:r>
       <w:r>
         <w:rPr>
@@ -1176,15 +1416,11 @@
       <w:r>
         <w:rPr>
           <w:rFonts w:ascii="Georgia" w:cs="Georgia" w:eastAsia="Georgia" w:hAnsi="Georgia"/>
-          <w:b w:val="0"/>
-          <w:bCs w:val="0"/>
-          <w:i w:val="0"/>
-          <w:iCs w:val="0"/>
-          <w:sz w:val="22"/>
-          <w:szCs w:val="22"/>
-          <w:rtl w:val="0"/>
-        </w:rPr>
-        <w:t xml:space="preserve">Cross-field comparisons complicate any simple medical-versus-other ranking, as Sepehri, Hajijalili, and Namaziandost (2019) compared hedges and boosters in 30 medical and 30 engineering research articles and found a significant disciplinary difference, with medical articles carrying more hedge tokens overall in their sample. Medical writing is not uniformly under-hedged relative to other technical fields. What remains distinctive is the reporting pattern inside the article: categorical presentation of measured results, denser hedging where interpretation and generalization begin. Hu and Cao (2011) add publication medium and evidence type outside medicine. In applied-linguistics journal abstracts, English-medium texts featured markedly more hedges than Chinese-medium texts, and empirical research abstracts used significantly more boosters than non-empirical articles. Stance choices therefore track section, medium, and evidence type as well as discipline.</w:t>
+          <w:sz w:val="22"/>
+          <w:szCs w:val="22"/>
+          <w:rtl w:val="0"/>
+        </w:rPr>
+        <w:t xml:space="preserve">Research on Philippine student research writing brings the evidence closer to the thesis genre. Luyun (2024) analysed introduction and conclusion sections in 41 undergraduate research papers from BSED and BEED programs at a Philippine university, using Mojica's hedge categories and Hyland's booster taxonomy. The most frequent hedge forms included this study, it, and the study, with may also appearing among Type I devices. The dominant booster was should, and no significant difference in hedge or booster frequency emerged between the two education programs. Melon-Galvez (2017) examined the hedging system of Filipino engineering students writing technical ESP texts and linked hedge use to framing, intertextuality, and task type, with pedagogical implications for precision and interpersonal stance in technical discourse.</w:t>
       </w:r>
       <w:r>
         <w:rPr>
@@ -1204,15 +1440,11 @@
       <w:r>
         <w:rPr>
           <w:rFonts w:ascii="Georgia" w:cs="Georgia" w:eastAsia="Georgia" w:hAnsi="Georgia"/>
-          <w:b w:val="0"/>
-          <w:bCs w:val="0"/>
-          <w:i w:val="0"/>
-          <w:iCs w:val="0"/>
-          <w:sz w:val="22"/>
-          <w:szCs w:val="22"/>
-          <w:rtl w:val="0"/>
-        </w:rPr>
-        <w:t xml:space="preserve">Smirnova and Pérez-Guerra (2025) ask whether formal stance features alone can recover hard-versus-soft disciplinary groups. Their corpus covers about 1.6 million words of research articles from eight disciplines: chemistry, physics, engineering, and mathematics on the hard side, and business studies, history, linguistics, and political science on the soft side. Grammatical and lexical stance features, including hedges, boosters, and self-mention, were quantified and modelled. Multivariate analysis identified features that significantly contributed to hard-versus-soft variation. Clustering on those formal frequencies alone grouped the eight disciplines into two clusters matching the original hard and soft division. The result strengthens the claim that disciplinary variation in stance is systematic enough to classify fields, even when meaning-based interpretation is set aside.</w:t>
+          <w:sz w:val="22"/>
+          <w:szCs w:val="22"/>
+          <w:rtl w:val="0"/>
+        </w:rPr>
+        <w:t xml:space="preserve">Published research articles written in Philippine English add a professional layer. Magday et al. (2026) compared hedges in the Results and Discussion sections of 70 English Language Teaching research articles, 35 by Filipino writers and 35 by Thai writers. Filipino writers used hedges at a higher density (23.74 per 1,000 words) than Thai writers (17.63 per 1,000 words). The authors link the difference in part to the Philippines' ESL relationship with English versus Thailand's EFL context, even where disciplinary conventions are shared. Gamad et al. (2024) analysed metadiscourse markers in the Results, Discussion, and Conclusion sections of 90 research articles across social sciences, linguistics, and business in Philippine English, American English, and Chinese English. Hedges were the most frequent interactional markers overall, and Philippine English research articles showed comparatively high metadiscourse use, with interactional preferences varying by discipline.</w:t>
       </w:r>
       <w:r>
         <w:rPr>
@@ -1232,21 +1464,17 @@
       <w:r>
         <w:rPr>
           <w:rFonts w:ascii="Georgia" w:cs="Georgia" w:eastAsia="Georgia" w:hAnsi="Georgia"/>
-          <w:b w:val="0"/>
-          <w:bCs w:val="0"/>
-          <w:i w:val="0"/>
-          <w:iCs w:val="0"/>
-          <w:sz w:val="22"/>
-          <w:szCs w:val="22"/>
-          <w:rtl w:val="0"/>
-        </w:rPr>
-        <w:t xml:space="preserve">Expert scientific English therefore shows measurable variation, but the variation is local to how each field, section, medium, and publication context handles evidence and claim risk. In medical and clinical writing, that local pattern includes categorical reporting of measured results and denser hedging when claims move into interpretation. For developing writers in second-language settings, the expert picture is a target rather than a description of current practice. The present study asks whether PSAU undergraduates in three applied programs already show any of that field-sensitive differentiation in the compressed genre of the thesis abstract.</w:t>
-      </w:r>
-      <w:r>
-        <w:rPr>
-          <w:rtl w:val="0"/>
-          <w:rFonts w:ascii="Georgia" w:hAnsi="Georgia" w:cs="Georgia"/>
-          <w:sz w:val="22"/>
+          <w:sz w:val="22"/>
+          <w:szCs w:val="22"/>
+          <w:rtl w:val="0"/>
+        </w:rPr>
+        <w:t>Outside student essays and research articles, Philippine editorial writing shows hedging as a context-sensitive resource rather than a fixed national style. Villanueva (2014) examined 30 editorials from three leading Philippine newspapers and found that nearly half of the hedges were references to official reports or authorities, with modals and adverbs making up a little over 30 percent. Those forms helped editors manage accountability and soften claims on politically sensitive topics. Grengia (2025) extended the editorial analysis to student publications, The Philippine Collegian and The LaSallian, and found deliberate but publication-specific hedge use tied to voice, audience, and rhetorical goals. Taken together, the Philippine evidence shows modal-heavy inventories, frequent booster preference in learner writing, and higher hedge density in some professional Filipino ELT research than in comparable EFL contexts. Published accounts of student hedging in the Philippines have centered on essays, education theses, or professional ELT articles rather than applied life-science undergraduate thesis abstracts. That gap is the present study’s descriptive starting point.</w:t>
+      </w:r>
+      <w:r>
+        <w:rPr>
+          <w:rFonts w:ascii="Georgia" w:hAnsi="Georgia" w:cs="Georgia" w:eastAsia="Georgia"/>
+          <w:sz w:val="22"/>
+          <w:rtl w:val="0"/>
           <w:szCs w:val="22"/>
         </w:rPr>
       </w:r>
@@ -1260,15 +1488,11 @@
       <w:r>
         <w:rPr>
           <w:rFonts w:ascii="Georgia" w:cs="Georgia" w:eastAsia="Georgia" w:hAnsi="Georgia"/>
-          <w:b w:val="0"/>
-          <w:bCs w:val="0"/>
-          <w:i w:val="1"/>
-          <w:iCs w:val="1"/>
-          <w:sz w:val="22"/>
-          <w:szCs w:val="22"/>
-          <w:rtl w:val="0"/>
-        </w:rPr>
-        <w:t xml:space="preserve">Hedging in L2 and EFL Contexts</w:t>
+          <w:sz w:val="22"/>
+          <w:szCs w:val="22"/>
+          <w:rtl w:val="0"/>
+        </w:rPr>
+        <w:t xml:space="preserve">Disciplinary Variation in Abstracts and Undergraduate Theses</w:t>
       </w:r>
       <w:r>
         <w:rPr>
@@ -1288,15 +1512,11 @@
       <w:r>
         <w:rPr>
           <w:rFonts w:ascii="Georgia" w:cs="Georgia" w:eastAsia="Georgia" w:hAnsi="Georgia"/>
-          <w:b w:val="0"/>
-          <w:bCs w:val="0"/>
-          <w:i w:val="0"/>
-          <w:iCs w:val="0"/>
-          <w:sz w:val="22"/>
-          <w:szCs w:val="22"/>
-          <w:rtl w:val="0"/>
-        </w:rPr>
-        <w:t xml:space="preserve">English is the medium of academic writing at PSAU, but it is not the home language for most students. Research on second-language academic writing has long treated hedging as a point of difficulty rather than as a simple vocabulary gap. Hyland and Milton (1997) compared expressions of doubt and certainty in a one-million-word corpus of examination scripts from 900 Cantonese-speaking school leavers writing in English and 770 British learners of similar age and educational level. The L2 writers relied on a more limited range of epistemic items, offered stronger commitments, and showed greater difficulty conveying a precise degree of certainty than their L1 peers. That pattern remains a baseline across EFL research. L2 academic writers often under-qualify claims or overuse a small set of strong forms.</w:t>
+          <w:sz w:val="22"/>
+          <w:szCs w:val="22"/>
+          <w:rtl w:val="0"/>
+        </w:rPr>
+        <w:t xml:space="preserve">Abstracts compress research into a constrained space. Expert abstract studies already show that field norms reach this short genre. Imataki and Kobayashi (2024) report measurable disciplinary differences in expert abstracts for features such as voice and nominalization. Xie and Mi (2023) examine promotion and caution across disciplines and ranking levels. Hedge words were more frequent in soft sciences and higher-ranking journals, while positive promotional wording was more common in hard sciences. Their results make abstracts a useful site for studying how caution and promotion compete under length pressure.</w:t>
       </w:r>
       <w:r>
         <w:rPr>
@@ -1316,15 +1536,11 @@
       <w:r>
         <w:rPr>
           <w:rFonts w:ascii="Georgia" w:cs="Georgia" w:eastAsia="Georgia" w:hAnsi="Georgia"/>
-          <w:b w:val="0"/>
-          <w:bCs w:val="0"/>
-          <w:i w:val="0"/>
-          <w:iCs w:val="0"/>
-          <w:sz w:val="22"/>
-          <w:szCs w:val="22"/>
-          <w:rtl w:val="0"/>
-        </w:rPr>
-        <w:t xml:space="preserve">Hinkel (2005) sharpens the formal picture with a large student-essay corpus of 745 essays and about 221,000 words. L2 writers used a limited range of hedging devices, many of them associated with conversational rather than formal written discourse. The same essays showed a prevalence of conversational intensifiers and overstatements that are common in informal speech but rare in academic prose. Demir (2018) compared lexical hedges in academic texts by English L1 and L2 writers and reported significant differences across modal, verbal, adjectival, adverbial, quantifier, and noun hedges, as well as in total hedge use. Taken together, these studies show that the L2 issue is not only density. It is range, register, and the balance between caution and overstatement.</w:t>
+          <w:sz w:val="22"/>
+          <w:szCs w:val="22"/>
+          <w:rtl w:val="0"/>
+        </w:rPr>
+        <w:t xml:space="preserve">Thesis and dissertation abstracts written by developing researchers add a second layer. Wahyuningsih and Sofwan (2014) analyzed hedges in graduate thesis abstracts at Semarang State University across five programs: English, Mathematics, Science, Social, and Education Management. Lexical hedges were coded with Salager-Meyer's (1994) and Hyland's (1998) taxonomies, and non-lexical forms followed Navratilova (2013). English, Social, and Education Management abstracts used more hedges than Mathematics and Science. English led the lexical counts overall. Agentless passives were the dominant non-lexical form in every program. The authors link higher soft-field density to interpretive claims and lower hard-field density to measurement-based reporting. The study shows that disciplinary contrast appears inside the thesis abstract even when writers share one institution and one English medium.</w:t>
       </w:r>
       <w:r>
         <w:rPr>
@@ -1344,15 +1560,11 @@
       <w:r>
         <w:rPr>
           <w:rFonts w:ascii="Georgia" w:cs="Georgia" w:eastAsia="Georgia" w:hAnsi="Georgia"/>
-          <w:b w:val="0"/>
-          <w:bCs w:val="0"/>
-          <w:i w:val="0"/>
-          <w:iCs w:val="0"/>
-          <w:sz w:val="22"/>
-          <w:szCs w:val="22"/>
-          <w:rtl w:val="0"/>
-        </w:rPr>
-        <w:t xml:space="preserve">Takimoto (2015) adds a recognition layer. In a corpus comparison of academic essays by Japanese EFL learners and English L1 writers, the EFL group used more boosters than hedges and preferred straightforward, explicit expressions, whereas English L1 writers were more tentative. A follow-up task suggested that certainty items were more visible to the learners than possibility and probability items, which they often misapprehended. Underuse of hedges can therefore coexist with limited pragmatic awareness of what the missing forms do. Luo (2021), in a systematic review of undergraduate English language learners' hedging, reaches a similar aggregate conclusion. ELLs generally use fewer hedges than English L1 writers, draw on a narrower inventory, and face combined challenges of academic experience and L2 form control.</w:t>
+          <w:sz w:val="22"/>
+          <w:szCs w:val="22"/>
+          <w:rtl w:val="0"/>
+        </w:rPr>
+        <w:t xml:space="preserve">Demanou and Tabe (2022) examined hedging in DIPES II dissertation abstracts at the Higher Teachers' Training College of Maroua across Bilingual Letters, English, Geography, and History. A specialized corpus of 46,368 tokens was searched with AntConc. Overall hedge density was low, about 2.6% of tokens. Markers of intentional vagueness, accuracy hedges, and writer-oriented hedges were the most common types. Students relied mainly on simpler forms such as some, few, many, could, and a number of. More complex frames such as it appears that were almost absent. Bilingual Letters abstracts were the most tentative, followed by English, Geography, and History. Across communicative moves, the findings and results move carried the densest hedging, especially writer-oriented forms that distance the writer from the claim. The study treats hedging as both discipline-specific and move-specific inside the abstract.</w:t>
       </w:r>
       <w:r>
         <w:rPr>
@@ -1372,15 +1584,11 @@
       <w:r>
         <w:rPr>
           <w:rFonts w:ascii="Georgia" w:cs="Georgia" w:eastAsia="Georgia" w:hAnsi="Georgia"/>
-          <w:b w:val="0"/>
-          <w:bCs w:val="0"/>
-          <w:i w:val="0"/>
-          <w:iCs w:val="0"/>
-          <w:sz w:val="22"/>
-          <w:szCs w:val="22"/>
-          <w:rtl w:val="0"/>
-        </w:rPr>
-        <w:t xml:space="preserve">Alonso (2019) approaches the same problem through a multicompetence design rather than an L2-only comparison. She examined hedges in academic writing by 24 Spanish learners of English, collecting data from the same participants in both Spanish and English, and compared them with monolingual Spanish and monolingual English control groups of 24 speakers each. Hedges were coded following Hyland's (1994) typology. Chi-square analyses showed differences between English and Spanish speakers, and between English speakers and L2 learners, especially in impersonal expressions and lexical verbs. Evidence of crosslinguistic influence appeared, and similarity in the use of adverbs across the learners' L1 and L2 pointed to L1-L2 convergence. The design matters for the present study because it shows that L2 hedging patterns cannot be read as a pure deficit against English L1 norms without also considering the writer's full language system. Publication medium and cultural writing tradition can widen the same gap. Hu and Cao (2011) found that applied-linguistics abstracts in English-medium journals carried markedly more hedges than those in Chinese-medium journals, a difference they link jointly to rhetorical convention and epistemological belief.</w:t>
+          <w:sz w:val="22"/>
+          <w:szCs w:val="22"/>
+          <w:rtl w:val="0"/>
+        </w:rPr>
+        <w:t xml:space="preserve">Al-Zarieni and Alkhresheh (2024) studied hedges and boosters in 30 linguistics M.A. thesis abstracts at Yarmouk University, following Hyland's (2005) interpersonal model. Hedges outnumbered boosters (117 to 60, or 66% to 34% of the combined set). Hedges were read as ways of limiting opposition risk, marking politeness, and presenting results cautiously. Boosters were used to assert originality and stress certainty. The study adds an Arabic postgraduate linguistics sample to the abstract-focused record and shows that even language-focused programs still balance caution against certainty marking under abstract constraints.</w:t>
       </w:r>
       <w:r>
         <w:rPr>
@@ -1400,15 +1608,11 @@
       <w:r>
         <w:rPr>
           <w:rFonts w:ascii="Georgia" w:cs="Georgia" w:eastAsia="Georgia" w:hAnsi="Georgia"/>
-          <w:b w:val="0"/>
-          <w:bCs w:val="0"/>
-          <w:i w:val="0"/>
-          <w:iCs w:val="0"/>
-          <w:sz w:val="22"/>
-          <w:szCs w:val="22"/>
-          <w:rtl w:val="0"/>
-        </w:rPr>
-        <w:t xml:space="preserve">Undergraduate thesis abstracts, the genre closest to the present corpus, show the same L2 pressures. As reviewed under undergraduate writing, Mazidah et al. (2022) and Ghia et al. (2022) report that L2 thesis abstracts often carry fewer hedges and stronger certainty marking than L1 comparison groups, even among language-oriented programs. Bayraktar-Cepni and Kulaksiz (2022) compared hedging in discussion sections of ELT MA and PhD theses and found that MA theses contained significantly more hedges than PhD theses, a difference they link to developing writers' stronger need to soften stance. Level of academic experience, not only L1 versus L2 status, therefore shapes how much caution writers encode.</w:t>
+          <w:sz w:val="22"/>
+          <w:szCs w:val="22"/>
+          <w:rtl w:val="0"/>
+        </w:rPr>
+        <w:t xml:space="preserve">Mazidah et al. (2022), reviewed under undergraduate writing, found a soft-versus-hard contrast in undergraduate thesis abstracts at Qomaruddin University that aligns with the graduate pattern reported by Wahyuningsih and Sofwan (2014). English-education abstracts used more hedges, while mathematics abstracts used more boosters.</w:t>
       </w:r>
       <w:r>
         <w:rPr>
@@ -1428,15 +1632,11 @@
       <w:r>
         <w:rPr>
           <w:rFonts w:ascii="Georgia" w:cs="Georgia" w:eastAsia="Georgia" w:hAnsi="Georgia"/>
-          <w:b w:val="0"/>
-          <w:bCs w:val="0"/>
-          <w:i w:val="0"/>
-          <w:iCs w:val="0"/>
-          <w:sz w:val="22"/>
-          <w:szCs w:val="22"/>
-          <w:rtl w:val="0"/>
-        </w:rPr>
-        <w:t xml:space="preserve">Instructional research points in the same direction. Petchkij (2019) argues that explicit teaching of hedges can raise their use in Thai EFL contexts, though modal forms often remain dominant. Loi and Lim (2015) analysed hedging orientations in discussion sections from the Journal of English for Academic Purposes and elicited specialist views on L2 difficulty. Those specialists attributed second-language learners' difficulty modulating claims to socio-cultural factors, classroom instruction, disciplinary culture, and disciplinary appeals, and stressed that pragmatic fluency in hedging is teachable rather than automatic. Regional ASEAN and Philippine learner studies, taken up in the next section, likewise report limited hedge inventories and frequent booster preference in student academic English (Ningrum et al., 2024; Lopez et al., 2025; Escalona, 2025). Since the present study does not measure English proficiency independently, observed patterns in the PSAU corpus may reflect L2 constraints, disciplinary socialization, instructional history, or some combination of these. The aim is a descriptive baseline of how stance is worded in ratified undergraduate thesis abstracts, not a test of which single factor causes the pattern.</w:t>
+          <w:sz w:val="22"/>
+          <w:szCs w:val="22"/>
+          <w:rtl w:val="0"/>
+        </w:rPr>
+        <w:t xml:space="preserve">Chafidha and Mujiyanto (2021) compared hedges in thirty master's thesis abstracts from the English and Indonesian graduate programs at Universitas Negeri Semarang, coded with Hyland's (1998) polypragmatic model. Writer-oriented, accuracy-oriented, and reader-oriented hedges appeared in both programs. English abstracts used more writer-oriented hedges, which distance the writer from the proposition. Indonesian abstracts used more reader-oriented hedges, which engage the audience. The study shows that program language focus can shape interpersonal orientation even when hedge functions themselves look similar.</w:t>
       </w:r>
       <w:r>
         <w:rPr>
@@ -1456,15 +1656,11 @@
       <w:r>
         <w:rPr>
           <w:rFonts w:ascii="Georgia" w:cs="Georgia" w:eastAsia="Georgia" w:hAnsi="Georgia"/>
-          <w:b w:val="0"/>
-          <w:bCs w:val="0"/>
-          <w:i w:val="1"/>
-          <w:iCs w:val="1"/>
-          <w:sz w:val="22"/>
-          <w:szCs w:val="22"/>
-          <w:rtl w:val="0"/>
-        </w:rPr>
-        <w:t xml:space="preserve">Hedging in Philippine Academic Writing Contexts</w:t>
+          <w:sz w:val="22"/>
+          <w:szCs w:val="22"/>
+          <w:rtl w:val="0"/>
+        </w:rPr>
+        <w:t xml:space="preserve">Expert abstract conventions are therefore relatively well mapped for selected linguistic features and for caution versus promotion. Developing-researcher thesis abstracts show a recurring soft-versus-hard density contrast, a preference for simpler hedge forms, and program-level differences in interpersonal orientation. Most of that work still centers on language, education, or social-science programs. Whether undergraduates in applied life sciences show any disciplinary differentiation in this genre remains an open empirical question.</w:t>
       </w:r>
       <w:r>
         <w:rPr>
@@ -1484,15 +1680,11 @@
       <w:r>
         <w:rPr>
           <w:rFonts w:ascii="Georgia" w:cs="Georgia" w:eastAsia="Georgia" w:hAnsi="Georgia"/>
-          <w:b w:val="0"/>
-          <w:bCs w:val="0"/>
-          <w:i w:val="0"/>
-          <w:iCs w:val="0"/>
-          <w:sz w:val="22"/>
-          <w:szCs w:val="22"/>
-          <w:rtl w:val="0"/>
-        </w:rPr>
-        <w:t xml:space="preserve">Philippine and regional findings align with the broader picture of English-medium student writing while adding local detail. Ningrum et al. (2024) analysed academic writing from the ICNALE learner corpus across ten ASEAN contexts, including the Philippines. ASEAN EFL learners preferred boosters over hedges. Overused boosters included completely, really, and always, while the most frequent hedges included usually, often, and maybe. The pattern suggests that regional learners often encode confidence more readily than caution in academic prose.</w:t>
+          <w:sz w:val="22"/>
+          <w:szCs w:val="22"/>
+          <w:rtl w:val="0"/>
+        </w:rPr>
+        <w:t xml:space="preserve">What the review establishes is a set of durable patterns rather than a single ranking of fields. Expert writers adjust hedge density and form mix to the epistemic demands of their work, and that adjustment is visible even inside the short abstract. Density alone does not tell the full story. Form mix, interpersonal orientation, and the move in which a hedge appears also vary by field and by communicative purpose. Developing researchers, including advanced student writers, typically work with a smaller set of forms and lean on modals. That restriction holds not only in abstracts, where length pressure is high, but also in longer sections such as discussions, which suggests a developing stance repertoire rather than a pure genre effect. Regional student writing often pairs the modal preference with relatively strong boosting, so caution and certainty marking coexist in the same short texts rather than trading off cleanly.</w:t>
       </w:r>
       <w:r>
         <w:rPr>
@@ -1512,15 +1704,11 @@
       <w:r>
         <w:rPr>
           <w:rFonts w:ascii="Georgia" w:cs="Georgia" w:eastAsia="Georgia" w:hAnsi="Georgia"/>
-          <w:b w:val="0"/>
-          <w:bCs w:val="0"/>
-          <w:i w:val="0"/>
-          <w:iCs w:val="0"/>
-          <w:sz w:val="22"/>
-          <w:szCs w:val="22"/>
-          <w:rtl w:val="0"/>
-        </w:rPr>
-        <w:t xml:space="preserve">Local college essay studies point in the same direction. Lopez et al. (2025) examined 50 argumentative essays by English Language Studies majors at a northern Philippine state university. Students showed developing-stage control of hedges and boosters, with epistemic modal verbs the most frequent forms across proficiency levels. Escalona (2025) compared hedges and boosters in essays by AB-English and BS-Information Technology students and found that female writers used hedges more often than male writers, while overall frequencies remained relatively consistent across major fields. Both studies examine essays rather than thesis abstracts, so they cannot be read as direct predictions for the present corpus. They do show that Philippine undergraduate academic English often leans on a small modal set and mixes intensifying moves with limited softening.</w:t>
+          <w:sz w:val="22"/>
+          <w:szCs w:val="22"/>
+          <w:rtl w:val="0"/>
+        </w:rPr>
+        <w:t xml:space="preserve">Thesis and dissertation abstracts written by students add a further constraint. Soft-versus-hard density contrasts and program-level differences in interpersonal orientation appear inside that genre, yet almost all of that evidence comes from language, education, or social-science programs. Applied life sciences sit in a different relation to evidence. Claims are often tied to experimental outcomes, clinical observation, or field measurement, and the abstract must still package those claims under strict length limits. The open question is not whether undergraduates hedge at all. It is whether disciplinary differentiation of the kind documented for experts and for student writers in other fields appears inside applied life-science thesis abstracts under Philippine institutional conditions, and whether that differentiation shows up in density, form mix, function, or some combination of the three.</w:t>
       </w:r>
       <w:r>
         <w:rPr>
@@ -1540,15 +1728,11 @@
       <w:r>
         <w:rPr>
           <w:rFonts w:ascii="Georgia" w:cs="Georgia" w:eastAsia="Georgia" w:hAnsi="Georgia"/>
-          <w:b w:val="0"/>
-          <w:bCs w:val="0"/>
-          <w:i w:val="0"/>
-          <w:iCs w:val="0"/>
-          <w:sz w:val="22"/>
-          <w:szCs w:val="22"/>
-          <w:rtl w:val="0"/>
-        </w:rPr>
-        <w:t xml:space="preserve">Research on Philippine student research writing brings the evidence closer to the thesis genre. Luyun (2024) analysed introduction and conclusion sections in 41 undergraduate research papers from BSED and BEED programs at a Philippine university, using Mojica's hedge categories and Hyland's booster taxonomy. The most frequent hedge forms included this study, it, and the study, with may also appearing among Type I devices. The dominant booster was should, and no significant difference in hedge or booster frequency emerged between the two education programs. Melon-Galvez (2017) examined the hedging system of Filipino engineering students writing technical ESP texts and linked hedge use to framing, intertextuality, and task type, with pedagogical implications for precision and interpersonal stance in technical discourse.</w:t>
+          <w:sz w:val="22"/>
+          <w:szCs w:val="22"/>
+          <w:rtl w:val="0"/>
+        </w:rPr>
+        <w:t xml:space="preserve">That empirical question cannot be answered without a clear boundary on what counts as a hedge. The literature does not share one definition, and the differences matter for coding. Hyland's polypragmatic model keeps both reduced commitment to propositional truth and reader-oriented interpersonal effects inside the same broad category. A single token can manage accuracy and manage the reader at once. Salager-Meyer treats the same devices as ways of distributing claim responsibility among writer, data, and circumstance, which is especially relevant for research writing where findings are provisional. Crompton argues for a narrower scope limited to epistemic modality on knowledge claims, on the ground that stretching hedge to every politeness feature of academic prose weakens the term and blurs what is being counted.</w:t>
       </w:r>
       <w:r>
         <w:rPr>
@@ -1568,15 +1752,11 @@
       <w:r>
         <w:rPr>
           <w:rFonts w:ascii="Georgia" w:cs="Georgia" w:eastAsia="Georgia" w:hAnsi="Georgia"/>
-          <w:b w:val="0"/>
-          <w:bCs w:val="0"/>
-          <w:i w:val="0"/>
-          <w:iCs w:val="0"/>
-          <w:sz w:val="22"/>
-          <w:szCs w:val="22"/>
-          <w:rtl w:val="0"/>
-        </w:rPr>
-        <w:t xml:space="preserve">Published research articles written in Philippine English add a professional layer. Magday et al. (2026) compared hedges in the Results and Discussion sections of 70 English Language Teaching research articles, 35 by Filipino writers and 35 by Thai writers. Filipino writers used hedges at a higher density (23.74 per 1,000 words) than Thai writers (17.63 per 1,000 words). The authors link the difference in part to the Philippines' ESL relationship with English versus Thailand's EFL context, even where disciplinary conventions are shared. Gamad et al. (2024) analysed metadiscourse markers in the Results, Discussion, and Conclusion sections of 90 research articles across social sciences, linguistics, and business in Philippine English, American English, and Chinese English. Hedges were the most frequent interactional markers overall, and Philippine English research articles showed comparatively high metadiscourse use, with interactional preferences varying by discipline.</w:t>
+          <w:sz w:val="22"/>
+          <w:szCs w:val="22"/>
+          <w:rtl w:val="0"/>
+        </w:rPr>
+        <w:t xml:space="preserve">Directives and recommendations sit at the edge of that debate. They manage action rather than the truth of a claim. Under a wide interpersonal reading they look like mitigation. Under a claim-centered reading they fall outside the hedge count. This study adopts the claim-centered boundary, so a token is retained as a hedge only when it changes the writer's stance toward a proposition that evidence could show to be wrong. Epistemic Caution records reduced commitment to that claim's truth. Politeness/Deference records interpersonal softening of the same claim when that softening co-occurs with, or stands in place of, an epistemic effect on a claim. Softened recommendations are logged as false positives under this scope. The choice is a position in the definitional debate.</w:t>
       </w:r>
       <w:r>
         <w:rPr>
@@ -1600,7 +1780,7 @@
           <w:szCs w:val="22"/>
           <w:rtl w:val="0"/>
         </w:rPr>
-        <w:t>Outside student essays and research articles, Philippine editorial writing shows hedging as a context-sensitive resource rather than a fixed national style. Villanueva (2014) examined 30 editorials from three leading Philippine newspapers and found that nearly half of the hedges were references to official reports or authorities, with modals and adverbs making up a little over 30 percent. Those forms helped editors manage accountability and soften claims on politically sensitive topics. Grengia (2025) extended the editorial analysis to student publications, The Philippine Collegian and The LaSallian, and found deliberate but publication-specific hedge use tied to voice, audience, and rhetorical goals. Taken together, the Philippine evidence shows modal-heavy inventories, frequent booster preference in learner writing, and higher hedge density in some professional Filipino ELT research than in comparable EFL contexts. Published accounts of student hedging in the Philippines have centered on essays, education theses, or professional ELT articles rather than applied life-science undergraduate thesis abstracts. That gap is the present study’s descriptive starting point.</w:t>
+        <w:t>This review did not identify published studies that map hedging in undergraduate thesis abstracts from applied science disciplines in a Philippine setting.</w:t>
       </w:r>
       <w:r>
         <w:rPr>
@@ -1620,370 +1800,6 @@
       <w:r>
         <w:rPr>
           <w:rFonts w:ascii="Georgia" w:cs="Georgia" w:eastAsia="Georgia" w:hAnsi="Georgia"/>
-          <w:b w:val="0"/>
-          <w:bCs w:val="0"/>
-          <w:i w:val="1"/>
-          <w:iCs w:val="1"/>
-          <w:sz w:val="22"/>
-          <w:szCs w:val="22"/>
-          <w:rtl w:val="0"/>
-        </w:rPr>
-        <w:t xml:space="preserve">Disciplinary Variation in Abstracts and Undergraduate Theses</w:t>
-      </w:r>
-      <w:r>
-        <w:rPr>
-          <w:rtl w:val="0"/>
-          <w:rFonts w:ascii="Georgia" w:hAnsi="Georgia" w:cs="Georgia"/>
-          <w:sz w:val="22"/>
-          <w:szCs w:val="22"/>
-        </w:rPr>
-      </w:r>
-    </w:p>
-    <w:p>
-      <w:pPr>
-        <w:spacing w:before="0" w:after="0" w:line="480" w:lineRule="auto"/>
-        <w:ind w:firstLine="720"/>
-        <w:jc w:val="both"/>
-      </w:pPr>
-      <w:r>
-        <w:rPr>
-          <w:rFonts w:ascii="Georgia" w:cs="Georgia" w:eastAsia="Georgia" w:hAnsi="Georgia"/>
-          <w:b w:val="0"/>
-          <w:bCs w:val="0"/>
-          <w:i w:val="0"/>
-          <w:iCs w:val="0"/>
-          <w:sz w:val="22"/>
-          <w:szCs w:val="22"/>
-          <w:rtl w:val="0"/>
-        </w:rPr>
-        <w:t xml:space="preserve">Abstracts compress research into a constrained space. Expert abstract studies already show that field norms reach this short genre. Imataki and Kobayashi (2024) report measurable disciplinary differences in expert abstracts for features such as voice and nominalization. Xie and Mi (2023) examine promotion and caution across disciplines and ranking levels. Hedge words were more frequent in soft sciences and higher-ranking journals, while positive promotional wording was more common in hard sciences. Their results make abstracts a useful site for studying how caution and promotion compete under length pressure.</w:t>
-      </w:r>
-      <w:r>
-        <w:rPr>
-          <w:rtl w:val="0"/>
-          <w:rFonts w:ascii="Georgia" w:hAnsi="Georgia" w:cs="Georgia"/>
-          <w:sz w:val="22"/>
-          <w:szCs w:val="22"/>
-        </w:rPr>
-      </w:r>
-    </w:p>
-    <w:p>
-      <w:pPr>
-        <w:spacing w:before="0" w:after="0" w:line="480" w:lineRule="auto"/>
-        <w:ind w:firstLine="720"/>
-        <w:jc w:val="both"/>
-      </w:pPr>
-      <w:r>
-        <w:rPr>
-          <w:rFonts w:ascii="Georgia" w:cs="Georgia" w:eastAsia="Georgia" w:hAnsi="Georgia"/>
-          <w:b w:val="0"/>
-          <w:bCs w:val="0"/>
-          <w:i w:val="0"/>
-          <w:iCs w:val="0"/>
-          <w:sz w:val="22"/>
-          <w:szCs w:val="22"/>
-          <w:rtl w:val="0"/>
-        </w:rPr>
-        <w:t xml:space="preserve">Thesis and dissertation abstracts written by developing researchers add a second layer. Wahyuningsih and Sofwan (2014) analyzed hedges in graduate thesis abstracts at Semarang State University across five programs: English, Mathematics, Science, Social, and Education Management. Lexical hedges were coded with Salager-Meyer's (1994) and Hyland's (1998) taxonomies, and non-lexical forms followed Navratilova (2013). English, Social, and Education Management abstracts used more hedges than Mathematics and Science. English led the lexical counts overall. Agentless passives were the dominant non-lexical form in every program. The authors link higher soft-field density to interpretive claims and lower hard-field density to measurement-based reporting. The study shows that disciplinary contrast appears inside the thesis abstract even when writers share one institution and one English medium.</w:t>
-      </w:r>
-      <w:r>
-        <w:rPr>
-          <w:rtl w:val="0"/>
-          <w:rFonts w:ascii="Georgia" w:hAnsi="Georgia" w:cs="Georgia"/>
-          <w:sz w:val="22"/>
-          <w:szCs w:val="22"/>
-        </w:rPr>
-      </w:r>
-    </w:p>
-    <w:p>
-      <w:pPr>
-        <w:spacing w:before="0" w:after="0" w:line="480" w:lineRule="auto"/>
-        <w:ind w:firstLine="720"/>
-        <w:jc w:val="both"/>
-      </w:pPr>
-      <w:r>
-        <w:rPr>
-          <w:rFonts w:ascii="Georgia" w:cs="Georgia" w:eastAsia="Georgia" w:hAnsi="Georgia"/>
-          <w:b w:val="0"/>
-          <w:bCs w:val="0"/>
-          <w:i w:val="0"/>
-          <w:iCs w:val="0"/>
-          <w:sz w:val="22"/>
-          <w:szCs w:val="22"/>
-          <w:rtl w:val="0"/>
-        </w:rPr>
-        <w:t xml:space="preserve">Demanou and Tabe (2022) examined hedging in DIPES II dissertation abstracts at the Higher Teachers' Training College of Maroua across Bilingual Letters, English, Geography, and History. A specialized corpus of 46,368 tokens was searched with AntConc. Overall hedge density was low, about 2.6% of tokens. Markers of intentional vagueness, accuracy hedges, and writer-oriented hedges were the most common types. Students relied mainly on simpler forms such as some, few, many, could, and a number of. More complex frames such as it appears that were almost absent. Bilingual Letters abstracts were the most tentative, followed by English, Geography, and History. Across communicative moves, the findings and results move carried the densest hedging, especially writer-oriented forms that distance the writer from the claim. The study treats hedging as both discipline-specific and move-specific inside the abstract.</w:t>
-      </w:r>
-      <w:r>
-        <w:rPr>
-          <w:rtl w:val="0"/>
-          <w:rFonts w:ascii="Georgia" w:hAnsi="Georgia" w:cs="Georgia"/>
-          <w:sz w:val="22"/>
-          <w:szCs w:val="22"/>
-        </w:rPr>
-      </w:r>
-    </w:p>
-    <w:p>
-      <w:pPr>
-        <w:spacing w:before="0" w:after="0" w:line="480" w:lineRule="auto"/>
-        <w:ind w:firstLine="720"/>
-        <w:jc w:val="both"/>
-      </w:pPr>
-      <w:r>
-        <w:rPr>
-          <w:rFonts w:ascii="Georgia" w:cs="Georgia" w:eastAsia="Georgia" w:hAnsi="Georgia"/>
-          <w:b w:val="0"/>
-          <w:bCs w:val="0"/>
-          <w:i w:val="0"/>
-          <w:iCs w:val="0"/>
-          <w:sz w:val="22"/>
-          <w:szCs w:val="22"/>
-          <w:rtl w:val="0"/>
-        </w:rPr>
-        <w:t xml:space="preserve">Al-Zarieni and Alkhresheh (2024) studied hedges and boosters in 30 linguistics M.A. thesis abstracts at Yarmouk University, following Hyland's (2005) interpersonal model. Hedges outnumbered boosters (117 to 60, or 66% to 34% of the combined set). Hedges were read as ways of limiting opposition risk, marking politeness, and presenting results cautiously. Boosters were used to assert originality and stress certainty. The study adds an Arabic postgraduate linguistics sample to the abstract-focused record and shows that even language-focused programs still balance caution against certainty marking under abstract constraints.</w:t>
-      </w:r>
-      <w:r>
-        <w:rPr>
-          <w:rtl w:val="0"/>
-          <w:rFonts w:ascii="Georgia" w:hAnsi="Georgia" w:cs="Georgia"/>
-          <w:sz w:val="22"/>
-          <w:szCs w:val="22"/>
-        </w:rPr>
-      </w:r>
-    </w:p>
-    <w:p>
-      <w:pPr>
-        <w:spacing w:before="0" w:after="0" w:line="480" w:lineRule="auto"/>
-        <w:ind w:firstLine="720"/>
-        <w:jc w:val="both"/>
-      </w:pPr>
-      <w:r>
-        <w:rPr>
-          <w:rFonts w:ascii="Georgia" w:cs="Georgia" w:eastAsia="Georgia" w:hAnsi="Georgia"/>
-          <w:b w:val="0"/>
-          <w:bCs w:val="0"/>
-          <w:i w:val="0"/>
-          <w:iCs w:val="0"/>
-          <w:sz w:val="22"/>
-          <w:szCs w:val="22"/>
-          <w:rtl w:val="0"/>
-        </w:rPr>
-        <w:t xml:space="preserve">Mazidah et al. (2022), reviewed under undergraduate writing, found a soft-versus-hard contrast in undergraduate thesis abstracts at Qomaruddin University that aligns with the graduate pattern reported by Wahyuningsih and Sofwan (2014). English-education abstracts used more hedges, while mathematics abstracts used more boosters.</w:t>
-      </w:r>
-      <w:r>
-        <w:rPr>
-          <w:rtl w:val="0"/>
-          <w:rFonts w:ascii="Georgia" w:hAnsi="Georgia" w:cs="Georgia"/>
-          <w:sz w:val="22"/>
-          <w:szCs w:val="22"/>
-        </w:rPr>
-      </w:r>
-    </w:p>
-    <w:p>
-      <w:pPr>
-        <w:spacing w:before="0" w:after="0" w:line="480" w:lineRule="auto"/>
-        <w:ind w:firstLine="720"/>
-        <w:jc w:val="both"/>
-      </w:pPr>
-      <w:r>
-        <w:rPr>
-          <w:rFonts w:ascii="Georgia" w:cs="Georgia" w:eastAsia="Georgia" w:hAnsi="Georgia"/>
-          <w:b w:val="0"/>
-          <w:bCs w:val="0"/>
-          <w:i w:val="0"/>
-          <w:iCs w:val="0"/>
-          <w:sz w:val="22"/>
-          <w:szCs w:val="22"/>
-          <w:rtl w:val="0"/>
-        </w:rPr>
-        <w:t xml:space="preserve">Chafidha and Mujiyanto (2021) compared hedges in thirty master's thesis abstracts from the English and Indonesian graduate programs at Universitas Negeri Semarang, coded with Hyland's (1998) polypragmatic model. Writer-oriented, accuracy-oriented, and reader-oriented hedges appeared in both programs. English abstracts used more writer-oriented hedges, which distance the writer from the proposition. Indonesian abstracts used more reader-oriented hedges, which engage the audience. The study shows that program language focus can shape interpersonal orientation even when hedge functions themselves look similar.</w:t>
-      </w:r>
-      <w:r>
-        <w:rPr>
-          <w:rtl w:val="0"/>
-          <w:rFonts w:ascii="Georgia" w:hAnsi="Georgia" w:cs="Georgia"/>
-          <w:sz w:val="22"/>
-          <w:szCs w:val="22"/>
-        </w:rPr>
-      </w:r>
-    </w:p>
-    <w:p>
-      <w:pPr>
-        <w:spacing w:before="0" w:after="0" w:line="480" w:lineRule="auto"/>
-        <w:ind w:firstLine="720"/>
-        <w:jc w:val="both"/>
-      </w:pPr>
-      <w:r>
-        <w:rPr>
-          <w:rFonts w:ascii="Georgia" w:cs="Georgia" w:eastAsia="Georgia" w:hAnsi="Georgia"/>
-          <w:b w:val="0"/>
-          <w:bCs w:val="0"/>
-          <w:i w:val="0"/>
-          <w:iCs w:val="0"/>
-          <w:sz w:val="22"/>
-          <w:szCs w:val="22"/>
-          <w:rtl w:val="0"/>
-        </w:rPr>
-        <w:t xml:space="preserve">Expert abstract conventions are therefore relatively well mapped for selected linguistic features and for caution versus promotion. Developing-researcher thesis abstracts show a recurring soft-versus-hard density contrast, a preference for simpler hedge forms, and program-level differences in interpersonal orientation. Most of that work still centers on language, education, or social-science programs. Whether undergraduates in applied life sciences show any disciplinary differentiation in this genre remains an open empirical question.</w:t>
-      </w:r>
-      <w:r>
-        <w:rPr>
-          <w:rtl w:val="0"/>
-          <w:rFonts w:ascii="Georgia" w:hAnsi="Georgia" w:cs="Georgia"/>
-          <w:sz w:val="22"/>
-          <w:szCs w:val="22"/>
-        </w:rPr>
-      </w:r>
-    </w:p>
-    <w:p>
-      <w:pPr>
-        <w:spacing w:before="0" w:after="0" w:line="480" w:lineRule="auto"/>
-        <w:ind w:firstLine="720"/>
-        <w:jc w:val="both"/>
-      </w:pPr>
-      <w:r>
-        <w:rPr>
-          <w:rFonts w:ascii="Georgia" w:cs="Georgia" w:eastAsia="Georgia" w:hAnsi="Georgia"/>
-          <w:b w:val="0"/>
-          <w:bCs w:val="0"/>
-          <w:i w:val="0"/>
-          <w:iCs w:val="0"/>
-          <w:sz w:val="22"/>
-          <w:szCs w:val="22"/>
-          <w:rtl w:val="0"/>
-        </w:rPr>
-        <w:t xml:space="preserve">What the review establishes is a set of durable patterns rather than a single ranking of fields. Expert writers adjust hedge density and form mix to the epistemic demands of their work, and that adjustment is visible even inside the short abstract. Density alone does not tell the full story. Form mix, interpersonal orientation, and the move in which a hedge appears also vary by field and by communicative purpose. Developing researchers, including advanced student writers, typically work with a smaller set of forms and lean on modals. That restriction holds not only in abstracts, where length pressure is high, but also in longer sections such as discussions, which suggests a developing stance repertoire rather than a pure genre effect. Regional student writing often pairs the modal preference with relatively strong boosting, so caution and certainty marking coexist in the same short texts rather than trading off cleanly.</w:t>
-      </w:r>
-      <w:r>
-        <w:rPr>
-          <w:rtl w:val="0"/>
-          <w:rFonts w:ascii="Georgia" w:hAnsi="Georgia" w:cs="Georgia"/>
-          <w:sz w:val="22"/>
-          <w:szCs w:val="22"/>
-        </w:rPr>
-      </w:r>
-    </w:p>
-    <w:p>
-      <w:pPr>
-        <w:spacing w:before="0" w:after="0" w:line="480" w:lineRule="auto"/>
-        <w:ind w:firstLine="720"/>
-        <w:jc w:val="both"/>
-      </w:pPr>
-      <w:r>
-        <w:rPr>
-          <w:rFonts w:ascii="Georgia" w:cs="Georgia" w:eastAsia="Georgia" w:hAnsi="Georgia"/>
-          <w:b w:val="0"/>
-          <w:bCs w:val="0"/>
-          <w:i w:val="0"/>
-          <w:iCs w:val="0"/>
-          <w:sz w:val="22"/>
-          <w:szCs w:val="22"/>
-          <w:rtl w:val="0"/>
-        </w:rPr>
-        <w:t xml:space="preserve">Thesis and dissertation abstracts written by students add a further constraint. Soft-versus-hard density contrasts and program-level differences in interpersonal orientation appear inside that genre, yet almost all of that evidence comes from language, education, or social-science programs. Applied life sciences sit in a different relation to evidence. Claims are often tied to experimental outcomes, clinical observation, or field measurement, and the abstract must still package those claims under strict length limits. The open question is not whether undergraduates hedge at all. It is whether disciplinary differentiation of the kind documented for experts and for student writers in other fields appears inside applied life-science thesis abstracts under Philippine institutional conditions, and whether that differentiation shows up in density, form mix, function, or some combination of the three.</w:t>
-      </w:r>
-      <w:r>
-        <w:rPr>
-          <w:rtl w:val="0"/>
-          <w:rFonts w:ascii="Georgia" w:hAnsi="Georgia" w:cs="Georgia"/>
-          <w:sz w:val="22"/>
-          <w:szCs w:val="22"/>
-        </w:rPr>
-      </w:r>
-    </w:p>
-    <w:p>
-      <w:pPr>
-        <w:spacing w:before="0" w:after="0" w:line="480" w:lineRule="auto"/>
-        <w:ind w:firstLine="720"/>
-        <w:jc w:val="both"/>
-      </w:pPr>
-      <w:r>
-        <w:rPr>
-          <w:rFonts w:ascii="Georgia" w:cs="Georgia" w:eastAsia="Georgia" w:hAnsi="Georgia"/>
-          <w:b w:val="0"/>
-          <w:bCs w:val="0"/>
-          <w:i w:val="0"/>
-          <w:iCs w:val="0"/>
-          <w:sz w:val="22"/>
-          <w:szCs w:val="22"/>
-          <w:rtl w:val="0"/>
-        </w:rPr>
-        <w:t xml:space="preserve">That empirical question cannot be answered without a clear boundary on what counts as a hedge. The literature does not share one definition, and the differences matter for coding. Hyland's polypragmatic model keeps both reduced commitment to propositional truth and reader-oriented interpersonal effects inside the same broad category. A single token can manage accuracy and manage the reader at once. Salager-Meyer treats the same devices as ways of distributing claim responsibility among writer, data, and circumstance, which is especially relevant for research writing where findings are provisional. Crompton argues for a narrower scope limited to epistemic modality on knowledge claims, on the ground that stretching hedge to every politeness feature of academic prose weakens the term and blurs what is being counted.</w:t>
-      </w:r>
-      <w:r>
-        <w:rPr>
-          <w:rtl w:val="0"/>
-          <w:rFonts w:ascii="Georgia" w:hAnsi="Georgia" w:cs="Georgia"/>
-          <w:sz w:val="22"/>
-          <w:szCs w:val="22"/>
-        </w:rPr>
-      </w:r>
-    </w:p>
-    <w:p>
-      <w:pPr>
-        <w:spacing w:before="0" w:after="0" w:line="480" w:lineRule="auto"/>
-        <w:ind w:firstLine="720"/>
-        <w:jc w:val="both"/>
-      </w:pPr>
-      <w:r>
-        <w:rPr>
-          <w:rFonts w:ascii="Georgia" w:cs="Georgia" w:eastAsia="Georgia" w:hAnsi="Georgia"/>
-          <w:b w:val="0"/>
-          <w:bCs w:val="0"/>
-          <w:i w:val="0"/>
-          <w:iCs w:val="0"/>
-          <w:sz w:val="22"/>
-          <w:szCs w:val="22"/>
-          <w:rtl w:val="0"/>
-        </w:rPr>
-        <w:t xml:space="preserve">Directives and recommendations sit at the edge of that debate. They manage action rather than the truth of a claim. Under a wide interpersonal reading they look like mitigation. Under a claim-centered reading they fall outside the hedge count. This study adopts the claim-centered boundary, so a token is retained as a hedge only when it changes the writer's stance toward a proposition that evidence could show to be wrong. Epistemic Caution records reduced commitment to that claim's truth. Politeness/Deference records interpersonal softening of the same claim when that softening co-occurs with, or stands in place of, an epistemic effect on a claim. Softened recommendations are logged as false positives under this scope. The choice is a position in the definitional debate.</w:t>
-      </w:r>
-      <w:r>
-        <w:rPr>
-          <w:rtl w:val="0"/>
-          <w:rFonts w:ascii="Georgia" w:hAnsi="Georgia" w:cs="Georgia"/>
-          <w:sz w:val="22"/>
-          <w:szCs w:val="22"/>
-        </w:rPr>
-      </w:r>
-    </w:p>
-    <w:p>
-      <w:pPr>
-        <w:spacing w:before="0" w:after="0" w:line="480" w:lineRule="auto"/>
-        <w:ind w:firstLine="720"/>
-        <w:jc w:val="both"/>
-      </w:pPr>
-      <w:r>
-        <w:rPr>
-          <w:rFonts w:ascii="Georgia" w:cs="Georgia" w:eastAsia="Georgia" w:hAnsi="Georgia"/>
-          <w:sz w:val="22"/>
-          <w:szCs w:val="22"/>
-          <w:rtl w:val="0"/>
-        </w:rPr>
-        <w:t>This review did not identify published studies that map hedging in undergraduate thesis abstracts from applied science disciplines in a Philippine setting.</w:t>
-      </w:r>
-      <w:r>
-        <w:rPr>
-          <w:rFonts w:ascii="Georgia" w:hAnsi="Georgia" w:cs="Georgia" w:eastAsia="Georgia"/>
-          <w:sz w:val="22"/>
-          <w:rtl w:val="0"/>
-          <w:szCs w:val="22"/>
-        </w:rPr>
-      </w:r>
-    </w:p>
-    <w:p>
-      <w:pPr>
-        <w:spacing w:before="0" w:after="0" w:line="480" w:lineRule="auto"/>
-        <w:ind w:firstLine="720"/>
-        <w:jc w:val="both"/>
-      </w:pPr>
-      <w:r>
-        <w:rPr>
-          <w:rFonts w:ascii="Georgia" w:cs="Georgia" w:eastAsia="Georgia" w:hAnsi="Georgia"/>
-          <w:b w:val="0"/>
-          <w:bCs w:val="0"/>
-          <w:i w:val="0"/>
-          <w:iCs w:val="0"/>
           <w:sz w:val="22"/>
           <w:szCs w:val="22"/>
           <w:rtl w:val="0"/>
@@ -2047,10 +1863,6 @@
       <w:r>
         <w:rPr>
           <w:rFonts w:ascii="Georgia" w:cs="Georgia" w:eastAsia="Georgia" w:hAnsi="Georgia"/>
-          <w:b w:val="0"/>
-          <w:bCs w:val="0"/>
-          <w:i w:val="0"/>
-          <w:iCs w:val="0"/>
           <w:sz w:val="22"/>
           <w:szCs w:val="22"/>
           <w:rtl w:val="0"/>
@@ -2075,10 +1887,6 @@
       <w:r>
         <w:rPr>
           <w:rFonts w:ascii="Georgia" w:cs="Georgia" w:eastAsia="Georgia" w:hAnsi="Georgia"/>
-          <w:b w:val="0"/>
-          <w:bCs w:val="0"/>
-          <w:i w:val="0"/>
-          <w:iCs w:val="0"/>
           <w:sz w:val="22"/>
           <w:szCs w:val="22"/>
           <w:rtl w:val="0"/>
@@ -2103,10 +1911,6 @@
       <w:r>
         <w:rPr>
           <w:rFonts w:ascii="Georgia" w:cs="Georgia" w:eastAsia="Georgia" w:hAnsi="Georgia"/>
-          <w:b w:val="0"/>
-          <w:bCs w:val="0"/>
-          <w:i w:val="0"/>
-          <w:iCs w:val="0"/>
           <w:sz w:val="22"/>
           <w:szCs w:val="22"/>
           <w:rtl w:val="0"/>
@@ -2131,10 +1935,6 @@
       <w:r>
         <w:rPr>
           <w:rFonts w:ascii="Georgia" w:cs="Georgia" w:eastAsia="Georgia" w:hAnsi="Georgia"/>
-          <w:b w:val="0"/>
-          <w:bCs w:val="0"/>
-          <w:i w:val="0"/>
-          <w:iCs w:val="0"/>
           <w:sz w:val="22"/>
           <w:szCs w:val="22"/>
           <w:rtl w:val="0"/>
@@ -2159,10 +1959,6 @@
       <w:r>
         <w:rPr>
           <w:rFonts w:ascii="Georgia" w:cs="Georgia" w:eastAsia="Georgia" w:hAnsi="Georgia"/>
-          <w:b w:val="0"/>
-          <w:bCs w:val="0"/>
-          <w:i w:val="0"/>
-          <w:iCs w:val="0"/>
           <w:sz w:val="22"/>
           <w:szCs w:val="22"/>
           <w:rtl w:val="0"/>
@@ -2187,10 +1983,6 @@
       <w:r>
         <w:rPr>
           <w:rFonts w:ascii="Georgia" w:cs="Georgia" w:eastAsia="Georgia" w:hAnsi="Georgia"/>
-          <w:b w:val="0"/>
-          <w:bCs w:val="0"/>
-          <w:i w:val="0"/>
-          <w:iCs w:val="0"/>
           <w:sz w:val="22"/>
           <w:szCs w:val="22"/>
           <w:rtl w:val="0"/>
@@ -2254,10 +2046,6 @@
       <w:r>
         <w:rPr>
           <w:rFonts w:ascii="Georgia" w:cs="Georgia" w:eastAsia="Georgia" w:hAnsi="Georgia"/>
-          <w:b w:val="0"/>
-          <w:bCs w:val="0"/>
-          <w:i w:val="0"/>
-          <w:iCs w:val="0"/>
           <w:sz w:val="22"/>
           <w:szCs w:val="22"/>
           <w:rtl w:val="0"/>
@@ -2282,10 +2070,6 @@
       <w:r>
         <w:rPr>
           <w:rFonts w:ascii="Georgia" w:cs="Georgia" w:eastAsia="Georgia" w:hAnsi="Georgia"/>
-          <w:b w:val="0"/>
-          <w:bCs w:val="0"/>
-          <w:i w:val="0"/>
-          <w:iCs w:val="0"/>
           <w:sz w:val="22"/>
           <w:szCs w:val="22"/>
           <w:rtl w:val="0"/>
@@ -2470,10 +2254,6 @@
       <w:r>
         <w:rPr>
           <w:rFonts w:ascii="Georgia" w:cs="Georgia" w:eastAsia="Georgia" w:hAnsi="Georgia"/>
-          <w:b w:val="0"/>
-          <w:bCs w:val="0"/>
-          <w:i w:val="0"/>
-          <w:iCs w:val="0"/>
           <w:sz w:val="22"/>
           <w:szCs w:val="22"/>
           <w:rtl w:val="0"/>
@@ -2537,10 +2317,6 @@
       <w:r>
         <w:rPr>
           <w:rFonts w:ascii="Georgia" w:cs="Georgia" w:eastAsia="Georgia" w:hAnsi="Georgia"/>
-          <w:b w:val="1"/>
-          <w:bCs w:val="1"/>
-          <w:i w:val="0"/>
-          <w:iCs w:val="0"/>
           <w:sz w:val="22"/>
           <w:szCs w:val="22"/>
           <w:rtl w:val="0"/>
@@ -2550,10 +2326,6 @@
       <w:r>
         <w:rPr>
           <w:rFonts w:ascii="Georgia" w:cs="Georgia" w:eastAsia="Georgia" w:hAnsi="Georgia"/>
-          <w:b w:val="0"/>
-          <w:bCs w:val="0"/>
-          <w:i w:val="0"/>
-          <w:iCs w:val="0"/>
           <w:sz w:val="22"/>
           <w:szCs w:val="22"/>
           <w:rtl w:val="0"/>
@@ -2578,10 +2350,6 @@
       <w:r>
         <w:rPr>
           <w:rFonts w:ascii="Georgia" w:cs="Georgia" w:eastAsia="Georgia" w:hAnsi="Georgia"/>
-          <w:b w:val="1"/>
-          <w:bCs w:val="1"/>
-          <w:i w:val="0"/>
-          <w:iCs w:val="0"/>
           <w:sz w:val="22"/>
           <w:szCs w:val="22"/>
           <w:rtl w:val="0"/>
@@ -2591,10 +2359,6 @@
       <w:r>
         <w:rPr>
           <w:rFonts w:ascii="Georgia" w:cs="Georgia" w:eastAsia="Georgia" w:hAnsi="Georgia"/>
-          <w:b w:val="0"/>
-          <w:bCs w:val="0"/>
-          <w:i w:val="0"/>
-          <w:iCs w:val="0"/>
           <w:sz w:val="22"/>
           <w:szCs w:val="22"/>
           <w:rtl w:val="0"/>
@@ -2619,10 +2383,6 @@
       <w:r>
         <w:rPr>
           <w:rFonts w:ascii="Georgia" w:cs="Georgia" w:eastAsia="Georgia" w:hAnsi="Georgia"/>
-          <w:b w:val="1"/>
-          <w:bCs w:val="1"/>
-          <w:i w:val="0"/>
-          <w:iCs w:val="0"/>
           <w:sz w:val="22"/>
           <w:szCs w:val="22"/>
           <w:rtl w:val="0"/>
@@ -2632,10 +2392,6 @@
       <w:r>
         <w:rPr>
           <w:rFonts w:ascii="Georgia" w:cs="Georgia" w:eastAsia="Georgia" w:hAnsi="Georgia"/>
-          <w:b w:val="0"/>
-          <w:bCs w:val="0"/>
-          <w:i w:val="0"/>
-          <w:iCs w:val="0"/>
           <w:sz w:val="22"/>
           <w:szCs w:val="22"/>
           <w:rtl w:val="0"/>
@@ -2660,10 +2416,6 @@
       <w:r>
         <w:rPr>
           <w:rFonts w:ascii="Georgia" w:cs="Georgia" w:eastAsia="Georgia" w:hAnsi="Georgia"/>
-          <w:b w:val="1"/>
-          <w:bCs w:val="1"/>
-          <w:i w:val="0"/>
-          <w:iCs w:val="0"/>
           <w:sz w:val="22"/>
           <w:szCs w:val="22"/>
           <w:rtl w:val="0"/>
@@ -2673,10 +2425,6 @@
       <w:r>
         <w:rPr>
           <w:rFonts w:ascii="Georgia" w:cs="Georgia" w:eastAsia="Georgia" w:hAnsi="Georgia"/>
-          <w:b w:val="0"/>
-          <w:bCs w:val="0"/>
-          <w:i w:val="0"/>
-          <w:iCs w:val="0"/>
           <w:sz w:val="22"/>
           <w:szCs w:val="22"/>
           <w:rtl w:val="0"/>
@@ -2740,10 +2488,6 @@
       <w:r>
         <w:rPr>
           <w:rFonts w:ascii="Georgia" w:cs="Georgia" w:eastAsia="Georgia" w:hAnsi="Georgia"/>
-          <w:b w:val="0"/>
-          <w:bCs w:val="0"/>
-          <w:i w:val="0"/>
-          <w:iCs w:val="0"/>
           <w:sz w:val="22"/>
           <w:szCs w:val="22"/>
           <w:rtl w:val="0"/>
@@ -2768,10 +2512,6 @@
       <w:r>
         <w:rPr>
           <w:rFonts w:ascii="Georgia" w:cs="Georgia" w:eastAsia="Georgia" w:hAnsi="Georgia"/>
-          <w:b w:val="0"/>
-          <w:bCs w:val="0"/>
-          <w:i w:val="0"/>
-          <w:iCs w:val="0"/>
           <w:sz w:val="22"/>
           <w:szCs w:val="22"/>
           <w:rtl w:val="0"/>
@@ -2796,10 +2536,6 @@
       <w:r>
         <w:rPr>
           <w:rFonts w:ascii="Georgia" w:cs="Georgia" w:eastAsia="Georgia" w:hAnsi="Georgia"/>
-          <w:b w:val="0"/>
-          <w:bCs w:val="0"/>
-          <w:i w:val="0"/>
-          <w:iCs w:val="0"/>
           <w:sz w:val="22"/>
           <w:szCs w:val="22"/>
           <w:rtl w:val="0"/>
@@ -2824,10 +2560,6 @@
       <w:r>
         <w:rPr>
           <w:rFonts w:ascii="Georgia" w:cs="Georgia" w:eastAsia="Georgia" w:hAnsi="Georgia"/>
-          <w:b w:val="0"/>
-          <w:bCs w:val="0"/>
-          <w:i w:val="0"/>
-          <w:iCs w:val="0"/>
           <w:sz w:val="22"/>
           <w:szCs w:val="22"/>
           <w:rtl w:val="0"/>
@@ -2852,10 +2584,6 @@
       <w:r>
         <w:rPr>
           <w:rFonts w:ascii="Georgia" w:cs="Georgia" w:eastAsia="Georgia" w:hAnsi="Georgia"/>
-          <w:b w:val="0"/>
-          <w:bCs w:val="0"/>
-          <w:i w:val="0"/>
-          <w:iCs w:val="0"/>
           <w:strike w:val="0"/>
           <w:sz w:val="22"/>
           <w:szCs w:val="22"/>
@@ -2881,10 +2609,6 @@
       <w:r>
         <w:rPr>
           <w:rFonts w:ascii="Georgia" w:cs="Georgia" w:eastAsia="Georgia" w:hAnsi="Georgia"/>
-          <w:b w:val="0"/>
-          <w:bCs w:val="0"/>
-          <w:i w:val="0"/>
-          <w:iCs w:val="0"/>
           <w:sz w:val="22"/>
           <w:szCs w:val="22"/>
           <w:rtl w:val="0"/>
@@ -2909,10 +2633,6 @@
       <w:r>
         <w:rPr>
           <w:rFonts w:ascii="Georgia" w:cs="Georgia" w:eastAsia="Georgia" w:hAnsi="Georgia"/>
-          <w:b w:val="0"/>
-          <w:bCs w:val="0"/>
-          <w:i w:val="0"/>
-          <w:iCs w:val="0"/>
           <w:sz w:val="22"/>
           <w:szCs w:val="22"/>
           <w:rtl w:val="0"/>
@@ -2976,10 +2696,6 @@
       <w:r>
         <w:rPr>
           <w:rFonts w:ascii="Georgia" w:cs="Georgia" w:eastAsia="Georgia" w:hAnsi="Georgia"/>
-          <w:b w:val="0"/>
-          <w:bCs w:val="0"/>
-          <w:i w:val="0"/>
-          <w:iCs w:val="0"/>
           <w:sz w:val="22"/>
           <w:szCs w:val="22"/>
           <w:rtl w:val="0"/>
@@ -3004,10 +2720,6 @@
       <w:r>
         <w:rPr>
           <w:rFonts w:ascii="Georgia" w:cs="Georgia" w:eastAsia="Georgia" w:hAnsi="Georgia"/>
-          <w:b w:val="1"/>
-          <w:bCs w:val="1"/>
-          <w:i w:val="0"/>
-          <w:iCs w:val="0"/>
           <w:sz w:val="22"/>
           <w:szCs w:val="22"/>
           <w:rtl w:val="0"/>
@@ -3017,8 +2729,6 @@
       <w:r>
         <w:rPr>
           <w:rFonts w:ascii="Georgia" w:cs="Georgia" w:eastAsia="Georgia" w:hAnsi="Georgia"/>
-          <w:i w:val="0"/>
-          <w:iCs w:val="0"/>
           <w:sz w:val="22"/>
           <w:szCs w:val="22"/>
           <w:rtl w:val="0"/>
@@ -3043,10 +2753,6 @@
       <w:r>
         <w:rPr>
           <w:rFonts w:ascii="Georgia" w:cs="Georgia" w:eastAsia="Georgia" w:hAnsi="Georgia"/>
-          <w:b w:val="1"/>
-          <w:bCs w:val="1"/>
-          <w:i w:val="0"/>
-          <w:iCs w:val="0"/>
           <w:sz w:val="22"/>
           <w:szCs w:val="22"/>
           <w:rtl w:val="0"/>
@@ -3056,8 +2762,6 @@
       <w:r>
         <w:rPr>
           <w:rFonts w:ascii="Georgia" w:cs="Georgia" w:eastAsia="Georgia" w:hAnsi="Georgia"/>
-          <w:i w:val="0"/>
-          <w:iCs w:val="0"/>
           <w:sz w:val="22"/>
           <w:szCs w:val="22"/>
           <w:rtl w:val="0"/>
@@ -3082,10 +2786,6 @@
       <w:r>
         <w:rPr>
           <w:rFonts w:ascii="Georgia" w:cs="Georgia" w:eastAsia="Georgia" w:hAnsi="Georgia"/>
-          <w:b w:val="1"/>
-          <w:bCs w:val="1"/>
-          <w:i w:val="0"/>
-          <w:iCs w:val="0"/>
           <w:sz w:val="22"/>
           <w:szCs w:val="22"/>
           <w:rtl w:val="0"/>
@@ -3095,8 +2795,6 @@
       <w:r>
         <w:rPr>
           <w:rFonts w:ascii="Georgia" w:cs="Georgia" w:eastAsia="Georgia" w:hAnsi="Georgia"/>
-          <w:i w:val="0"/>
-          <w:iCs w:val="0"/>
           <w:sz w:val="22"/>
           <w:szCs w:val="22"/>
           <w:rtl w:val="0"/>
@@ -3121,10 +2819,6 @@
       <w:r>
         <w:rPr>
           <w:rFonts w:ascii="Georgia" w:cs="Georgia" w:eastAsia="Georgia" w:hAnsi="Georgia"/>
-          <w:b w:val="1"/>
-          <w:bCs w:val="1"/>
-          <w:i w:val="0"/>
-          <w:iCs w:val="0"/>
           <w:sz w:val="22"/>
           <w:szCs w:val="22"/>
           <w:rtl w:val="0"/>
@@ -3134,8 +2828,6 @@
       <w:r>
         <w:rPr>
           <w:rFonts w:ascii="Georgia" w:cs="Georgia" w:eastAsia="Georgia" w:hAnsi="Georgia"/>
-          <w:i w:val="0"/>
-          <w:iCs w:val="0"/>
           <w:sz w:val="22"/>
           <w:szCs w:val="22"/>
           <w:rtl w:val="0"/>
@@ -3160,10 +2852,6 @@
       <w:r>
         <w:rPr>
           <w:rFonts w:ascii="Georgia" w:cs="Georgia" w:eastAsia="Georgia" w:hAnsi="Georgia"/>
-          <w:b w:val="1"/>
-          <w:bCs w:val="1"/>
-          <w:i w:val="0"/>
-          <w:iCs w:val="0"/>
           <w:sz w:val="22"/>
           <w:szCs w:val="22"/>
           <w:rtl w:val="0"/>
@@ -3173,8 +2861,6 @@
       <w:r>
         <w:rPr>
           <w:rFonts w:ascii="Georgia" w:cs="Georgia" w:eastAsia="Georgia" w:hAnsi="Georgia"/>
-          <w:i w:val="0"/>
-          <w:iCs w:val="0"/>
           <w:sz w:val="22"/>
           <w:szCs w:val="22"/>
           <w:rtl w:val="0"/>
@@ -3199,10 +2885,6 @@
       <w:r>
         <w:rPr>
           <w:rFonts w:ascii="Georgia" w:cs="Georgia" w:eastAsia="Georgia" w:hAnsi="Georgia"/>
-          <w:b w:val="1"/>
-          <w:bCs w:val="1"/>
-          <w:i w:val="0"/>
-          <w:iCs w:val="0"/>
           <w:sz w:val="22"/>
           <w:szCs w:val="22"/>
           <w:rtl w:val="0"/>
@@ -3212,8 +2894,6 @@
       <w:r>
         <w:rPr>
           <w:rFonts w:ascii="Georgia" w:cs="Georgia" w:eastAsia="Georgia" w:hAnsi="Georgia"/>
-          <w:i w:val="0"/>
-          <w:iCs w:val="0"/>
           <w:sz w:val="22"/>
           <w:szCs w:val="22"/>
           <w:rtl w:val="0"/>
@@ -3238,10 +2918,6 @@
       <w:r>
         <w:rPr>
           <w:rFonts w:ascii="Georgia" w:cs="Georgia" w:eastAsia="Georgia" w:hAnsi="Georgia"/>
-          <w:b w:val="1"/>
-          <w:bCs w:val="1"/>
-          <w:i w:val="0"/>
-          <w:iCs w:val="0"/>
           <w:sz w:val="22"/>
           <w:szCs w:val="22"/>
           <w:rtl w:val="0"/>
@@ -3251,8 +2927,6 @@
       <w:r>
         <w:rPr>
           <w:rFonts w:ascii="Georgia" w:cs="Georgia" w:eastAsia="Georgia" w:hAnsi="Georgia"/>
-          <w:i w:val="0"/>
-          <w:iCs w:val="0"/>
           <w:sz w:val="22"/>
           <w:szCs w:val="22"/>
           <w:rtl w:val="0"/>
@@ -3277,10 +2951,6 @@
       <w:r>
         <w:rPr>
           <w:rFonts w:ascii="Georgia" w:cs="Georgia" w:eastAsia="Georgia" w:hAnsi="Georgia"/>
-          <w:b w:val="1"/>
-          <w:bCs w:val="1"/>
-          <w:i w:val="0"/>
-          <w:iCs w:val="0"/>
           <w:sz w:val="22"/>
           <w:szCs w:val="22"/>
           <w:rtl w:val="0"/>
@@ -3290,8 +2960,6 @@
       <w:r>
         <w:rPr>
           <w:rFonts w:ascii="Georgia" w:cs="Georgia" w:eastAsia="Georgia" w:hAnsi="Georgia"/>
-          <w:i w:val="0"/>
-          <w:iCs w:val="0"/>
           <w:sz w:val="22"/>
           <w:szCs w:val="22"/>
           <w:rtl w:val="0"/>
@@ -3316,10 +2984,6 @@
       <w:r>
         <w:rPr>
           <w:rFonts w:ascii="Georgia" w:cs="Georgia" w:eastAsia="Georgia" w:hAnsi="Georgia"/>
-          <w:b w:val="1"/>
-          <w:bCs w:val="1"/>
-          <w:i w:val="0"/>
-          <w:iCs w:val="0"/>
           <w:sz w:val="22"/>
           <w:szCs w:val="22"/>
           <w:rtl w:val="0"/>
@@ -3329,8 +2993,6 @@
       <w:r>
         <w:rPr>
           <w:rFonts w:ascii="Georgia" w:cs="Georgia" w:eastAsia="Georgia" w:hAnsi="Georgia"/>
-          <w:i w:val="0"/>
-          <w:iCs w:val="0"/>
           <w:sz w:val="22"/>
           <w:szCs w:val="22"/>
           <w:rtl w:val="0"/>
@@ -3355,10 +3017,6 @@
       <w:r>
         <w:rPr>
           <w:rFonts w:ascii="Georgia" w:cs="Georgia" w:eastAsia="Georgia" w:hAnsi="Georgia"/>
-          <w:b w:val="1"/>
-          <w:bCs w:val="1"/>
-          <w:i w:val="0"/>
-          <w:iCs w:val="0"/>
           <w:sz w:val="22"/>
           <w:szCs w:val="22"/>
           <w:rtl w:val="0"/>
@@ -3368,8 +3026,6 @@
       <w:r>
         <w:rPr>
           <w:rFonts w:ascii="Georgia" w:cs="Georgia" w:eastAsia="Georgia" w:hAnsi="Georgia"/>
-          <w:i w:val="0"/>
-          <w:iCs w:val="0"/>
           <w:sz w:val="22"/>
           <w:szCs w:val="22"/>
           <w:rtl w:val="0"/>
@@ -3394,10 +3050,6 @@
       <w:r>
         <w:rPr>
           <w:rFonts w:ascii="Georgia" w:cs="Georgia" w:eastAsia="Georgia" w:hAnsi="Georgia"/>
-          <w:b w:val="1"/>
-          <w:bCs w:val="1"/>
-          <w:i w:val="0"/>
-          <w:iCs w:val="0"/>
           <w:sz w:val="22"/>
           <w:szCs w:val="22"/>
           <w:rtl w:val="0"/>
@@ -3407,8 +3059,6 @@
       <w:r>
         <w:rPr>
           <w:rFonts w:ascii="Georgia" w:cs="Georgia" w:eastAsia="Georgia" w:hAnsi="Georgia"/>
-          <w:i w:val="0"/>
-          <w:iCs w:val="0"/>
           <w:sz w:val="22"/>
           <w:szCs w:val="22"/>
           <w:rtl w:val="0"/>
@@ -3433,10 +3083,6 @@
       <w:r>
         <w:rPr>
           <w:rFonts w:ascii="Georgia" w:cs="Georgia" w:eastAsia="Georgia" w:hAnsi="Georgia"/>
-          <w:b w:val="1"/>
-          <w:bCs w:val="1"/>
-          <w:i w:val="0"/>
-          <w:iCs w:val="0"/>
           <w:sz w:val="22"/>
           <w:szCs w:val="22"/>
           <w:rtl w:val="0"/>
@@ -3446,8 +3092,6 @@
       <w:r>
         <w:rPr>
           <w:rFonts w:ascii="Georgia" w:cs="Georgia" w:eastAsia="Georgia" w:hAnsi="Georgia"/>
-          <w:i w:val="0"/>
-          <w:iCs w:val="0"/>
           <w:sz w:val="22"/>
           <w:szCs w:val="22"/>
           <w:rtl w:val="0"/>
@@ -3472,10 +3116,6 @@
       <w:r>
         <w:rPr>
           <w:rFonts w:ascii="Georgia" w:cs="Georgia" w:eastAsia="Georgia" w:hAnsi="Georgia"/>
-          <w:b w:val="1"/>
-          <w:bCs w:val="1"/>
-          <w:i w:val="0"/>
-          <w:iCs w:val="0"/>
           <w:sz w:val="22"/>
           <w:szCs w:val="22"/>
           <w:rtl w:val="0"/>
@@ -3485,8 +3125,6 @@
       <w:r>
         <w:rPr>
           <w:rFonts w:ascii="Georgia" w:cs="Georgia" w:eastAsia="Georgia" w:hAnsi="Georgia"/>
-          <w:i w:val="0"/>
-          <w:iCs w:val="0"/>
           <w:sz w:val="22"/>
           <w:szCs w:val="22"/>
           <w:rtl w:val="0"/>
@@ -3511,10 +3149,6 @@
       <w:r>
         <w:rPr>
           <w:rFonts w:ascii="Georgia" w:cs="Georgia" w:eastAsia="Georgia" w:hAnsi="Georgia"/>
-          <w:b w:val="1"/>
-          <w:bCs w:val="1"/>
-          <w:i w:val="0"/>
-          <w:iCs w:val="0"/>
           <w:sz w:val="22"/>
           <w:szCs w:val="22"/>
           <w:rtl w:val="0"/>
@@ -3524,8 +3158,6 @@
       <w:r>
         <w:rPr>
           <w:rFonts w:ascii="Georgia" w:cs="Georgia" w:eastAsia="Georgia" w:hAnsi="Georgia"/>
-          <w:i w:val="0"/>
-          <w:iCs w:val="0"/>
           <w:sz w:val="22"/>
           <w:szCs w:val="22"/>
           <w:rtl w:val="0"/>
@@ -3550,10 +3182,6 @@
       <w:r>
         <w:rPr>
           <w:rFonts w:ascii="Georgia" w:cs="Georgia" w:eastAsia="Georgia" w:hAnsi="Georgia"/>
-          <w:b w:val="1"/>
-          <w:bCs w:val="1"/>
-          <w:i w:val="0"/>
-          <w:iCs w:val="0"/>
           <w:sz w:val="22"/>
           <w:szCs w:val="22"/>
           <w:rtl w:val="0"/>
@@ -3563,8 +3191,6 @@
       <w:r>
         <w:rPr>
           <w:rFonts w:ascii="Georgia" w:cs="Georgia" w:eastAsia="Georgia" w:hAnsi="Georgia"/>
-          <w:i w:val="0"/>
-          <w:iCs w:val="0"/>
           <w:sz w:val="22"/>
           <w:szCs w:val="22"/>
           <w:rtl w:val="0"/>
@@ -3589,10 +3215,6 @@
       <w:r>
         <w:rPr>
           <w:rFonts w:ascii="Georgia" w:cs="Georgia" w:eastAsia="Georgia" w:hAnsi="Georgia"/>
-          <w:b w:val="1"/>
-          <w:bCs w:val="1"/>
-          <w:i w:val="0"/>
-          <w:iCs w:val="0"/>
           <w:sz w:val="22"/>
           <w:szCs w:val="22"/>
           <w:rtl w:val="0"/>
@@ -3602,8 +3224,6 @@
       <w:r>
         <w:rPr>
           <w:rFonts w:ascii="Georgia" w:cs="Georgia" w:eastAsia="Georgia" w:hAnsi="Georgia"/>
-          <w:i w:val="0"/>
-          <w:iCs w:val="0"/>
           <w:sz w:val="22"/>
           <w:szCs w:val="22"/>
           <w:rtl w:val="0"/>
@@ -3628,10 +3248,6 @@
       <w:r>
         <w:rPr>
           <w:rFonts w:ascii="Georgia" w:cs="Georgia" w:eastAsia="Georgia" w:hAnsi="Georgia"/>
-          <w:b w:val="1"/>
-          <w:bCs w:val="1"/>
-          <w:i w:val="0"/>
-          <w:iCs w:val="0"/>
           <w:sz w:val="22"/>
           <w:szCs w:val="22"/>
           <w:rtl w:val="0"/>
@@ -3641,8 +3257,6 @@
       <w:r>
         <w:rPr>
           <w:rFonts w:ascii="Georgia" w:cs="Georgia" w:eastAsia="Georgia" w:hAnsi="Georgia"/>
-          <w:i w:val="0"/>
-          <w:iCs w:val="0"/>
           <w:sz w:val="22"/>
           <w:szCs w:val="22"/>
           <w:rtl w:val="0"/>
@@ -3667,10 +3281,6 @@
       <w:r>
         <w:rPr>
           <w:rFonts w:ascii="Georgia" w:cs="Georgia" w:eastAsia="Georgia" w:hAnsi="Georgia"/>
-          <w:b w:val="1"/>
-          <w:bCs w:val="1"/>
-          <w:i w:val="0"/>
-          <w:iCs w:val="0"/>
           <w:sz w:val="22"/>
           <w:szCs w:val="22"/>
           <w:rtl w:val="0"/>
@@ -3680,8 +3290,6 @@
       <w:r>
         <w:rPr>
           <w:rFonts w:ascii="Georgia" w:cs="Georgia" w:eastAsia="Georgia" w:hAnsi="Georgia"/>
-          <w:i w:val="0"/>
-          <w:iCs w:val="0"/>
           <w:sz w:val="22"/>
           <w:szCs w:val="22"/>
           <w:rtl w:val="0"/>
@@ -3823,10 +3431,6 @@
       <w:r>
         <w:rPr>
           <w:rFonts w:ascii="Georgia" w:cs="Georgia" w:eastAsia="Georgia" w:hAnsi="Georgia"/>
-          <w:b w:val="0"/>
-          <w:bCs w:val="0"/>
-          <w:i w:val="0"/>
-          <w:iCs w:val="0"/>
           <w:sz w:val="22"/>
           <w:szCs w:val="22"/>
           <w:rtl w:val="0"/>
@@ -3890,10 +3494,6 @@
       <w:r>
         <w:rPr>
           <w:rFonts w:ascii="Georgia" w:cs="Georgia" w:eastAsia="Georgia" w:hAnsi="Georgia"/>
-          <w:b w:val="0"/>
-          <w:bCs w:val="0"/>
-          <w:i w:val="0"/>
-          <w:iCs w:val="0"/>
           <w:sz w:val="22"/>
           <w:szCs w:val="22"/>
           <w:rtl w:val="0"/>
@@ -3918,10 +3518,6 @@
       <w:r>
         <w:rPr>
           <w:rFonts w:ascii="Georgia" w:cs="Georgia" w:eastAsia="Georgia" w:hAnsi="Georgia"/>
-          <w:b w:val="0"/>
-          <w:bCs w:val="0"/>
-          <w:i w:val="0"/>
-          <w:iCs w:val="0"/>
           <w:sz w:val="22"/>
           <w:szCs w:val="22"/>
           <w:rtl w:val="0"/>
@@ -3946,10 +3542,6 @@
       <w:r>
         <w:rPr>
           <w:rFonts w:ascii="Georgia" w:cs="Georgia" w:eastAsia="Georgia" w:hAnsi="Georgia"/>
-          <w:b w:val="0"/>
-          <w:bCs w:val="0"/>
-          <w:i w:val="0"/>
-          <w:iCs w:val="0"/>
           <w:sz w:val="22"/>
           <w:szCs w:val="22"/>
           <w:rtl w:val="0"/>
@@ -4013,10 +3605,6 @@
       <w:r>
         <w:rPr>
           <w:rFonts w:ascii="Georgia" w:cs="Georgia" w:eastAsia="Georgia" w:hAnsi="Georgia"/>
-          <w:b w:val="0"/>
-          <w:bCs w:val="0"/>
-          <w:i w:val="0"/>
-          <w:iCs w:val="0"/>
           <w:sz w:val="22"/>
           <w:szCs w:val="22"/>
           <w:rtl w:val="0"/>
@@ -4080,10 +3668,6 @@
       <w:r>
         <w:rPr>
           <w:rFonts w:ascii="Georgia" w:cs="Georgia" w:eastAsia="Georgia" w:hAnsi="Georgia"/>
-          <w:b w:val="0"/>
-          <w:bCs w:val="0"/>
-          <w:i w:val="0"/>
-          <w:iCs w:val="0"/>
           <w:sz w:val="22"/>
           <w:szCs w:val="22"/>
           <w:rtl w:val="0"/>
@@ -5012,6 +4596,34 @@
     </w:p>
     <w:p>
       <w:pPr>
+        <w:keepNext/>
+        <w:spacing w:before="0" w:after="0" w:line="480" w:lineRule="auto"/>
+        <w:jc w:val="left"/>
+      </w:pPr>
+      <w:r>
+        <w:rPr>
+          <w:rFonts w:ascii="Georgia" w:cs="Georgia" w:eastAsia="Georgia" w:hAnsi="Georgia"/>
+          <w:i w:val="1"/>
+          <w:iCs w:val="1"/>
+          <w:sz w:val="24"/>
+          <w:szCs w:val="24"/>
+          <w:rtl w:val="0"/>
+        </w:rPr>
+        <w:t xml:space="preserve">Coding Decision Rules for Ambiguous Cases</w:t>
+      </w:r>
+      <w:r>
+        <w:rPr>
+          <w:rtl w:val="0"/>
+          <w:rFonts w:ascii="Georgia" w:hAnsi="Georgia" w:cs="Georgia"/>
+          <w:sz w:val="24"/>
+          <w:szCs w:val="24"/>
+          <w:i/>
+          <w:iCs/>
+        </w:rPr>
+      </w:r>
+    </w:p>
+    <w:p>
+      <w:pPr>
         <w:spacing w:before="0" w:after="0" w:line="480" w:lineRule="auto"/>
         <w:ind w:firstLine="720"/>
         <w:jc w:val="both"/>
@@ -5019,38 +4631,6 @@
       <w:r>
         <w:rPr>
           <w:rFonts w:ascii="Georgia" w:cs="Georgia" w:eastAsia="Georgia" w:hAnsi="Georgia"/>
-          <w:b w:val="0"/>
-          <w:bCs w:val="0"/>
-          <w:i w:val="1"/>
-          <w:iCs w:val="1"/>
-          <w:sz w:val="22"/>
-          <w:szCs w:val="22"/>
-          <w:rtl w:val="0"/>
-        </w:rPr>
-        <w:t xml:space="preserve">Coding Decision Rules for Ambiguous Cases</w:t>
-      </w:r>
-      <w:r>
-        <w:rPr>
-          <w:rtl w:val="0"/>
-          <w:rFonts w:ascii="Georgia" w:hAnsi="Georgia" w:cs="Georgia"/>
-          <w:sz w:val="22"/>
-          <w:szCs w:val="22"/>
-        </w:rPr>
-      </w:r>
-    </w:p>
-    <w:p>
-      <w:pPr>
-        <w:spacing w:before="0" w:after="0" w:line="480" w:lineRule="auto"/>
-        <w:ind w:firstLine="720"/>
-        <w:jc w:val="both"/>
-      </w:pPr>
-      <w:r>
-        <w:rPr>
-          <w:rFonts w:ascii="Georgia" w:cs="Georgia" w:eastAsia="Georgia" w:hAnsi="Georgia"/>
-          <w:b w:val="0"/>
-          <w:bCs w:val="0"/>
-          <w:i w:val="0"/>
-          <w:iCs w:val="0"/>
           <w:sz w:val="22"/>
           <w:szCs w:val="22"/>
           <w:rtl w:val="0"/>
@@ -6287,10 +5867,6 @@
       <w:r>
         <w:rPr>
           <w:rFonts w:ascii="Georgia" w:cs="Georgia" w:eastAsia="Georgia" w:hAnsi="Georgia"/>
-          <w:b w:val="0"/>
-          <w:bCs w:val="0"/>
-          <w:i w:val="0"/>
-          <w:iCs w:val="0"/>
           <w:sz w:val="22"/>
           <w:szCs w:val="22"/>
           <w:rtl w:val="0"/>
@@ -6617,10 +6193,6 @@
       <w:r>
         <w:rPr>
           <w:rFonts w:ascii="Georgia" w:cs="Georgia" w:eastAsia="Georgia" w:hAnsi="Georgia"/>
-          <w:b w:val="0"/>
-          <w:bCs w:val="0"/>
-          <w:i w:val="0"/>
-          <w:iCs w:val="0"/>
           <w:sz w:val="22"/>
           <w:szCs w:val="22"/>
           <w:rtl w:val="0"/>
@@ -6762,10 +6334,6 @@
       <w:r>
         <w:rPr>
           <w:rFonts w:ascii="Georgia" w:cs="Georgia" w:eastAsia="Georgia" w:hAnsi="Georgia"/>
-          <w:b w:val="0"/>
-          <w:bCs w:val="0"/>
-          <w:i w:val="0"/>
-          <w:iCs w:val="0"/>
           <w:sz w:val="22"/>
           <w:szCs w:val="22"/>
           <w:rtl w:val="0"/>
@@ -8313,10 +7881,6 @@
       <w:r>
         <w:rPr>
           <w:rFonts w:ascii="Georgia" w:cs="Georgia" w:eastAsia="Georgia" w:hAnsi="Georgia"/>
-          <w:b w:val="0"/>
-          <w:bCs w:val="0"/>
-          <w:i w:val="0"/>
-          <w:iCs w:val="0"/>
           <w:sz w:val="22"/>
           <w:szCs w:val="22"/>
           <w:rtl w:val="0"/>
@@ -8380,10 +7944,6 @@
       <w:r>
         <w:rPr>
           <w:rFonts w:ascii="Georgia" w:cs="Georgia" w:eastAsia="Georgia" w:hAnsi="Georgia"/>
-          <w:b w:val="0"/>
-          <w:bCs w:val="0"/>
-          <w:i w:val="0"/>
-          <w:iCs w:val="0"/>
           <w:sz w:val="22"/>
           <w:szCs w:val="22"/>
           <w:rtl w:val="0"/>
@@ -8408,10 +7968,6 @@
       <w:r>
         <w:rPr>
           <w:rFonts w:ascii="Georgia" w:cs="Georgia" w:eastAsia="Georgia" w:hAnsi="Georgia"/>
-          <w:b w:val="0"/>
-          <w:bCs w:val="0"/>
-          <w:i w:val="0"/>
-          <w:iCs w:val="0"/>
           <w:sz w:val="22"/>
           <w:szCs w:val="22"/>
           <w:rtl w:val="0"/>
@@ -8467,23 +8023,35 @@
     </w:p>
     <w:p>
       <w:pPr>
+        <w:spacing w:before="0" w:after="0" w:line="480" w:lineRule="auto"/>
+      </w:pPr>
+      <w:r>
+        <w:t xml:space="preserve"/>
+      </w:r>
+    </w:p>
+    <w:p>
+      <w:pPr>
         <w:keepNext/>
-        <w:spacing w:before="0" w:after="0" w:line="360" w:lineRule="auto"/>
+        <w:spacing w:before="0" w:after="0" w:line="480" w:lineRule="auto"/>
         <w:jc w:val="left"/>
       </w:pPr>
       <w:r>
         <w:rPr>
           <w:rFonts w:ascii="Georgia" w:hAnsi="Georgia" w:cs="Georgia" w:eastAsia="Georgia"/>
-          <w:sz w:val="22"/>
-          <w:szCs w:val="22"/>
+          <w:sz w:val="24"/>
+          <w:szCs w:val="24"/>
+          <w:i/>
+          <w:iCs/>
         </w:rPr>
         <w:t xml:space="preserve">Hedge Types by Count and Discipline</w:t>
       </w:r>
       <w:r>
         <w:rPr>
           <w:rFonts w:ascii="Georgia" w:hAnsi="Georgia" w:cs="Georgia" w:eastAsia="Georgia"/>
-          <w:sz w:val="22"/>
-          <w:szCs w:val="22"/>
+          <w:sz w:val="24"/>
+          <w:szCs w:val="24"/>
+          <w:i/>
+          <w:iCs/>
         </w:rPr>
       </w:r>
     </w:p>
@@ -11361,10 +10929,6 @@
       <w:r>
         <w:rPr>
           <w:rFonts w:ascii="Georgia" w:cs="Georgia" w:eastAsia="Georgia" w:hAnsi="Georgia"/>
-          <w:b w:val="0"/>
-          <w:bCs w:val="0"/>
-          <w:i w:val="0"/>
-          <w:iCs w:val="0"/>
           <w:sz w:val="22"/>
           <w:szCs w:val="22"/>
           <w:rtl w:val="0"/>
@@ -11389,10 +10953,6 @@
       <w:r>
         <w:rPr>
           <w:rFonts w:ascii="Georgia" w:cs="Georgia" w:eastAsia="Georgia" w:hAnsi="Georgia"/>
-          <w:b w:val="0"/>
-          <w:bCs w:val="0"/>
-          <w:i w:val="0"/>
-          <w:iCs w:val="0"/>
           <w:sz w:val="22"/>
           <w:szCs w:val="22"/>
           <w:rtl w:val="0"/>
@@ -11417,10 +10977,6 @@
       <w:r>
         <w:rPr>
           <w:rFonts w:ascii="Georgia" w:cs="Georgia" w:eastAsia="Georgia" w:hAnsi="Georgia"/>
-          <w:b w:val="0"/>
-          <w:bCs w:val="0"/>
-          <w:i w:val="0"/>
-          <w:iCs w:val="0"/>
           <w:sz w:val="22"/>
           <w:szCs w:val="22"/>
           <w:rtl w:val="0"/>
@@ -11445,10 +11001,6 @@
       <w:r>
         <w:rPr>
           <w:rFonts w:ascii="Georgia" w:cs="Georgia" w:eastAsia="Georgia" w:hAnsi="Georgia"/>
-          <w:b w:val="0"/>
-          <w:bCs w:val="0"/>
-          <w:i w:val="0"/>
-          <w:iCs w:val="0"/>
           <w:sz w:val="22"/>
           <w:szCs w:val="22"/>
           <w:rtl w:val="0"/>
@@ -11512,10 +11064,6 @@
       <w:r>
         <w:rPr>
           <w:rFonts w:ascii="Georgia" w:cs="Georgia" w:eastAsia="Georgia" w:hAnsi="Georgia"/>
-          <w:b w:val="0"/>
-          <w:bCs w:val="0"/>
-          <w:i w:val="0"/>
-          <w:iCs w:val="0"/>
           <w:sz w:val="22"/>
           <w:szCs w:val="22"/>
           <w:rtl w:val="0"/>
@@ -13223,10 +12771,6 @@
       <w:r>
         <w:rPr>
           <w:rFonts w:ascii="Georgia" w:cs="Georgia" w:eastAsia="Georgia" w:hAnsi="Georgia"/>
-          <w:b w:val="0"/>
-          <w:bCs w:val="0"/>
-          <w:i w:val="0"/>
-          <w:iCs w:val="0"/>
           <w:sz w:val="22"/>
           <w:szCs w:val="22"/>
           <w:rtl w:val="0"/>
@@ -13251,10 +12795,6 @@
       <w:r>
         <w:rPr>
           <w:rFonts w:ascii="Georgia" w:cs="Georgia" w:eastAsia="Georgia" w:hAnsi="Georgia"/>
-          <w:b w:val="0"/>
-          <w:bCs w:val="0"/>
-          <w:i w:val="0"/>
-          <w:iCs w:val="0"/>
           <w:sz w:val="22"/>
           <w:szCs w:val="22"/>
           <w:rtl w:val="0"/>
@@ -13279,10 +12819,6 @@
       <w:r>
         <w:rPr>
           <w:rFonts w:ascii="Georgia" w:cs="Georgia" w:eastAsia="Georgia" w:hAnsi="Georgia"/>
-          <w:b w:val="0"/>
-          <w:bCs w:val="0"/>
-          <w:i w:val="0"/>
-          <w:iCs w:val="0"/>
           <w:sz w:val="22"/>
           <w:szCs w:val="22"/>
           <w:rtl w:val="0"/>
@@ -14397,10 +13933,6 @@
       <w:r>
         <w:rPr>
           <w:rFonts w:ascii="Georgia" w:cs="Georgia" w:eastAsia="Georgia" w:hAnsi="Georgia"/>
-          <w:b w:val="0"/>
-          <w:bCs w:val="0"/>
-          <w:i w:val="0"/>
-          <w:iCs w:val="0"/>
           <w:sz w:val="22"/>
           <w:szCs w:val="22"/>
           <w:rtl w:val="0"/>
@@ -14425,10 +13957,6 @@
       <w:r>
         <w:rPr>
           <w:rFonts w:ascii="Georgia" w:cs="Georgia" w:eastAsia="Georgia" w:hAnsi="Georgia"/>
-          <w:b w:val="0"/>
-          <w:bCs w:val="0"/>
-          <w:i w:val="0"/>
-          <w:iCs w:val="0"/>
           <w:sz w:val="22"/>
           <w:szCs w:val="22"/>
           <w:rtl w:val="0"/>
@@ -14453,10 +13981,6 @@
       <w:r>
         <w:rPr>
           <w:rFonts w:ascii="Georgia" w:cs="Georgia" w:eastAsia="Georgia" w:hAnsi="Georgia"/>
-          <w:b w:val="0"/>
-          <w:bCs w:val="0"/>
-          <w:i w:val="0"/>
-          <w:iCs w:val="0"/>
           <w:sz w:val="22"/>
           <w:szCs w:val="22"/>
           <w:rtl w:val="0"/>
@@ -14481,10 +14005,6 @@
       <w:r>
         <w:rPr>
           <w:rFonts w:ascii="Georgia" w:cs="Georgia" w:eastAsia="Georgia" w:hAnsi="Georgia"/>
-          <w:b w:val="0"/>
-          <w:bCs w:val="0"/>
-          <w:i w:val="0"/>
-          <w:iCs w:val="0"/>
           <w:sz w:val="22"/>
           <w:szCs w:val="22"/>
           <w:rtl w:val="0"/>
@@ -14509,10 +14029,6 @@
       <w:r>
         <w:rPr>
           <w:rFonts w:ascii="Georgia" w:cs="Georgia" w:eastAsia="Georgia" w:hAnsi="Georgia"/>
-          <w:b w:val="0"/>
-          <w:bCs w:val="0"/>
-          <w:i w:val="0"/>
-          <w:iCs w:val="0"/>
           <w:sz w:val="22"/>
           <w:szCs w:val="22"/>
           <w:rtl w:val="0"/>
@@ -14604,10 +14120,6 @@
       <w:r>
         <w:rPr>
           <w:rFonts w:ascii="Georgia" w:cs="Georgia" w:eastAsia="Georgia" w:hAnsi="Georgia"/>
-          <w:b w:val="0"/>
-          <w:bCs w:val="0"/>
-          <w:i w:val="0"/>
-          <w:iCs w:val="0"/>
           <w:sz w:val="22"/>
           <w:szCs w:val="22"/>
           <w:rtl w:val="0"/>
@@ -15339,10 +14851,6 @@
       <w:r>
         <w:rPr>
           <w:rFonts w:ascii="Georgia" w:cs="Georgia" w:eastAsia="Georgia" w:hAnsi="Georgia"/>
-          <w:b w:val="0"/>
-          <w:bCs w:val="0"/>
-          <w:i w:val="0"/>
-          <w:iCs w:val="0"/>
           <w:sz w:val="22"/>
           <w:szCs w:val="22"/>
           <w:rtl w:val="0"/>
@@ -15367,10 +14875,6 @@
       <w:r>
         <w:rPr>
           <w:rFonts w:ascii="Georgia" w:cs="Georgia" w:eastAsia="Georgia" w:hAnsi="Georgia"/>
-          <w:b w:val="0"/>
-          <w:bCs w:val="0"/>
-          <w:i w:val="0"/>
-          <w:iCs w:val="0"/>
           <w:sz w:val="22"/>
           <w:szCs w:val="22"/>
           <w:rtl w:val="0"/>
@@ -16931,10 +16435,6 @@
       <w:r>
         <w:rPr>
           <w:rFonts w:ascii="Georgia" w:cs="Georgia" w:eastAsia="Georgia" w:hAnsi="Georgia"/>
-          <w:b w:val="0"/>
-          <w:bCs w:val="0"/>
-          <w:i w:val="0"/>
-          <w:iCs w:val="0"/>
           <w:sz w:val="22"/>
           <w:szCs w:val="22"/>
           <w:rtl w:val="0"/>
@@ -18172,10 +17672,6 @@
       <w:r>
         <w:rPr>
           <w:rFonts w:ascii="Georgia" w:cs="Georgia" w:eastAsia="Georgia" w:hAnsi="Georgia"/>
-          <w:b w:val="0"/>
-          <w:bCs w:val="0"/>
-          <w:i w:val="0"/>
-          <w:iCs w:val="0"/>
           <w:sz w:val="22"/>
           <w:szCs w:val="22"/>
           <w:rtl w:val="0"/>
@@ -18239,10 +17735,6 @@
       <w:r>
         <w:rPr>
           <w:rFonts w:ascii="Georgia" w:cs="Georgia" w:eastAsia="Georgia" w:hAnsi="Georgia"/>
-          <w:b w:val="0"/>
-          <w:bCs w:val="0"/>
-          <w:i w:val="0"/>
-          <w:iCs w:val="0"/>
           <w:sz w:val="22"/>
           <w:szCs w:val="22"/>
           <w:rtl w:val="0"/>
@@ -18267,10 +17759,6 @@
       <w:r>
         <w:rPr>
           <w:rFonts w:ascii="Georgia" w:cs="Georgia" w:eastAsia="Georgia" w:hAnsi="Georgia"/>
-          <w:b w:val="0"/>
-          <w:bCs w:val="0"/>
-          <w:i w:val="1"/>
-          <w:iCs w:val="1"/>
           <w:sz w:val="22"/>
           <w:szCs w:val="22"/>
           <w:rtl w:val="0"/>
@@ -18295,10 +17783,6 @@
       <w:r>
         <w:rPr>
           <w:rFonts w:ascii="Georgia" w:cs="Georgia" w:eastAsia="Georgia" w:hAnsi="Georgia"/>
-          <w:b w:val="0"/>
-          <w:bCs w:val="0"/>
-          <w:i w:val="0"/>
-          <w:iCs w:val="0"/>
           <w:sz w:val="22"/>
           <w:szCs w:val="22"/>
           <w:rtl w:val="0"/>
@@ -19838,10 +19322,6 @@
       <w:r>
         <w:rPr>
           <w:rFonts w:ascii="Georgia" w:cs="Georgia" w:eastAsia="Georgia" w:hAnsi="Georgia"/>
-          <w:b w:val="0"/>
-          <w:bCs w:val="0"/>
-          <w:i w:val="0"/>
-          <w:iCs w:val="0"/>
           <w:sz w:val="22"/>
           <w:szCs w:val="22"/>
           <w:rtl w:val="0"/>
@@ -19866,10 +19346,6 @@
       <w:r>
         <w:rPr>
           <w:rFonts w:ascii="Georgia" w:cs="Georgia" w:eastAsia="Georgia" w:hAnsi="Georgia"/>
-          <w:b w:val="0"/>
-          <w:bCs w:val="0"/>
-          <w:i w:val="0"/>
-          <w:iCs w:val="0"/>
           <w:sz w:val="22"/>
           <w:szCs w:val="22"/>
           <w:rtl w:val="0"/>
@@ -21404,10 +20880,6 @@
       <w:r>
         <w:rPr>
           <w:rFonts w:ascii="Georgia" w:cs="Georgia" w:eastAsia="Georgia" w:hAnsi="Georgia"/>
-          <w:b w:val="0"/>
-          <w:bCs w:val="0"/>
-          <w:i w:val="0"/>
-          <w:iCs w:val="0"/>
           <w:sz w:val="22"/>
           <w:szCs w:val="22"/>
           <w:rtl w:val="0"/>
@@ -21471,10 +20943,6 @@
       <w:r>
         <w:rPr>
           <w:rFonts w:ascii="Georgia" w:cs="Georgia" w:eastAsia="Georgia" w:hAnsi="Georgia"/>
-          <w:b w:val="0"/>
-          <w:bCs w:val="0"/>
-          <w:i w:val="0"/>
-          <w:iCs w:val="0"/>
           <w:sz w:val="22"/>
           <w:szCs w:val="22"/>
           <w:rtl w:val="0"/>
@@ -21679,10 +21147,6 @@
       <w:r>
         <w:rPr>
           <w:rFonts w:ascii="Georgia" w:cs="Georgia" w:eastAsia="Georgia" w:hAnsi="Georgia"/>
-          <w:b w:val="0"/>
-          <w:bCs w:val="0"/>
-          <w:i w:val="0"/>
-          <w:iCs w:val="0"/>
           <w:sz w:val="22"/>
           <w:szCs w:val="22"/>
           <w:rtl w:val="0"/>
@@ -21707,10 +21171,6 @@
       <w:r>
         <w:rPr>
           <w:rFonts w:ascii="Georgia" w:cs="Georgia" w:eastAsia="Georgia" w:hAnsi="Georgia"/>
-          <w:b w:val="0"/>
-          <w:bCs w:val="0"/>
-          <w:i w:val="0"/>
-          <w:iCs w:val="0"/>
           <w:sz w:val="22"/>
           <w:szCs w:val="22"/>
           <w:rtl w:val="0"/>
@@ -21870,10 +21330,6 @@
       <w:r>
         <w:rPr>
           <w:rFonts w:ascii="Georgia" w:cs="Georgia" w:eastAsia="Georgia" w:hAnsi="Georgia"/>
-          <w:b w:val="0"/>
-          <w:bCs w:val="0"/>
-          <w:i w:val="0"/>
-          <w:iCs w:val="0"/>
           <w:sz w:val="22"/>
           <w:szCs w:val="22"/>
           <w:rtl w:val="0"/>

</xml_diff>

<commit_message>
Draft_127_body: force thematic format on all lit-review and discussion heads
</commit_message>
<xml_diff>
--- a/thesis/003_ThesisProposal_Draft_127_body.docx
+++ b/thesis/003_ThesisProposal_Draft_127_body.docx
@@ -706,28 +706,516 @@
     <w:p>
       <w:pPr>
         <w:spacing w:before="0" w:after="0" w:line="480" w:lineRule="auto"/>
+      </w:pPr>
+      <w:r>
+        <w:t xml:space="preserve"/>
+      </w:r>
+    </w:p>
+    <w:p>
+      <w:pPr>
+        <w:keepNext/>
+        <w:spacing w:before="0" w:after="0" w:line="480" w:lineRule="auto"/>
+        <w:jc w:val="left"/>
+      </w:pPr>
+      <w:r>
+        <w:rPr>
+          <w:rFonts w:ascii="Georgia" w:cs="Georgia" w:eastAsia="Georgia" w:hAnsi="Georgia"/>
+          <w:i w:val="1"/>
+          <w:iCs w:val="1"/>
+          <w:sz w:val="24"/>
+          <w:szCs w:val="24"/>
+          <w:rtl w:val="0"/>
+        </w:rPr>
+        <w:t xml:space="preserve">Hedging in Undergraduate Writing</w:t>
+      </w:r>
+      <w:r>
+        <w:rPr>
+          <w:rtl w:val="0"/>
+          <w:rFonts w:ascii="Georgia" w:hAnsi="Georgia" w:cs="Georgia"/>
+          <w:sz w:val="24"/>
+          <w:szCs w:val="24"/>
+          <w:i/>
+          <w:iCs/>
+        </w:rPr>
+      </w:r>
+    </w:p>
+    <w:p>
+      <w:pPr>
+        <w:spacing w:before="0" w:after="0" w:line="480" w:lineRule="auto"/>
         <w:ind w:firstLine="720"/>
         <w:jc w:val="both"/>
       </w:pPr>
       <w:r>
         <w:rPr>
           <w:rFonts w:ascii="Georgia" w:cs="Georgia" w:eastAsia="Georgia" w:hAnsi="Georgia"/>
-          <w:b w:val="0"/>
-          <w:bCs w:val="0"/>
+          <w:sz w:val="22"/>
+          <w:szCs w:val="22"/>
+          <w:rtl w:val="0"/>
+        </w:rPr>
+        <w:t xml:space="preserve">Studies of developing researchers converge on a restricted hedging repertoire, but the evidence is not a single undifferentiated claim. Khunasathitchai et al. (2025) analyzed move structure and hedge use in 60 research paper abstracts written by Thai EFL English-majored undergraduates. Three moves were obligatory in their sample: presenting the research, describing the methodology, and summarizing the findings. Hedges appeared in the moves that present the research, summarize findings, and discuss the study, not evenly across the abstract. Modal verbs were the most frequent hedge type, followed by epistemic lexical verbs and epistemic adverbs, while epistemic adjectives were rare and epistemic nouns were absent. The inventory is therefore small and modal-heavy even in a language-major sample writing the high-stakes abstract genre. Suratno and Aydawati (2025) shift the lens to discussion sections of non-science undergraduate theses. Using a corpus of 30 theses (over 100,000 words), they found that student writers relied heavily on the modal dapat compared with other hedging devices. That concentration suggests limited familiarity with a wider hedge set. Because discussion sections offer more rhetorical space than abstracts, the finding is telling: restricted variety is not only a product of length pressure. It also reflects a developing stance repertoire that has not yet branched into the fuller range of forms common in expert writing.</w:t>
+      </w:r>
+      <w:r>
+        <w:rPr>
+          <w:rtl w:val="0"/>
+          <w:rFonts w:ascii="Georgia" w:hAnsi="Georgia" w:cs="Georgia"/>
+          <w:sz w:val="22"/>
+          <w:szCs w:val="22"/>
+        </w:rPr>
+      </w:r>
+    </w:p>
+    <w:p>
+      <w:pPr>
+        <w:spacing w:before="0" w:after="0" w:line="480" w:lineRule="auto"/>
+        <w:ind w:firstLine="720"/>
+        <w:jc w:val="both"/>
+      </w:pPr>
+      <w:r>
+        <w:rPr>
+          <w:rFonts w:ascii="Georgia" w:cs="Georgia" w:eastAsia="Georgia" w:hAnsi="Georgia"/>
+          <w:sz w:val="22"/>
+          <w:szCs w:val="22"/>
+          <w:rtl w:val="0"/>
+        </w:rPr>
+        <w:t xml:space="preserve">Ghia et al. (2022) supply one of the clearest abstract-focused accounts. They built a corpus of 217 English-language bachelor’s thesis abstracts written by advanced Italian EFL undergraduates specializing in linguistic and cross-cultural mediation, totaling 287,048 words, and compared hedge use with a subsection of successful L1 student writing in MICUSP. Fifteen hedge forms were set against boosters and modals of logical possibility and inferential certainty. The EFL abstracts used fewer hedges overall and leaned more on boosters and on modals of epistemic certainty than the L1 comparison group. At the same time, patterns in the two corpora still showed parallelisms, which the authors read as awareness of hedging strategies rather than absence of the concept. The study matters for the present work because it isolates the thesis abstract as a genre and shows that advanced student writers can under-hedge even when their programs center on language. Mazidah et al. (2022) compared hedges and boosters in 50 undergraduate thesis abstracts from Qomaruddin University: 25 from an English Language Education program and 25 from a Mathematics program. Coding followed Hyland’s (2005) taxonomy throughout. Across the sample they recorded 53 hedge tokens (22 variants) against 130 booster tokens (17 variants), so boosters outnumbered hedges overall. Mathematics abstracts used more hedge tokens than the English-education abstracts, while the English-education group still showed a wider set of hedge word variants. The authors link student hedging to limited knowledge of English academic rhetoric. For the present study, the result underscores that undergraduate abstracts can favor certainty markers as much as caution, and that program differences need not follow a simple language-versus-science split.</w:t>
+      </w:r>
+      <w:r>
+        <w:rPr>
+          <w:rtl w:val="0"/>
+          <w:rFonts w:ascii="Georgia" w:hAnsi="Georgia" w:cs="Georgia"/>
+          <w:sz w:val="22"/>
+          <w:szCs w:val="22"/>
+        </w:rPr>
+      </w:r>
+    </w:p>
+    <w:p>
+      <w:pPr>
+        <w:spacing w:before="0" w:after="0" w:line="480" w:lineRule="auto"/>
+        <w:ind w:firstLine="720"/>
+        <w:jc w:val="both"/>
+      </w:pPr>
+      <w:r>
+        <w:rPr>
+          <w:rFonts w:ascii="Georgia" w:cs="Georgia" w:eastAsia="Georgia" w:hAnsi="Georgia"/>
+          <w:sz w:val="22"/>
+          <w:szCs w:val="22"/>
+          <w:rtl w:val="0"/>
+        </w:rPr>
+        <w:t xml:space="preserve">Wang (2022) widens the student-writing picture by comparing hedging across sixteen disciplines in MICUSP. Five types of hedging devices were examined in successful upper-level student papers rather than in expert research articles alone. Hedging was more common in argumentation-driven disciplines than in data-driven ones, and further differences appeared between disciplines housed under the same broad division. That pattern challenges a simple natural-versus-social science split: two science fields need not hedge alike, and two fields within the same division need not either. Modal auxiliaries were one of the device types tracked, and disciplinary profiles for modal-auxiliary hedges differed across the corpus. Wang’s study therefore supports disciplinary comparison among student writers while also showing that aggregate “more hedging” can hide different formal mixes. For applied life-science undergraduates, the implication is that any cross-program difference at PSAU should be read against this dual finding: discipline can matter, and form-level patterns need to be reported alongside density.</w:t>
+      </w:r>
+      <w:r>
+        <w:rPr>
+          <w:rtl w:val="0"/>
+          <w:rFonts w:ascii="Georgia" w:hAnsi="Georgia" w:cs="Georgia"/>
+          <w:sz w:val="22"/>
+          <w:szCs w:val="22"/>
+        </w:rPr>
+      </w:r>
+    </w:p>
+    <w:p>
+      <w:pPr>
+        <w:spacing w:before="0" w:after="0" w:line="480" w:lineRule="auto"/>
+        <w:ind w:firstLine="720"/>
+        <w:jc w:val="both"/>
+      </w:pPr>
+      <w:r>
+        <w:rPr>
+          <w:rFonts w:ascii="Georgia" w:cs="Georgia" w:eastAsia="Georgia" w:hAnsi="Georgia"/>
+          <w:sz w:val="22"/>
+          <w:szCs w:val="22"/>
+          <w:rtl w:val="0"/>
+        </w:rPr>
+        <w:t xml:space="preserve">Halabisaz et al. (2014) focus the comparison on thesis abstracts in applied linguistics. They sampled 300 master’s abstracts written between 2000 and 2013, split between English L1 writers and Iranian student writers, and coded hedges according to Crompton’s (1997) taxonomy. English L1 writers used more hedging devices overall, and student writers used fewer. The authors attribute the difference to rhetorical sensitivity, modality, awareness of audience and purpose, and cultural background. Because the unit of analysis is the thesis abstract, the study sits closer to the present design than full-paper comparisons do. It also shows that L1-second-language differences in hedging can appear even among writers who have completed substantial graduate coursework in a language-related field.</w:t>
+      </w:r>
+      <w:r>
+        <w:rPr>
+          <w:rtl w:val="0"/>
+          <w:rFonts w:ascii="Georgia" w:hAnsi="Georgia" w:cs="Georgia"/>
+          <w:sz w:val="22"/>
+          <w:szCs w:val="22"/>
+        </w:rPr>
+      </w:r>
+    </w:p>
+    <w:p>
+      <w:pPr>
+        <w:spacing w:before="0" w:after="0" w:line="480" w:lineRule="auto"/>
+        <w:ind w:firstLine="720"/>
+        <w:jc w:val="both"/>
+      </w:pPr>
+      <w:r>
+        <w:rPr>
+          <w:rFonts w:ascii="Georgia" w:cs="Georgia" w:eastAsia="Georgia" w:hAnsi="Georgia"/>
+          <w:sz w:val="22"/>
+          <w:szCs w:val="22"/>
+          <w:rtl w:val="0"/>
+        </w:rPr>
+        <w:t xml:space="preserve">Taken together, these studies show that undergraduate and master’s-level writers often under-deploy hedges, lean on a limited set of forms (often modals), and may differ by program without matching expert disciplinary profiles. Clear gaps remain for the present work: only a few of these studies examined abstracts specifically, and most of those focused on English or language majors rather than applied science programs. Others analyzed discussion sections or full papers, where rhetorical space is wider. None is set in a Philippine context for Agriculture, Veterinary Medicine, and Biology undergraduate thesis abstracts.</w:t>
+      </w:r>
+      <w:r>
+        <w:rPr>
+          <w:rtl w:val="0"/>
+          <w:rFonts w:ascii="Georgia" w:hAnsi="Georgia" w:cs="Georgia"/>
+          <w:sz w:val="22"/>
+          <w:szCs w:val="22"/>
+        </w:rPr>
+      </w:r>
+    </w:p>
+    <w:p>
+      <w:pPr>
+        <w:spacing w:before="0" w:after="0" w:line="480" w:lineRule="auto"/>
+      </w:pPr>
+      <w:r>
+        <w:t xml:space="preserve"/>
+      </w:r>
+    </w:p>
+    <w:p>
+      <w:pPr>
+        <w:keepNext/>
+        <w:spacing w:before="0" w:after="0" w:line="480" w:lineRule="auto"/>
+        <w:jc w:val="left"/>
+      </w:pPr>
+      <w:r>
+        <w:rPr>
+          <w:rFonts w:ascii="Georgia" w:cs="Georgia" w:eastAsia="Georgia" w:hAnsi="Georgia"/>
+          <w:sz w:val="24"/>
+          <w:szCs w:val="24"/>
+          <w:rtl w:val="0"/>
+          <w:i/>
+          <w:iCs/>
+        </w:rPr>
+        <w:t xml:space="preserve">Disciplinary Variation in Scientific and Medical Writing</w:t>
+      </w:r>
+      <w:r>
+        <w:rPr>
+          <w:rtl w:val="0"/>
+          <w:rFonts w:ascii="Georgia" w:hAnsi="Georgia" w:cs="Georgia"/>
+          <w:sz w:val="24"/>
+          <w:szCs w:val="24"/>
+          <w:i/>
+          <w:iCs/>
+        </w:rPr>
+      </w:r>
+    </w:p>
+    <w:p>
+      <w:pPr>
+        <w:spacing w:before="0" w:after="0" w:line="480" w:lineRule="auto"/>
+        <w:ind w:firstLine="720"/>
+        <w:jc w:val="both"/>
+      </w:pPr>
+      <w:r>
+        <w:rPr>
+          <w:rFonts w:ascii="Georgia" w:cs="Georgia" w:eastAsia="Georgia" w:hAnsi="Georgia"/>
+          <w:sz w:val="22"/>
+          <w:szCs w:val="22"/>
+          <w:rtl w:val="0"/>
+        </w:rPr>
+        <w:t xml:space="preserve">Field norms shape expert hedging, but not along a simple hard-or-soft divide. Hyland (1996) grounds that claim in scientific research writing itself. In a corpus of 26 molecular biology research articles, he shows that hedging is central to gaining reader acceptance of claims. Writers use hedges to state findings with precision, caution, and deference to colleagues rather than as optional politeness. Lexical forms carry most of the load: about 79% of hedging instances are lexical, mainly verbs, adjectives, and adverbs, rather than modal verbs alone. That formal profile matters for later comparison with undergraduate biology and applied-life-science abstracts that may lean more heavily on a small modal set.</w:t>
+      </w:r>
+      <w:r>
+        <w:rPr>
+          <w:rtl w:val="0"/>
+          <w:rFonts w:ascii="Georgia" w:hAnsi="Georgia" w:cs="Georgia"/>
+          <w:sz w:val="22"/>
+          <w:szCs w:val="22"/>
+        </w:rPr>
+      </w:r>
+    </w:p>
+    <w:p>
+      <w:pPr>
+        <w:spacing w:before="0" w:after="0" w:line="480" w:lineRule="auto"/>
+        <w:ind w:firstLine="720"/>
+        <w:jc w:val="both"/>
+      </w:pPr>
+      <w:r>
+        <w:rPr>
+          <w:rFonts w:ascii="Georgia" w:cs="Georgia" w:eastAsia="Georgia" w:hAnsi="Georgia"/>
+          <w:sz w:val="22"/>
+          <w:szCs w:val="22"/>
+          <w:rtl w:val="0"/>
+        </w:rPr>
+        <w:t xml:space="preserve">Afshar et al. (2014) scale the comparison across fields. They examined Discussion sections of 180 research articles from Humanities (Law, Persian literature, TEFL), Basic Sciences (Biology, Applied Chemistry, Geology), and Agriculture (Biotechnology, Soil Sciences, Horticulture), with 20 articles per sub-field, using Salager-Meyer’s (1994) taxonomy. Significant differences appeared both among the three fields and among sub-fields within each field. Humanities articles carried the highest overall hedge counts. Agriculture and Basic Sciences sat lower, with further unevenness inside each label. The study therefore does more than rank soft above hard. It shows that sub-field matters even when articles share a broad disciplinary name.</w:t>
+      </w:r>
+      <w:r>
+        <w:rPr>
+          <w:rtl w:val="0"/>
+          <w:rFonts w:ascii="Georgia" w:hAnsi="Georgia" w:cs="Georgia"/>
+          <w:sz w:val="22"/>
+          <w:szCs w:val="22"/>
+        </w:rPr>
+      </w:r>
+    </w:p>
+    <w:p>
+      <w:pPr>
+        <w:spacing w:before="0" w:after="0" w:line="480" w:lineRule="auto"/>
+        <w:ind w:firstLine="720"/>
+        <w:jc w:val="both"/>
+      </w:pPr>
+      <w:r>
+        <w:rPr>
+          <w:rFonts w:ascii="Georgia" w:cs="Georgia" w:eastAsia="Georgia" w:hAnsi="Georgia"/>
+          <w:sz w:val="22"/>
+          <w:szCs w:val="22"/>
+          <w:rtl w:val="0"/>
+        </w:rPr>
+        <w:t xml:space="preserve">Mohammed (2011) takes a different cut by comparing lexical hedges in biochemistry and applied-linguistics research articles by American and Arabic authors. The study found that American writers used more hedging forms than Arabic writers in both disciplines. Linguists used considerably fewer hedges than scientists, and biochemistry articles were more heavily hedged than applied-linguistics articles. Discussion sections contained more hedges than introductions. Because Mohammed focuses on lexical hedges rather than Salager-Meyer’s full taxonomy, the ranking cannot be stacked directly onto Afshar et al.’s field totals. What the two studies share is that density tracks the pairing under analysis and the coding scheme, not a single universal hard-or-soft scale.</w:t>
+      </w:r>
+      <w:r>
+        <w:rPr>
+          <w:rtl w:val="0"/>
+          <w:rFonts w:ascii="Georgia" w:hAnsi="Georgia" w:cs="Georgia"/>
+          <w:sz w:val="22"/>
+          <w:szCs w:val="22"/>
+        </w:rPr>
+      </w:r>
+    </w:p>
+    <w:p>
+      <w:pPr>
+        <w:spacing w:before="0" w:after="0" w:line="480" w:lineRule="auto"/>
+        <w:ind w:firstLine="720"/>
+        <w:jc w:val="both"/>
+      </w:pPr>
+      <w:r>
+        <w:rPr>
+          <w:rFonts w:ascii="Georgia" w:cs="Georgia" w:eastAsia="Georgia" w:hAnsi="Georgia"/>
+          <w:sz w:val="22"/>
+          <w:szCs w:val="22"/>
+          <w:rtl w:val="0"/>
+        </w:rPr>
+        <w:t xml:space="preserve">Rezvani and Javadi (2021) test hard-versus-soft differences in abstracts by Iranian writers of English. They sampled 200 research-article abstracts, 50 each from chemistry, mathematics, philosophy, and English, grouped as hard and soft sciences under Biglan’s (1973) typology. Soft-science abstracts used more hedge expressions overall, and soft writers drew more on modals, verbs, nouns, adjectives, and adverbs, while hard-science writers used more conditional expressions. Epistemic and cognition verbs were the most frequent hedging expressions in both groups. The study supports disciplinary differentiation inside the compressed abstract genre and shows that form mix, not only density, separates the two clusters.</w:t>
+      </w:r>
+      <w:r>
+        <w:rPr>
+          <w:rtl w:val="0"/>
+          <w:rFonts w:ascii="Georgia" w:hAnsi="Georgia" w:cs="Georgia"/>
+          <w:sz w:val="22"/>
+          <w:szCs w:val="22"/>
+        </w:rPr>
+      </w:r>
+    </w:p>
+    <w:p>
+      <w:pPr>
+        <w:spacing w:before="0" w:after="0" w:line="480" w:lineRule="auto"/>
+        <w:ind w:firstLine="720"/>
+        <w:jc w:val="both"/>
+      </w:pPr>
+      <w:r>
+        <w:rPr>
+          <w:rFonts w:ascii="Georgia" w:cs="Georgia" w:eastAsia="Georgia" w:hAnsi="Georgia"/>
+          <w:sz w:val="22"/>
+          <w:szCs w:val="22"/>
+          <w:rtl w:val="0"/>
+        </w:rPr>
+        <w:t xml:space="preserve">Bonyadi, Gholami, and Nasiri (2012) keep the lens on an applied science close to agriculture. They compared hedges in Discussion sections of 60 environmental-sciences research articles: 20 by English research writers, 20 by Iranian writers in English, and 20 by Iranian writers in Farsi, coded with Salager-Meyer’s (1994) taxonomy. English and Iranian English articles did not differ significantly in hedge use, but English and Farsi articles did. The authors link the English-Farsi gap to rhetorical preference in Farsi for less hedged, more categorically validated prose, a pattern that sits at odds with international environmental-science discourse expectations. For the present corpus, the study is a reminder that applied-science hedging norms are international as well as disciplinary, and that L1 background can still shape English research writing in the same field.</w:t>
+      </w:r>
+      <w:r>
+        <w:rPr>
+          <w:rtl w:val="0"/>
+          <w:rFonts w:ascii="Georgia" w:hAnsi="Georgia" w:cs="Georgia"/>
+          <w:sz w:val="22"/>
+          <w:szCs w:val="22"/>
+        </w:rPr>
+      </w:r>
+    </w:p>
+    <w:p>
+      <w:pPr>
+        <w:spacing w:before="0" w:after="0" w:line="480" w:lineRule="auto"/>
+        <w:ind w:firstLine="720"/>
+        <w:jc w:val="both"/>
+      </w:pPr>
+      <w:r>
+        <w:rPr>
+          <w:rFonts w:ascii="Georgia" w:cs="Georgia" w:eastAsia="Georgia" w:hAnsi="Georgia"/>
+          <w:sz w:val="22"/>
+          <w:szCs w:val="22"/>
+          <w:rtl w:val="0"/>
+        </w:rPr>
+        <w:t xml:space="preserve">Within life sciences proper, Souici and Slougui (2022) examined 31 biology research articles by Algerian authors from five locally published journals. Main verbs were the most prominent hedge category. Within that category, non-factive reporting verbs ranked highest. Writers relied on those verbs to support and frame findings rather than on a wide modal set alone. Hamidi et al. (2025) compared conclusion sections of basic-science and clinical-science papers in the Medical Journal of the Islamic Republic of Iran. Clinical papers used more hedge tokens (330 versus 154), yet an inferential test found no statistically significant difference. Journal standards and cultural factors, the authors argue, shape hedging as much as the basic-versus-clinical split.</w:t>
+      </w:r>
+      <w:r>
+        <w:rPr>
+          <w:rtl w:val="0"/>
+          <w:rFonts w:ascii="Georgia" w:hAnsi="Georgia" w:cs="Georgia"/>
+          <w:sz w:val="22"/>
+          <w:szCs w:val="22"/>
+        </w:rPr>
+      </w:r>
+    </w:p>
+    <w:p>
+      <w:pPr>
+        <w:spacing w:before="0" w:after="0" w:line="480" w:lineRule="auto"/>
+        <w:ind w:firstLine="720"/>
+        <w:jc w:val="both"/>
+      </w:pPr>
+      <w:r>
+        <w:rPr>
+          <w:rFonts w:ascii="Georgia" w:cs="Georgia" w:eastAsia="Georgia" w:hAnsi="Georgia"/>
+          <w:sz w:val="22"/>
+          <w:szCs w:val="22"/>
+          <w:rtl w:val="0"/>
+        </w:rPr>
+        <w:t xml:space="preserve">Salager-Meyer (1994) anchors much of this comparative work in medical English. In research papers and case reports from leading medical journals, hedge frequency and category distribution shifted with rhetorical section. Discussion and Comment sections were the most heavily hedged. Methods and case-report body sections were among the least. Shields, approximators, and compound hedges accounted for the great majority of devices. Introductions favored shields, especially epistemic verbs, as writers carved an early niche for the study. That section pattern matters for how medical writers present results. Directly measured findings often remain categorical, and hedging rises where writers move from measurement to interpretation, generalization, or clinical implication. The same medical discourse can therefore look firm in the results strip and still manage claim responsibility in the interpretive strip.</w:t>
+      </w:r>
+      <w:r>
+        <w:rPr>
+          <w:rtl w:val="0"/>
+          <w:rFonts w:ascii="Georgia" w:hAnsi="Georgia" w:cs="Georgia"/>
+          <w:sz w:val="22"/>
+          <w:szCs w:val="22"/>
+        </w:rPr>
+      </w:r>
+    </w:p>
+    <w:p>
+      <w:pPr>
+        <w:spacing w:before="0" w:after="0" w:line="480" w:lineRule="auto"/>
+        <w:ind w:firstLine="720"/>
+        <w:jc w:val="both"/>
+      </w:pPr>
+      <w:r>
+        <w:rPr>
+          <w:rFonts w:ascii="Georgia" w:cs="Georgia" w:eastAsia="Georgia" w:hAnsi="Georgia"/>
+          <w:sz w:val="22"/>
+          <w:szCs w:val="22"/>
+          <w:rtl w:val="0"/>
+        </w:rPr>
+        <w:t xml:space="preserve">Corpus work on medical Results and Discussion sections supports that reading. Doğan and Akbaş (2021) analysed about 215,000 words from the Results and Discussion sections of 100 medical research articles across fields from anatomy to endocrinology. Medical writers used modal auxiliaries frequently to mark stance. They did not rely on a matching surge of boosters to amplify commitment. Where boosters appeared, they were often strategic, used to support credibility and reader engagement rather than as a default claim of certainty. Medical scientific English in those sections is therefore better described as calibrated commitment than as either blanket tentativeness or blanket conviction.</w:t>
+      </w:r>
+      <w:r>
+        <w:rPr>
+          <w:rtl w:val="0"/>
+          <w:rFonts w:ascii="Georgia" w:hAnsi="Georgia" w:cs="Georgia"/>
+          <w:sz w:val="22"/>
+          <w:szCs w:val="22"/>
+        </w:rPr>
+      </w:r>
+    </w:p>
+    <w:p>
+      <w:pPr>
+        <w:spacing w:before="0" w:after="0" w:line="480" w:lineRule="auto"/>
+        <w:ind w:firstLine="720"/>
+        <w:jc w:val="both"/>
+      </w:pPr>
+      <w:r>
+        <w:rPr>
+          <w:rFonts w:ascii="Georgia" w:cs="Georgia" w:eastAsia="Georgia" w:hAnsi="Georgia"/>
+          <w:sz w:val="22"/>
+          <w:szCs w:val="22"/>
+          <w:rtl w:val="0"/>
+        </w:rPr>
+        <w:t xml:space="preserve">Lingard (2026) makes the same point in pedagogical terms for health-professions research writing. High authorial commitment is appropriate when the warrant is strong. Heavy hedging on a well-supported measurement can read as unnecessary softening. Low commitment remains necessary when the claim outruns the data. The issue is match of stance to warrant, not a medical culture of always agreeing or disagreeing more bluntly than other sciences.</w:t>
+      </w:r>
+      <w:r>
+        <w:rPr>
+          <w:rtl w:val="0"/>
+          <w:rFonts w:ascii="Georgia" w:hAnsi="Georgia" w:cs="Georgia"/>
+          <w:sz w:val="22"/>
+          <w:szCs w:val="22"/>
+        </w:rPr>
+      </w:r>
+    </w:p>
+    <w:p>
+      <w:pPr>
+        <w:spacing w:before="0" w:after="0" w:line="480" w:lineRule="auto"/>
+        <w:ind w:firstLine="720"/>
+        <w:jc w:val="both"/>
+      </w:pPr>
+      <w:r>
+        <w:rPr>
+          <w:rFonts w:ascii="Georgia" w:cs="Georgia" w:eastAsia="Georgia" w:hAnsi="Georgia"/>
+          <w:sz w:val="22"/>
+          <w:szCs w:val="22"/>
+          <w:rtl w:val="0"/>
+        </w:rPr>
+        <w:t xml:space="preserve">Cross-field comparisons complicate any simple medical-versus-other ranking, as Sepehri, Hajijalili, and Namaziandost (2019) compared hedges and boosters in 30 medical and 30 engineering research articles and found a significant disciplinary difference, with medical articles carrying more hedge tokens overall in their sample. Medical writing is not uniformly under-hedged relative to other technical fields. What remains distinctive is the reporting pattern inside the article: categorical presentation of measured results, denser hedging where interpretation and generalization begin. Hu and Cao (2011) add publication medium and evidence type outside medicine. In applied-linguistics journal abstracts, English-medium texts featured markedly more hedges than Chinese-medium texts, and empirical research abstracts used significantly more boosters than non-empirical articles. Stance choices therefore track section, medium, and evidence type as well as discipline.</w:t>
+      </w:r>
+      <w:r>
+        <w:rPr>
+          <w:rtl w:val="0"/>
+          <w:rFonts w:ascii="Georgia" w:hAnsi="Georgia" w:cs="Georgia"/>
+          <w:sz w:val="22"/>
+          <w:szCs w:val="22"/>
+        </w:rPr>
+      </w:r>
+    </w:p>
+    <w:p>
+      <w:pPr>
+        <w:spacing w:before="0" w:after="0" w:line="480" w:lineRule="auto"/>
+        <w:ind w:firstLine="720"/>
+        <w:jc w:val="both"/>
+      </w:pPr>
+      <w:r>
+        <w:rPr>
+          <w:rFonts w:ascii="Georgia" w:cs="Georgia" w:eastAsia="Georgia" w:hAnsi="Georgia"/>
+          <w:sz w:val="22"/>
+          <w:szCs w:val="22"/>
+          <w:rtl w:val="0"/>
+        </w:rPr>
+        <w:t xml:space="preserve">Smirnova and Pérez-Guerra (2025) ask whether formal stance features alone can recover hard-versus-soft disciplinary groups. Their corpus covers about 1.6 million words of research articles from eight disciplines: chemistry, physics, engineering, and mathematics on the hard side, and business studies, history, linguistics, and political science on the soft side. Grammatical and lexical stance features, including hedges, boosters, and self-mention, were quantified and modelled. Multivariate analysis identified features that significantly contributed to hard-versus-soft variation. Clustering on those formal frequencies alone grouped the eight disciplines into two clusters matching the original hard and soft division. The result strengthens the claim that disciplinary variation in stance is systematic enough to classify fields, even when meaning-based interpretation is set aside.</w:t>
+      </w:r>
+      <w:r>
+        <w:rPr>
+          <w:rtl w:val="0"/>
+          <w:rFonts w:ascii="Georgia" w:hAnsi="Georgia" w:cs="Georgia"/>
+          <w:sz w:val="22"/>
+          <w:szCs w:val="22"/>
+        </w:rPr>
+      </w:r>
+    </w:p>
+    <w:p>
+      <w:pPr>
+        <w:spacing w:before="0" w:after="0" w:line="480" w:lineRule="auto"/>
+        <w:ind w:firstLine="720"/>
+        <w:jc w:val="both"/>
+      </w:pPr>
+      <w:r>
+        <w:rPr>
+          <w:rFonts w:ascii="Georgia" w:cs="Georgia" w:eastAsia="Georgia" w:hAnsi="Georgia"/>
+          <w:sz w:val="22"/>
+          <w:szCs w:val="22"/>
+          <w:rtl w:val="0"/>
+        </w:rPr>
+        <w:t xml:space="preserve">Expert scientific English therefore shows measurable variation, but the variation is local to how each field, section, medium, and publication context handles evidence and claim risk. In medical and clinical writing, that local pattern includes categorical reporting of measured results and denser hedging when claims move into interpretation. For developing writers in second-language settings, the expert picture is a target rather than a description of current practice. The present study asks whether PSAU undergraduates in three applied programs already show any of that field-sensitive differentiation in the compressed genre of the thesis abstract.</w:t>
+      </w:r>
+      <w:r>
+        <w:rPr>
+          <w:rtl w:val="0"/>
+          <w:rFonts w:ascii="Georgia" w:hAnsi="Georgia" w:cs="Georgia"/>
+          <w:sz w:val="22"/>
+          <w:szCs w:val="22"/>
+        </w:rPr>
+      </w:r>
+    </w:p>
+    <w:p>
+      <w:pPr>
+        <w:spacing w:before="0" w:after="0" w:line="480" w:lineRule="auto"/>
+      </w:pPr>
+      <w:r>
+        <w:t xml:space="preserve"/>
+      </w:r>
+    </w:p>
+    <w:p>
+      <w:pPr>
+        <w:keepNext/>
+        <w:spacing w:before="0" w:after="0" w:line="480" w:lineRule="auto"/>
+        <w:jc w:val="left"/>
+      </w:pPr>
+      <w:r>
+        <w:rPr>
+          <w:rFonts w:ascii="Georgia" w:cs="Georgia" w:eastAsia="Georgia" w:hAnsi="Georgia"/>
           <w:i w:val="1"/>
           <w:iCs w:val="1"/>
-          <w:sz w:val="22"/>
-          <w:szCs w:val="22"/>
-          <w:rtl w:val="0"/>
-        </w:rPr>
-        <w:t xml:space="preserve">Hedging in Undergraduate Writing</w:t>
-      </w:r>
-      <w:r>
-        <w:rPr>
-          <w:rtl w:val="0"/>
-          <w:rFonts w:ascii="Georgia" w:hAnsi="Georgia" w:cs="Georgia"/>
-          <w:sz w:val="22"/>
-          <w:szCs w:val="22"/>
+          <w:sz w:val="24"/>
+          <w:szCs w:val="24"/>
+          <w:rtl w:val="0"/>
+        </w:rPr>
+        <w:t xml:space="preserve">Hedging in L2 and EFL Contexts</w:t>
+      </w:r>
+      <w:r>
+        <w:rPr>
+          <w:rtl w:val="0"/>
+          <w:rFonts w:ascii="Georgia" w:hAnsi="Georgia" w:cs="Georgia"/>
+          <w:sz w:val="24"/>
+          <w:szCs w:val="24"/>
+          <w:i/>
+          <w:iCs/>
         </w:rPr>
       </w:r>
     </w:p>
@@ -744,7 +1232,7 @@
           <w:szCs w:val="22"/>
           <w:rtl w:val="0"/>
         </w:rPr>
-        <w:t xml:space="preserve">Studies of developing researchers converge on a restricted hedging repertoire, but the evidence is not a single undifferentiated claim. Khunasathitchai et al. (2025) analyzed move structure and hedge use in 60 research paper abstracts written by Thai EFL English-majored undergraduates. Three moves were obligatory in their sample: presenting the research, describing the methodology, and summarizing the findings. Hedges appeared in the moves that present the research, summarize findings, and discuss the study, not evenly across the abstract. Modal verbs were the most frequent hedge type, followed by epistemic lexical verbs and epistemic adverbs, while epistemic adjectives were rare and epistemic nouns were absent. The inventory is therefore small and modal-heavy even in a language-major sample writing the high-stakes abstract genre. Suratno and Aydawati (2025) shift the lens to discussion sections of non-science undergraduate theses. Using a corpus of 30 theses (over 100,000 words), they found that student writers relied heavily on the modal dapat compared with other hedging devices. That concentration suggests limited familiarity with a wider hedge set. Because discussion sections offer more rhetorical space than abstracts, the finding is telling: restricted variety is not only a product of length pressure. It also reflects a developing stance repertoire that has not yet branched into the fuller range of forms common in expert writing.</w:t>
+        <w:t xml:space="preserve">English is the medium of academic writing at PSAU, but it is not the home language for most students. Research on second-language academic writing has long treated hedging as a point of difficulty rather than as a simple vocabulary gap. Hyland and Milton (1997) compared expressions of doubt and certainty in a one-million-word corpus of examination scripts from 900 Cantonese-speaking school leavers writing in English and 770 British learners of similar age and educational level. The L2 writers relied on a more limited range of epistemic items, offered stronger commitments, and showed greater difficulty conveying a precise degree of certainty than their L1 peers. That pattern remains a baseline across EFL research. L2 academic writers often under-qualify claims or overuse a small set of strong forms.</w:t>
       </w:r>
       <w:r>
         <w:rPr>
@@ -768,7 +1256,7 @@
           <w:szCs w:val="22"/>
           <w:rtl w:val="0"/>
         </w:rPr>
-        <w:t xml:space="preserve">Ghia et al. (2022) supply one of the clearest abstract-focused accounts. They built a corpus of 217 English-language bachelor’s thesis abstracts written by advanced Italian EFL undergraduates specializing in linguistic and cross-cultural mediation, totaling 287,048 words, and compared hedge use with a subsection of successful L1 student writing in MICUSP. Fifteen hedge forms were set against boosters and modals of logical possibility and inferential certainty. The EFL abstracts used fewer hedges overall and leaned more on boosters and on modals of epistemic certainty than the L1 comparison group. At the same time, patterns in the two corpora still showed parallelisms, which the authors read as awareness of hedging strategies rather than absence of the concept. The study matters for the present work because it isolates the thesis abstract as a genre and shows that advanced student writers can under-hedge even when their programs center on language. Mazidah et al. (2022) compared hedges and boosters in 50 undergraduate thesis abstracts from Qomaruddin University: 25 from an English Language Education program and 25 from a Mathematics program. Coding followed Hyland’s (2005) taxonomy throughout. Across the sample they recorded 53 hedge tokens (22 variants) against 130 booster tokens (17 variants), so boosters outnumbered hedges overall. Mathematics abstracts used more hedge tokens than the English-education abstracts, while the English-education group still showed a wider set of hedge word variants. The authors link student hedging to limited knowledge of English academic rhetoric. For the present study, the result underscores that undergraduate abstracts can favor certainty markers as much as caution, and that program differences need not follow a simple language-versus-science split.</w:t>
+        <w:t xml:space="preserve">Hinkel (2005) sharpens the formal picture with a large student-essay corpus of 745 essays and about 221,000 words. L2 writers used a limited range of hedging devices, many of them associated with conversational rather than formal written discourse. The same essays showed a prevalence of conversational intensifiers and overstatements that are common in informal speech but rare in academic prose. Demir (2018) compared lexical hedges in academic texts by English L1 and L2 writers and reported significant differences across modal, verbal, adjectival, adverbial, quantifier, and noun hedges, as well as in total hedge use. Taken together, these studies show that the L2 issue is not only density. It is range, register, and the balance between caution and overstatement.</w:t>
       </w:r>
       <w:r>
         <w:rPr>
@@ -792,7 +1280,7 @@
           <w:szCs w:val="22"/>
           <w:rtl w:val="0"/>
         </w:rPr>
-        <w:t xml:space="preserve">Wang (2022) widens the student-writing picture by comparing hedging across sixteen disciplines in MICUSP. Five types of hedging devices were examined in successful upper-level student papers rather than in expert research articles alone. Hedging was more common in argumentation-driven disciplines than in data-driven ones, and further differences appeared between disciplines housed under the same broad division. That pattern challenges a simple natural-versus-social science split: two science fields need not hedge alike, and two fields within the same division need not either. Modal auxiliaries were one of the device types tracked, and disciplinary profiles for modal-auxiliary hedges differed across the corpus. Wang’s study therefore supports disciplinary comparison among student writers while also showing that aggregate “more hedging” can hide different formal mixes. For applied life-science undergraduates, the implication is that any cross-program difference at PSAU should be read against this dual finding: discipline can matter, and form-level patterns need to be reported alongside density.</w:t>
+        <w:t xml:space="preserve">Takimoto (2015) adds a recognition layer. In a corpus comparison of academic essays by Japanese EFL learners and English L1 writers, the EFL group used more boosters than hedges and preferred straightforward, explicit expressions, whereas English L1 writers were more tentative. A follow-up task suggested that certainty items were more visible to the learners than possibility and probability items, which they often misapprehended. Underuse of hedges can therefore coexist with limited pragmatic awareness of what the missing forms do. Luo (2021), in a systematic review of undergraduate English language learners' hedging, reaches a similar aggregate conclusion. ELLs generally use fewer hedges than English L1 writers, draw on a narrower inventory, and face combined challenges of academic experience and L2 form control.</w:t>
       </w:r>
       <w:r>
         <w:rPr>
@@ -816,7 +1304,7 @@
           <w:szCs w:val="22"/>
           <w:rtl w:val="0"/>
         </w:rPr>
-        <w:t xml:space="preserve">Halabisaz et al. (2014) focus the comparison on thesis abstracts in applied linguistics. They sampled 300 master’s abstracts written between 2000 and 2013, split between English L1 writers and Iranian student writers, and coded hedges according to Crompton’s (1997) taxonomy. English L1 writers used more hedging devices overall, and student writers used fewer. The authors attribute the difference to rhetorical sensitivity, modality, awareness of audience and purpose, and cultural background. Because the unit of analysis is the thesis abstract, the study sits closer to the present design than full-paper comparisons do. It also shows that L1-second-language differences in hedging can appear even among writers who have completed substantial graduate coursework in a language-related field.</w:t>
+        <w:t xml:space="preserve">Alonso (2019) approaches the same problem through a multicompetence design rather than an L2-only comparison. She examined hedges in academic writing by 24 Spanish learners of English, collecting data from the same participants in both Spanish and English, and compared them with monolingual Spanish and monolingual English control groups of 24 speakers each. Hedges were coded following Hyland's (1994) typology. Chi-square analyses showed differences between English and Spanish speakers, and between English speakers and L2 learners, especially in impersonal expressions and lexical verbs. Evidence of crosslinguistic influence appeared, and similarity in the use of adverbs across the learners' L1 and L2 pointed to L1-L2 convergence. The design matters for the present study because it shows that L2 hedging patterns cannot be read as a pure deficit against English L1 norms without also considering the writer's full language system. Publication medium and cultural writing tradition can widen the same gap. Hu and Cao (2011) found that applied-linguistics abstracts in English-medium journals carried markedly more hedges than those in Chinese-medium journals, a difference they link jointly to rhetorical convention and epistemological belief.</w:t>
       </w:r>
       <w:r>
         <w:rPr>
@@ -840,7 +1328,7 @@
           <w:szCs w:val="22"/>
           <w:rtl w:val="0"/>
         </w:rPr>
-        <w:t xml:space="preserve">Taken together, these studies show that undergraduate and master’s-level writers often under-deploy hedges, lean on a limited set of forms (often modals), and may differ by program without matching expert disciplinary profiles. Clear gaps remain for the present work: only a few of these studies examined abstracts specifically, and most of those focused on English or language majors rather than applied science programs. Others analyzed discussion sections or full papers, where rhetorical space is wider. None is set in a Philippine context for Agriculture, Veterinary Medicine, and Biology undergraduate thesis abstracts.</w:t>
+        <w:t xml:space="preserve">Undergraduate thesis abstracts, the genre closest to the present corpus, show the same L2 pressures. As reviewed under undergraduate writing, Mazidah et al. (2022) and Ghia et al. (2022) report that L2 thesis abstracts often carry fewer hedges and stronger certainty marking than L1 comparison groups, even among language-oriented programs. Bayraktar-Cepni and Kulaksiz (2022) compared hedging in discussion sections of ELT MA and PhD theses and found that MA theses contained significantly more hedges than PhD theses, a difference they link to developing writers' stronger need to soften stance. Level of academic experience, not only L1 versus L2 status, therefore shapes how much caution writers encode.</w:t>
       </w:r>
       <w:r>
         <w:rPr>
@@ -864,14 +1352,50 @@
           <w:szCs w:val="22"/>
           <w:rtl w:val="0"/>
         </w:rPr>
-        <w:t xml:space="preserve">Disciplinary Variation in Scientific and Medical Writing</w:t>
-      </w:r>
-      <w:r>
-        <w:rPr>
-          <w:rtl w:val="0"/>
-          <w:rFonts w:ascii="Georgia" w:hAnsi="Georgia" w:cs="Georgia"/>
-          <w:sz w:val="22"/>
-          <w:szCs w:val="22"/>
+        <w:t xml:space="preserve">Instructional research points in the same direction. Petchkij (2019) argues that explicit teaching of hedges can raise their use in Thai EFL contexts, though modal forms often remain dominant. Loi and Lim (2015) analysed hedging orientations in discussion sections from the Journal of English for Academic Purposes and elicited specialist views on L2 difficulty. Those specialists attributed second-language learners' difficulty modulating claims to socio-cultural factors, classroom instruction, disciplinary culture, and disciplinary appeals, and stressed that pragmatic fluency in hedging is teachable rather than automatic. Regional ASEAN and Philippine learner studies, taken up in the next section, likewise report limited hedge inventories and frequent booster preference in student academic English (Ningrum et al., 2024; Lopez et al., 2025; Escalona, 2025). Since the present study does not measure English proficiency independently, observed patterns in the PSAU corpus may reflect L2 constraints, disciplinary socialization, instructional history, or some combination of these. The aim is a descriptive baseline of how stance is worded in ratified undergraduate thesis abstracts, not a test of which single factor causes the pattern.</w:t>
+      </w:r>
+      <w:r>
+        <w:rPr>
+          <w:rtl w:val="0"/>
+          <w:rFonts w:ascii="Georgia" w:hAnsi="Georgia" w:cs="Georgia"/>
+          <w:sz w:val="22"/>
+          <w:szCs w:val="22"/>
+        </w:rPr>
+      </w:r>
+    </w:p>
+    <w:p>
+      <w:pPr>
+        <w:spacing w:before="0" w:after="0" w:line="480" w:lineRule="auto"/>
+      </w:pPr>
+      <w:r>
+        <w:t xml:space="preserve"/>
+      </w:r>
+    </w:p>
+    <w:p>
+      <w:pPr>
+        <w:keepNext/>
+        <w:spacing w:before="0" w:after="0" w:line="480" w:lineRule="auto"/>
+        <w:jc w:val="left"/>
+      </w:pPr>
+      <w:r>
+        <w:rPr>
+          <w:rFonts w:ascii="Georgia" w:cs="Georgia" w:eastAsia="Georgia" w:hAnsi="Georgia"/>
+          <w:sz w:val="24"/>
+          <w:szCs w:val="24"/>
+          <w:rtl w:val="0"/>
+          <w:i/>
+          <w:iCs/>
+        </w:rPr>
+        <w:t xml:space="preserve">Hedging in Philippine Academic Writing Contexts</w:t>
+      </w:r>
+      <w:r>
+        <w:rPr>
+          <w:rtl w:val="0"/>
+          <w:rFonts w:ascii="Georgia" w:hAnsi="Georgia" w:cs="Georgia"/>
+          <w:sz w:val="24"/>
+          <w:szCs w:val="24"/>
+          <w:i/>
+          <w:iCs/>
         </w:rPr>
       </w:r>
     </w:p>
@@ -888,7 +1412,7 @@
           <w:szCs w:val="22"/>
           <w:rtl w:val="0"/>
         </w:rPr>
-        <w:t xml:space="preserve">Field norms shape expert hedging, but not along a simple hard-or-soft divide. Hyland (1996) grounds that claim in scientific research writing itself. In a corpus of 26 molecular biology research articles, he shows that hedging is central to gaining reader acceptance of claims. Writers use hedges to state findings with precision, caution, and deference to colleagues rather than as optional politeness. Lexical forms carry most of the load: about 79% of hedging instances are lexical, mainly verbs, adjectives, and adverbs, rather than modal verbs alone. That formal profile matters for later comparison with undergraduate biology and applied-life-science abstracts that may lean more heavily on a small modal set.</w:t>
+        <w:t xml:space="preserve">Philippine and regional findings align with the broader picture of English-medium student writing while adding local detail. Ningrum et al. (2024) analysed academic writing from the ICNALE learner corpus across ten ASEAN contexts, including the Philippines. ASEAN EFL learners preferred boosters over hedges. Overused boosters included completely, really, and always, while the most frequent hedges included usually, often, and maybe. The pattern suggests that regional learners often encode confidence more readily than caution in academic prose.</w:t>
       </w:r>
       <w:r>
         <w:rPr>
@@ -912,7 +1436,7 @@
           <w:szCs w:val="22"/>
           <w:rtl w:val="0"/>
         </w:rPr>
-        <w:t xml:space="preserve">Afshar et al. (2014) scale the comparison across fields. They examined Discussion sections of 180 research articles from Humanities (Law, Persian literature, TEFL), Basic Sciences (Biology, Applied Chemistry, Geology), and Agriculture (Biotechnology, Soil Sciences, Horticulture), with 20 articles per sub-field, using Salager-Meyer’s (1994) taxonomy. Significant differences appeared both among the three fields and among sub-fields within each field. Humanities articles carried the highest overall hedge counts. Agriculture and Basic Sciences sat lower, with further unevenness inside each label. The study therefore does more than rank soft above hard. It shows that sub-field matters even when articles share a broad disciplinary name.</w:t>
+        <w:t xml:space="preserve">Local college essay studies point in the same direction. Lopez et al. (2025) examined 50 argumentative essays by English Language Studies majors at a northern Philippine state university. Students showed developing-stage control of hedges and boosters, with epistemic modal verbs the most frequent forms across proficiency levels. Escalona (2025) compared hedges and boosters in essays by AB-English and BS-Information Technology students and found that female writers used hedges more often than male writers, while overall frequencies remained relatively consistent across major fields. Both studies examine essays rather than thesis abstracts, so they cannot be read as direct predictions for the present corpus. They do show that Philippine undergraduate academic English often leans on a small modal set and mixes intensifying moves with limited softening.</w:t>
       </w:r>
       <w:r>
         <w:rPr>
@@ -936,7 +1460,7 @@
           <w:szCs w:val="22"/>
           <w:rtl w:val="0"/>
         </w:rPr>
-        <w:t xml:space="preserve">Mohammed (2011) takes a different cut by comparing lexical hedges in biochemistry and applied-linguistics research articles by American and Arabic authors. The study found that American writers used more hedging forms than Arabic writers in both disciplines. Linguists used considerably fewer hedges than scientists, and biochemistry articles were more heavily hedged than applied-linguistics articles. Discussion sections contained more hedges than introductions. Because Mohammed focuses on lexical hedges rather than Salager-Meyer’s full taxonomy, the ranking cannot be stacked directly onto Afshar et al.’s field totals. What the two studies share is that density tracks the pairing under analysis and the coding scheme, not a single universal hard-or-soft scale.</w:t>
+        <w:t xml:space="preserve">Research on Philippine student research writing brings the evidence closer to the thesis genre. Luyun (2024) analysed introduction and conclusion sections in 41 undergraduate research papers from BSED and BEED programs at a Philippine university, using Mojica's hedge categories and Hyland's booster taxonomy. The most frequent hedge forms included this study, it, and the study, with may also appearing among Type I devices. The dominant booster was should, and no significant difference in hedge or booster frequency emerged between the two education programs. Melon-Galvez (2017) examined the hedging system of Filipino engineering students writing technical ESP texts and linked hedge use to framing, intertextuality, and task type, with pedagogical implications for precision and interpersonal stance in technical discourse.</w:t>
       </w:r>
       <w:r>
         <w:rPr>
@@ -960,7 +1484,7 @@
           <w:szCs w:val="22"/>
           <w:rtl w:val="0"/>
         </w:rPr>
-        <w:t xml:space="preserve">Rezvani and Javadi (2021) test hard-versus-soft differences in abstracts by Iranian writers of English. They sampled 200 research-article abstracts, 50 each from chemistry, mathematics, philosophy, and English, grouped as hard and soft sciences under Biglan’s (1973) typology. Soft-science abstracts used more hedge expressions overall, and soft writers drew more on modals, verbs, nouns, adjectives, and adverbs, while hard-science writers used more conditional expressions. Epistemic and cognition verbs were the most frequent hedging expressions in both groups. The study supports disciplinary differentiation inside the compressed abstract genre and shows that form mix, not only density, separates the two clusters.</w:t>
+        <w:t xml:space="preserve">Published research articles written in Philippine English add a professional layer. Magday et al. (2026) compared hedges in the Results and Discussion sections of 70 English Language Teaching research articles, 35 by Filipino writers and 35 by Thai writers. Filipino writers used hedges at a higher density (23.74 per 1,000 words) than Thai writers (17.63 per 1,000 words). The authors link the difference in part to the Philippines' ESL relationship with English versus Thailand's EFL context, even where disciplinary conventions are shared. Gamad et al. (2024) analysed metadiscourse markers in the Results, Discussion, and Conclusion sections of 90 research articles across social sciences, linguistics, and business in Philippine English, American English, and Chinese English. Hedges were the most frequent interactional markers overall, and Philippine English research articles showed comparatively high metadiscourse use, with interactional preferences varying by discipline.</w:t>
       </w:r>
       <w:r>
         <w:rPr>
@@ -984,513 +1508,39 @@
           <w:szCs w:val="22"/>
           <w:rtl w:val="0"/>
         </w:rPr>
-        <w:t xml:space="preserve">Bonyadi, Gholami, and Nasiri (2012) keep the lens on an applied science close to agriculture. They compared hedges in Discussion sections of 60 environmental-sciences research articles: 20 by English research writers, 20 by Iranian writers in English, and 20 by Iranian writers in Farsi, coded with Salager-Meyer’s (1994) taxonomy. English and Iranian English articles did not differ significantly in hedge use, but English and Farsi articles did. The authors link the English-Farsi gap to rhetorical preference in Farsi for less hedged, more categorically validated prose, a pattern that sits at odds with international environmental-science discourse expectations. For the present corpus, the study is a reminder that applied-science hedging norms are international as well as disciplinary, and that L1 background can still shape English research writing in the same field.</w:t>
-      </w:r>
-      <w:r>
-        <w:rPr>
-          <w:rtl w:val="0"/>
-          <w:rFonts w:ascii="Georgia" w:hAnsi="Georgia" w:cs="Georgia"/>
-          <w:sz w:val="22"/>
-          <w:szCs w:val="22"/>
-        </w:rPr>
-      </w:r>
-    </w:p>
-    <w:p>
-      <w:pPr>
-        <w:spacing w:before="0" w:after="0" w:line="480" w:lineRule="auto"/>
-        <w:ind w:firstLine="720"/>
-        <w:jc w:val="both"/>
+        <w:t>Outside student essays and research articles, Philippine editorial writing shows hedging as a context-sensitive resource rather than a fixed national style. Villanueva (2014) examined 30 editorials from three leading Philippine newspapers and found that nearly half of the hedges were references to official reports or authorities, with modals and adverbs making up a little over 30 percent. Those forms helped editors manage accountability and soften claims on politically sensitive topics. Grengia (2025) extended the editorial analysis to student publications, The Philippine Collegian and The LaSallian, and found deliberate but publication-specific hedge use tied to voice, audience, and rhetorical goals. Taken together, the Philippine evidence shows modal-heavy inventories, frequent booster preference in learner writing, and higher hedge density in some professional Filipino ELT research than in comparable EFL contexts. Published accounts of student hedging in the Philippines have centered on essays, education theses, or professional ELT articles rather than applied life-science undergraduate thesis abstracts. That gap is the present study’s descriptive starting point.</w:t>
+      </w:r>
+      <w:r>
+        <w:rPr>
+          <w:rFonts w:ascii="Georgia" w:hAnsi="Georgia" w:cs="Georgia" w:eastAsia="Georgia"/>
+          <w:sz w:val="22"/>
+          <w:rtl w:val="0"/>
+          <w:szCs w:val="22"/>
+        </w:rPr>
+      </w:r>
+    </w:p>
+    <w:p>
+      <w:pPr>
+        <w:spacing w:before="0" w:after="0" w:line="480" w:lineRule="auto"/>
+      </w:pPr>
+      <w:r>
+        <w:t xml:space="preserve"/>
+      </w:r>
+    </w:p>
+    <w:p>
+      <w:pPr>
+        <w:keepNext/>
+        <w:spacing w:before="0" w:after="0" w:line="480" w:lineRule="auto"/>
+        <w:jc w:val="left"/>
       </w:pPr>
       <w:r>
         <w:rPr>
           <w:rFonts w:ascii="Georgia" w:cs="Georgia" w:eastAsia="Georgia" w:hAnsi="Georgia"/>
-          <w:sz w:val="22"/>
-          <w:szCs w:val="22"/>
-          <w:rtl w:val="0"/>
-        </w:rPr>
-        <w:t xml:space="preserve">Within life sciences proper, Souici and Slougui (2022) examined 31 biology research articles by Algerian authors from five locally published journals. Main verbs were the most prominent hedge category. Within that category, non-factive reporting verbs ranked highest. Writers relied on those verbs to support and frame findings rather than on a wide modal set alone. Hamidi et al. (2025) compared conclusion sections of basic-science and clinical-science papers in the Medical Journal of the Islamic Republic of Iran. Clinical papers used more hedge tokens (330 versus 154), yet an inferential test found no statistically significant difference. Journal standards and cultural factors, the authors argue, shape hedging as much as the basic-versus-clinical split.</w:t>
-      </w:r>
-      <w:r>
-        <w:rPr>
-          <w:rtl w:val="0"/>
-          <w:rFonts w:ascii="Georgia" w:hAnsi="Georgia" w:cs="Georgia"/>
-          <w:sz w:val="22"/>
-          <w:szCs w:val="22"/>
-        </w:rPr>
-      </w:r>
-    </w:p>
-    <w:p>
-      <w:pPr>
-        <w:spacing w:before="0" w:after="0" w:line="480" w:lineRule="auto"/>
-        <w:ind w:firstLine="720"/>
-        <w:jc w:val="both"/>
-      </w:pPr>
-      <w:r>
-        <w:rPr>
-          <w:rFonts w:ascii="Georgia" w:cs="Georgia" w:eastAsia="Georgia" w:hAnsi="Georgia"/>
-          <w:sz w:val="22"/>
-          <w:szCs w:val="22"/>
-          <w:rtl w:val="0"/>
-        </w:rPr>
-        <w:t xml:space="preserve">Salager-Meyer (1994) anchors much of this comparative work in medical English. In research papers and case reports from leading medical journals, hedge frequency and category distribution shifted with rhetorical section. Discussion and Comment sections were the most heavily hedged. Methods and case-report body sections were among the least. Shields, approximators, and compound hedges accounted for the great majority of devices. Introductions favored shields, especially epistemic verbs, as writers carved an early niche for the study. That section pattern matters for how medical writers present results. Directly measured findings often remain categorical, and hedging rises where writers move from measurement to interpretation, generalization, or clinical implication. The same medical discourse can therefore look firm in the results strip and still manage claim responsibility in the interpretive strip.</w:t>
-      </w:r>
-      <w:r>
-        <w:rPr>
-          <w:rtl w:val="0"/>
-          <w:rFonts w:ascii="Georgia" w:hAnsi="Georgia" w:cs="Georgia"/>
-          <w:sz w:val="22"/>
-          <w:szCs w:val="22"/>
-        </w:rPr>
-      </w:r>
-    </w:p>
-    <w:p>
-      <w:pPr>
-        <w:spacing w:before="0" w:after="0" w:line="480" w:lineRule="auto"/>
-        <w:ind w:firstLine="720"/>
-        <w:jc w:val="both"/>
-      </w:pPr>
-      <w:r>
-        <w:rPr>
-          <w:rFonts w:ascii="Georgia" w:cs="Georgia" w:eastAsia="Georgia" w:hAnsi="Georgia"/>
-          <w:sz w:val="22"/>
-          <w:szCs w:val="22"/>
-          <w:rtl w:val="0"/>
-        </w:rPr>
-        <w:t xml:space="preserve">Corpus work on medical Results and Discussion sections supports that reading. Doğan and Akbaş (2021) analysed about 215,000 words from the Results and Discussion sections of 100 medical research articles across fields from anatomy to endocrinology. Medical writers used modal auxiliaries frequently to mark stance. They did not rely on a matching surge of boosters to amplify commitment. Where boosters appeared, they were often strategic, used to support credibility and reader engagement rather than as a default claim of certainty. Medical scientific English in those sections is therefore better described as calibrated commitment than as either blanket tentativeness or blanket conviction.</w:t>
-      </w:r>
-      <w:r>
-        <w:rPr>
-          <w:rtl w:val="0"/>
-          <w:rFonts w:ascii="Georgia" w:hAnsi="Georgia" w:cs="Georgia"/>
-          <w:sz w:val="22"/>
-          <w:szCs w:val="22"/>
-        </w:rPr>
-      </w:r>
-    </w:p>
-    <w:p>
-      <w:pPr>
-        <w:spacing w:before="0" w:after="0" w:line="480" w:lineRule="auto"/>
-        <w:ind w:firstLine="720"/>
-        <w:jc w:val="both"/>
-      </w:pPr>
-      <w:r>
-        <w:rPr>
-          <w:rFonts w:ascii="Georgia" w:cs="Georgia" w:eastAsia="Georgia" w:hAnsi="Georgia"/>
-          <w:sz w:val="22"/>
-          <w:szCs w:val="22"/>
-          <w:rtl w:val="0"/>
-        </w:rPr>
-        <w:t xml:space="preserve">Lingard (2026) makes the same point in pedagogical terms for health-professions research writing. High authorial commitment is appropriate when the warrant is strong. Heavy hedging on a well-supported measurement can read as unnecessary softening. Low commitment remains necessary when the claim outruns the data. The issue is match of stance to warrant, not a medical culture of always agreeing or disagreeing more bluntly than other sciences.</w:t>
-      </w:r>
-      <w:r>
-        <w:rPr>
-          <w:rtl w:val="0"/>
-          <w:rFonts w:ascii="Georgia" w:hAnsi="Georgia" w:cs="Georgia"/>
-          <w:sz w:val="22"/>
-          <w:szCs w:val="22"/>
-        </w:rPr>
-      </w:r>
-    </w:p>
-    <w:p>
-      <w:pPr>
-        <w:spacing w:before="0" w:after="0" w:line="480" w:lineRule="auto"/>
-        <w:ind w:firstLine="720"/>
-        <w:jc w:val="both"/>
-      </w:pPr>
-      <w:r>
-        <w:rPr>
-          <w:rFonts w:ascii="Georgia" w:cs="Georgia" w:eastAsia="Georgia" w:hAnsi="Georgia"/>
-          <w:sz w:val="22"/>
-          <w:szCs w:val="22"/>
-          <w:rtl w:val="0"/>
-        </w:rPr>
-        <w:t xml:space="preserve">Cross-field comparisons complicate any simple medical-versus-other ranking, as Sepehri, Hajijalili, and Namaziandost (2019) compared hedges and boosters in 30 medical and 30 engineering research articles and found a significant disciplinary difference, with medical articles carrying more hedge tokens overall in their sample. Medical writing is not uniformly under-hedged relative to other technical fields. What remains distinctive is the reporting pattern inside the article: categorical presentation of measured results, denser hedging where interpretation and generalization begin. Hu and Cao (2011) add publication medium and evidence type outside medicine. In applied-linguistics journal abstracts, English-medium texts featured markedly more hedges than Chinese-medium texts, and empirical research abstracts used significantly more boosters than non-empirical articles. Stance choices therefore track section, medium, and evidence type as well as discipline.</w:t>
-      </w:r>
-      <w:r>
-        <w:rPr>
-          <w:rtl w:val="0"/>
-          <w:rFonts w:ascii="Georgia" w:hAnsi="Georgia" w:cs="Georgia"/>
-          <w:sz w:val="22"/>
-          <w:szCs w:val="22"/>
-        </w:rPr>
-      </w:r>
-    </w:p>
-    <w:p>
-      <w:pPr>
-        <w:spacing w:before="0" w:after="0" w:line="480" w:lineRule="auto"/>
-        <w:ind w:firstLine="720"/>
-        <w:jc w:val="both"/>
-      </w:pPr>
-      <w:r>
-        <w:rPr>
-          <w:rFonts w:ascii="Georgia" w:cs="Georgia" w:eastAsia="Georgia" w:hAnsi="Georgia"/>
-          <w:sz w:val="22"/>
-          <w:szCs w:val="22"/>
-          <w:rtl w:val="0"/>
-        </w:rPr>
-        <w:t xml:space="preserve">Smirnova and Pérez-Guerra (2025) ask whether formal stance features alone can recover hard-versus-soft disciplinary groups. Their corpus covers about 1.6 million words of research articles from eight disciplines: chemistry, physics, engineering, and mathematics on the hard side, and business studies, history, linguistics, and political science on the soft side. Grammatical and lexical stance features, including hedges, boosters, and self-mention, were quantified and modelled. Multivariate analysis identified features that significantly contributed to hard-versus-soft variation. Clustering on those formal frequencies alone grouped the eight disciplines into two clusters matching the original hard and soft division. The result strengthens the claim that disciplinary variation in stance is systematic enough to classify fields, even when meaning-based interpretation is set aside.</w:t>
-      </w:r>
-      <w:r>
-        <w:rPr>
-          <w:rtl w:val="0"/>
-          <w:rFonts w:ascii="Georgia" w:hAnsi="Georgia" w:cs="Georgia"/>
-          <w:sz w:val="22"/>
-          <w:szCs w:val="22"/>
-        </w:rPr>
-      </w:r>
-    </w:p>
-    <w:p>
-      <w:pPr>
-        <w:spacing w:before="0" w:after="0" w:line="480" w:lineRule="auto"/>
-        <w:ind w:firstLine="720"/>
-        <w:jc w:val="both"/>
-      </w:pPr>
-      <w:r>
-        <w:rPr>
-          <w:rFonts w:ascii="Georgia" w:cs="Georgia" w:eastAsia="Georgia" w:hAnsi="Georgia"/>
-          <w:sz w:val="22"/>
-          <w:szCs w:val="22"/>
-          <w:rtl w:val="0"/>
-        </w:rPr>
-        <w:t xml:space="preserve">Expert scientific English therefore shows measurable variation, but the variation is local to how each field, section, medium, and publication context handles evidence and claim risk. In medical and clinical writing, that local pattern includes categorical reporting of measured results and denser hedging when claims move into interpretation. For developing writers in second-language settings, the expert picture is a target rather than a description of current practice. The present study asks whether PSAU undergraduates in three applied programs already show any of that field-sensitive differentiation in the compressed genre of the thesis abstract.</w:t>
-      </w:r>
-      <w:r>
-        <w:rPr>
-          <w:rtl w:val="0"/>
-          <w:rFonts w:ascii="Georgia" w:hAnsi="Georgia" w:cs="Georgia"/>
-          <w:sz w:val="22"/>
-          <w:szCs w:val="22"/>
-        </w:rPr>
-      </w:r>
-    </w:p>
-    <w:p>
-      <w:pPr>
-        <w:spacing w:before="0" w:after="0" w:line="480" w:lineRule="auto"/>
-        <w:ind w:firstLine="720"/>
-        <w:jc w:val="both"/>
-      </w:pPr>
-      <w:r>
-        <w:rPr>
-          <w:rFonts w:ascii="Georgia" w:cs="Georgia" w:eastAsia="Georgia" w:hAnsi="Georgia"/>
-          <w:b w:val="0"/>
-          <w:bCs w:val="0"/>
-          <w:i w:val="1"/>
-          <w:iCs w:val="1"/>
-          <w:sz w:val="22"/>
-          <w:szCs w:val="22"/>
-          <w:rtl w:val="0"/>
-        </w:rPr>
-        <w:t xml:space="preserve">Hedging in L2 and EFL Contexts</w:t>
-      </w:r>
-      <w:r>
-        <w:rPr>
-          <w:rtl w:val="0"/>
-          <w:rFonts w:ascii="Georgia" w:hAnsi="Georgia" w:cs="Georgia"/>
-          <w:sz w:val="22"/>
-          <w:szCs w:val="22"/>
-        </w:rPr>
-      </w:r>
-    </w:p>
-    <w:p>
-      <w:pPr>
-        <w:spacing w:before="0" w:after="0" w:line="480" w:lineRule="auto"/>
-        <w:ind w:firstLine="720"/>
-        <w:jc w:val="both"/>
-      </w:pPr>
-      <w:r>
-        <w:rPr>
-          <w:rFonts w:ascii="Georgia" w:cs="Georgia" w:eastAsia="Georgia" w:hAnsi="Georgia"/>
-          <w:sz w:val="22"/>
-          <w:szCs w:val="22"/>
-          <w:rtl w:val="0"/>
-        </w:rPr>
-        <w:t xml:space="preserve">English is the medium of academic writing at PSAU, but it is not the home language for most students. Research on second-language academic writing has long treated hedging as a point of difficulty rather than as a simple vocabulary gap. Hyland and Milton (1997) compared expressions of doubt and certainty in a one-million-word corpus of examination scripts from 900 Cantonese-speaking school leavers writing in English and 770 British learners of similar age and educational level. The L2 writers relied on a more limited range of epistemic items, offered stronger commitments, and showed greater difficulty conveying a precise degree of certainty than their L1 peers. That pattern remains a baseline across EFL research. L2 academic writers often under-qualify claims or overuse a small set of strong forms.</w:t>
-      </w:r>
-      <w:r>
-        <w:rPr>
-          <w:rtl w:val="0"/>
-          <w:rFonts w:ascii="Georgia" w:hAnsi="Georgia" w:cs="Georgia"/>
-          <w:sz w:val="22"/>
-          <w:szCs w:val="22"/>
-        </w:rPr>
-      </w:r>
-    </w:p>
-    <w:p>
-      <w:pPr>
-        <w:spacing w:before="0" w:after="0" w:line="480" w:lineRule="auto"/>
-        <w:ind w:firstLine="720"/>
-        <w:jc w:val="both"/>
-      </w:pPr>
-      <w:r>
-        <w:rPr>
-          <w:rFonts w:ascii="Georgia" w:cs="Georgia" w:eastAsia="Georgia" w:hAnsi="Georgia"/>
-          <w:sz w:val="22"/>
-          <w:szCs w:val="22"/>
-          <w:rtl w:val="0"/>
-        </w:rPr>
-        <w:t xml:space="preserve">Hinkel (2005) sharpens the formal picture with a large student-essay corpus of 745 essays and about 221,000 words. L2 writers used a limited range of hedging devices, many of them associated with conversational rather than formal written discourse. The same essays showed a prevalence of conversational intensifiers and overstatements that are common in informal speech but rare in academic prose. Demir (2018) compared lexical hedges in academic texts by English L1 and L2 writers and reported significant differences across modal, verbal, adjectival, adverbial, quantifier, and noun hedges, as well as in total hedge use. Taken together, these studies show that the L2 issue is not only density. It is range, register, and the balance between caution and overstatement.</w:t>
-      </w:r>
-      <w:r>
-        <w:rPr>
-          <w:rtl w:val="0"/>
-          <w:rFonts w:ascii="Georgia" w:hAnsi="Georgia" w:cs="Georgia"/>
-          <w:sz w:val="22"/>
-          <w:szCs w:val="22"/>
-        </w:rPr>
-      </w:r>
-    </w:p>
-    <w:p>
-      <w:pPr>
-        <w:spacing w:before="0" w:after="0" w:line="480" w:lineRule="auto"/>
-        <w:ind w:firstLine="720"/>
-        <w:jc w:val="both"/>
-      </w:pPr>
-      <w:r>
-        <w:rPr>
-          <w:rFonts w:ascii="Georgia" w:cs="Georgia" w:eastAsia="Georgia" w:hAnsi="Georgia"/>
-          <w:sz w:val="22"/>
-          <w:szCs w:val="22"/>
-          <w:rtl w:val="0"/>
-        </w:rPr>
-        <w:t xml:space="preserve">Takimoto (2015) adds a recognition layer. In a corpus comparison of academic essays by Japanese EFL learners and English L1 writers, the EFL group used more boosters than hedges and preferred straightforward, explicit expressions, whereas English L1 writers were more tentative. A follow-up task suggested that certainty items were more visible to the learners than possibility and probability items, which they often misapprehended. Underuse of hedges can therefore coexist with limited pragmatic awareness of what the missing forms do. Luo (2021), in a systematic review of undergraduate English language learners' hedging, reaches a similar aggregate conclusion. ELLs generally use fewer hedges than English L1 writers, draw on a narrower inventory, and face combined challenges of academic experience and L2 form control.</w:t>
-      </w:r>
-      <w:r>
-        <w:rPr>
-          <w:rtl w:val="0"/>
-          <w:rFonts w:ascii="Georgia" w:hAnsi="Georgia" w:cs="Georgia"/>
-          <w:sz w:val="22"/>
-          <w:szCs w:val="22"/>
-        </w:rPr>
-      </w:r>
-    </w:p>
-    <w:p>
-      <w:pPr>
-        <w:spacing w:before="0" w:after="0" w:line="480" w:lineRule="auto"/>
-        <w:ind w:firstLine="720"/>
-        <w:jc w:val="both"/>
-      </w:pPr>
-      <w:r>
-        <w:rPr>
-          <w:rFonts w:ascii="Georgia" w:cs="Georgia" w:eastAsia="Georgia" w:hAnsi="Georgia"/>
-          <w:sz w:val="22"/>
-          <w:szCs w:val="22"/>
-          <w:rtl w:val="0"/>
-        </w:rPr>
-        <w:t xml:space="preserve">Alonso (2019) approaches the same problem through a multicompetence design rather than an L2-only comparison. She examined hedges in academic writing by 24 Spanish learners of English, collecting data from the same participants in both Spanish and English, and compared them with monolingual Spanish and monolingual English control groups of 24 speakers each. Hedges were coded following Hyland's (1994) typology. Chi-square analyses showed differences between English and Spanish speakers, and between English speakers and L2 learners, especially in impersonal expressions and lexical verbs. Evidence of crosslinguistic influence appeared, and similarity in the use of adverbs across the learners' L1 and L2 pointed to L1-L2 convergence. The design matters for the present study because it shows that L2 hedging patterns cannot be read as a pure deficit against English L1 norms without also considering the writer's full language system. Publication medium and cultural writing tradition can widen the same gap. Hu and Cao (2011) found that applied-linguistics abstracts in English-medium journals carried markedly more hedges than those in Chinese-medium journals, a difference they link jointly to rhetorical convention and epistemological belief.</w:t>
-      </w:r>
-      <w:r>
-        <w:rPr>
-          <w:rtl w:val="0"/>
-          <w:rFonts w:ascii="Georgia" w:hAnsi="Georgia" w:cs="Georgia"/>
-          <w:sz w:val="22"/>
-          <w:szCs w:val="22"/>
-        </w:rPr>
-      </w:r>
-    </w:p>
-    <w:p>
-      <w:pPr>
-        <w:spacing w:before="0" w:after="0" w:line="480" w:lineRule="auto"/>
-        <w:ind w:firstLine="720"/>
-        <w:jc w:val="both"/>
-      </w:pPr>
-      <w:r>
-        <w:rPr>
-          <w:rFonts w:ascii="Georgia" w:cs="Georgia" w:eastAsia="Georgia" w:hAnsi="Georgia"/>
-          <w:sz w:val="22"/>
-          <w:szCs w:val="22"/>
-          <w:rtl w:val="0"/>
-        </w:rPr>
-        <w:t xml:space="preserve">Undergraduate thesis abstracts, the genre closest to the present corpus, show the same L2 pressures. As reviewed under undergraduate writing, Mazidah et al. (2022) and Ghia et al. (2022) report that L2 thesis abstracts often carry fewer hedges and stronger certainty marking than L1 comparison groups, even among language-oriented programs. Bayraktar-Cepni and Kulaksiz (2022) compared hedging in discussion sections of ELT MA and PhD theses and found that MA theses contained significantly more hedges than PhD theses, a difference they link to developing writers' stronger need to soften stance. Level of academic experience, not only L1 versus L2 status, therefore shapes how much caution writers encode.</w:t>
-      </w:r>
-      <w:r>
-        <w:rPr>
-          <w:rtl w:val="0"/>
-          <w:rFonts w:ascii="Georgia" w:hAnsi="Georgia" w:cs="Georgia"/>
-          <w:sz w:val="22"/>
-          <w:szCs w:val="22"/>
-        </w:rPr>
-      </w:r>
-    </w:p>
-    <w:p>
-      <w:pPr>
-        <w:spacing w:before="0" w:after="0" w:line="480" w:lineRule="auto"/>
-        <w:ind w:firstLine="720"/>
-        <w:jc w:val="both"/>
-      </w:pPr>
-      <w:r>
-        <w:rPr>
-          <w:rFonts w:ascii="Georgia" w:cs="Georgia" w:eastAsia="Georgia" w:hAnsi="Georgia"/>
-          <w:sz w:val="22"/>
-          <w:szCs w:val="22"/>
-          <w:rtl w:val="0"/>
-        </w:rPr>
-        <w:t xml:space="preserve">Instructional research points in the same direction. Petchkij (2019) argues that explicit teaching of hedges can raise their use in Thai EFL contexts, though modal forms often remain dominant. Loi and Lim (2015) analysed hedging orientations in discussion sections from the Journal of English for Academic Purposes and elicited specialist views on L2 difficulty. Those specialists attributed second-language learners' difficulty modulating claims to socio-cultural factors, classroom instruction, disciplinary culture, and disciplinary appeals, and stressed that pragmatic fluency in hedging is teachable rather than automatic. Regional ASEAN and Philippine learner studies, taken up in the next section, likewise report limited hedge inventories and frequent booster preference in student academic English (Ningrum et al., 2024; Lopez et al., 2025; Escalona, 2025). Since the present study does not measure English proficiency independently, observed patterns in the PSAU corpus may reflect L2 constraints, disciplinary socialization, instructional history, or some combination of these. The aim is a descriptive baseline of how stance is worded in ratified undergraduate thesis abstracts, not a test of which single factor causes the pattern.</w:t>
-      </w:r>
-      <w:r>
-        <w:rPr>
-          <w:rtl w:val="0"/>
-          <w:rFonts w:ascii="Georgia" w:hAnsi="Georgia" w:cs="Georgia"/>
-          <w:sz w:val="22"/>
-          <w:szCs w:val="22"/>
-        </w:rPr>
-      </w:r>
-    </w:p>
-    <w:p>
-      <w:pPr>
-        <w:spacing w:before="0" w:after="0" w:line="480" w:lineRule="auto"/>
-        <w:ind w:firstLine="720"/>
-        <w:jc w:val="both"/>
-      </w:pPr>
-      <w:r>
-        <w:rPr>
-          <w:rFonts w:ascii="Georgia" w:cs="Georgia" w:eastAsia="Georgia" w:hAnsi="Georgia"/>
-          <w:sz w:val="22"/>
-          <w:szCs w:val="22"/>
-          <w:rtl w:val="0"/>
-        </w:rPr>
-        <w:t xml:space="preserve">Hedging in Philippine Academic Writing Contexts</w:t>
-      </w:r>
-      <w:r>
-        <w:rPr>
-          <w:rtl w:val="0"/>
-          <w:rFonts w:ascii="Georgia" w:hAnsi="Georgia" w:cs="Georgia"/>
-          <w:sz w:val="22"/>
-          <w:szCs w:val="22"/>
-        </w:rPr>
-      </w:r>
-    </w:p>
-    <w:p>
-      <w:pPr>
-        <w:spacing w:before="0" w:after="0" w:line="480" w:lineRule="auto"/>
-        <w:ind w:firstLine="720"/>
-        <w:jc w:val="both"/>
-      </w:pPr>
-      <w:r>
-        <w:rPr>
-          <w:rFonts w:ascii="Georgia" w:cs="Georgia" w:eastAsia="Georgia" w:hAnsi="Georgia"/>
-          <w:sz w:val="22"/>
-          <w:szCs w:val="22"/>
-          <w:rtl w:val="0"/>
-        </w:rPr>
-        <w:t xml:space="preserve">Philippine and regional findings align with the broader picture of English-medium student writing while adding local detail. Ningrum et al. (2024) analysed academic writing from the ICNALE learner corpus across ten ASEAN contexts, including the Philippines. ASEAN EFL learners preferred boosters over hedges. Overused boosters included completely, really, and always, while the most frequent hedges included usually, often, and maybe. The pattern suggests that regional learners often encode confidence more readily than caution in academic prose.</w:t>
-      </w:r>
-      <w:r>
-        <w:rPr>
-          <w:rtl w:val="0"/>
-          <w:rFonts w:ascii="Georgia" w:hAnsi="Georgia" w:cs="Georgia"/>
-          <w:sz w:val="22"/>
-          <w:szCs w:val="22"/>
-        </w:rPr>
-      </w:r>
-    </w:p>
-    <w:p>
-      <w:pPr>
-        <w:spacing w:before="0" w:after="0" w:line="480" w:lineRule="auto"/>
-        <w:ind w:firstLine="720"/>
-        <w:jc w:val="both"/>
-      </w:pPr>
-      <w:r>
-        <w:rPr>
-          <w:rFonts w:ascii="Georgia" w:cs="Georgia" w:eastAsia="Georgia" w:hAnsi="Georgia"/>
-          <w:sz w:val="22"/>
-          <w:szCs w:val="22"/>
-          <w:rtl w:val="0"/>
-        </w:rPr>
-        <w:t xml:space="preserve">Local college essay studies point in the same direction. Lopez et al. (2025) examined 50 argumentative essays by English Language Studies majors at a northern Philippine state university. Students showed developing-stage control of hedges and boosters, with epistemic modal verbs the most frequent forms across proficiency levels. Escalona (2025) compared hedges and boosters in essays by AB-English and BS-Information Technology students and found that female writers used hedges more often than male writers, while overall frequencies remained relatively consistent across major fields. Both studies examine essays rather than thesis abstracts, so they cannot be read as direct predictions for the present corpus. They do show that Philippine undergraduate academic English often leans on a small modal set and mixes intensifying moves with limited softening.</w:t>
-      </w:r>
-      <w:r>
-        <w:rPr>
-          <w:rtl w:val="0"/>
-          <w:rFonts w:ascii="Georgia" w:hAnsi="Georgia" w:cs="Georgia"/>
-          <w:sz w:val="22"/>
-          <w:szCs w:val="22"/>
-        </w:rPr>
-      </w:r>
-    </w:p>
-    <w:p>
-      <w:pPr>
-        <w:spacing w:before="0" w:after="0" w:line="480" w:lineRule="auto"/>
-        <w:ind w:firstLine="720"/>
-        <w:jc w:val="both"/>
-      </w:pPr>
-      <w:r>
-        <w:rPr>
-          <w:rFonts w:ascii="Georgia" w:cs="Georgia" w:eastAsia="Georgia" w:hAnsi="Georgia"/>
-          <w:sz w:val="22"/>
-          <w:szCs w:val="22"/>
-          <w:rtl w:val="0"/>
-        </w:rPr>
-        <w:t xml:space="preserve">Research on Philippine student research writing brings the evidence closer to the thesis genre. Luyun (2024) analysed introduction and conclusion sections in 41 undergraduate research papers from BSED and BEED programs at a Philippine university, using Mojica's hedge categories and Hyland's booster taxonomy. The most frequent hedge forms included this study, it, and the study, with may also appearing among Type I devices. The dominant booster was should, and no significant difference in hedge or booster frequency emerged between the two education programs. Melon-Galvez (2017) examined the hedging system of Filipino engineering students writing technical ESP texts and linked hedge use to framing, intertextuality, and task type, with pedagogical implications for precision and interpersonal stance in technical discourse.</w:t>
-      </w:r>
-      <w:r>
-        <w:rPr>
-          <w:rtl w:val="0"/>
-          <w:rFonts w:ascii="Georgia" w:hAnsi="Georgia" w:cs="Georgia"/>
-          <w:sz w:val="22"/>
-          <w:szCs w:val="22"/>
-        </w:rPr>
-      </w:r>
-    </w:p>
-    <w:p>
-      <w:pPr>
-        <w:spacing w:before="0" w:after="0" w:line="480" w:lineRule="auto"/>
-        <w:ind w:firstLine="720"/>
-        <w:jc w:val="both"/>
-      </w:pPr>
-      <w:r>
-        <w:rPr>
-          <w:rFonts w:ascii="Georgia" w:cs="Georgia" w:eastAsia="Georgia" w:hAnsi="Georgia"/>
-          <w:sz w:val="22"/>
-          <w:szCs w:val="22"/>
-          <w:rtl w:val="0"/>
-        </w:rPr>
-        <w:t xml:space="preserve">Published research articles written in Philippine English add a professional layer. Magday et al. (2026) compared hedges in the Results and Discussion sections of 70 English Language Teaching research articles, 35 by Filipino writers and 35 by Thai writers. Filipino writers used hedges at a higher density (23.74 per 1,000 words) than Thai writers (17.63 per 1,000 words). The authors link the difference in part to the Philippines' ESL relationship with English versus Thailand's EFL context, even where disciplinary conventions are shared. Gamad et al. (2024) analysed metadiscourse markers in the Results, Discussion, and Conclusion sections of 90 research articles across social sciences, linguistics, and business in Philippine English, American English, and Chinese English. Hedges were the most frequent interactional markers overall, and Philippine English research articles showed comparatively high metadiscourse use, with interactional preferences varying by discipline.</w:t>
-      </w:r>
-      <w:r>
-        <w:rPr>
-          <w:rtl w:val="0"/>
-          <w:rFonts w:ascii="Georgia" w:hAnsi="Georgia" w:cs="Georgia"/>
-          <w:sz w:val="22"/>
-          <w:szCs w:val="22"/>
-        </w:rPr>
-      </w:r>
-    </w:p>
-    <w:p>
-      <w:pPr>
-        <w:spacing w:before="0" w:after="0" w:line="480" w:lineRule="auto"/>
-        <w:ind w:firstLine="720"/>
-        <w:jc w:val="both"/>
-      </w:pPr>
-      <w:r>
-        <w:rPr>
-          <w:rFonts w:ascii="Georgia" w:cs="Georgia" w:eastAsia="Georgia" w:hAnsi="Georgia"/>
-          <w:sz w:val="22"/>
-          <w:szCs w:val="22"/>
-          <w:rtl w:val="0"/>
-        </w:rPr>
-        <w:t>Outside student essays and research articles, Philippine editorial writing shows hedging as a context-sensitive resource rather than a fixed national style. Villanueva (2014) examined 30 editorials from three leading Philippine newspapers and found that nearly half of the hedges were references to official reports or authorities, with modals and adverbs making up a little over 30 percent. Those forms helped editors manage accountability and soften claims on politically sensitive topics. Grengia (2025) extended the editorial analysis to student publications, The Philippine Collegian and The LaSallian, and found deliberate but publication-specific hedge use tied to voice, audience, and rhetorical goals. Taken together, the Philippine evidence shows modal-heavy inventories, frequent booster preference in learner writing, and higher hedge density in some professional Filipino ELT research than in comparable EFL contexts. Published accounts of student hedging in the Philippines have centered on essays, education theses, or professional ELT articles rather than applied life-science undergraduate thesis abstracts. That gap is the present study’s descriptive starting point.</w:t>
-      </w:r>
-      <w:r>
-        <w:rPr>
-          <w:rFonts w:ascii="Georgia" w:hAnsi="Georgia" w:cs="Georgia" w:eastAsia="Georgia"/>
-          <w:sz w:val="22"/>
-          <w:rtl w:val="0"/>
-          <w:szCs w:val="22"/>
-        </w:rPr>
-      </w:r>
-    </w:p>
-    <w:p>
-      <w:pPr>
-        <w:spacing w:before="0" w:after="0" w:line="480" w:lineRule="auto"/>
-        <w:ind w:firstLine="720"/>
-        <w:jc w:val="both"/>
-      </w:pPr>
-      <w:r>
-        <w:rPr>
-          <w:rFonts w:ascii="Georgia" w:cs="Georgia" w:eastAsia="Georgia" w:hAnsi="Georgia"/>
-          <w:sz w:val="22"/>
-          <w:szCs w:val="22"/>
-          <w:rtl w:val="0"/>
+          <w:sz w:val="24"/>
+          <w:szCs w:val="24"/>
+          <w:rtl w:val="0"/>
+          <w:i/>
+          <w:iCs/>
         </w:rPr>
         <w:t xml:space="preserve">Disciplinary Variation in Abstracts and Undergraduate Theses</w:t>
       </w:r>
@@ -1498,8 +1548,10 @@
         <w:rPr>
           <w:rtl w:val="0"/>
           <w:rFonts w:ascii="Georgia" w:hAnsi="Georgia" w:cs="Georgia"/>
-          <w:sz w:val="22"/>
-          <w:szCs w:val="22"/>
+          <w:sz w:val="24"/>
+          <w:szCs w:val="24"/>
+          <w:i/>
+          <w:iCs/>
         </w:rPr>
       </w:r>
     </w:p>
@@ -6389,23 +6441,35 @@
     </w:p>
     <w:p>
       <w:pPr>
+        <w:spacing w:before="0" w:after="0" w:line="480" w:lineRule="auto"/>
+      </w:pPr>
+      <w:r>
+        <w:t xml:space="preserve"/>
+      </w:r>
+    </w:p>
+    <w:p>
+      <w:pPr>
         <w:keepNext/>
-        <w:spacing w:before="0" w:after="0" w:line="360" w:lineRule="auto"/>
+        <w:spacing w:before="0" w:after="0" w:line="480" w:lineRule="auto"/>
         <w:jc w:val="left"/>
       </w:pPr>
       <w:r>
         <w:rPr>
           <w:rFonts w:ascii="Georgia" w:hAnsi="Georgia" w:cs="Georgia" w:eastAsia="Georgia"/>
-          <w:sz w:val="22"/>
-          <w:szCs w:val="22"/>
+          <w:sz w:val="24"/>
+          <w:szCs w:val="24"/>
+          <w:i/>
+          <w:iCs/>
         </w:rPr>
         <w:t xml:space="preserve">PSAU Thesis Repository: Population and Sampling Summary</w:t>
       </w:r>
       <w:r>
         <w:rPr>
           <w:rFonts w:ascii="Georgia" w:hAnsi="Georgia" w:cs="Georgia" w:eastAsia="Georgia"/>
-          <w:sz w:val="22"/>
-          <w:szCs w:val="22"/>
+          <w:sz w:val="24"/>
+          <w:szCs w:val="24"/>
+          <w:i/>
+          <w:iCs/>
         </w:rPr>
       </w:r>
     </w:p>
@@ -17753,15 +17817,25 @@
     <w:p>
       <w:pPr>
         <w:spacing w:before="0" w:after="0" w:line="480" w:lineRule="auto"/>
-        <w:ind w:firstLine="720"/>
-        <w:jc w:val="both"/>
+      </w:pPr>
+      <w:r>
+        <w:t xml:space="preserve"/>
+      </w:r>
+    </w:p>
+    <w:p>
+      <w:pPr>
+        <w:keepNext/>
+        <w:spacing w:before="0" w:after="0" w:line="480" w:lineRule="auto"/>
+        <w:jc w:val="left"/>
       </w:pPr>
       <w:r>
         <w:rPr>
           <w:rFonts w:ascii="Georgia" w:cs="Georgia" w:eastAsia="Georgia" w:hAnsi="Georgia"/>
-          <w:sz w:val="22"/>
-          <w:szCs w:val="22"/>
-          <w:rtl w:val="0"/>
+          <w:sz w:val="24"/>
+          <w:szCs w:val="24"/>
+          <w:rtl w:val="0"/>
+          <w:i/>
+          <w:iCs/>
         </w:rPr>
         <w:t xml:space="preserve">Outcome Type and the Limits of a Design Explanation</w:t>
       </w:r>
@@ -17769,8 +17843,10 @@
         <w:rPr>
           <w:rtl w:val="0"/>
           <w:rFonts w:ascii="Georgia" w:hAnsi="Georgia" w:cs="Georgia"/>
-          <w:sz w:val="22"/>
-          <w:szCs w:val="22"/>
+          <w:sz w:val="24"/>
+          <w:szCs w:val="24"/>
+          <w:i/>
+          <w:iCs/>
         </w:rPr>
       </w:r>
     </w:p>
@@ -20845,19 +20921,17 @@
     </w:p>
     <w:p>
       <w:pPr>
-        <w:spacing w:before="0" w:after="0" w:line="480" w:lineRule="auto"/>
-        <w:ind w:firstLine="720"/>
-        <w:jc w:val="both"/>
+        <w:keepNext/>
+        <w:spacing w:before="0" w:after="0" w:line="480" w:lineRule="auto"/>
+        <w:jc w:val="left"/>
       </w:pPr>
       <w:r>
         <w:rPr>
           <w:rFonts w:ascii="Georgia" w:cs="Georgia" w:eastAsia="Georgia" w:hAnsi="Georgia"/>
-          <w:b w:val="0"/>
-          <w:bCs w:val="0"/>
           <w:i w:val="1"/>
           <w:iCs w:val="1"/>
-          <w:sz w:val="22"/>
-          <w:szCs w:val="22"/>
+          <w:sz w:val="24"/>
+          <w:szCs w:val="24"/>
           <w:rtl w:val="0"/>
         </w:rPr>
         <w:t xml:space="preserve">What the Contrast Can and Cannot Mean</w:t>
@@ -20866,8 +20940,10 @@
         <w:rPr>
           <w:rtl w:val="0"/>
           <w:rFonts w:ascii="Georgia" w:hAnsi="Georgia" w:cs="Georgia"/>
-          <w:sz w:val="22"/>
-          <w:szCs w:val="22"/>
+          <w:sz w:val="24"/>
+          <w:szCs w:val="24"/>
+          <w:i/>
+          <w:iCs/>
         </w:rPr>
       </w:r>
     </w:p>
@@ -23088,54 +23164,224 @@
     <w:p>
       <w:pPr>
         <w:spacing w:before="0" w:after="0" w:line="480" w:lineRule="auto"/>
+      </w:pPr>
+      <w:r>
+        <w:t xml:space="preserve"/>
+      </w:r>
+    </w:p>
+    <w:p>
+      <w:pPr>
+        <w:keepNext/>
+        <w:spacing w:before="0" w:after="0" w:line="480" w:lineRule="auto"/>
+        <w:jc w:val="left"/>
+      </w:pPr>
+      <w:r>
+        <w:rPr>
+          <w:sz w:val="24"/>
+          <w:szCs w:val="24"/>
+          <w:rtl w:val="0"/>
+          <w:rFonts w:ascii="Georgia" w:hAnsi="Georgia" w:cs="Georgia"/>
+          <w:i/>
+          <w:iCs/>
+        </w:rPr>
+        <w:t xml:space="preserve">Quick-Reference</w:t>
+      </w:r>
+      <w:r>
+        <w:rPr>
+          <w:rtl w:val="0"/>
+          <w:rFonts w:ascii="Georgia" w:hAnsi="Georgia" w:cs="Georgia"/>
+          <w:sz w:val="24"/>
+          <w:szCs w:val="24"/>
+          <w:i/>
+          <w:iCs/>
+        </w:rPr>
+      </w:r>
+    </w:p>
+    <w:p>
+      <w:pPr>
+        <w:spacing w:before="0" w:after="0" w:line="480" w:lineRule="auto"/>
+        <w:ind w:left="720" w:hanging="360"/>
+        <w:jc w:val="both"/>
+      </w:pPr>
+      <w:r>
+        <w:rPr>
+          <w:b w:val="1"/>
+          <w:bCs w:val="1"/>
+          <w:rtl w:val="0"/>
+          <w:rFonts w:ascii="Georgia" w:hAnsi="Georgia" w:cs="Georgia"/>
+          <w:sz w:val="22"/>
+          <w:szCs w:val="22"/>
+        </w:rPr>
+        <w:t xml:space="preserve">• Context decides. </w:t>
+      </w:r>
+      <w:r>
+        <w:rPr>
+          <w:rtl w:val="0"/>
+          <w:rFonts w:ascii="Georgia" w:hAnsi="Georgia" w:cs="Georgia"/>
+          <w:sz w:val="22"/>
+          <w:szCs w:val="22"/>
+        </w:rPr>
+        <w:t xml:space="preserve">A listed word is a hedge only when it works as one in the sentence.</w:t>
+      </w:r>
+    </w:p>
+    <w:p>
+      <w:pPr>
+        <w:spacing w:before="0" w:after="0" w:line="480" w:lineRule="auto"/>
+      </w:pPr>
+      <w:r>
+        <w:t xml:space="preserve"/>
+      </w:r>
+    </w:p>
+    <w:p>
+      <w:pPr>
+        <w:keepNext/>
+        <w:spacing w:before="0" w:after="0" w:line="480" w:lineRule="auto"/>
+        <w:jc w:val="left"/>
+      </w:pPr>
+      <w:r>
+        <w:rPr>
+          <w:rtl w:val="0"/>
+          <w:rFonts w:ascii="Georgia" w:hAnsi="Georgia" w:cs="Georgia"/>
+          <w:sz w:val="24"/>
+          <w:szCs w:val="24"/>
+          <w:i/>
+          <w:iCs/>
+        </w:rPr>
+        <w:t xml:space="preserve">Types</w:t>
+      </w:r>
+      <w:r>
+        <w:rPr>
+          <w:rtl w:val="0"/>
+          <w:rFonts w:ascii="Georgia" w:hAnsi="Georgia" w:cs="Georgia"/>
+          <w:sz w:val="24"/>
+          <w:szCs w:val="24"/>
+          <w:i/>
+          <w:iCs/>
+        </w:rPr>
+      </w:r>
+    </w:p>
+    <w:p>
+      <w:pPr>
+        <w:spacing w:before="0" w:after="0" w:line="480" w:lineRule="auto"/>
+        <w:ind w:left="720" w:hanging="360"/>
+        <w:jc w:val="both"/>
+      </w:pPr>
+      <w:r>
+        <w:rPr>
+          <w:b w:val="1"/>
+          <w:bCs w:val="1"/>
+          <w:rtl w:val="0"/>
+          <w:rFonts w:ascii="Georgia" w:hAnsi="Georgia" w:cs="Georgia"/>
+          <w:sz w:val="22"/>
+          <w:szCs w:val="22"/>
+        </w:rPr>
+        <w:t xml:space="preserve">• Modal: </w:t>
+      </w:r>
+      <w:r>
+        <w:rPr>
+          <w:rtl w:val="0"/>
+          <w:rFonts w:ascii="Georgia" w:hAnsi="Georgia" w:cs="Georgia"/>
+          <w:sz w:val="22"/>
+          <w:szCs w:val="22"/>
+        </w:rPr>
+        <w:t xml:space="preserve">may, might, could, would, should, can (possibility only, not capability or obligation).</w:t>
+      </w:r>
+    </w:p>
+    <w:p>
+      <w:pPr>
+        <w:spacing w:before="0" w:after="0" w:line="480" w:lineRule="auto"/>
+        <w:ind w:left="720" w:hanging="360"/>
+        <w:jc w:val="both"/>
+      </w:pPr>
+      <w:r>
+        <w:rPr>
+          <w:b w:val="1"/>
+          <w:bCs w:val="1"/>
+          <w:rtl w:val="0"/>
+          <w:rFonts w:ascii="Georgia" w:hAnsi="Georgia" w:cs="Georgia"/>
+          <w:sz w:val="22"/>
+          <w:szCs w:val="22"/>
+        </w:rPr>
+        <w:t xml:space="preserve">• Lexical: </w:t>
+      </w:r>
+      <w:r>
+        <w:rPr>
+          <w:rtl w:val="0"/>
+          <w:rFonts w:ascii="Georgia" w:hAnsi="Georgia" w:cs="Georgia"/>
+          <w:sz w:val="22"/>
+          <w:szCs w:val="22"/>
+        </w:rPr>
+        <w:t xml:space="preserve">suggest, indicate, appear, seem, possible, likely, potential (when they qualify a claim and pass Step 2).</w:t>
+      </w:r>
+    </w:p>
+    <w:p>
+      <w:pPr>
+        <w:spacing w:before="0" w:after="0" w:line="480" w:lineRule="auto"/>
+        <w:ind w:left="720" w:hanging="360"/>
+        <w:jc w:val="both"/>
+      </w:pPr>
+      <w:r>
+        <w:rPr>
+          <w:b w:val="1"/>
+          <w:bCs w:val="1"/>
+          <w:rtl w:val="0"/>
+          <w:rFonts w:ascii="Georgia" w:hAnsi="Georgia" w:cs="Georgia"/>
+          <w:sz w:val="22"/>
+          <w:szCs w:val="22"/>
+        </w:rPr>
+        <w:t xml:space="preserve">• Adverbial: </w:t>
+      </w:r>
+      <w:r>
+        <w:rPr>
+          <w:rtl w:val="0"/>
+          <w:rFonts w:ascii="Georgia" w:hAnsi="Georgia" w:cs="Georgia"/>
+          <w:sz w:val="22"/>
+          <w:szCs w:val="22"/>
+        </w:rPr>
+        <w:t xml:space="preserve">generally, typically, possibly, probably (scope or certainty, not procedural routine).</w:t>
+      </w:r>
+    </w:p>
+    <w:p>
+      <w:pPr>
+        <w:spacing w:before="0" w:after="0" w:line="480" w:lineRule="auto"/>
+        <w:ind w:left="720" w:hanging="360"/>
+        <w:jc w:val="both"/>
+      </w:pPr>
+      <w:r>
+        <w:rPr>
+          <w:b w:val="1"/>
+          <w:bCs w:val="1"/>
+          <w:rtl w:val="0"/>
+          <w:rFonts w:ascii="Georgia" w:hAnsi="Georgia" w:cs="Georgia"/>
+          <w:sz w:val="22"/>
+          <w:szCs w:val="22"/>
+        </w:rPr>
+        <w:t xml:space="preserve">• Clause-level: </w:t>
+      </w:r>
+      <w:r>
+        <w:rPr>
+          <w:rtl w:val="0"/>
+          <w:rFonts w:ascii="Georgia" w:hAnsi="Georgia" w:cs="Georgia"/>
+          <w:sz w:val="22"/>
+          <w:szCs w:val="22"/>
+        </w:rPr>
+        <w:t xml:space="preserve">it seems that, it is possible that, to some extent.</w:t>
+      </w:r>
+    </w:p>
+    <w:p>
+      <w:pPr>
+        <w:spacing w:before="0" w:after="0" w:line="480" w:lineRule="auto"/>
         <w:ind w:firstLine="720"/>
         <w:jc w:val="both"/>
       </w:pPr>
       <w:r>
         <w:rPr>
-          <w:b w:val="1"/>
-          <w:bCs w:val="1"/>
-          <w:sz w:val="22"/>
-          <w:szCs w:val="22"/>
-          <w:rtl w:val="0"/>
-          <w:rFonts w:ascii="Georgia" w:hAnsi="Georgia" w:cs="Georgia"/>
-        </w:rPr>
-        <w:t xml:space="preserve">Quick-Reference</w:t>
-      </w:r>
-      <w:r>
-        <w:rPr>
-          <w:rtl w:val="0"/>
-          <w:rFonts w:ascii="Georgia" w:hAnsi="Georgia" w:cs="Georgia"/>
-          <w:sz w:val="22"/>
-          <w:szCs w:val="22"/>
-        </w:rPr>
-      </w:r>
-    </w:p>
-    <w:p>
-      <w:pPr>
-        <w:spacing w:before="0" w:after="0" w:line="480" w:lineRule="auto"/>
-        <w:ind w:left="720" w:hanging="360"/>
-        <w:jc w:val="both"/>
-      </w:pPr>
-      <w:r>
-        <w:rPr>
-          <w:b w:val="1"/>
-          <w:bCs w:val="1"/>
-          <w:rtl w:val="0"/>
-          <w:rFonts w:ascii="Georgia" w:hAnsi="Georgia" w:cs="Georgia"/>
-          <w:sz w:val="22"/>
-          <w:szCs w:val="22"/>
-        </w:rPr>
-        <w:t xml:space="preserve">• Context decides. </w:t>
-      </w:r>
-      <w:r>
-        <w:rPr>
-          <w:rtl w:val="0"/>
-          <w:rFonts w:ascii="Georgia" w:hAnsi="Georgia" w:cs="Georgia"/>
-          <w:sz w:val="22"/>
-          <w:szCs w:val="22"/>
-        </w:rPr>
-        <w:t xml:space="preserve">A listed word is a hedge only when it works as one in the sentence.</w:t>
+          <w:rtl w:val="0"/>
+          <w:rFonts w:ascii="Georgia" w:hAnsi="Georgia" w:cs="Georgia"/>
+          <w:sz w:val="22"/>
+          <w:szCs w:val="22"/>
+        </w:rPr>
+        <w:t xml:space="preserve">Functions: EC = uncertainty about a claim’s truth. P = interpersonal softening of a claim. FP = fails the claim condition or both checks.</w:t>
       </w:r>
     </w:p>
     <w:p>
@@ -23146,130 +23392,12 @@
       </w:pPr>
       <w:r>
         <w:rPr>
-          <w:b w:val="1"/>
-          <w:bCs w:val="1"/>
-          <w:rtl w:val="0"/>
-          <w:rFonts w:ascii="Georgia" w:hAnsi="Georgia" w:cs="Georgia"/>
-          <w:sz w:val="22"/>
-          <w:szCs w:val="22"/>
-        </w:rPr>
-        <w:t xml:space="preserve">Types</w:t>
-      </w:r>
-      <w:r>
-        <w:rPr>
-          <w:rtl w:val="0"/>
-          <w:rFonts w:ascii="Georgia" w:hAnsi="Georgia" w:cs="Georgia"/>
-          <w:sz w:val="22"/>
-          <w:szCs w:val="22"/>
-        </w:rPr>
-      </w:r>
-    </w:p>
-    <w:p>
-      <w:pPr>
-        <w:spacing w:before="0" w:after="0" w:line="480" w:lineRule="auto"/>
-        <w:ind w:left="720" w:hanging="360"/>
-        <w:jc w:val="both"/>
-      </w:pPr>
-      <w:r>
-        <w:rPr>
-          <w:b w:val="1"/>
-          <w:bCs w:val="1"/>
-          <w:rtl w:val="0"/>
-          <w:rFonts w:ascii="Georgia" w:hAnsi="Georgia" w:cs="Georgia"/>
-          <w:sz w:val="22"/>
-          <w:szCs w:val="22"/>
-        </w:rPr>
-        <w:t xml:space="preserve">• Modal: </w:t>
-      </w:r>
-      <w:r>
-        <w:rPr>
-          <w:rtl w:val="0"/>
-          <w:rFonts w:ascii="Georgia" w:hAnsi="Georgia" w:cs="Georgia"/>
-          <w:sz w:val="22"/>
-          <w:szCs w:val="22"/>
-        </w:rPr>
-        <w:t xml:space="preserve">may, might, could, would, should, can (possibility only, not capability or obligation).</w:t>
-      </w:r>
-    </w:p>
-    <w:p>
-      <w:pPr>
-        <w:spacing w:before="0" w:after="0" w:line="480" w:lineRule="auto"/>
-        <w:ind w:left="720" w:hanging="360"/>
-        <w:jc w:val="both"/>
-      </w:pPr>
-      <w:r>
-        <w:rPr>
-          <w:b w:val="1"/>
-          <w:bCs w:val="1"/>
-          <w:rtl w:val="0"/>
-          <w:rFonts w:ascii="Georgia" w:hAnsi="Georgia" w:cs="Georgia"/>
-          <w:sz w:val="22"/>
-          <w:szCs w:val="22"/>
-        </w:rPr>
-        <w:t xml:space="preserve">• Lexical: </w:t>
-      </w:r>
-      <w:r>
-        <w:rPr>
-          <w:rtl w:val="0"/>
-          <w:rFonts w:ascii="Georgia" w:hAnsi="Georgia" w:cs="Georgia"/>
-          <w:sz w:val="22"/>
-          <w:szCs w:val="22"/>
-        </w:rPr>
-        <w:t xml:space="preserve">suggest, indicate, appear, seem, possible, likely, potential (when they qualify a claim and pass Step 2).</w:t>
-      </w:r>
-    </w:p>
-    <w:p>
-      <w:pPr>
-        <w:spacing w:before="0" w:after="0" w:line="480" w:lineRule="auto"/>
-        <w:ind w:left="720" w:hanging="360"/>
-        <w:jc w:val="both"/>
-      </w:pPr>
-      <w:r>
-        <w:rPr>
-          <w:b w:val="1"/>
-          <w:bCs w:val="1"/>
-          <w:rtl w:val="0"/>
-          <w:rFonts w:ascii="Georgia" w:hAnsi="Georgia" w:cs="Georgia"/>
-          <w:sz w:val="22"/>
-          <w:szCs w:val="22"/>
-        </w:rPr>
-        <w:t xml:space="preserve">• Adverbial: </w:t>
-      </w:r>
-      <w:r>
-        <w:rPr>
-          <w:rtl w:val="0"/>
-          <w:rFonts w:ascii="Georgia" w:hAnsi="Georgia" w:cs="Georgia"/>
-          <w:sz w:val="22"/>
-          <w:szCs w:val="22"/>
-        </w:rPr>
-        <w:t xml:space="preserve">generally, typically, possibly, probably (scope or certainty, not procedural routine).</w:t>
-      </w:r>
-    </w:p>
-    <w:p>
-      <w:pPr>
-        <w:spacing w:before="0" w:after="0" w:line="480" w:lineRule="auto"/>
-        <w:ind w:left="720" w:hanging="360"/>
-        <w:jc w:val="both"/>
-      </w:pPr>
-      <w:r>
-        <w:rPr>
-          <w:b w:val="1"/>
-          <w:bCs w:val="1"/>
-          <w:rtl w:val="0"/>
-          <w:rFonts w:ascii="Georgia" w:hAnsi="Georgia" w:cs="Georgia"/>
-          <w:sz w:val="22"/>
-          <w:szCs w:val="22"/>
-        </w:rPr>
-        <w:t xml:space="preserve">• Clause-level: </w:t>
-      </w:r>
-      <w:r>
-        <w:rPr>
-          <w:rtl w:val="0"/>
-          <w:rFonts w:ascii="Georgia" w:hAnsi="Georgia" w:cs="Georgia"/>
-          <w:sz w:val="22"/>
-          <w:szCs w:val="22"/>
-        </w:rPr>
-        <w:t xml:space="preserve">it seems that, it is possible that, to some extent.</w:t>
+          <w:rFonts w:ascii="Georgia" w:cs="Georgia" w:eastAsia="Cardo" w:hAnsi="Georgia"/>
+          <w:rtl w:val="0"/>
+          <w:sz w:val="22"/>
+          <w:szCs w:val="22"/>
+        </w:rPr>
+        <w:t xml:space="preserve">Core rules: suggest/indicate finding→hedge, recommendation→FP-Rec, can/may possibility→hedge, capability→FP-Cap, generally/typically claim-limit→hedge, procedural→FP-Proc, appear/seem result-uncertainty→hedge, location→FP-Gen.</w:t>
       </w:r>
     </w:p>
     <w:p>
@@ -23280,43 +23408,11 @@
       </w:pPr>
       <w:r>
         <w:rPr>
-          <w:rtl w:val="0"/>
-          <w:rFonts w:ascii="Georgia" w:hAnsi="Georgia" w:cs="Georgia"/>
-          <w:sz w:val="22"/>
-          <w:szCs w:val="22"/>
-        </w:rPr>
-        <w:t xml:space="preserve">Functions: EC = uncertainty about a claim’s truth. P = interpersonal softening of a claim. FP = fails the claim condition or both checks.</w:t>
-      </w:r>
-    </w:p>
-    <w:p>
-      <w:pPr>
-        <w:spacing w:before="0" w:after="0" w:line="480" w:lineRule="auto"/>
-        <w:ind w:firstLine="720"/>
-        <w:jc w:val="both"/>
-      </w:pPr>
-      <w:r>
-        <w:rPr>
           <w:rFonts w:ascii="Georgia" w:cs="Georgia" w:eastAsia="Cardo" w:hAnsi="Georgia"/>
           <w:rtl w:val="0"/>
           <w:sz w:val="22"/>
           <w:szCs w:val="22"/>
         </w:rPr>
-        <w:t xml:space="preserve">Core rules: suggest/indicate finding→hedge, recommendation→FP-Rec, can/may possibility→hedge, capability→FP-Cap, generally/typically claim-limit→hedge, procedural→FP-Proc, appear/seem result-uncertainty→hedge, location→FP-Gen.</w:t>
-      </w:r>
-    </w:p>
-    <w:p>
-      <w:pPr>
-        <w:spacing w:before="0" w:after="0" w:line="480" w:lineRule="auto"/>
-        <w:ind w:firstLine="720"/>
-        <w:jc w:val="both"/>
-      </w:pPr>
-      <w:r>
-        <w:rPr>
-          <w:rFonts w:ascii="Georgia" w:cs="Georgia" w:eastAsia="Cardo" w:hAnsi="Georgia"/>
-          <w:rtl w:val="0"/>
-          <w:sz w:val="22"/>
-          <w:szCs w:val="22"/>
-        </w:rPr>
         <w:t xml:space="preserve">Steps 1-3: Step 1 wide-net candidates. Step 2 = claim condition, then Working Test + Reader Test → EC, P, or FP. Step 3 = type on retained P and EC.</w:t>
       </w:r>
       <w:r>
@@ -23338,17 +23434,25 @@
     <w:p>
       <w:pPr>
         <w:spacing w:before="0" w:after="0" w:line="480" w:lineRule="auto"/>
-        <w:ind w:firstLine="720"/>
-        <w:jc w:val="both"/>
-      </w:pPr>
-      <w:r>
-        <w:rPr>
-          <w:b w:val="1"/>
-          <w:bCs w:val="1"/>
-          <w:sz w:val="22"/>
-          <w:szCs w:val="22"/>
-          <w:rtl w:val="0"/>
-          <w:rFonts w:ascii="Georgia" w:hAnsi="Georgia" w:cs="Georgia"/>
+      </w:pPr>
+      <w:r>
+        <w:t xml:space="preserve"/>
+      </w:r>
+    </w:p>
+    <w:p>
+      <w:pPr>
+        <w:keepNext/>
+        <w:spacing w:before="0" w:after="0" w:line="480" w:lineRule="auto"/>
+        <w:jc w:val="left"/>
+      </w:pPr>
+      <w:r>
+        <w:rPr>
+          <w:sz w:val="24"/>
+          <w:szCs w:val="24"/>
+          <w:rtl w:val="0"/>
+          <w:rFonts w:ascii="Georgia" w:hAnsi="Georgia" w:cs="Georgia"/>
+          <w:i/>
+          <w:iCs/>
         </w:rPr>
         <w:t xml:space="preserve">Quick-Reference Legend</w:t>
       </w:r>
@@ -23356,8 +23460,10 @@
         <w:rPr>
           <w:rtl w:val="0"/>
           <w:rFonts w:ascii="Georgia" w:hAnsi="Georgia" w:cs="Georgia"/>
-          <w:sz w:val="22"/>
-          <w:szCs w:val="22"/>
+          <w:sz w:val="24"/>
+          <w:szCs w:val="24"/>
+          <w:i/>
+          <w:iCs/>
         </w:rPr>
       </w:r>
     </w:p>
@@ -23877,18 +23983,18 @@
     </w:p>
     <w:p>
       <w:pPr>
-        <w:spacing w:before="0" w:after="0" w:line="480" w:lineRule="auto"/>
-        <w:ind w:firstLine="720"/>
-        <w:jc w:val="both"/>
-      </w:pPr>
-      <w:r>
-        <w:rPr>
-          <w:b w:val="1"/>
-          <w:bCs w:val="1"/>
-          <w:rtl w:val="0"/>
-          <w:rFonts w:ascii="Georgia" w:hAnsi="Georgia" w:cs="Georgia"/>
-          <w:sz w:val="22"/>
-          <w:szCs w:val="22"/>
+        <w:keepNext/>
+        <w:spacing w:before="0" w:after="0" w:line="480" w:lineRule="auto"/>
+        <w:jc w:val="left"/>
+      </w:pPr>
+      <w:r>
+        <w:rPr>
+          <w:rtl w:val="0"/>
+          <w:rFonts w:ascii="Georgia" w:hAnsi="Georgia" w:cs="Georgia"/>
+          <w:sz w:val="24"/>
+          <w:szCs w:val="24"/>
+          <w:i/>
+          <w:iCs/>
         </w:rPr>
         <w:t xml:space="preserve">Combined Example</w:t>
       </w:r>
@@ -23896,8 +24002,10 @@
         <w:rPr>
           <w:rtl w:val="0"/>
           <w:rFonts w:ascii="Georgia" w:hAnsi="Georgia" w:cs="Georgia"/>
-          <w:sz w:val="22"/>
-          <w:szCs w:val="22"/>
+          <w:sz w:val="24"/>
+          <w:szCs w:val="24"/>
+          <w:i/>
+          <w:iCs/>
         </w:rPr>
       </w:r>
     </w:p>
@@ -24219,26 +24327,99 @@
     <w:p>
       <w:pPr>
         <w:spacing w:before="0" w:after="0" w:line="480" w:lineRule="auto"/>
-        <w:ind w:firstLine="720"/>
+      </w:pPr>
+      <w:r>
+        <w:t xml:space="preserve"/>
+      </w:r>
+    </w:p>
+    <w:p>
+      <w:pPr>
+        <w:keepNext/>
+        <w:spacing w:before="0" w:after="0" w:line="480" w:lineRule="auto"/>
+        <w:jc w:val="left"/>
+      </w:pPr>
+      <w:r>
+        <w:rPr>
+          <w:sz w:val="24"/>
+          <w:szCs w:val="24"/>
+          <w:rtl w:val="0"/>
+          <w:rFonts w:ascii="Georgia" w:hAnsi="Georgia" w:cs="Georgia"/>
+          <w:i/>
+          <w:iCs/>
+        </w:rPr>
+        <w:t xml:space="preserve">FULL CODEBOOK</w:t>
+      </w:r>
+      <w:r>
+        <w:rPr>
+          <w:rtl w:val="0"/>
+          <w:rFonts w:ascii="Georgia" w:hAnsi="Georgia" w:cs="Georgia"/>
+          <w:sz w:val="24"/>
+          <w:szCs w:val="24"/>
+          <w:i/>
+          <w:iCs/>
+        </w:rPr>
+      </w:r>
+    </w:p>
+    <w:p>
+      <w:pPr>
+        <w:spacing w:before="0" w:after="0" w:line="480" w:lineRule="auto"/>
+        <w:ind w:left="720" w:hanging="360"/>
         <w:jc w:val="both"/>
       </w:pPr>
       <w:r>
         <w:rPr>
           <w:b w:val="1"/>
           <w:bCs w:val="1"/>
-          <w:sz w:val="22"/>
-          <w:szCs w:val="22"/>
-          <w:rtl w:val="0"/>
-          <w:rFonts w:ascii="Georgia" w:hAnsi="Georgia" w:cs="Georgia"/>
-        </w:rPr>
-        <w:t xml:space="preserve">FULL CODEBOOK</w:t>
-      </w:r>
-      <w:r>
-        <w:rPr>
-          <w:rtl w:val="0"/>
-          <w:rFonts w:ascii="Georgia" w:hAnsi="Georgia" w:cs="Georgia"/>
-          <w:sz w:val="22"/>
-          <w:szCs w:val="22"/>
+          <w:rtl w:val="0"/>
+          <w:rFonts w:ascii="Georgia" w:hAnsi="Georgia" w:cs="Georgia"/>
+          <w:sz w:val="22"/>
+          <w:szCs w:val="22"/>
+        </w:rPr>
+        <w:t xml:space="preserve">• Purpose. </w:t>
+      </w:r>
+      <w:r>
+        <w:rPr>
+          <w:rtl w:val="0"/>
+          <w:rFonts w:ascii="Georgia" w:hAnsi="Georgia" w:cs="Georgia"/>
+          <w:sz w:val="22"/>
+          <w:szCs w:val="22"/>
+        </w:rPr>
+        <w:t xml:space="preserve">Coding scheme for the PSAU undergraduate thesis abstract corpus, adapted from Hyland (1998) for type.</w:t>
+      </w:r>
+    </w:p>
+    <w:p>
+      <w:pPr>
+        <w:spacing w:before="0" w:after="0" w:line="480" w:lineRule="auto"/>
+      </w:pPr>
+      <w:r>
+        <w:t xml:space="preserve"/>
+      </w:r>
+    </w:p>
+    <w:p>
+      <w:pPr>
+        <w:keepNext/>
+        <w:spacing w:before="0" w:after="0" w:line="480" w:lineRule="auto"/>
+        <w:jc w:val="left"/>
+      </w:pPr>
+      <w:r>
+        <w:rPr>
+          <w:rtl w:val="0"/>
+          <w:rFonts w:ascii="Georgia" w:hAnsi="Georgia" w:cs="Georgia"/>
+          <w:sz w:val="24"/>
+          <w:szCs w:val="24"/>
+          <w:i/>
+          <w:iCs/>
+        </w:rPr>
+        <w:t xml:space="preserve">Steps 1-3</w:t>
+      </w:r>
+      <w:r>
+        <w:rPr>
+          <w:rtl w:val="0"/>
+          <w:rFonts w:ascii="Georgia" w:hAnsi="Georgia" w:cs="Georgia"/>
+          <w:sz w:val="24"/>
+          <w:szCs w:val="24"/>
+          <w:i/>
+          <w:iCs/>
         </w:rPr>
       </w:r>
     </w:p>
@@ -24257,22 +24438,22 @@
           <w:sz w:val="22"/>
           <w:szCs w:val="22"/>
         </w:rPr>
-        <w:t xml:space="preserve">• Purpose. </w:t>
-      </w:r>
-      <w:r>
-        <w:rPr>
-          <w:rtl w:val="0"/>
-          <w:rFonts w:ascii="Georgia" w:hAnsi="Georgia" w:cs="Georgia"/>
-          <w:sz w:val="22"/>
-          <w:szCs w:val="22"/>
-        </w:rPr>
-        <w:t xml:space="preserve">Coding scheme for the PSAU undergraduate thesis abstract corpus, adapted from Hyland (1998) for type.</w:t>
-      </w:r>
-    </w:p>
-    <w:p>
-      <w:pPr>
-        <w:spacing w:before="0" w:after="0" w:line="480" w:lineRule="auto"/>
-        <w:ind w:firstLine="720"/>
+        <w:t xml:space="preserve">• Step 1. </w:t>
+      </w:r>
+      <w:r>
+        <w:rPr>
+          <w:rtl w:val="0"/>
+          <w:rFonts w:ascii="Georgia" w:hAnsi="Georgia" w:cs="Georgia"/>
+          <w:sz w:val="22"/>
+          <w:szCs w:val="22"/>
+        </w:rPr>
+        <w:t xml:space="preserve">After a full read, mark all possible hedge candidates (wide net). Do not count retained hedges yet.</w:t>
+      </w:r>
+    </w:p>
+    <w:p>
+      <w:pPr>
+        <w:spacing w:before="0" w:after="0" w:line="480" w:lineRule="auto"/>
+        <w:ind w:left="720" w:hanging="360"/>
         <w:jc w:val="both"/>
       </w:pPr>
       <w:r>
@@ -24284,12 +24465,12 @@
           <w:sz w:val="22"/>
           <w:szCs w:val="22"/>
         </w:rPr>
-        <w:t xml:space="preserve">Steps 1-3</w:t>
-      </w:r>
-      <w:r>
-        <w:rPr>
-          <w:rtl w:val="0"/>
-          <w:rFonts w:ascii="Georgia" w:hAnsi="Georgia" w:cs="Georgia"/>
+        <w:t>• Step 2. Claim condition: the device must attach to a claim (a statement about data, the world, or prior work that evidence could show to be wrong). Aims, directives, and routine procedures are excluded by kind. If not a claim, log FP with a reason code. Working Test: remove the device. If commitment to the claim’s truth rises → EC. Reader Test: remove the device. If truth commitment stays the same but the claim is blunter to the reader or the writer takes sole ownership against prior work → P. EC and P may be assigned together when commitment rises and the token also softens interpersonal force. In that case record EC with concurrent P. Neither test met → FP.</w:t>
+      </w:r>
+      <w:r>
+        <w:rPr>
+          <w:rFonts w:ascii="Georgia" w:cs="Georgia" w:eastAsia="Cardo" w:hAnsi="Georgia"/>
+          <w:rtl w:val="0"/>
           <w:sz w:val="22"/>
           <w:szCs w:val="22"/>
         </w:rPr>
@@ -24310,16 +24491,16 @@
           <w:sz w:val="22"/>
           <w:szCs w:val="22"/>
         </w:rPr>
-        <w:t xml:space="preserve">• Step 1. </w:t>
-      </w:r>
-      <w:r>
-        <w:rPr>
-          <w:rtl w:val="0"/>
-          <w:rFonts w:ascii="Georgia" w:hAnsi="Georgia" w:cs="Georgia"/>
-          <w:sz w:val="22"/>
-          <w:szCs w:val="22"/>
-        </w:rPr>
-        <w:t xml:space="preserve">After a full read, mark all possible hedge candidates (wide net). Do not count retained hedges yet.</w:t>
+        <w:t xml:space="preserve">• Step 3. </w:t>
+      </w:r>
+      <w:r>
+        <w:rPr>
+          <w:rtl w:val="0"/>
+          <w:rFonts w:ascii="Georgia" w:hAnsi="Georgia" w:cs="Georgia"/>
+          <w:sz w:val="22"/>
+          <w:szCs w:val="22"/>
+        </w:rPr>
+        <w:t xml:space="preserve">On retained EC and P tokens, assign type (modal, lexical, adverbial, clause-level).</w:t>
       </w:r>
     </w:p>
     <w:p>
@@ -24337,7 +24518,7 @@
           <w:sz w:val="22"/>
           <w:szCs w:val="22"/>
         </w:rPr>
-        <w:t>• Step 2. Claim condition: the device must attach to a claim (a statement about data, the world, or prior work that evidence could show to be wrong). Aims, directives, and routine procedures are excluded by kind. If not a claim, log FP with a reason code. Working Test: remove the device. If commitment to the claim’s truth rises → EC. Reader Test: remove the device. If truth commitment stays the same but the claim is blunter to the reader or the writer takes sole ownership against prior work → P. EC and P may be assigned together when commitment rises and the token also softens interpersonal force. In that case record EC with concurrent P. Neither test met → FP.</w:t>
+        <w:t xml:space="preserve">• Order. </w:t>
       </w:r>
       <w:r>
         <w:rPr>
@@ -24345,6 +24526,43 @@
           <w:rtl w:val="0"/>
           <w:sz w:val="22"/>
           <w:szCs w:val="22"/>
+        </w:rPr>
+        <w:t xml:space="preserve">Full abstract → Step 1 → Step 2 (claim condition, then Working Test and Reader Test) → reason codes on rejects → Step 3 type → Coder Notes.</w:t>
+      </w:r>
+    </w:p>
+    <w:p>
+      <w:pPr>
+        <w:spacing w:before="0" w:after="0" w:line="480" w:lineRule="auto"/>
+      </w:pPr>
+      <w:r>
+        <w:t xml:space="preserve"/>
+      </w:r>
+    </w:p>
+    <w:p>
+      <w:pPr>
+        <w:keepNext/>
+        <w:spacing w:before="0" w:after="0" w:line="480" w:lineRule="auto"/>
+        <w:jc w:val="left"/>
+      </w:pPr>
+      <w:r>
+        <w:rPr>
+          <w:rtl w:val="0"/>
+          <w:rFonts w:ascii="Georgia" w:hAnsi="Georgia" w:cs="Georgia"/>
+          <w:sz w:val="24"/>
+          <w:szCs w:val="24"/>
+          <w:i/>
+          <w:iCs/>
+        </w:rPr>
+        <w:t xml:space="preserve">Working Examples</w:t>
+      </w:r>
+      <w:r>
+        <w:rPr>
+          <w:rtl w:val="0"/>
+          <w:rFonts w:ascii="Georgia" w:hAnsi="Georgia" w:cs="Georgia"/>
+          <w:sz w:val="24"/>
+          <w:szCs w:val="24"/>
+          <w:i/>
+          <w:iCs/>
         </w:rPr>
       </w:r>
     </w:p>
@@ -24363,16 +24581,16 @@
           <w:sz w:val="22"/>
           <w:szCs w:val="22"/>
         </w:rPr>
-        <w:t xml:space="preserve">• Step 3. </w:t>
-      </w:r>
-      <w:r>
-        <w:rPr>
-          <w:rtl w:val="0"/>
-          <w:rFonts w:ascii="Georgia" w:hAnsi="Georgia" w:cs="Georgia"/>
-          <w:sz w:val="22"/>
-          <w:szCs w:val="22"/>
-        </w:rPr>
-        <w:t xml:space="preserve">On retained EC and P tokens, assign type (modal, lexical, adverbial, clause-level).</w:t>
+        <w:t xml:space="preserve">• EC: </w:t>
+      </w:r>
+      <w:r>
+        <w:rPr>
+          <w:rFonts w:ascii="Georgia" w:cs="Georgia" w:eastAsia="Cardo" w:hAnsi="Georgia"/>
+          <w:rtl w:val="0"/>
+          <w:sz w:val="22"/>
+          <w:szCs w:val="22"/>
+        </w:rPr>
+        <w:t xml:space="preserve">“The treatment may reduce infection rates.” Removing may raise truth commitment → EC.</w:t>
       </w:r>
     </w:p>
     <w:p>
@@ -24390,22 +24608,22 @@
           <w:sz w:val="22"/>
           <w:szCs w:val="22"/>
         </w:rPr>
-        <w:t xml:space="preserve">• Order. </w:t>
-      </w:r>
-      <w:r>
-        <w:rPr>
-          <w:rFonts w:ascii="Georgia" w:cs="Georgia" w:eastAsia="Cardo" w:hAnsi="Georgia"/>
-          <w:rtl w:val="0"/>
-          <w:sz w:val="22"/>
-          <w:szCs w:val="22"/>
-        </w:rPr>
-        <w:t xml:space="preserve">Full abstract → Step 1 → Step 2 (claim condition, then Working Test and Reader Test) → reason codes on rejects → Step 3 type → Coder Notes.</w:t>
-      </w:r>
-    </w:p>
-    <w:p>
-      <w:pPr>
-        <w:spacing w:before="0" w:after="0" w:line="480" w:lineRule="auto"/>
-        <w:ind w:firstLine="720"/>
+        <w:t xml:space="preserve">• FP-Cap: </w:t>
+      </w:r>
+      <w:r>
+        <w:rPr>
+          <w:rtl w:val="0"/>
+          <w:rFonts w:ascii="Georgia" w:hAnsi="Georgia" w:cs="Georgia"/>
+          <w:sz w:val="22"/>
+          <w:szCs w:val="22"/>
+        </w:rPr>
+        <w:t xml:space="preserve">“PCR can detect low concentrations.” can = capability, not uncertainty.</w:t>
+      </w:r>
+    </w:p>
+    <w:p>
+      <w:pPr>
+        <w:spacing w:before="0" w:after="0" w:line="480" w:lineRule="auto"/>
+        <w:ind w:left="720" w:hanging="360"/>
         <w:jc w:val="both"/>
       </w:pPr>
       <w:r>
@@ -24417,15 +24635,16 @@
           <w:sz w:val="22"/>
           <w:szCs w:val="22"/>
         </w:rPr>
-        <w:t xml:space="preserve">Working Examples</w:t>
-      </w:r>
-      <w:r>
-        <w:rPr>
-          <w:rtl w:val="0"/>
-          <w:rFonts w:ascii="Georgia" w:hAnsi="Georgia" w:cs="Georgia"/>
-          <w:sz w:val="22"/>
-          <w:szCs w:val="22"/>
-        </w:rPr>
+        <w:t xml:space="preserve">• P: </w:t>
+      </w:r>
+      <w:r>
+        <w:rPr>
+          <w:rFonts w:ascii="Georgia" w:cs="Georgia" w:eastAsia="Cardo" w:hAnsi="Georgia"/>
+          <w:rtl w:val="0"/>
+          <w:sz w:val="22"/>
+          <w:szCs w:val="22"/>
+        </w:rPr>
+        <w:t xml:space="preserve">“As suggested by previous researchers, the treatment is effective.” Removing the attribution leaves truth the same but sole ownership against prior work → P. </w:t>
       </w:r>
     </w:p>
     <w:p>
@@ -24443,7 +24662,7 @@
           <w:sz w:val="22"/>
           <w:szCs w:val="22"/>
         </w:rPr>
-        <w:t xml:space="preserve">• EC: </w:t>
+        <w:t xml:space="preserve">• FP-REC: </w:t>
       </w:r>
       <w:r>
         <w:rPr>
@@ -24452,87 +24671,6 @@
           <w:sz w:val="22"/>
           <w:szCs w:val="22"/>
         </w:rPr>
-        <w:t xml:space="preserve">“The treatment may reduce infection rates.” Removing may raise truth commitment → EC.</w:t>
-      </w:r>
-    </w:p>
-    <w:p>
-      <w:pPr>
-        <w:spacing w:before="0" w:after="0" w:line="480" w:lineRule="auto"/>
-        <w:ind w:left="720" w:hanging="360"/>
-        <w:jc w:val="both"/>
-      </w:pPr>
-      <w:r>
-        <w:rPr>
-          <w:b w:val="1"/>
-          <w:bCs w:val="1"/>
-          <w:rtl w:val="0"/>
-          <w:rFonts w:ascii="Georgia" w:hAnsi="Georgia" w:cs="Georgia"/>
-          <w:sz w:val="22"/>
-          <w:szCs w:val="22"/>
-        </w:rPr>
-        <w:t xml:space="preserve">• FP-Cap: </w:t>
-      </w:r>
-      <w:r>
-        <w:rPr>
-          <w:rtl w:val="0"/>
-          <w:rFonts w:ascii="Georgia" w:hAnsi="Georgia" w:cs="Georgia"/>
-          <w:sz w:val="22"/>
-          <w:szCs w:val="22"/>
-        </w:rPr>
-        <w:t xml:space="preserve">“PCR can detect low concentrations.” can = capability, not uncertainty.</w:t>
-      </w:r>
-    </w:p>
-    <w:p>
-      <w:pPr>
-        <w:spacing w:before="0" w:after="0" w:line="480" w:lineRule="auto"/>
-        <w:ind w:left="720" w:hanging="360"/>
-        <w:jc w:val="both"/>
-      </w:pPr>
-      <w:r>
-        <w:rPr>
-          <w:b w:val="1"/>
-          <w:bCs w:val="1"/>
-          <w:rtl w:val="0"/>
-          <w:rFonts w:ascii="Georgia" w:hAnsi="Georgia" w:cs="Georgia"/>
-          <w:sz w:val="22"/>
-          <w:szCs w:val="22"/>
-        </w:rPr>
-        <w:t xml:space="preserve">• P: </w:t>
-      </w:r>
-      <w:r>
-        <w:rPr>
-          <w:rFonts w:ascii="Georgia" w:cs="Georgia" w:eastAsia="Cardo" w:hAnsi="Georgia"/>
-          <w:rtl w:val="0"/>
-          <w:sz w:val="22"/>
-          <w:szCs w:val="22"/>
-        </w:rPr>
-        <w:t xml:space="preserve">“As suggested by previous researchers, the treatment is effective.” Removing the attribution leaves truth the same but sole ownership against prior work → P. </w:t>
-      </w:r>
-    </w:p>
-    <w:p>
-      <w:pPr>
-        <w:spacing w:before="0" w:after="0" w:line="480" w:lineRule="auto"/>
-        <w:ind w:left="720" w:hanging="360"/>
-        <w:jc w:val="both"/>
-      </w:pPr>
-      <w:r>
-        <w:rPr>
-          <w:b w:val="1"/>
-          <w:bCs w:val="1"/>
-          <w:rtl w:val="0"/>
-          <w:rFonts w:ascii="Georgia" w:hAnsi="Georgia" w:cs="Georgia"/>
-          <w:sz w:val="22"/>
-          <w:szCs w:val="22"/>
-        </w:rPr>
-        <w:t xml:space="preserve">• FP-REC: </w:t>
-      </w:r>
-      <w:r>
-        <w:rPr>
-          <w:rFonts w:ascii="Georgia" w:cs="Georgia" w:eastAsia="Cardo" w:hAnsi="Georgia"/>
-          <w:rtl w:val="0"/>
-          <w:sz w:val="22"/>
-          <w:szCs w:val="22"/>
-        </w:rPr>
         <w:t xml:space="preserve">“Farmers should adopt the treatment” is a directive → FP-Rec.</w:t>
       </w:r>
       <w:r>
@@ -24554,17 +24692,25 @@
     <w:p>
       <w:pPr>
         <w:spacing w:before="0" w:after="0" w:line="480" w:lineRule="auto"/>
-        <w:ind w:firstLine="720"/>
-        <w:jc w:val="both"/>
-      </w:pPr>
-      <w:r>
-        <w:rPr>
-          <w:b w:val="1"/>
-          <w:bCs w:val="1"/>
-          <w:sz w:val="22"/>
-          <w:szCs w:val="22"/>
-          <w:rtl w:val="0"/>
-          <w:rFonts w:ascii="Georgia" w:hAnsi="Georgia" w:cs="Georgia"/>
+      </w:pPr>
+      <w:r>
+        <w:t xml:space="preserve"/>
+      </w:r>
+    </w:p>
+    <w:p>
+      <w:pPr>
+        <w:keepNext/>
+        <w:spacing w:before="0" w:after="0" w:line="480" w:lineRule="auto"/>
+        <w:jc w:val="left"/>
+      </w:pPr>
+      <w:r>
+        <w:rPr>
+          <w:sz w:val="24"/>
+          <w:szCs w:val="24"/>
+          <w:rtl w:val="0"/>
+          <w:rFonts w:ascii="Georgia" w:hAnsi="Georgia" w:cs="Georgia"/>
+          <w:i/>
+          <w:iCs/>
         </w:rPr>
         <w:t xml:space="preserve">Hedge Type (Primary Colors)</w:t>
       </w:r>
@@ -24572,8 +24718,10 @@
         <w:rPr>
           <w:rtl w:val="0"/>
           <w:rFonts w:ascii="Georgia" w:hAnsi="Georgia" w:cs="Georgia"/>
-          <w:sz w:val="22"/>
-          <w:szCs w:val="22"/>
+          <w:sz w:val="24"/>
+          <w:szCs w:val="24"/>
+          <w:i/>
+          <w:iCs/>
         </w:rPr>
       </w:r>
     </w:p>
@@ -25454,17 +25602,25 @@
     <w:p>
       <w:pPr>
         <w:spacing w:before="0" w:after="0" w:line="480" w:lineRule="auto"/>
-        <w:ind w:firstLine="720"/>
-        <w:jc w:val="both"/>
-      </w:pPr>
-      <w:r>
-        <w:rPr>
-          <w:b w:val="1"/>
-          <w:bCs w:val="1"/>
-          <w:sz w:val="22"/>
-          <w:szCs w:val="22"/>
-          <w:rtl w:val="0"/>
-          <w:rFonts w:ascii="Georgia" w:hAnsi="Georgia" w:cs="Georgia"/>
+      </w:pPr>
+      <w:r>
+        <w:t xml:space="preserve"/>
+      </w:r>
+    </w:p>
+    <w:p>
+      <w:pPr>
+        <w:keepNext/>
+        <w:spacing w:before="0" w:after="0" w:line="480" w:lineRule="auto"/>
+        <w:jc w:val="left"/>
+      </w:pPr>
+      <w:r>
+        <w:rPr>
+          <w:sz w:val="24"/>
+          <w:szCs w:val="24"/>
+          <w:rtl w:val="0"/>
+          <w:rFonts w:ascii="Georgia" w:hAnsi="Georgia" w:cs="Georgia"/>
+          <w:i/>
+          <w:iCs/>
         </w:rPr>
         <w:t xml:space="preserve">Hedge Function (Colored Text Labels)</w:t>
       </w:r>
@@ -25472,8 +25628,10 @@
         <w:rPr>
           <w:rtl w:val="0"/>
           <w:rFonts w:ascii="Georgia" w:hAnsi="Georgia" w:cs="Georgia"/>
-          <w:sz w:val="22"/>
-          <w:szCs w:val="22"/>
+          <w:sz w:val="24"/>
+          <w:szCs w:val="24"/>
+          <w:i/>
+          <w:iCs/>
         </w:rPr>
       </w:r>
     </w:p>
@@ -26230,17 +26388,25 @@
     <w:p>
       <w:pPr>
         <w:spacing w:before="0" w:after="0" w:line="480" w:lineRule="auto"/>
-        <w:ind w:firstLine="720"/>
-        <w:jc w:val="both"/>
-      </w:pPr>
-      <w:r>
-        <w:rPr>
-          <w:b w:val="1"/>
-          <w:bCs w:val="1"/>
-          <w:sz w:val="22"/>
-          <w:szCs w:val="22"/>
-          <w:rtl w:val="0"/>
-          <w:rFonts w:ascii="Georgia" w:hAnsi="Georgia" w:cs="Georgia"/>
+      </w:pPr>
+      <w:r>
+        <w:t xml:space="preserve"/>
+      </w:r>
+    </w:p>
+    <w:p>
+      <w:pPr>
+        <w:keepNext/>
+        <w:spacing w:before="0" w:after="0" w:line="480" w:lineRule="auto"/>
+        <w:jc w:val="left"/>
+      </w:pPr>
+      <w:r>
+        <w:rPr>
+          <w:sz w:val="24"/>
+          <w:szCs w:val="24"/>
+          <w:rtl w:val="0"/>
+          <w:rFonts w:ascii="Georgia" w:hAnsi="Georgia" w:cs="Georgia"/>
+          <w:i/>
+          <w:iCs/>
         </w:rPr>
         <w:t xml:space="preserve">Marking False Positives</w:t>
       </w:r>
@@ -26248,8 +26414,10 @@
         <w:rPr>
           <w:rtl w:val="0"/>
           <w:rFonts w:ascii="Georgia" w:hAnsi="Georgia" w:cs="Georgia"/>
-          <w:sz w:val="22"/>
-          <w:szCs w:val="22"/>
+          <w:sz w:val="24"/>
+          <w:szCs w:val="24"/>
+          <w:i/>
+          <w:iCs/>
         </w:rPr>
       </w:r>
     </w:p>
@@ -27086,18 +27254,18 @@
     </w:p>
     <w:p>
       <w:pPr>
-        <w:spacing w:before="0" w:after="0" w:line="480" w:lineRule="auto"/>
-        <w:ind w:firstLine="720"/>
-        <w:jc w:val="both"/>
-      </w:pPr>
-      <w:r>
-        <w:rPr>
-          <w:b w:val="1"/>
-          <w:bCs w:val="1"/>
-          <w:sz w:val="22"/>
-          <w:szCs w:val="22"/>
-          <w:rtl w:val="0"/>
-          <w:rFonts w:ascii="Georgia" w:hAnsi="Georgia" w:cs="Georgia"/>
+        <w:keepNext/>
+        <w:spacing w:before="0" w:after="0" w:line="480" w:lineRule="auto"/>
+        <w:jc w:val="left"/>
+      </w:pPr>
+      <w:r>
+        <w:rPr>
+          <w:sz w:val="24"/>
+          <w:szCs w:val="24"/>
+          <w:rtl w:val="0"/>
+          <w:rFonts w:ascii="Georgia" w:hAnsi="Georgia" w:cs="Georgia"/>
+          <w:i/>
+          <w:iCs/>
         </w:rPr>
         <w:t xml:space="preserve">Unhedged Assertions (Warranted Caution, Neutral Grey)</w:t>
       </w:r>
@@ -27105,8 +27273,10 @@
         <w:rPr>
           <w:rtl w:val="0"/>
           <w:rFonts w:ascii="Georgia" w:hAnsi="Georgia" w:cs="Georgia"/>
-          <w:sz w:val="22"/>
-          <w:szCs w:val="22"/>
+          <w:sz w:val="24"/>
+          <w:szCs w:val="24"/>
+          <w:i/>
+          <w:iCs/>
         </w:rPr>
       </w:r>
     </w:p>
@@ -27853,25 +28023,27 @@
     </w:p>
     <w:p>
       <w:pPr>
-        <w:spacing w:before="0" w:after="0" w:line="480" w:lineRule="auto"/>
-        <w:ind w:firstLine="720"/>
-        <w:jc w:val="both"/>
-      </w:pPr>
-      <w:r>
-        <w:rPr>
-          <w:rFonts w:ascii="Georgia" w:hAnsi="Georgia" w:cs="Georgia"/>
-          <w:sz w:val="22"/>
-          <w:szCs w:val="22"/>
-        </w:rPr>
-      </w:r>
-      <w:r>
-        <w:rPr>
-          <w:b w:val="1"/>
-          <w:bCs w:val="1"/>
-          <w:sz w:val="22"/>
-          <w:szCs w:val="22"/>
-          <w:rtl w:val="0"/>
-          <w:rFonts w:ascii="Georgia" w:hAnsi="Georgia" w:cs="Georgia"/>
+        <w:keepNext/>
+        <w:spacing w:before="0" w:after="0" w:line="480" w:lineRule="auto"/>
+        <w:jc w:val="left"/>
+      </w:pPr>
+      <w:r>
+        <w:rPr>
+          <w:rFonts w:ascii="Georgia" w:hAnsi="Georgia" w:cs="Georgia"/>
+          <w:sz w:val="24"/>
+          <w:szCs w:val="24"/>
+          <w:i/>
+          <w:iCs/>
+        </w:rPr>
+      </w:r>
+      <w:r>
+        <w:rPr>
+          <w:sz w:val="24"/>
+          <w:szCs w:val="24"/>
+          <w:rtl w:val="0"/>
+          <w:rFonts w:ascii="Georgia" w:hAnsi="Georgia" w:cs="Georgia"/>
+          <w:i/>
+          <w:iCs/>
         </w:rPr>
         <w:t xml:space="preserve">Coding Sheet Columns</w:t>
       </w:r>
@@ -27879,8 +28051,10 @@
         <w:rPr>
           <w:rtl w:val="0"/>
           <w:rFonts w:ascii="Georgia" w:hAnsi="Georgia" w:cs="Georgia"/>
-          <w:sz w:val="22"/>
-          <w:szCs w:val="22"/>
+          <w:sz w:val="24"/>
+          <w:szCs w:val="24"/>
+          <w:i/>
+          <w:iCs/>
         </w:rPr>
       </w:r>
     </w:p>

</xml_diff>

<commit_message>
Draft_127_body: pull Figure 1 out of table (remove horizontal borders)
</commit_message>
<xml_diff>
--- a/thesis/003_ThesisProposal_Draft_127_body.docx
+++ b/thesis/003_ThesisProposal_Draft_127_body.docx
@@ -2137,154 +2137,106 @@
         </w:rPr>
       </w:r>
     </w:p>
-    <w:tbl>
-      <w:tblPr>
-        <w:tblW w:w="5000" w:type="pct"/>
-        <w:tblBorders>
-          <w:top w:val="nil" w:sz="0" w:space="0" w:color="auto"/>
-          <w:left w:val="nil" w:sz="0" w:space="0" w:color="auto"/>
-          <w:bottom w:val="nil" w:sz="0" w:space="0" w:color="auto"/>
-          <w:right w:val="nil" w:sz="0" w:space="0" w:color="auto"/>
-          <w:insideH w:val="nil" w:sz="0" w:space="0" w:color="auto"/>
-          <w:insideV w:val="nil" w:sz="0" w:space="0" w:color="auto"/>
-        </w:tblBorders>
-        <w:tblInd w:w="0" w:type="dxa"/>
-      </w:tblPr>
-      <w:tblGrid>
-        <w:gridCol w:w="9360"/>
-      </w:tblGrid>
-      <w:tr>
-        <w:trPr>
-          <w:cantSplit/>
-        </w:trPr>
-        <w:tc>
-          <w:tcPr>
-            <w:tcW w:w="9360" w:type="dxa"/>
-            <w:tcBorders>
-              <w:top w:val="single" w:sz="18" w:space="0" w:color="000000"/>
-              <w:left w:val="nil"/>
-              <w:bottom w:val="single" w:sz="4" w:space="0" w:color="000000"/>
-              <w:right w:val="nil"/>
-            </w:tcBorders>
-            <w:vAlign w:val="center"/>
-          </w:tcPr>
-          <w:p>
-            <w:pPr>
-              <w:spacing w:before="0" w:after="0" w:line="480" w:lineRule="auto"/>
-            </w:pPr>
-            <w:r>
-              <w:t xml:space="preserve"/>
-            </w:r>
-          </w:p>
-          <w:p>
-            <w:pPr>
-              <w:spacing w:before="40" w:after="40" w:line="276" w:lineRule="auto"/>
-              <w:jc w:val="center"/>
-            </w:pPr>
-            <w:r>
-              <w:rPr>
-                <w:rFonts w:ascii="Georgia" w:hAnsi="Georgia" w:cs="Georgia" w:eastAsia="Georgia"/>
-                <w:b/>
-                <w:bCs/>
-                <w:sz w:val="22"/>
-                <w:szCs w:val="22"/>
-              </w:rPr>
-              <w:t xml:space="preserve">Figure 1</w:t>
-            </w:r>
-            <w:r>
-              <w:rPr>
-                <w:rFonts w:ascii="Georgia" w:hAnsi="Georgia" w:cs="Georgia" w:eastAsia="Georgia"/>
-                <w:b/>
-                <w:bCs/>
-                <w:sz w:val="22"/>
-                <w:szCs w:val="22"/>
-              </w:rPr>
-            </w:r>
-          </w:p>
-          <w:p>
-            <w:pPr>
-              <w:spacing w:before="40" w:after="40" w:line="276" w:lineRule="auto"/>
-              <w:jc w:val="center"/>
-            </w:pPr>
-            <w:r>
-              <w:rPr>
-                <w:rFonts w:ascii="Georgia" w:hAnsi="Georgia" w:cs="Georgia" w:eastAsia="Georgia"/>
-                <w:sz w:val="22"/>
-                <w:szCs w:val="22"/>
-              </w:rPr>
-              <w:t xml:space="preserve">Conceptual Framework of the Study</w:t>
-            </w:r>
-            <w:r>
-              <w:rPr>
-                <w:rFonts w:ascii="Georgia" w:hAnsi="Georgia" w:cs="Georgia" w:eastAsia="Georgia"/>
-                <w:sz w:val="22"/>
-                <w:szCs w:val="22"/>
-              </w:rPr>
-            </w:r>
-          </w:p>
-          <w:p>
-            <w:pPr>
-              <w:spacing w:before="40" w:after="40" w:line="276" w:lineRule="auto"/>
-              <w:jc w:val="center"/>
-            </w:pPr>
-            <w:r>
-              <w:rPr>
-                <w:rFonts w:ascii="Georgia" w:hAnsi="Georgia" w:cs="Georgia"/>
-                <w:sz w:val="22"/>
-                <w:szCs w:val="22"/>
-              </w:rPr>
-              <w:drawing>
-                <wp:inline distB="0" distT="0" distL="0" distR="0">
-                  <wp:extent cx="3601720" cy="2851785"/>
-                  <wp:effectExtent b="0" l="0" r="0" t="0"/>
-                  <wp:docPr id="1" name="image1.png"/>
-                  <a:graphic>
-                    <a:graphicData uri="http://schemas.openxmlformats.org/drawingml/2006/picture">
-                      <pic:pic>
-                        <pic:nvPicPr>
-                          <pic:cNvPr id="0" name="image1.png"/>
-                          <pic:cNvPicPr preferRelativeResize="0"/>
-                        </pic:nvPicPr>
-                        <pic:blipFill>
-                          <a:blip r:embed="rId10"/>
-                          <a:srcRect b="0" l="0" r="0" t="0"/>
-                          <a:stretch>
-                            <a:fillRect/>
-                          </a:stretch>
-                        </pic:blipFill>
-                        <pic:spPr>
-                          <a:xfrm>
-                            <a:off x="0" y="0"/>
-                            <a:ext cx="3601720" cy="2851785"/>
-                          </a:xfrm>
-                          <a:prstGeom prst="rect"/>
-                        </pic:spPr>
-                      </pic:pic>
-                    </a:graphicData>
-                  </a:graphic>
-                </wp:inline>
-              </w:drawing>
-            </w:r>
-            <w:r>
-              <w:rPr>
-                <w:rtl w:val="0"/>
-                <w:rFonts w:ascii="Georgia" w:hAnsi="Georgia" w:cs="Georgia"/>
-                <w:sz w:val="22"/>
-                <w:szCs w:val="22"/>
-              </w:rPr>
-            </w:r>
-          </w:p>
-          <w:p>
-            <w:pPr>
-              <w:spacing w:before="0" w:after="0" w:line="480" w:lineRule="auto"/>
-            </w:pPr>
-            <w:r>
-              <w:t xml:space="preserve"/>
-            </w:r>
-          </w:p>
-        </w:tc>
-      </w:tr>
-    </w:tbl>
+    <w:p>
+      <w:pPr>
+        <w:spacing w:before="0" w:after="0" w:line="480" w:lineRule="auto"/>
+        <w:jc w:val="left"/>
+      </w:pPr>
+      <w:r>
+        <w:rPr>
+          <w:rFonts w:ascii="Georgia" w:hAnsi="Georgia"/>
+          <w:sz w:val="22"/>
+          <w:szCs w:val="22"/>
+        </w:rPr>
+        <w:t xml:space="preserve"/>
+      </w:r>
+    </w:p>
+    <w:p>
+      <w:pPr>
+        <w:keepNext/>
+        <w:spacing w:before="0" w:after="0" w:line="360" w:lineRule="auto"/>
+        <w:jc w:val="left"/>
+      </w:pPr>
+      <w:r>
+        <w:rPr>
+          <w:rFonts w:ascii="Georgia" w:hAnsi="Georgia"/>
+          <w:b/>
+          <w:sz w:val="22"/>
+          <w:szCs w:val="22"/>
+        </w:rPr>
+        <w:t>Figure 1</w:t>
+      </w:r>
+    </w:p>
+    <w:p>
+      <w:pPr>
+        <w:keepNext/>
+        <w:spacing w:before="0" w:after="0" w:line="360" w:lineRule="auto"/>
+        <w:jc w:val="left"/>
+      </w:pPr>
+      <w:r>
+        <w:rPr>
+          <w:rFonts w:ascii="Georgia" w:hAnsi="Georgia"/>
+          <w:sz w:val="22"/>
+          <w:szCs w:val="22"/>
+        </w:rPr>
+        <w:t>Conceptual Framework of the Study</w:t>
+      </w:r>
+    </w:p>
+    <w:p>
+      <w:pPr>
+        <w:spacing w:before="0" w:after="0" w:line="480" w:lineRule="auto"/>
+        <w:jc w:val="center"/>
+      </w:pPr>
+      <w:r>
+        <w:drawing>
+          <wp:inline distT="0" distB="0" distL="0" distR="0">
+            <wp:extent cx="3601720" cy="2851785"/>
+            <wp:effectExtent l="0" t="0" r="0" b="0"/>
+            <wp:docPr id="1" name="Figure1"/>
+            <wp:cNvGraphicFramePr/>
+            <a:graphic>
+              <a:graphicData uri="http://schemas.openxmlformats.org/drawingml/2006/picture">
+                <pic:pic>
+                  <pic:nvPicPr>
+                    <pic:cNvPr id="0" name="Figure1"/>
+                    <pic:cNvPicPr/>
+                  </pic:nvPicPr>
+                  <pic:blipFill>
+                    <a:blip r:embed="rId10"/>
+                    <a:stretch>
+                      <a:fillRect/>
+                    </a:stretch>
+                  </pic:blipFill>
+                  <pic:spPr>
+                    <a:xfrm>
+                      <a:off x="0" y="0"/>
+                      <a:ext cx="3601720" cy="2851785"/>
+                    </a:xfrm>
+                    <a:prstGeom prst="rect">
+                      <a:avLst/>
+                    </a:prstGeom>
+                  </pic:spPr>
+                </pic:pic>
+              </a:graphicData>
+            </a:graphic>
+          </wp:inline>
+        </w:drawing>
+      </w:r>
+    </w:p>
+    <w:p>
+      <w:pPr>
+        <w:spacing w:before="0" w:after="0" w:line="480" w:lineRule="auto"/>
+        <w:jc w:val="left"/>
+      </w:pPr>
+      <w:r>
+        <w:rPr>
+          <w:rFonts w:ascii="Georgia" w:hAnsi="Georgia"/>
+          <w:sz w:val="22"/>
+          <w:szCs w:val="22"/>
+        </w:rPr>
+        <w:t xml:space="preserve"/>
+      </w:r>
+    </w:p>
     <w:p>
       <w:pPr>
         <w:spacing w:before="0" w:after="0" w:line="480" w:lineRule="auto"/>

</xml_diff>